<commit_message>
Analyse du projet compléter puis création d'un kanban avec des users stories.
</commit_message>
<xml_diff>
--- a/R-320-NicolasMarques-Rapport.docx
+++ b/R-320-NicolasMarques-Rapport.docx
@@ -688,69 +688,918 @@
       </w:r>
     </w:p>
     <w:p>
-      <w:r>
-        <w:t xml:space="preserve">Un système </w:t>
-      </w:r>
-      <w:r>
-        <w:t>"</w:t>
-      </w:r>
-      <w:r>
-        <w:t>d’horaire</w:t>
-      </w:r>
-      <w:r>
-        <w:t>"</w:t>
-      </w:r>
-      <w:r>
-        <w:t xml:space="preserve"> est présent pour avoir l’heure d’entrée, de sortie du véhicule puis calculé le tarif.</w:t>
+      <w:pPr>
+        <w:rPr>
+          <w:sz w:val="32"/>
+          <w:szCs w:val="32"/>
+        </w:rPr>
+      </w:pPr>
+      <w:r>
+        <w:rPr>
+          <w:color w:val="EE0000"/>
+        </w:rPr>
+        <w:t>1</w:t>
+      </w:r>
+      <w:r>
+        <w:t xml:space="preserve"> : Un</w:t>
+      </w:r>
+      <w:r>
+        <w:t xml:space="preserve"> système "d’horaire" est présent pour avoir l’heure d’entrée, de sortie du véhicule puis calculé </w:t>
+      </w:r>
+      <w:r>
+        <w:t>son</w:t>
+      </w:r>
+      <w:r>
+        <w:t xml:space="preserve"> tarif</w:t>
+      </w:r>
+      <w:r>
+        <w:t xml:space="preserve"> basé sur sa durée de stationnement</w:t>
+      </w:r>
+      <w:r>
+        <w:t>.</w:t>
       </w:r>
     </w:p>
     <w:p>
-      <w:r>
-        <w:t xml:space="preserve">L’utilisateur peut ajouter des véhicules en entrant une plaque d’immatriculation sous ce format </w:t>
-      </w:r>
-      <w:r>
-        <w:t>"</w:t>
-      </w:r>
-      <w:r>
-        <w:rPr>
+      <w:pPr>
+        <w:rPr>
+          <w:sz w:val="32"/>
+          <w:szCs w:val="32"/>
+        </w:rPr>
+      </w:pPr>
+      <w:r>
+        <w:rPr>
+          <w:color w:val="EE0000"/>
+        </w:rPr>
+        <w:t>2 </w:t>
+      </w:r>
+      <w:r>
+        <w:t xml:space="preserve">: </w:t>
+      </w:r>
+      <w:r>
+        <w:t>L’utilisateur peut ajouter des véhicules en entrant une plaque d’immatriculation sous ce format "</w:t>
+      </w:r>
+      <w:r>
+        <w:rPr>
+          <w:b/>
+          <w:bCs/>
+          <w:i/>
+          <w:iCs/>
           <w:color w:val="BF4E14" w:themeColor="accent2" w:themeShade="BF"/>
-        </w:rPr>
-        <w:t xml:space="preserve">2 lettres </w:t>
+          <w:u w:val="single"/>
+        </w:rPr>
+        <w:t xml:space="preserve">2 </w:t>
+      </w:r>
+      <w:r>
+        <w:rPr>
+          <w:b/>
+          <w:bCs/>
+          <w:i/>
+          <w:iCs/>
+          <w:color w:val="BF4E14" w:themeColor="accent2" w:themeShade="BF"/>
+          <w:u w:val="single"/>
+        </w:rPr>
+        <w:t>lettres</w:t>
+      </w:r>
+      <w:r>
+        <w:rPr>
+          <w:color w:val="BF4E14" w:themeColor="accent2" w:themeShade="BF"/>
+        </w:rPr>
+        <w:t xml:space="preserve"> </w:t>
       </w:r>
       <w:r>
         <w:t xml:space="preserve">– </w:t>
       </w:r>
       <w:r>
         <w:rPr>
+          <w:b/>
+          <w:bCs/>
+          <w:i/>
+          <w:iCs/>
           <w:color w:val="124F1A" w:themeColor="accent3" w:themeShade="BF"/>
-        </w:rPr>
-        <w:t>jusqu’à 6 chiffres</w:t>
-      </w:r>
-      <w:r>
-        <w:t>"</w:t>
-      </w:r>
-      <w:r>
-        <w:t>.</w:t>
-      </w:r>
-      <w:r>
-        <w:t xml:space="preserve"> Puis un ticket va automatiquement être attribuer au véhicule (son heure d’entrée, la place de parking, puis le tarif horaire).</w:t>
+          <w:u w:val="single"/>
+        </w:rPr>
+        <w:t xml:space="preserve">jusqu’à 6 </w:t>
+      </w:r>
+      <w:r>
+        <w:rPr>
+          <w:b/>
+          <w:bCs/>
+          <w:i/>
+          <w:iCs/>
+          <w:color w:val="124F1A" w:themeColor="accent3" w:themeShade="BF"/>
+          <w:u w:val="single"/>
+        </w:rPr>
+        <w:t>chiffres</w:t>
+      </w:r>
+      <w:r>
+        <w:t>".</w:t>
+      </w:r>
+      <w:r>
+        <w:t xml:space="preserve"> Puis un ticket va automatiquement être attribuer au véhicule (</w:t>
+      </w:r>
+      <w:r>
+        <w:rPr>
+          <w:b/>
+          <w:bCs/>
+          <w:i/>
+          <w:iCs/>
+          <w:color w:val="00B0F0"/>
+          <w:u w:val="single"/>
+        </w:rPr>
+        <w:t>son heure d’entrée, la place de parking, puis le tarif horaire</w:t>
+      </w:r>
+      <w:r>
+        <w:t>).</w:t>
       </w:r>
     </w:p>
     <w:p>
-      <w:r>
-        <w:t>Il aura la possibilité de sortir un véhicule du parking soit en entrant sa plaque d’immatriculation ou son numéro de place.</w:t>
-      </w:r>
-      <w:r>
-        <w:t xml:space="preserve"> (</w:t>
-      </w:r>
+      <w:pPr>
+        <w:rPr>
+          <w:sz w:val="32"/>
+          <w:szCs w:val="32"/>
+        </w:rPr>
+      </w:pPr>
       <w:r>
         <w:rPr>
           <w:color w:val="EE0000"/>
         </w:rPr>
-        <w:t>À finir l’analyse</w:t>
-      </w:r>
-      <w:r>
-        <w:t>)</w:t>
+        <w:t>3 </w:t>
+      </w:r>
+      <w:r>
+        <w:t xml:space="preserve">: </w:t>
+      </w:r>
+      <w:r>
+        <w:t>Un système de recherche fonctionnant comme ce ci : L’utilisateur entre soit une plaque d’immatriculation ou un numéro de place.</w:t>
+      </w:r>
+    </w:p>
+    <w:p>
+      <w:pPr>
+        <w:rPr>
+          <w:sz w:val="32"/>
+          <w:szCs w:val="32"/>
+        </w:rPr>
+      </w:pPr>
+      <w:r>
+        <w:rPr>
+          <w:color w:val="EE0000"/>
+        </w:rPr>
+        <w:t>4 </w:t>
+      </w:r>
+      <w:r>
+        <w:t xml:space="preserve">: </w:t>
+      </w:r>
+      <w:r>
+        <w:t xml:space="preserve">L’utilisateur peut chercher un véhicule en utilisant le système de recherche. </w:t>
+      </w:r>
+      <w:r>
+        <w:t xml:space="preserve">Si une correspondance est trouvée, </w:t>
+      </w:r>
+      <w:r>
+        <w:rPr>
+          <w:b/>
+          <w:bCs/>
+          <w:i/>
+          <w:iCs/>
+          <w:color w:val="D86DCB" w:themeColor="accent5" w:themeTint="99"/>
+          <w:u w:val="single"/>
+        </w:rPr>
+        <w:t>afficher sa plaque d’immatriculation, heure d’entré, durée de stationnement, prix actuel, et son numéro de place</w:t>
+      </w:r>
+      <w:r>
+        <w:t>. Si la plaque ou le numéro de place n’a aucun résultat, afficher un message pour dire à l’utilisateur que aucun résultat n’a pu être trouvé.</w:t>
+      </w:r>
+    </w:p>
+    <w:p>
+      <w:pPr>
+        <w:rPr>
+          <w:sz w:val="32"/>
+          <w:szCs w:val="32"/>
+        </w:rPr>
+      </w:pPr>
+      <w:r>
+        <w:rPr>
+          <w:color w:val="EE0000"/>
+        </w:rPr>
+        <w:t>5 </w:t>
+      </w:r>
+      <w:r>
+        <w:t xml:space="preserve">: </w:t>
+      </w:r>
+      <w:r>
+        <w:t>L’utilisateur</w:t>
+      </w:r>
+      <w:r>
+        <w:t xml:space="preserve"> aura la possibilité de sortir un véhicule du parking en </w:t>
+      </w:r>
+      <w:r>
+        <w:t>utilisant le système de recherche</w:t>
+      </w:r>
+      <w:r>
+        <w:t>.</w:t>
+      </w:r>
+      <w:r>
+        <w:t xml:space="preserve"> Si une correspondance est trouvée, d’abord demandé à l’utilisateur s’il est sûr de vouloir libérer la place. Si oui, </w:t>
+      </w:r>
+      <w:r>
+        <w:rPr>
+          <w:b/>
+          <w:bCs/>
+          <w:i/>
+          <w:iCs/>
+          <w:color w:val="8DD873" w:themeColor="accent6" w:themeTint="99"/>
+          <w:u w:val="single"/>
+        </w:rPr>
+        <w:t>afficher son heure d’entrée et de sortie et le montant payé</w:t>
+      </w:r>
+      <w:r>
+        <w:t xml:space="preserve">. Si non, annulé l’action. En revanche si aucune correspondance est trouvée, afficher un message </w:t>
+      </w:r>
+      <w:r>
+        <w:t>pour dire à l’utilisateur que aucun résultat n’a pu être trouvé.</w:t>
+      </w:r>
+    </w:p>
+    <w:p>
+      <w:pPr>
+        <w:rPr>
+          <w:sz w:val="32"/>
+          <w:szCs w:val="32"/>
+        </w:rPr>
+      </w:pPr>
+      <w:r>
+        <w:rPr>
+          <w:color w:val="EE0000"/>
+        </w:rPr>
+        <w:t>6 </w:t>
+      </w:r>
+      <w:r>
+        <w:t xml:space="preserve">: </w:t>
+      </w:r>
+      <w:r>
+        <w:t>Afficher l’état du parking de manière visuel. Afficher les places occupées et libres. Pour que l’utilisateur ce repère plus facilement.</w:t>
+      </w:r>
+    </w:p>
+    <w:p>
+      <w:pPr>
+        <w:rPr>
+          <w:sz w:val="32"/>
+          <w:szCs w:val="32"/>
+        </w:rPr>
+      </w:pPr>
+      <w:r>
+        <w:rPr>
+          <w:color w:val="EE0000"/>
+        </w:rPr>
+        <w:t>7 </w:t>
+      </w:r>
+      <w:r>
+        <w:t xml:space="preserve">: </w:t>
+      </w:r>
+      <w:r>
+        <w:t xml:space="preserve">Avoir des statistiques du jour. Par exemple le pourcentage du parking occupées, le montant total payé, la durée de stationnement de tous </w:t>
+      </w:r>
+      <w:r>
+        <w:t>les véhicules actuels</w:t>
+      </w:r>
+      <w:r>
+        <w:t>, la durée moyenne de stationnement, etc…</w:t>
+      </w:r>
+    </w:p>
+    <w:p>
+      <w:pPr>
+        <w:rPr>
+          <w:sz w:val="32"/>
+          <w:szCs w:val="32"/>
+        </w:rPr>
+      </w:pPr>
+      <w:r>
+        <w:rPr>
+          <w:color w:val="EE0000"/>
+        </w:rPr>
+        <w:t>8 </w:t>
+      </w:r>
+      <w:r>
+        <w:t xml:space="preserve">: </w:t>
+      </w:r>
+      <w:r>
+        <w:t xml:space="preserve">Avoir un historique des transactions. Afficher l’heure d’entrée d’un véhicule avec sa plaque d’immatriculation et son numéro de place écrit à coter. Puis afficher son heure de sortie </w:t>
+      </w:r>
+      <w:r>
+        <w:t xml:space="preserve">avec </w:t>
+      </w:r>
+      <w:r>
+        <w:t>les mêmes infos</w:t>
+      </w:r>
+      <w:r>
+        <w:t xml:space="preserve"> que l’heure d’entrée mais avec le montant payé en plus.</w:t>
+      </w:r>
+    </w:p>
+    <w:p>
+      <w:r>
+        <w:br w:type="page"/>
+      </w:r>
+    </w:p>
+    <w:p>
+      <w:r>
+        <w:rPr>
+          <w:color w:val="EE0000"/>
+        </w:rPr>
+        <w:lastRenderedPageBreak/>
+        <w:t>1</w:t>
+      </w:r>
+      <w:r>
+        <w:t> :</w:t>
+      </w:r>
+      <w:r>
+        <w:rPr>
+          <w:b/>
+          <w:bCs/>
+          <w:color w:val="7030A0"/>
+        </w:rPr>
+        <w:t xml:space="preserve"> </w:t>
+      </w:r>
+      <w:r>
+        <w:rPr>
+          <w:b/>
+          <w:bCs/>
+          <w:color w:val="7030A0"/>
+        </w:rPr>
+        <w:t xml:space="preserve">Créer une classe statique pour </w:t>
+      </w:r>
+      <w:r>
+        <w:rPr>
+          <w:b/>
+          <w:bCs/>
+          <w:color w:val="7030A0"/>
+        </w:rPr>
+        <w:t xml:space="preserve">les </w:t>
+      </w:r>
+      <w:r>
+        <w:rPr>
+          <w:b/>
+          <w:bCs/>
+          <w:color w:val="7030A0"/>
+        </w:rPr>
+        <w:t>méthodes du projet.</w:t>
+      </w:r>
+      <w:r>
+        <w:rPr>
+          <w:color w:val="7030A0"/>
+        </w:rPr>
+        <w:t xml:space="preserve"> </w:t>
+      </w:r>
+      <w:r>
+        <w:t xml:space="preserve">Utilisé un </w:t>
+      </w:r>
+      <w:proofErr w:type="spellStart"/>
+      <w:r>
+        <w:t>timer</w:t>
+      </w:r>
+      <w:proofErr w:type="spellEnd"/>
+      <w:r>
+        <w:t xml:space="preserve"> qui s’incrémentera chaque seconde. Une seconde sera égale à une minute.</w:t>
+      </w:r>
+    </w:p>
+    <w:p>
+      <w:r>
+        <w:rPr>
+          <w:color w:val="EE0000"/>
+        </w:rPr>
+        <w:t>2 </w:t>
+      </w:r>
+      <w:r>
+        <w:t xml:space="preserve">: </w:t>
+      </w:r>
+      <w:r>
+        <w:t>Crée 2 classes</w:t>
+      </w:r>
+      <w:r>
+        <w:t xml:space="preserve"> non-statiques</w:t>
+      </w:r>
+      <w:r>
+        <w:t>. 1 pour une classe ticket (</w:t>
+      </w:r>
+      <w:r>
+        <w:rPr>
+          <w:b/>
+          <w:bCs/>
+          <w:i/>
+          <w:iCs/>
+          <w:color w:val="00B0F0"/>
+          <w:u w:val="single"/>
+        </w:rPr>
+        <w:t>contenant les infos du tickets</w:t>
+      </w:r>
+      <w:r>
+        <w:t xml:space="preserve">).1 pour le véhicule (sa </w:t>
+      </w:r>
+      <w:r>
+        <w:rPr>
+          <w:i/>
+          <w:iCs/>
+          <w:color w:val="BF4E14" w:themeColor="accent2" w:themeShade="BF"/>
+          <w:u w:val="single"/>
+        </w:rPr>
+        <w:t>plaque</w:t>
+      </w:r>
+      <w:r>
+        <w:rPr>
+          <w:i/>
+          <w:iCs/>
+          <w:u w:val="single"/>
+        </w:rPr>
+        <w:t xml:space="preserve"> </w:t>
+      </w:r>
+      <w:r>
+        <w:rPr>
+          <w:i/>
+          <w:iCs/>
+          <w:color w:val="124F1A" w:themeColor="accent3" w:themeShade="BF"/>
+          <w:u w:val="single"/>
+        </w:rPr>
+        <w:t>d’immatriculation</w:t>
+      </w:r>
+      <w:r>
+        <w:t>, et son ticket.)</w:t>
+      </w:r>
+      <w:r>
+        <w:t xml:space="preserve">. </w:t>
+      </w:r>
+      <w:r>
+        <w:t xml:space="preserve">Utiliser la composition/association d’objet pour </w:t>
+      </w:r>
+      <w:r>
+        <w:t>avoir le</w:t>
+      </w:r>
+      <w:r>
+        <w:t xml:space="preserve"> ticket comme attributs de la classe voiture.</w:t>
+      </w:r>
+      <w:r>
+        <w:br/>
+        <w:t>Puis ensuite</w:t>
+      </w:r>
+      <w:r>
+        <w:rPr>
+          <w:color w:val="7030A0"/>
+        </w:rPr>
+        <w:t xml:space="preserve"> </w:t>
+      </w:r>
+      <w:r>
+        <w:rPr>
+          <w:color w:val="7030A0"/>
+        </w:rPr>
+        <w:t xml:space="preserve">Utiliser la classe </w:t>
+      </w:r>
+      <w:r>
+        <w:rPr>
+          <w:color w:val="7030A0"/>
+        </w:rPr>
+        <w:t>statique</w:t>
+      </w:r>
+      <w:r>
+        <w:rPr>
+          <w:color w:val="7030A0"/>
+        </w:rPr>
+        <w:t xml:space="preserve"> </w:t>
+      </w:r>
+      <w:r>
+        <w:t>pour</w:t>
+      </w:r>
+      <w:r>
+        <w:t xml:space="preserve"> crée une méthode qui a pour paramètre un string (pour la plaque d’immatriculation). On va vérifier si </w:t>
+      </w:r>
+      <w:r>
+        <w:t>le numéro de plaque entrée par l’utilisateur est cohérent.</w:t>
+      </w:r>
+      <w:r>
+        <w:br/>
+        <w:t xml:space="preserve">Si oui, on va créer un nouveau véhicule avec la plaque entrée par l’utilisateur, puis un ticket avec </w:t>
+      </w:r>
+      <w:r>
+        <w:rPr>
+          <w:b/>
+          <w:bCs/>
+          <w:i/>
+          <w:iCs/>
+          <w:color w:val="00B0F0"/>
+          <w:u w:val="single"/>
+        </w:rPr>
+        <w:t>ses infos</w:t>
+      </w:r>
+      <w:r>
+        <w:t>.</w:t>
+      </w:r>
+      <w:r>
+        <w:br/>
+        <w:t>Sinon, on va afficher un message pour dire à l’utilisateu</w:t>
+      </w:r>
+      <w:r>
+        <w:t>r que ce n’est pas la bonne façon pour créer un véhicule. Puis montrer à l’utilisateur un exemple de comment doit être écrit la plaque d’immatriculation.</w:t>
+      </w:r>
+    </w:p>
+    <w:p>
+      <w:r>
+        <w:rPr>
+          <w:color w:val="EE0000"/>
+        </w:rPr>
+        <w:t>3 </w:t>
+      </w:r>
+      <w:r>
+        <w:t>:</w:t>
+      </w:r>
+      <w:r>
+        <w:rPr>
+          <w:color w:val="7030A0"/>
+        </w:rPr>
+        <w:t xml:space="preserve"> </w:t>
+      </w:r>
+      <w:r>
+        <w:rPr>
+          <w:color w:val="7030A0"/>
+        </w:rPr>
+        <w:t>Utiliser la classe statique</w:t>
+      </w:r>
+      <w:r>
+        <w:t xml:space="preserve"> pour créer </w:t>
+      </w:r>
+      <w:r>
+        <w:t>une</w:t>
+      </w:r>
+      <w:r>
+        <w:t xml:space="preserve"> méthode permettant la recherche de véhicule.</w:t>
+      </w:r>
+      <w:r>
+        <w:t xml:space="preserve"> </w:t>
+      </w:r>
+      <w:r>
+        <w:t>Cette méthode aura comme paramètre une</w:t>
+      </w:r>
+      <w:r>
+        <w:t xml:space="preserve"> </w:t>
+      </w:r>
+      <w:r>
+        <w:t>variable de type string</w:t>
+      </w:r>
+      <w:r>
+        <w:t>, puis une variable de type booléenne (pour dire ce que l’utilisateur veut faire. Chercher un véhicule, ou le faire sortir)</w:t>
+      </w:r>
+      <w:r>
+        <w:t xml:space="preserve">. On va </w:t>
+      </w:r>
+      <w:r>
+        <w:t xml:space="preserve">vérifier si le string est cohérent pour savoir si c’est une plaque d’immatriculation, si cela ne fonctionne pas, essayer de le transformer en type INT (pour savoir si c’est un numéro de place), si ça ne fonctionne pas, </w:t>
+      </w:r>
+      <w:r>
+        <w:t>appeler une autre méthode</w:t>
+      </w:r>
+      <w:r>
+        <w:t xml:space="preserve"> </w:t>
+      </w:r>
+      <w:r>
+        <w:t xml:space="preserve">(soit pour afficher les infos du véhicule, soit le faire sortir. Dont l’utilité du paramètre booléen) puis lui donner comme paramètre un texte écrit comme ce ci </w:t>
+      </w:r>
+      <w:r>
+        <w:t>"</w:t>
+      </w:r>
+      <w:proofErr w:type="spellStart"/>
+      <w:r>
+        <w:t>nothing</w:t>
+      </w:r>
+      <w:proofErr w:type="spellEnd"/>
+      <w:r>
+        <w:t xml:space="preserve"> </w:t>
+      </w:r>
+      <w:proofErr w:type="spellStart"/>
+      <w:r>
+        <w:t>found</w:t>
+      </w:r>
+      <w:proofErr w:type="spellEnd"/>
+      <w:r>
+        <w:t>"</w:t>
+      </w:r>
+      <w:r>
+        <w:t>.</w:t>
+      </w:r>
+      <w:r>
+        <w:br/>
+      </w:r>
+      <w:r>
+        <w:t xml:space="preserve">Cette méthode </w:t>
+      </w:r>
+      <w:r>
+        <w:t>appellera une autre méthode</w:t>
+      </w:r>
+      <w:r>
+        <w:t xml:space="preserve"> </w:t>
+      </w:r>
+      <w:r>
+        <w:t>en lui donnant comme paramètre la plaque</w:t>
+      </w:r>
+      <w:r>
+        <w:t xml:space="preserve"> (si l’utilisateur avait entrée un numéro de place, on aurait cherché dans le parking la place en question puis récupéré son numéro de plaque qui l’occupe)</w:t>
+      </w:r>
+      <w:r>
+        <w:t xml:space="preserve"> </w:t>
+      </w:r>
+      <w:r>
+        <w:t xml:space="preserve">si une </w:t>
+      </w:r>
+      <w:r>
+        <w:t>correspondance a été trouvé.</w:t>
+      </w:r>
+    </w:p>
+    <w:p>
+      <w:r>
+        <w:rPr>
+          <w:color w:val="EE0000"/>
+        </w:rPr>
+        <w:t>4 </w:t>
+      </w:r>
+      <w:r>
+        <w:t xml:space="preserve">: </w:t>
+      </w:r>
+      <w:r>
+        <w:rPr>
+          <w:color w:val="7030A0"/>
+        </w:rPr>
+        <w:t>Utiliser la classe statique</w:t>
+      </w:r>
+      <w:r>
+        <w:rPr>
+          <w:color w:val="7030A0"/>
+        </w:rPr>
+        <w:t xml:space="preserve"> </w:t>
+      </w:r>
+      <w:r>
+        <w:t>pour créer une nouvelle méthode pour afficher les informations du véhicule.</w:t>
+      </w:r>
+      <w:r>
+        <w:t xml:space="preserve"> La méthode aura comme paramètre une variable de type string. On vérifie si le string est un numéro de plaque cohérent.</w:t>
+      </w:r>
+    </w:p>
+    <w:p>
+      <w:r>
+        <w:t xml:space="preserve">Si oui, </w:t>
+      </w:r>
+      <w:r>
+        <w:rPr>
+          <w:i/>
+          <w:iCs/>
+          <w:color w:val="D86DCB" w:themeColor="accent5" w:themeTint="99"/>
+          <w:u w:val="single"/>
+        </w:rPr>
+        <w:t>récupérer les informations</w:t>
+      </w:r>
+      <w:r>
+        <w:t xml:space="preserve"> puis les afficher.</w:t>
+      </w:r>
+    </w:p>
+    <w:p>
+      <w:r>
+        <w:t xml:space="preserve">Si non, vérifier si le string est égal à </w:t>
+      </w:r>
+      <w:r>
+        <w:t>"</w:t>
+      </w:r>
+      <w:proofErr w:type="spellStart"/>
+      <w:r>
+        <w:t>nothing</w:t>
+      </w:r>
+      <w:proofErr w:type="spellEnd"/>
+      <w:r>
+        <w:t xml:space="preserve"> </w:t>
+      </w:r>
+      <w:proofErr w:type="spellStart"/>
+      <w:r>
+        <w:t>found</w:t>
+      </w:r>
+      <w:proofErr w:type="spellEnd"/>
+      <w:r>
+        <w:t>"</w:t>
+      </w:r>
+      <w:r>
+        <w:t xml:space="preserve">. Si c’est le cas, </w:t>
+      </w:r>
+      <w:r>
+        <w:t>afficher un message pour dire à l’utilisateur que aucun résultat n’a pu être trouvé</w:t>
+      </w:r>
+      <w:r>
+        <w:t xml:space="preserve">. Si ce n’est pas le cas, afficher un message d’erreur comme </w:t>
+      </w:r>
+      <w:r>
+        <w:t>"</w:t>
+      </w:r>
+      <w:r>
+        <w:t>Un problème c’est produit.</w:t>
+      </w:r>
+      <w:r>
+        <w:t>"</w:t>
+      </w:r>
+      <w:r>
+        <w:t> ;</w:t>
+      </w:r>
+    </w:p>
+    <w:p/>
+    <w:p/>
+    <w:p>
+      <w:r>
+        <w:rPr>
+          <w:color w:val="EE0000"/>
+        </w:rPr>
+        <w:lastRenderedPageBreak/>
+        <w:t>5 </w:t>
+      </w:r>
+      <w:r>
+        <w:t xml:space="preserve">: </w:t>
+      </w:r>
+      <w:r>
+        <w:rPr>
+          <w:color w:val="7030A0"/>
+        </w:rPr>
+        <w:t>Utiliser la classe statique</w:t>
+      </w:r>
+      <w:r>
+        <w:rPr>
+          <w:color w:val="7030A0"/>
+        </w:rPr>
+        <w:t xml:space="preserve"> </w:t>
+      </w:r>
+      <w:r>
+        <w:t xml:space="preserve">pour créer une nouvelle méthode pour </w:t>
+      </w:r>
+      <w:r>
+        <w:t>faire sortir</w:t>
+      </w:r>
+      <w:r>
+        <w:t xml:space="preserve"> </w:t>
+      </w:r>
+      <w:r>
+        <w:t>un véhicule du parking</w:t>
+      </w:r>
+      <w:r>
+        <w:t>. La méthode aura comme paramètre une variable de type string. On vérifie si le string est un numéro de plaque cohérent.</w:t>
+      </w:r>
+    </w:p>
+    <w:p>
+      <w:r>
+        <w:t>Si oui, demander à l’utilisateur s’il est sûr de vouloir faire quitter ce véhicule</w:t>
+      </w:r>
+      <w:r>
+        <w:t xml:space="preserve">. Si l’utilisateur répond oui, </w:t>
+      </w:r>
+      <w:r>
+        <w:rPr>
+          <w:b/>
+          <w:bCs/>
+          <w:i/>
+          <w:iCs/>
+          <w:color w:val="8DD873" w:themeColor="accent6" w:themeTint="99"/>
+          <w:u w:val="single"/>
+        </w:rPr>
+        <w:t>afficher ses informations</w:t>
+      </w:r>
+      <w:r>
+        <w:t>. Sinon, annulé l’action.</w:t>
+      </w:r>
+    </w:p>
+    <w:p>
+      <w:r>
+        <w:t xml:space="preserve">Si non, vérifier si le string est égal à </w:t>
+      </w:r>
+      <w:r>
+        <w:t>"</w:t>
+      </w:r>
+      <w:proofErr w:type="spellStart"/>
+      <w:r>
+        <w:t>nothing</w:t>
+      </w:r>
+      <w:proofErr w:type="spellEnd"/>
+      <w:r>
+        <w:t xml:space="preserve"> </w:t>
+      </w:r>
+      <w:proofErr w:type="spellStart"/>
+      <w:r>
+        <w:t>found</w:t>
+      </w:r>
+      <w:proofErr w:type="spellEnd"/>
+      <w:r>
+        <w:t>"</w:t>
+      </w:r>
+      <w:r>
+        <w:t xml:space="preserve">. Si c’est le cas, </w:t>
+      </w:r>
+      <w:r>
+        <w:t>afficher un message pour dire à l’utilisateur que aucun résultat n’a pu être trouvé</w:t>
+      </w:r>
+      <w:r>
+        <w:t xml:space="preserve">. Si ce n’est pas le cas, afficher un message d’erreur comme </w:t>
+      </w:r>
+      <w:r>
+        <w:t>"</w:t>
+      </w:r>
+      <w:r>
+        <w:t>Un problème c’est produit.</w:t>
+      </w:r>
+      <w:r>
+        <w:t>"</w:t>
+      </w:r>
+      <w:r>
+        <w:t> ;</w:t>
+      </w:r>
+    </w:p>
+    <w:p>
+      <w:r>
+        <w:rPr>
+          <w:color w:val="EE0000"/>
+        </w:rPr>
+        <w:t>6 </w:t>
+      </w:r>
+      <w:r>
+        <w:t xml:space="preserve">: </w:t>
+      </w:r>
+      <w:r>
+        <w:rPr>
+          <w:color w:val="7030A0"/>
+        </w:rPr>
+        <w:t>Utiliser la classe statique</w:t>
+      </w:r>
+      <w:r>
+        <w:rPr>
+          <w:color w:val="7030A0"/>
+        </w:rPr>
+        <w:t xml:space="preserve"> </w:t>
+      </w:r>
+      <w:r>
+        <w:t>pour</w:t>
+      </w:r>
+      <w:r>
+        <w:t xml:space="preserve"> créer une nouvelle méthode pour afficher le parking.</w:t>
+      </w:r>
+      <w:r>
+        <w:br/>
+        <w:t>Le parking sera un tableau multi-dimensionnel, avec une taille fixe.</w:t>
+      </w:r>
+    </w:p>
+    <w:p>
+      <w:r>
+        <w:rPr>
+          <w:color w:val="EE0000"/>
+        </w:rPr>
+        <w:t>7 </w:t>
+      </w:r>
+      <w:r>
+        <w:t xml:space="preserve">: </w:t>
+      </w:r>
+      <w:r>
+        <w:rPr>
+          <w:color w:val="7030A0"/>
+        </w:rPr>
+        <w:t>Utiliser la classe statique</w:t>
+      </w:r>
+      <w:r>
+        <w:rPr>
+          <w:color w:val="7030A0"/>
+        </w:rPr>
+        <w:t xml:space="preserve"> </w:t>
+      </w:r>
+      <w:r>
+        <w:t>pour créer une nouvelle méthode</w:t>
+      </w:r>
+      <w:r>
+        <w:t xml:space="preserve"> pour afficher diverse stats et information.</w:t>
+      </w:r>
+    </w:p>
+    <w:p>
+      <w:r>
+        <w:rPr>
+          <w:color w:val="EE0000"/>
+        </w:rPr>
+        <w:t>8 </w:t>
+      </w:r>
+      <w:r>
+        <w:t xml:space="preserve">: </w:t>
+      </w:r>
+      <w:r>
+        <w:rPr>
+          <w:color w:val="7030A0"/>
+        </w:rPr>
+        <w:t>Utiliser la classe statique</w:t>
+      </w:r>
+      <w:r>
+        <w:rPr>
+          <w:color w:val="7030A0"/>
+        </w:rPr>
+        <w:t xml:space="preserve"> </w:t>
+      </w:r>
+      <w:r>
+        <w:t>pour</w:t>
+      </w:r>
+      <w:r>
+        <w:t xml:space="preserve"> créer une nouvelle méthode pour afficher l’historique des transactions.</w:t>
+      </w:r>
+    </w:p>
+    <w:p>
+      <w:r>
+        <w:br w:type="page"/>
       </w:r>
     </w:p>
     <w:p>
@@ -765,6 +1614,7 @@
         <w:rPr>
           <w:color w:val="auto"/>
         </w:rPr>
+        <w:lastRenderedPageBreak/>
         <w:t>Réalisation</w:t>
       </w:r>
       <w:bookmarkEnd w:id="2"/>
@@ -1664,7 +2514,7 @@
   <w:style w:type="paragraph" w:default="1" w:styleId="Normal">
     <w:name w:val="Normal"/>
     <w:qFormat/>
-    <w:rsid w:val="007B1237"/>
+    <w:rsid w:val="00AE51BA"/>
   </w:style>
   <w:style w:type="paragraph" w:styleId="Titre1">
     <w:name w:val="heading 1"/>
@@ -2456,6 +3306,8 @@
     <w:rsid w:val="000805B5"/>
     <w:rsid w:val="000B25E6"/>
     <w:rsid w:val="002907FD"/>
+    <w:rsid w:val="002C61A5"/>
+    <w:rsid w:val="00482DE2"/>
     <w:rsid w:val="005D009D"/>
     <w:rsid w:val="005E5E67"/>
     <w:rsid w:val="006242E2"/>

</xml_diff>

<commit_message>
feat: 3 features. Remove cars, show history, daily stats
</commit_message>
<xml_diff>
--- a/R-320-NicolasMarques-Rapport.docx
+++ b/R-320-NicolasMarques-Rapport.docx
@@ -139,7 +139,7 @@
           <w:r>
             <w:fldChar w:fldCharType="separate"/>
           </w:r>
-          <w:hyperlink w:anchor="_Toc238807538" w:history="1">
+          <w:hyperlink w:anchor="_Toc242003353" w:history="1">
             <w:r>
               <w:rPr>
                 <w:rStyle w:val="Lienhypertexte"/>
@@ -166,7 +166,7 @@
                 <w:noProof/>
                 <w:webHidden/>
               </w:rPr>
-              <w:instrText xml:space="preserve"> PAGEREF _Toc238807538 \h </w:instrText>
+              <w:instrText xml:space="preserve"> PAGEREF _Toc242003353 \h </w:instrText>
             </w:r>
             <w:r>
               <w:rPr>
@@ -186,7 +186,7 @@
                 <w:noProof/>
                 <w:webHidden/>
               </w:rPr>
-              <w:t>2</w:t>
+              <w:t>3</w:t>
             </w:r>
             <w:r>
               <w:rPr>
@@ -209,7 +209,7 @@
               <w:lang w:eastAsia="fr-CH"/>
             </w:rPr>
           </w:pPr>
-          <w:hyperlink w:anchor="_Toc238807539" w:history="1">
+          <w:hyperlink w:anchor="_Toc242003354" w:history="1">
             <w:r>
               <w:rPr>
                 <w:rStyle w:val="Lienhypertexte"/>
@@ -236,7 +236,7 @@
                 <w:noProof/>
                 <w:webHidden/>
               </w:rPr>
-              <w:instrText xml:space="preserve"> PAGEREF _Toc238807539 \h </w:instrText>
+              <w:instrText xml:space="preserve"> PAGEREF _Toc242003354 \h </w:instrText>
             </w:r>
             <w:r>
               <w:rPr>
@@ -256,7 +256,7 @@
                 <w:noProof/>
                 <w:webHidden/>
               </w:rPr>
-              <w:t>2</w:t>
+              <w:t>3</w:t>
             </w:r>
             <w:r>
               <w:rPr>
@@ -279,7 +279,7 @@
               <w:lang w:eastAsia="fr-CH"/>
             </w:rPr>
           </w:pPr>
-          <w:hyperlink w:anchor="_Toc238807540" w:history="1">
+          <w:hyperlink w:anchor="_Toc242003355" w:history="1">
             <w:r>
               <w:rPr>
                 <w:rStyle w:val="Lienhypertexte"/>
@@ -306,7 +306,7 @@
                 <w:noProof/>
                 <w:webHidden/>
               </w:rPr>
-              <w:instrText xml:space="preserve"> PAGEREF _Toc238807540 \h </w:instrText>
+              <w:instrText xml:space="preserve"> PAGEREF _Toc242003355 \h </w:instrText>
             </w:r>
             <w:r>
               <w:rPr>
@@ -326,7 +326,1127 @@
                 <w:noProof/>
                 <w:webHidden/>
               </w:rPr>
-              <w:t>2</w:t>
+              <w:t>6</w:t>
+            </w:r>
+            <w:r>
+              <w:rPr>
+                <w:noProof/>
+                <w:webHidden/>
+              </w:rPr>
+              <w:fldChar w:fldCharType="end"/>
+            </w:r>
+          </w:hyperlink>
+        </w:p>
+        <w:p>
+          <w:pPr>
+            <w:pStyle w:val="TM2"/>
+            <w:tabs>
+              <w:tab w:val="right" w:leader="dot" w:pos="9062"/>
+            </w:tabs>
+            <w:rPr>
+              <w:rFonts w:eastAsiaTheme="minorEastAsia"/>
+              <w:noProof/>
+              <w:lang w:eastAsia="fr-CH"/>
+            </w:rPr>
+          </w:pPr>
+          <w:hyperlink w:anchor="_Toc242003356" w:history="1">
+            <w:r>
+              <w:rPr>
+                <w:rStyle w:val="Lienhypertexte"/>
+                <w:noProof/>
+              </w:rPr>
+              <w:t>Program.cs</w:t>
+            </w:r>
+            <w:r>
+              <w:rPr>
+                <w:noProof/>
+                <w:webHidden/>
+              </w:rPr>
+              <w:tab/>
+            </w:r>
+            <w:r>
+              <w:rPr>
+                <w:noProof/>
+                <w:webHidden/>
+              </w:rPr>
+              <w:fldChar w:fldCharType="begin"/>
+            </w:r>
+            <w:r>
+              <w:rPr>
+                <w:noProof/>
+                <w:webHidden/>
+              </w:rPr>
+              <w:instrText xml:space="preserve"> PAGEREF _Toc242003356 \h </w:instrText>
+            </w:r>
+            <w:r>
+              <w:rPr>
+                <w:noProof/>
+                <w:webHidden/>
+              </w:rPr>
+            </w:r>
+            <w:r>
+              <w:rPr>
+                <w:noProof/>
+                <w:webHidden/>
+              </w:rPr>
+              <w:fldChar w:fldCharType="separate"/>
+            </w:r>
+            <w:r>
+              <w:rPr>
+                <w:noProof/>
+                <w:webHidden/>
+              </w:rPr>
+              <w:t>6</w:t>
+            </w:r>
+            <w:r>
+              <w:rPr>
+                <w:noProof/>
+                <w:webHidden/>
+              </w:rPr>
+              <w:fldChar w:fldCharType="end"/>
+            </w:r>
+          </w:hyperlink>
+        </w:p>
+        <w:p>
+          <w:pPr>
+            <w:pStyle w:val="TM2"/>
+            <w:tabs>
+              <w:tab w:val="right" w:leader="dot" w:pos="9062"/>
+            </w:tabs>
+            <w:rPr>
+              <w:rFonts w:eastAsiaTheme="minorEastAsia"/>
+              <w:noProof/>
+              <w:lang w:eastAsia="fr-CH"/>
+            </w:rPr>
+          </w:pPr>
+          <w:hyperlink w:anchor="_Toc242003357" w:history="1">
+            <w:r>
+              <w:rPr>
+                <w:rStyle w:val="Lienhypertexte"/>
+                <w:noProof/>
+              </w:rPr>
+              <w:t>PlayGame.cs</w:t>
+            </w:r>
+            <w:r>
+              <w:rPr>
+                <w:noProof/>
+                <w:webHidden/>
+              </w:rPr>
+              <w:tab/>
+            </w:r>
+            <w:r>
+              <w:rPr>
+                <w:noProof/>
+                <w:webHidden/>
+              </w:rPr>
+              <w:fldChar w:fldCharType="begin"/>
+            </w:r>
+            <w:r>
+              <w:rPr>
+                <w:noProof/>
+                <w:webHidden/>
+              </w:rPr>
+              <w:instrText xml:space="preserve"> PAGEREF _Toc242003357 \h </w:instrText>
+            </w:r>
+            <w:r>
+              <w:rPr>
+                <w:noProof/>
+                <w:webHidden/>
+              </w:rPr>
+            </w:r>
+            <w:r>
+              <w:rPr>
+                <w:noProof/>
+                <w:webHidden/>
+              </w:rPr>
+              <w:fldChar w:fldCharType="separate"/>
+            </w:r>
+            <w:r>
+              <w:rPr>
+                <w:noProof/>
+                <w:webHidden/>
+              </w:rPr>
+              <w:t>7</w:t>
+            </w:r>
+            <w:r>
+              <w:rPr>
+                <w:noProof/>
+                <w:webHidden/>
+              </w:rPr>
+              <w:fldChar w:fldCharType="end"/>
+            </w:r>
+          </w:hyperlink>
+        </w:p>
+        <w:p>
+          <w:pPr>
+            <w:pStyle w:val="TM3"/>
+            <w:tabs>
+              <w:tab w:val="right" w:leader="dot" w:pos="9062"/>
+            </w:tabs>
+            <w:rPr>
+              <w:rFonts w:eastAsiaTheme="minorEastAsia"/>
+              <w:noProof/>
+              <w:lang w:eastAsia="fr-CH"/>
+            </w:rPr>
+          </w:pPr>
+          <w:hyperlink w:anchor="_Toc242003358" w:history="1">
+            <w:r>
+              <w:rPr>
+                <w:rStyle w:val="Lienhypertexte"/>
+                <w:noProof/>
+              </w:rPr>
+              <w:t>StartProgram</w:t>
+            </w:r>
+            <w:r>
+              <w:rPr>
+                <w:noProof/>
+                <w:webHidden/>
+              </w:rPr>
+              <w:tab/>
+            </w:r>
+            <w:r>
+              <w:rPr>
+                <w:noProof/>
+                <w:webHidden/>
+              </w:rPr>
+              <w:fldChar w:fldCharType="begin"/>
+            </w:r>
+            <w:r>
+              <w:rPr>
+                <w:noProof/>
+                <w:webHidden/>
+              </w:rPr>
+              <w:instrText xml:space="preserve"> PAGEREF _Toc242003358 \h </w:instrText>
+            </w:r>
+            <w:r>
+              <w:rPr>
+                <w:noProof/>
+                <w:webHidden/>
+              </w:rPr>
+            </w:r>
+            <w:r>
+              <w:rPr>
+                <w:noProof/>
+                <w:webHidden/>
+              </w:rPr>
+              <w:fldChar w:fldCharType="separate"/>
+            </w:r>
+            <w:r>
+              <w:rPr>
+                <w:noProof/>
+                <w:webHidden/>
+              </w:rPr>
+              <w:t>7</w:t>
+            </w:r>
+            <w:r>
+              <w:rPr>
+                <w:noProof/>
+                <w:webHidden/>
+              </w:rPr>
+              <w:fldChar w:fldCharType="end"/>
+            </w:r>
+          </w:hyperlink>
+        </w:p>
+        <w:p>
+          <w:pPr>
+            <w:pStyle w:val="TM2"/>
+            <w:tabs>
+              <w:tab w:val="right" w:leader="dot" w:pos="9062"/>
+            </w:tabs>
+            <w:rPr>
+              <w:rFonts w:eastAsiaTheme="minorEastAsia"/>
+              <w:noProof/>
+              <w:lang w:eastAsia="fr-CH"/>
+            </w:rPr>
+          </w:pPr>
+          <w:hyperlink w:anchor="_Toc242003359" w:history="1">
+            <w:r>
+              <w:rPr>
+                <w:rStyle w:val="Lienhypertexte"/>
+                <w:noProof/>
+              </w:rPr>
+              <w:t>Menu.cs</w:t>
+            </w:r>
+            <w:r>
+              <w:rPr>
+                <w:noProof/>
+                <w:webHidden/>
+              </w:rPr>
+              <w:tab/>
+            </w:r>
+            <w:r>
+              <w:rPr>
+                <w:noProof/>
+                <w:webHidden/>
+              </w:rPr>
+              <w:fldChar w:fldCharType="begin"/>
+            </w:r>
+            <w:r>
+              <w:rPr>
+                <w:noProof/>
+                <w:webHidden/>
+              </w:rPr>
+              <w:instrText xml:space="preserve"> PAGEREF _Toc242003359 \h </w:instrText>
+            </w:r>
+            <w:r>
+              <w:rPr>
+                <w:noProof/>
+                <w:webHidden/>
+              </w:rPr>
+            </w:r>
+            <w:r>
+              <w:rPr>
+                <w:noProof/>
+                <w:webHidden/>
+              </w:rPr>
+              <w:fldChar w:fldCharType="separate"/>
+            </w:r>
+            <w:r>
+              <w:rPr>
+                <w:noProof/>
+                <w:webHidden/>
+              </w:rPr>
+              <w:t>8</w:t>
+            </w:r>
+            <w:r>
+              <w:rPr>
+                <w:noProof/>
+                <w:webHidden/>
+              </w:rPr>
+              <w:fldChar w:fldCharType="end"/>
+            </w:r>
+          </w:hyperlink>
+        </w:p>
+        <w:p>
+          <w:pPr>
+            <w:pStyle w:val="TM3"/>
+            <w:tabs>
+              <w:tab w:val="right" w:leader="dot" w:pos="9062"/>
+            </w:tabs>
+            <w:rPr>
+              <w:rFonts w:eastAsiaTheme="minorEastAsia"/>
+              <w:noProof/>
+              <w:lang w:eastAsia="fr-CH"/>
+            </w:rPr>
+          </w:pPr>
+          <w:hyperlink w:anchor="_Toc242003360" w:history="1">
+            <w:r>
+              <w:rPr>
+                <w:rStyle w:val="Lienhypertexte"/>
+                <w:noProof/>
+              </w:rPr>
+              <w:t>DisplayMenu</w:t>
+            </w:r>
+            <w:r>
+              <w:rPr>
+                <w:noProof/>
+                <w:webHidden/>
+              </w:rPr>
+              <w:tab/>
+            </w:r>
+            <w:r>
+              <w:rPr>
+                <w:noProof/>
+                <w:webHidden/>
+              </w:rPr>
+              <w:fldChar w:fldCharType="begin"/>
+            </w:r>
+            <w:r>
+              <w:rPr>
+                <w:noProof/>
+                <w:webHidden/>
+              </w:rPr>
+              <w:instrText xml:space="preserve"> PAGEREF _Toc242003360 \h </w:instrText>
+            </w:r>
+            <w:r>
+              <w:rPr>
+                <w:noProof/>
+                <w:webHidden/>
+              </w:rPr>
+            </w:r>
+            <w:r>
+              <w:rPr>
+                <w:noProof/>
+                <w:webHidden/>
+              </w:rPr>
+              <w:fldChar w:fldCharType="separate"/>
+            </w:r>
+            <w:r>
+              <w:rPr>
+                <w:noProof/>
+                <w:webHidden/>
+              </w:rPr>
+              <w:t>8</w:t>
+            </w:r>
+            <w:r>
+              <w:rPr>
+                <w:noProof/>
+                <w:webHidden/>
+              </w:rPr>
+              <w:fldChar w:fldCharType="end"/>
+            </w:r>
+          </w:hyperlink>
+        </w:p>
+        <w:p>
+          <w:pPr>
+            <w:pStyle w:val="TM3"/>
+            <w:tabs>
+              <w:tab w:val="right" w:leader="dot" w:pos="9062"/>
+            </w:tabs>
+            <w:rPr>
+              <w:rFonts w:eastAsiaTheme="minorEastAsia"/>
+              <w:noProof/>
+              <w:lang w:eastAsia="fr-CH"/>
+            </w:rPr>
+          </w:pPr>
+          <w:hyperlink w:anchor="_Toc242003361" w:history="1">
+            <w:r>
+              <w:rPr>
+                <w:rStyle w:val="Lienhypertexte"/>
+                <w:noProof/>
+              </w:rPr>
+              <w:t>UserInputHandler</w:t>
+            </w:r>
+            <w:r>
+              <w:rPr>
+                <w:noProof/>
+                <w:webHidden/>
+              </w:rPr>
+              <w:tab/>
+            </w:r>
+            <w:r>
+              <w:rPr>
+                <w:noProof/>
+                <w:webHidden/>
+              </w:rPr>
+              <w:fldChar w:fldCharType="begin"/>
+            </w:r>
+            <w:r>
+              <w:rPr>
+                <w:noProof/>
+                <w:webHidden/>
+              </w:rPr>
+              <w:instrText xml:space="preserve"> PAGEREF _Toc242003361 \h </w:instrText>
+            </w:r>
+            <w:r>
+              <w:rPr>
+                <w:noProof/>
+                <w:webHidden/>
+              </w:rPr>
+            </w:r>
+            <w:r>
+              <w:rPr>
+                <w:noProof/>
+                <w:webHidden/>
+              </w:rPr>
+              <w:fldChar w:fldCharType="separate"/>
+            </w:r>
+            <w:r>
+              <w:rPr>
+                <w:noProof/>
+                <w:webHidden/>
+              </w:rPr>
+              <w:t>9</w:t>
+            </w:r>
+            <w:r>
+              <w:rPr>
+                <w:noProof/>
+                <w:webHidden/>
+              </w:rPr>
+              <w:fldChar w:fldCharType="end"/>
+            </w:r>
+          </w:hyperlink>
+        </w:p>
+        <w:p>
+          <w:pPr>
+            <w:pStyle w:val="TM3"/>
+            <w:tabs>
+              <w:tab w:val="right" w:leader="dot" w:pos="9062"/>
+            </w:tabs>
+            <w:rPr>
+              <w:rFonts w:eastAsiaTheme="minorEastAsia"/>
+              <w:noProof/>
+              <w:lang w:eastAsia="fr-CH"/>
+            </w:rPr>
+          </w:pPr>
+          <w:hyperlink w:anchor="_Toc242003362" w:history="1">
+            <w:r>
+              <w:rPr>
+                <w:rStyle w:val="Lienhypertexte"/>
+                <w:noProof/>
+              </w:rPr>
+              <w:t>EnterVehicle</w:t>
+            </w:r>
+            <w:r>
+              <w:rPr>
+                <w:noProof/>
+                <w:webHidden/>
+              </w:rPr>
+              <w:tab/>
+            </w:r>
+            <w:r>
+              <w:rPr>
+                <w:noProof/>
+                <w:webHidden/>
+              </w:rPr>
+              <w:fldChar w:fldCharType="begin"/>
+            </w:r>
+            <w:r>
+              <w:rPr>
+                <w:noProof/>
+                <w:webHidden/>
+              </w:rPr>
+              <w:instrText xml:space="preserve"> PAGEREF _Toc242003362 \h </w:instrText>
+            </w:r>
+            <w:r>
+              <w:rPr>
+                <w:noProof/>
+                <w:webHidden/>
+              </w:rPr>
+            </w:r>
+            <w:r>
+              <w:rPr>
+                <w:noProof/>
+                <w:webHidden/>
+              </w:rPr>
+              <w:fldChar w:fldCharType="separate"/>
+            </w:r>
+            <w:r>
+              <w:rPr>
+                <w:noProof/>
+                <w:webHidden/>
+              </w:rPr>
+              <w:t>10</w:t>
+            </w:r>
+            <w:r>
+              <w:rPr>
+                <w:noProof/>
+                <w:webHidden/>
+              </w:rPr>
+              <w:fldChar w:fldCharType="end"/>
+            </w:r>
+          </w:hyperlink>
+        </w:p>
+        <w:p>
+          <w:pPr>
+            <w:pStyle w:val="TM3"/>
+            <w:tabs>
+              <w:tab w:val="right" w:leader="dot" w:pos="9062"/>
+            </w:tabs>
+            <w:rPr>
+              <w:rFonts w:eastAsiaTheme="minorEastAsia"/>
+              <w:noProof/>
+              <w:lang w:eastAsia="fr-CH"/>
+            </w:rPr>
+          </w:pPr>
+          <w:hyperlink w:anchor="_Toc242003363" w:history="1">
+            <w:r>
+              <w:rPr>
+                <w:rStyle w:val="Lienhypertexte"/>
+                <w:noProof/>
+              </w:rPr>
+              <w:t>SearchVehicle</w:t>
+            </w:r>
+            <w:r>
+              <w:rPr>
+                <w:noProof/>
+                <w:webHidden/>
+              </w:rPr>
+              <w:tab/>
+            </w:r>
+            <w:r>
+              <w:rPr>
+                <w:noProof/>
+                <w:webHidden/>
+              </w:rPr>
+              <w:fldChar w:fldCharType="begin"/>
+            </w:r>
+            <w:r>
+              <w:rPr>
+                <w:noProof/>
+                <w:webHidden/>
+              </w:rPr>
+              <w:instrText xml:space="preserve"> PAGEREF _Toc242003363 \h </w:instrText>
+            </w:r>
+            <w:r>
+              <w:rPr>
+                <w:noProof/>
+                <w:webHidden/>
+              </w:rPr>
+            </w:r>
+            <w:r>
+              <w:rPr>
+                <w:noProof/>
+                <w:webHidden/>
+              </w:rPr>
+              <w:fldChar w:fldCharType="separate"/>
+            </w:r>
+            <w:r>
+              <w:rPr>
+                <w:noProof/>
+                <w:webHidden/>
+              </w:rPr>
+              <w:t>11</w:t>
+            </w:r>
+            <w:r>
+              <w:rPr>
+                <w:noProof/>
+                <w:webHidden/>
+              </w:rPr>
+              <w:fldChar w:fldCharType="end"/>
+            </w:r>
+          </w:hyperlink>
+        </w:p>
+        <w:p>
+          <w:pPr>
+            <w:pStyle w:val="TM3"/>
+            <w:tabs>
+              <w:tab w:val="right" w:leader="dot" w:pos="9062"/>
+            </w:tabs>
+            <w:rPr>
+              <w:rFonts w:eastAsiaTheme="minorEastAsia"/>
+              <w:noProof/>
+              <w:lang w:eastAsia="fr-CH"/>
+            </w:rPr>
+          </w:pPr>
+          <w:hyperlink w:anchor="_Toc242003364" w:history="1">
+            <w:r>
+              <w:rPr>
+                <w:rStyle w:val="Lienhypertexte"/>
+                <w:noProof/>
+              </w:rPr>
+              <w:t>CallFindVehicle</w:t>
+            </w:r>
+            <w:r>
+              <w:rPr>
+                <w:noProof/>
+                <w:webHidden/>
+              </w:rPr>
+              <w:tab/>
+            </w:r>
+            <w:r>
+              <w:rPr>
+                <w:noProof/>
+                <w:webHidden/>
+              </w:rPr>
+              <w:fldChar w:fldCharType="begin"/>
+            </w:r>
+            <w:r>
+              <w:rPr>
+                <w:noProof/>
+                <w:webHidden/>
+              </w:rPr>
+              <w:instrText xml:space="preserve"> PAGEREF _Toc242003364 \h </w:instrText>
+            </w:r>
+            <w:r>
+              <w:rPr>
+                <w:noProof/>
+                <w:webHidden/>
+              </w:rPr>
+            </w:r>
+            <w:r>
+              <w:rPr>
+                <w:noProof/>
+                <w:webHidden/>
+              </w:rPr>
+              <w:fldChar w:fldCharType="separate"/>
+            </w:r>
+            <w:r>
+              <w:rPr>
+                <w:noProof/>
+                <w:webHidden/>
+              </w:rPr>
+              <w:t>12</w:t>
+            </w:r>
+            <w:r>
+              <w:rPr>
+                <w:noProof/>
+                <w:webHidden/>
+              </w:rPr>
+              <w:fldChar w:fldCharType="end"/>
+            </w:r>
+          </w:hyperlink>
+        </w:p>
+        <w:p>
+          <w:pPr>
+            <w:pStyle w:val="TM2"/>
+            <w:tabs>
+              <w:tab w:val="right" w:leader="dot" w:pos="9062"/>
+            </w:tabs>
+            <w:rPr>
+              <w:rFonts w:eastAsiaTheme="minorEastAsia"/>
+              <w:noProof/>
+              <w:lang w:eastAsia="fr-CH"/>
+            </w:rPr>
+          </w:pPr>
+          <w:hyperlink w:anchor="_Toc242003365" w:history="1">
+            <w:r>
+              <w:rPr>
+                <w:rStyle w:val="Lienhypertexte"/>
+                <w:noProof/>
+              </w:rPr>
+              <w:t>Parking.cs</w:t>
+            </w:r>
+            <w:r>
+              <w:rPr>
+                <w:noProof/>
+                <w:webHidden/>
+              </w:rPr>
+              <w:tab/>
+            </w:r>
+            <w:r>
+              <w:rPr>
+                <w:noProof/>
+                <w:webHidden/>
+              </w:rPr>
+              <w:fldChar w:fldCharType="begin"/>
+            </w:r>
+            <w:r>
+              <w:rPr>
+                <w:noProof/>
+                <w:webHidden/>
+              </w:rPr>
+              <w:instrText xml:space="preserve"> PAGEREF _Toc242003365 \h </w:instrText>
+            </w:r>
+            <w:r>
+              <w:rPr>
+                <w:noProof/>
+                <w:webHidden/>
+              </w:rPr>
+            </w:r>
+            <w:r>
+              <w:rPr>
+                <w:noProof/>
+                <w:webHidden/>
+              </w:rPr>
+              <w:fldChar w:fldCharType="separate"/>
+            </w:r>
+            <w:r>
+              <w:rPr>
+                <w:noProof/>
+                <w:webHidden/>
+              </w:rPr>
+              <w:t>13</w:t>
+            </w:r>
+            <w:r>
+              <w:rPr>
+                <w:noProof/>
+                <w:webHidden/>
+              </w:rPr>
+              <w:fldChar w:fldCharType="end"/>
+            </w:r>
+          </w:hyperlink>
+        </w:p>
+        <w:p>
+          <w:pPr>
+            <w:pStyle w:val="TM3"/>
+            <w:tabs>
+              <w:tab w:val="right" w:leader="dot" w:pos="9062"/>
+            </w:tabs>
+            <w:rPr>
+              <w:rFonts w:eastAsiaTheme="minorEastAsia"/>
+              <w:noProof/>
+              <w:lang w:eastAsia="fr-CH"/>
+            </w:rPr>
+          </w:pPr>
+          <w:hyperlink w:anchor="_Toc242003366" w:history="1">
+            <w:r>
+              <w:rPr>
+                <w:rStyle w:val="Lienhypertexte"/>
+                <w:noProof/>
+              </w:rPr>
+              <w:t>Display</w:t>
+            </w:r>
+            <w:r>
+              <w:rPr>
+                <w:noProof/>
+                <w:webHidden/>
+              </w:rPr>
+              <w:tab/>
+            </w:r>
+            <w:r>
+              <w:rPr>
+                <w:noProof/>
+                <w:webHidden/>
+              </w:rPr>
+              <w:fldChar w:fldCharType="begin"/>
+            </w:r>
+            <w:r>
+              <w:rPr>
+                <w:noProof/>
+                <w:webHidden/>
+              </w:rPr>
+              <w:instrText xml:space="preserve"> PAGEREF _Toc242003366 \h </w:instrText>
+            </w:r>
+            <w:r>
+              <w:rPr>
+                <w:noProof/>
+                <w:webHidden/>
+              </w:rPr>
+            </w:r>
+            <w:r>
+              <w:rPr>
+                <w:noProof/>
+                <w:webHidden/>
+              </w:rPr>
+              <w:fldChar w:fldCharType="separate"/>
+            </w:r>
+            <w:r>
+              <w:rPr>
+                <w:noProof/>
+                <w:webHidden/>
+              </w:rPr>
+              <w:t>13</w:t>
+            </w:r>
+            <w:r>
+              <w:rPr>
+                <w:noProof/>
+                <w:webHidden/>
+              </w:rPr>
+              <w:fldChar w:fldCharType="end"/>
+            </w:r>
+          </w:hyperlink>
+        </w:p>
+        <w:p>
+          <w:pPr>
+            <w:pStyle w:val="TM3"/>
+            <w:tabs>
+              <w:tab w:val="right" w:leader="dot" w:pos="9062"/>
+            </w:tabs>
+            <w:rPr>
+              <w:rFonts w:eastAsiaTheme="minorEastAsia"/>
+              <w:noProof/>
+              <w:lang w:eastAsia="fr-CH"/>
+            </w:rPr>
+          </w:pPr>
+          <w:hyperlink w:anchor="_Toc242003367" w:history="1">
+            <w:r>
+              <w:rPr>
+                <w:rStyle w:val="Lienhypertexte"/>
+                <w:noProof/>
+              </w:rPr>
+              <w:t>CheckParkingSpot</w:t>
+            </w:r>
+            <w:r>
+              <w:rPr>
+                <w:noProof/>
+                <w:webHidden/>
+              </w:rPr>
+              <w:tab/>
+            </w:r>
+            <w:r>
+              <w:rPr>
+                <w:noProof/>
+                <w:webHidden/>
+              </w:rPr>
+              <w:fldChar w:fldCharType="begin"/>
+            </w:r>
+            <w:r>
+              <w:rPr>
+                <w:noProof/>
+                <w:webHidden/>
+              </w:rPr>
+              <w:instrText xml:space="preserve"> PAGEREF _Toc242003367 \h </w:instrText>
+            </w:r>
+            <w:r>
+              <w:rPr>
+                <w:noProof/>
+                <w:webHidden/>
+              </w:rPr>
+            </w:r>
+            <w:r>
+              <w:rPr>
+                <w:noProof/>
+                <w:webHidden/>
+              </w:rPr>
+              <w:fldChar w:fldCharType="separate"/>
+            </w:r>
+            <w:r>
+              <w:rPr>
+                <w:noProof/>
+                <w:webHidden/>
+              </w:rPr>
+              <w:t>14</w:t>
+            </w:r>
+            <w:r>
+              <w:rPr>
+                <w:noProof/>
+                <w:webHidden/>
+              </w:rPr>
+              <w:fldChar w:fldCharType="end"/>
+            </w:r>
+          </w:hyperlink>
+        </w:p>
+        <w:p>
+          <w:pPr>
+            <w:pStyle w:val="TM3"/>
+            <w:tabs>
+              <w:tab w:val="right" w:leader="dot" w:pos="9062"/>
+            </w:tabs>
+            <w:rPr>
+              <w:rFonts w:eastAsiaTheme="minorEastAsia"/>
+              <w:noProof/>
+              <w:lang w:eastAsia="fr-CH"/>
+            </w:rPr>
+          </w:pPr>
+          <w:hyperlink w:anchor="_Toc242003368" w:history="1">
+            <w:r>
+              <w:rPr>
+                <w:rStyle w:val="Lienhypertexte"/>
+                <w:noProof/>
+              </w:rPr>
+              <w:t>AddVehicle</w:t>
+            </w:r>
+            <w:r>
+              <w:rPr>
+                <w:noProof/>
+                <w:webHidden/>
+              </w:rPr>
+              <w:tab/>
+            </w:r>
+            <w:r>
+              <w:rPr>
+                <w:noProof/>
+                <w:webHidden/>
+              </w:rPr>
+              <w:fldChar w:fldCharType="begin"/>
+            </w:r>
+            <w:r>
+              <w:rPr>
+                <w:noProof/>
+                <w:webHidden/>
+              </w:rPr>
+              <w:instrText xml:space="preserve"> PAGEREF _Toc242003368 \h </w:instrText>
+            </w:r>
+            <w:r>
+              <w:rPr>
+                <w:noProof/>
+                <w:webHidden/>
+              </w:rPr>
+            </w:r>
+            <w:r>
+              <w:rPr>
+                <w:noProof/>
+                <w:webHidden/>
+              </w:rPr>
+              <w:fldChar w:fldCharType="separate"/>
+            </w:r>
+            <w:r>
+              <w:rPr>
+                <w:noProof/>
+                <w:webHidden/>
+              </w:rPr>
+              <w:t>15</w:t>
+            </w:r>
+            <w:r>
+              <w:rPr>
+                <w:noProof/>
+                <w:webHidden/>
+              </w:rPr>
+              <w:fldChar w:fldCharType="end"/>
+            </w:r>
+          </w:hyperlink>
+        </w:p>
+        <w:p>
+          <w:pPr>
+            <w:pStyle w:val="TM3"/>
+            <w:tabs>
+              <w:tab w:val="right" w:leader="dot" w:pos="9062"/>
+            </w:tabs>
+            <w:rPr>
+              <w:rFonts w:eastAsiaTheme="minorEastAsia"/>
+              <w:noProof/>
+              <w:lang w:eastAsia="fr-CH"/>
+            </w:rPr>
+          </w:pPr>
+          <w:hyperlink w:anchor="_Toc242003369" w:history="1">
+            <w:r>
+              <w:rPr>
+                <w:rStyle w:val="Lienhypertexte"/>
+                <w:noProof/>
+              </w:rPr>
+              <w:t>FindVehicule</w:t>
+            </w:r>
+            <w:r>
+              <w:rPr>
+                <w:noProof/>
+                <w:webHidden/>
+              </w:rPr>
+              <w:tab/>
+            </w:r>
+            <w:r>
+              <w:rPr>
+                <w:noProof/>
+                <w:webHidden/>
+              </w:rPr>
+              <w:fldChar w:fldCharType="begin"/>
+            </w:r>
+            <w:r>
+              <w:rPr>
+                <w:noProof/>
+                <w:webHidden/>
+              </w:rPr>
+              <w:instrText xml:space="preserve"> PAGEREF _Toc242003369 \h </w:instrText>
+            </w:r>
+            <w:r>
+              <w:rPr>
+                <w:noProof/>
+                <w:webHidden/>
+              </w:rPr>
+            </w:r>
+            <w:r>
+              <w:rPr>
+                <w:noProof/>
+                <w:webHidden/>
+              </w:rPr>
+              <w:fldChar w:fldCharType="separate"/>
+            </w:r>
+            <w:r>
+              <w:rPr>
+                <w:noProof/>
+                <w:webHidden/>
+              </w:rPr>
+              <w:t>16</w:t>
+            </w:r>
+            <w:r>
+              <w:rPr>
+                <w:noProof/>
+                <w:webHidden/>
+              </w:rPr>
+              <w:fldChar w:fldCharType="end"/>
+            </w:r>
+          </w:hyperlink>
+        </w:p>
+        <w:p>
+          <w:pPr>
+            <w:pStyle w:val="TM3"/>
+            <w:tabs>
+              <w:tab w:val="right" w:leader="dot" w:pos="9062"/>
+            </w:tabs>
+            <w:rPr>
+              <w:rFonts w:eastAsiaTheme="minorEastAsia"/>
+              <w:noProof/>
+              <w:lang w:eastAsia="fr-CH"/>
+            </w:rPr>
+          </w:pPr>
+          <w:hyperlink w:anchor="_Toc242003370" w:history="1">
+            <w:r>
+              <w:rPr>
+                <w:rStyle w:val="Lienhypertexte"/>
+                <w:noProof/>
+              </w:rPr>
+              <w:t>FindVehicleReturn</w:t>
+            </w:r>
+            <w:r>
+              <w:rPr>
+                <w:noProof/>
+                <w:webHidden/>
+              </w:rPr>
+              <w:tab/>
+            </w:r>
+            <w:r>
+              <w:rPr>
+                <w:noProof/>
+                <w:webHidden/>
+              </w:rPr>
+              <w:fldChar w:fldCharType="begin"/>
+            </w:r>
+            <w:r>
+              <w:rPr>
+                <w:noProof/>
+                <w:webHidden/>
+              </w:rPr>
+              <w:instrText xml:space="preserve"> PAGEREF _Toc242003370 \h </w:instrText>
+            </w:r>
+            <w:r>
+              <w:rPr>
+                <w:noProof/>
+                <w:webHidden/>
+              </w:rPr>
+            </w:r>
+            <w:r>
+              <w:rPr>
+                <w:noProof/>
+                <w:webHidden/>
+              </w:rPr>
+              <w:fldChar w:fldCharType="separate"/>
+            </w:r>
+            <w:r>
+              <w:rPr>
+                <w:noProof/>
+                <w:webHidden/>
+              </w:rPr>
+              <w:t>17</w:t>
+            </w:r>
+            <w:r>
+              <w:rPr>
+                <w:noProof/>
+                <w:webHidden/>
+              </w:rPr>
+              <w:fldChar w:fldCharType="end"/>
+            </w:r>
+          </w:hyperlink>
+        </w:p>
+        <w:p>
+          <w:pPr>
+            <w:pStyle w:val="TM3"/>
+            <w:tabs>
+              <w:tab w:val="right" w:leader="dot" w:pos="9062"/>
+            </w:tabs>
+            <w:rPr>
+              <w:rFonts w:eastAsiaTheme="minorEastAsia"/>
+              <w:noProof/>
+              <w:lang w:eastAsia="fr-CH"/>
+            </w:rPr>
+          </w:pPr>
+          <w:hyperlink w:anchor="_Toc242003371" w:history="1">
+            <w:r>
+              <w:rPr>
+                <w:rStyle w:val="Lienhypertexte"/>
+                <w:noProof/>
+              </w:rPr>
+              <w:t>StatParking</w:t>
+            </w:r>
+            <w:r>
+              <w:rPr>
+                <w:noProof/>
+                <w:webHidden/>
+              </w:rPr>
+              <w:tab/>
+            </w:r>
+            <w:r>
+              <w:rPr>
+                <w:noProof/>
+                <w:webHidden/>
+              </w:rPr>
+              <w:fldChar w:fldCharType="begin"/>
+            </w:r>
+            <w:r>
+              <w:rPr>
+                <w:noProof/>
+                <w:webHidden/>
+              </w:rPr>
+              <w:instrText xml:space="preserve"> PAGEREF _Toc242003371 \h </w:instrText>
+            </w:r>
+            <w:r>
+              <w:rPr>
+                <w:noProof/>
+                <w:webHidden/>
+              </w:rPr>
+            </w:r>
+            <w:r>
+              <w:rPr>
+                <w:noProof/>
+                <w:webHidden/>
+              </w:rPr>
+              <w:fldChar w:fldCharType="separate"/>
+            </w:r>
+            <w:r>
+              <w:rPr>
+                <w:noProof/>
+                <w:webHidden/>
+              </w:rPr>
+              <w:t>18</w:t>
             </w:r>
             <w:r>
               <w:rPr>
@@ -349,13 +1469,13 @@
               <w:lang w:eastAsia="fr-CH"/>
             </w:rPr>
           </w:pPr>
-          <w:hyperlink w:anchor="_Toc238807541" w:history="1">
+          <w:hyperlink w:anchor="_Toc242003372" w:history="1">
             <w:r>
               <w:rPr>
                 <w:rStyle w:val="Lienhypertexte"/>
                 <w:noProof/>
               </w:rPr>
-              <w:t>Tests</w:t>
+              <w:t>Voiture.cs</w:t>
             </w:r>
             <w:r>
               <w:rPr>
@@ -376,7 +1496,7 @@
                 <w:noProof/>
                 <w:webHidden/>
               </w:rPr>
-              <w:instrText xml:space="preserve"> PAGEREF _Toc238807541 \h </w:instrText>
+              <w:instrText xml:space="preserve"> PAGEREF _Toc242003372 \h </w:instrText>
             </w:r>
             <w:r>
               <w:rPr>
@@ -396,7 +1516,147 @@
                 <w:noProof/>
                 <w:webHidden/>
               </w:rPr>
-              <w:t>2</w:t>
+              <w:t>19</w:t>
+            </w:r>
+            <w:r>
+              <w:rPr>
+                <w:noProof/>
+                <w:webHidden/>
+              </w:rPr>
+              <w:fldChar w:fldCharType="end"/>
+            </w:r>
+          </w:hyperlink>
+        </w:p>
+        <w:p>
+          <w:pPr>
+            <w:pStyle w:val="TM3"/>
+            <w:tabs>
+              <w:tab w:val="right" w:leader="dot" w:pos="9062"/>
+            </w:tabs>
+            <w:rPr>
+              <w:rFonts w:eastAsiaTheme="minorEastAsia"/>
+              <w:noProof/>
+              <w:lang w:eastAsia="fr-CH"/>
+            </w:rPr>
+          </w:pPr>
+          <w:hyperlink w:anchor="_Toc242003373" w:history="1">
+            <w:r>
+              <w:rPr>
+                <w:rStyle w:val="Lienhypertexte"/>
+                <w:noProof/>
+              </w:rPr>
+              <w:t>LicensingPlate</w:t>
+            </w:r>
+            <w:r>
+              <w:rPr>
+                <w:noProof/>
+                <w:webHidden/>
+              </w:rPr>
+              <w:tab/>
+            </w:r>
+            <w:r>
+              <w:rPr>
+                <w:noProof/>
+                <w:webHidden/>
+              </w:rPr>
+              <w:fldChar w:fldCharType="begin"/>
+            </w:r>
+            <w:r>
+              <w:rPr>
+                <w:noProof/>
+                <w:webHidden/>
+              </w:rPr>
+              <w:instrText xml:space="preserve"> PAGEREF _Toc242003373 \h </w:instrText>
+            </w:r>
+            <w:r>
+              <w:rPr>
+                <w:noProof/>
+                <w:webHidden/>
+              </w:rPr>
+            </w:r>
+            <w:r>
+              <w:rPr>
+                <w:noProof/>
+                <w:webHidden/>
+              </w:rPr>
+              <w:fldChar w:fldCharType="separate"/>
+            </w:r>
+            <w:r>
+              <w:rPr>
+                <w:noProof/>
+                <w:webHidden/>
+              </w:rPr>
+              <w:t>19</w:t>
+            </w:r>
+            <w:r>
+              <w:rPr>
+                <w:noProof/>
+                <w:webHidden/>
+              </w:rPr>
+              <w:fldChar w:fldCharType="end"/>
+            </w:r>
+          </w:hyperlink>
+        </w:p>
+        <w:p>
+          <w:pPr>
+            <w:pStyle w:val="TM3"/>
+            <w:tabs>
+              <w:tab w:val="right" w:leader="dot" w:pos="9062"/>
+            </w:tabs>
+            <w:rPr>
+              <w:rFonts w:eastAsiaTheme="minorEastAsia"/>
+              <w:noProof/>
+              <w:lang w:eastAsia="fr-CH"/>
+            </w:rPr>
+          </w:pPr>
+          <w:hyperlink w:anchor="_Toc242003374" w:history="1">
+            <w:r>
+              <w:rPr>
+                <w:rStyle w:val="Lienhypertexte"/>
+                <w:noProof/>
+              </w:rPr>
+              <w:t>Constructeur</w:t>
+            </w:r>
+            <w:r>
+              <w:rPr>
+                <w:noProof/>
+                <w:webHidden/>
+              </w:rPr>
+              <w:tab/>
+            </w:r>
+            <w:r>
+              <w:rPr>
+                <w:noProof/>
+                <w:webHidden/>
+              </w:rPr>
+              <w:fldChar w:fldCharType="begin"/>
+            </w:r>
+            <w:r>
+              <w:rPr>
+                <w:noProof/>
+                <w:webHidden/>
+              </w:rPr>
+              <w:instrText xml:space="preserve"> PAGEREF _Toc242003374 \h </w:instrText>
+            </w:r>
+            <w:r>
+              <w:rPr>
+                <w:noProof/>
+                <w:webHidden/>
+              </w:rPr>
+            </w:r>
+            <w:r>
+              <w:rPr>
+                <w:noProof/>
+                <w:webHidden/>
+              </w:rPr>
+              <w:fldChar w:fldCharType="separate"/>
+            </w:r>
+            <w:r>
+              <w:rPr>
+                <w:noProof/>
+                <w:webHidden/>
+              </w:rPr>
+              <w:t>19</w:t>
             </w:r>
             <w:r>
               <w:rPr>
@@ -419,12 +1679,362 @@
               <w:lang w:eastAsia="fr-CH"/>
             </w:rPr>
           </w:pPr>
-          <w:hyperlink w:anchor="_Toc238807542" w:history="1">
+          <w:hyperlink w:anchor="_Toc242003375" w:history="1">
             <w:r>
               <w:rPr>
                 <w:rStyle w:val="Lienhypertexte"/>
                 <w:noProof/>
               </w:rPr>
+              <w:t>Ticket.cs</w:t>
+            </w:r>
+            <w:r>
+              <w:rPr>
+                <w:noProof/>
+                <w:webHidden/>
+              </w:rPr>
+              <w:tab/>
+            </w:r>
+            <w:r>
+              <w:rPr>
+                <w:noProof/>
+                <w:webHidden/>
+              </w:rPr>
+              <w:fldChar w:fldCharType="begin"/>
+            </w:r>
+            <w:r>
+              <w:rPr>
+                <w:noProof/>
+                <w:webHidden/>
+              </w:rPr>
+              <w:instrText xml:space="preserve"> PAGEREF _Toc242003375 \h </w:instrText>
+            </w:r>
+            <w:r>
+              <w:rPr>
+                <w:noProof/>
+                <w:webHidden/>
+              </w:rPr>
+            </w:r>
+            <w:r>
+              <w:rPr>
+                <w:noProof/>
+                <w:webHidden/>
+              </w:rPr>
+              <w:fldChar w:fldCharType="separate"/>
+            </w:r>
+            <w:r>
+              <w:rPr>
+                <w:noProof/>
+                <w:webHidden/>
+              </w:rPr>
+              <w:t>20</w:t>
+            </w:r>
+            <w:r>
+              <w:rPr>
+                <w:noProof/>
+                <w:webHidden/>
+              </w:rPr>
+              <w:fldChar w:fldCharType="end"/>
+            </w:r>
+          </w:hyperlink>
+        </w:p>
+        <w:p>
+          <w:pPr>
+            <w:pStyle w:val="TM3"/>
+            <w:tabs>
+              <w:tab w:val="right" w:leader="dot" w:pos="9062"/>
+            </w:tabs>
+            <w:rPr>
+              <w:rFonts w:eastAsiaTheme="minorEastAsia"/>
+              <w:noProof/>
+              <w:lang w:eastAsia="fr-CH"/>
+            </w:rPr>
+          </w:pPr>
+          <w:hyperlink w:anchor="_Toc242003376" w:history="1">
+            <w:r>
+              <w:rPr>
+                <w:rStyle w:val="Lienhypertexte"/>
+                <w:noProof/>
+              </w:rPr>
+              <w:t>Constructeur</w:t>
+            </w:r>
+            <w:r>
+              <w:rPr>
+                <w:noProof/>
+                <w:webHidden/>
+              </w:rPr>
+              <w:tab/>
+            </w:r>
+            <w:r>
+              <w:rPr>
+                <w:noProof/>
+                <w:webHidden/>
+              </w:rPr>
+              <w:fldChar w:fldCharType="begin"/>
+            </w:r>
+            <w:r>
+              <w:rPr>
+                <w:noProof/>
+                <w:webHidden/>
+              </w:rPr>
+              <w:instrText xml:space="preserve"> PAGEREF _Toc242003376 \h </w:instrText>
+            </w:r>
+            <w:r>
+              <w:rPr>
+                <w:noProof/>
+                <w:webHidden/>
+              </w:rPr>
+            </w:r>
+            <w:r>
+              <w:rPr>
+                <w:noProof/>
+                <w:webHidden/>
+              </w:rPr>
+              <w:fldChar w:fldCharType="separate"/>
+            </w:r>
+            <w:r>
+              <w:rPr>
+                <w:noProof/>
+                <w:webHidden/>
+              </w:rPr>
+              <w:t>20</w:t>
+            </w:r>
+            <w:r>
+              <w:rPr>
+                <w:noProof/>
+                <w:webHidden/>
+              </w:rPr>
+              <w:fldChar w:fldCharType="end"/>
+            </w:r>
+          </w:hyperlink>
+        </w:p>
+        <w:p>
+          <w:pPr>
+            <w:pStyle w:val="TM3"/>
+            <w:tabs>
+              <w:tab w:val="right" w:leader="dot" w:pos="9062"/>
+            </w:tabs>
+            <w:rPr>
+              <w:rFonts w:eastAsiaTheme="minorEastAsia"/>
+              <w:noProof/>
+              <w:lang w:eastAsia="fr-CH"/>
+            </w:rPr>
+          </w:pPr>
+          <w:hyperlink w:anchor="_Toc242003377" w:history="1">
+            <w:r>
+              <w:rPr>
+                <w:rStyle w:val="Lienhypertexte"/>
+                <w:noProof/>
+              </w:rPr>
+              <w:t>Calc</w:t>
+            </w:r>
+            <w:r>
+              <w:rPr>
+                <w:noProof/>
+                <w:webHidden/>
+              </w:rPr>
+              <w:tab/>
+            </w:r>
+            <w:r>
+              <w:rPr>
+                <w:noProof/>
+                <w:webHidden/>
+              </w:rPr>
+              <w:fldChar w:fldCharType="begin"/>
+            </w:r>
+            <w:r>
+              <w:rPr>
+                <w:noProof/>
+                <w:webHidden/>
+              </w:rPr>
+              <w:instrText xml:space="preserve"> PAGEREF _Toc242003377 \h </w:instrText>
+            </w:r>
+            <w:r>
+              <w:rPr>
+                <w:noProof/>
+                <w:webHidden/>
+              </w:rPr>
+            </w:r>
+            <w:r>
+              <w:rPr>
+                <w:noProof/>
+                <w:webHidden/>
+              </w:rPr>
+              <w:fldChar w:fldCharType="separate"/>
+            </w:r>
+            <w:r>
+              <w:rPr>
+                <w:noProof/>
+                <w:webHidden/>
+              </w:rPr>
+              <w:t>20</w:t>
+            </w:r>
+            <w:r>
+              <w:rPr>
+                <w:noProof/>
+                <w:webHidden/>
+              </w:rPr>
+              <w:fldChar w:fldCharType="end"/>
+            </w:r>
+          </w:hyperlink>
+        </w:p>
+        <w:p>
+          <w:pPr>
+            <w:pStyle w:val="TM3"/>
+            <w:tabs>
+              <w:tab w:val="right" w:leader="dot" w:pos="9062"/>
+            </w:tabs>
+            <w:rPr>
+              <w:rFonts w:eastAsiaTheme="minorEastAsia"/>
+              <w:noProof/>
+              <w:lang w:eastAsia="fr-CH"/>
+            </w:rPr>
+          </w:pPr>
+          <w:hyperlink w:anchor="_Toc242003378" w:history="1">
+            <w:r>
+              <w:rPr>
+                <w:rStyle w:val="Lienhypertexte"/>
+                <w:noProof/>
+              </w:rPr>
+              <w:t>GetCurrentParkedTime</w:t>
+            </w:r>
+            <w:r>
+              <w:rPr>
+                <w:noProof/>
+                <w:webHidden/>
+              </w:rPr>
+              <w:tab/>
+            </w:r>
+            <w:r>
+              <w:rPr>
+                <w:noProof/>
+                <w:webHidden/>
+              </w:rPr>
+              <w:fldChar w:fldCharType="begin"/>
+            </w:r>
+            <w:r>
+              <w:rPr>
+                <w:noProof/>
+                <w:webHidden/>
+              </w:rPr>
+              <w:instrText xml:space="preserve"> PAGEREF _Toc242003378 \h </w:instrText>
+            </w:r>
+            <w:r>
+              <w:rPr>
+                <w:noProof/>
+                <w:webHidden/>
+              </w:rPr>
+            </w:r>
+            <w:r>
+              <w:rPr>
+                <w:noProof/>
+                <w:webHidden/>
+              </w:rPr>
+              <w:fldChar w:fldCharType="separate"/>
+            </w:r>
+            <w:r>
+              <w:rPr>
+                <w:noProof/>
+                <w:webHidden/>
+              </w:rPr>
+              <w:t>20</w:t>
+            </w:r>
+            <w:r>
+              <w:rPr>
+                <w:noProof/>
+                <w:webHidden/>
+              </w:rPr>
+              <w:fldChar w:fldCharType="end"/>
+            </w:r>
+          </w:hyperlink>
+        </w:p>
+        <w:p>
+          <w:pPr>
+            <w:pStyle w:val="TM1"/>
+            <w:tabs>
+              <w:tab w:val="right" w:leader="dot" w:pos="9062"/>
+            </w:tabs>
+            <w:rPr>
+              <w:rFonts w:eastAsiaTheme="minorEastAsia"/>
+              <w:noProof/>
+              <w:lang w:eastAsia="fr-CH"/>
+            </w:rPr>
+          </w:pPr>
+          <w:hyperlink w:anchor="_Toc242003379" w:history="1">
+            <w:r>
+              <w:rPr>
+                <w:rStyle w:val="Lienhypertexte"/>
+                <w:noProof/>
+              </w:rPr>
+              <w:t>Tests</w:t>
+            </w:r>
+            <w:r>
+              <w:rPr>
+                <w:noProof/>
+                <w:webHidden/>
+              </w:rPr>
+              <w:tab/>
+            </w:r>
+            <w:r>
+              <w:rPr>
+                <w:noProof/>
+                <w:webHidden/>
+              </w:rPr>
+              <w:fldChar w:fldCharType="begin"/>
+            </w:r>
+            <w:r>
+              <w:rPr>
+                <w:noProof/>
+                <w:webHidden/>
+              </w:rPr>
+              <w:instrText xml:space="preserve"> PAGEREF _Toc242003379 \h </w:instrText>
+            </w:r>
+            <w:r>
+              <w:rPr>
+                <w:noProof/>
+                <w:webHidden/>
+              </w:rPr>
+            </w:r>
+            <w:r>
+              <w:rPr>
+                <w:noProof/>
+                <w:webHidden/>
+              </w:rPr>
+              <w:fldChar w:fldCharType="separate"/>
+            </w:r>
+            <w:r>
+              <w:rPr>
+                <w:noProof/>
+                <w:webHidden/>
+              </w:rPr>
+              <w:t>21</w:t>
+            </w:r>
+            <w:r>
+              <w:rPr>
+                <w:noProof/>
+                <w:webHidden/>
+              </w:rPr>
+              <w:fldChar w:fldCharType="end"/>
+            </w:r>
+          </w:hyperlink>
+        </w:p>
+        <w:p>
+          <w:pPr>
+            <w:pStyle w:val="TM1"/>
+            <w:tabs>
+              <w:tab w:val="right" w:leader="dot" w:pos="9062"/>
+            </w:tabs>
+            <w:rPr>
+              <w:rFonts w:eastAsiaTheme="minorEastAsia"/>
+              <w:noProof/>
+              <w:lang w:eastAsia="fr-CH"/>
+            </w:rPr>
+          </w:pPr>
+          <w:hyperlink w:anchor="_Toc242003380" w:history="1">
+            <w:r>
+              <w:rPr>
+                <w:rStyle w:val="Lienhypertexte"/>
+                <w:noProof/>
+              </w:rPr>
               <w:t>Conclusion</w:t>
             </w:r>
             <w:r>
@@ -446,7 +2056,7 @@
                 <w:noProof/>
                 <w:webHidden/>
               </w:rPr>
-              <w:instrText xml:space="preserve"> PAGEREF _Toc238807542 \h </w:instrText>
+              <w:instrText xml:space="preserve"> PAGEREF _Toc242003380 \h </w:instrText>
             </w:r>
             <w:r>
               <w:rPr>
@@ -466,7 +2076,7 @@
                 <w:noProof/>
                 <w:webHidden/>
               </w:rPr>
-              <w:t>2</w:t>
+              <w:t>22</w:t>
             </w:r>
             <w:r>
               <w:rPr>
@@ -489,7 +2099,7 @@
               <w:lang w:eastAsia="fr-CH"/>
             </w:rPr>
           </w:pPr>
-          <w:hyperlink w:anchor="_Toc238807543" w:history="1">
+          <w:hyperlink w:anchor="_Toc242003381" w:history="1">
             <w:r>
               <w:rPr>
                 <w:rStyle w:val="Lienhypertexte"/>
@@ -516,7 +2126,7 @@
                 <w:noProof/>
                 <w:webHidden/>
               </w:rPr>
-              <w:instrText xml:space="preserve"> PAGEREF _Toc238807543 \h </w:instrText>
+              <w:instrText xml:space="preserve"> PAGEREF _Toc242003381 \h </w:instrText>
             </w:r>
             <w:r>
               <w:rPr>
@@ -536,7 +2146,7 @@
                 <w:noProof/>
                 <w:webHidden/>
               </w:rPr>
-              <w:t>2</w:t>
+              <w:t>22</w:t>
             </w:r>
             <w:r>
               <w:rPr>
@@ -559,7 +2169,7 @@
               <w:lang w:eastAsia="fr-CH"/>
             </w:rPr>
           </w:pPr>
-          <w:hyperlink w:anchor="_Toc238807544" w:history="1">
+          <w:hyperlink w:anchor="_Toc242003382" w:history="1">
             <w:r>
               <w:rPr>
                 <w:rStyle w:val="Lienhypertexte"/>
@@ -586,7 +2196,7 @@
                 <w:noProof/>
                 <w:webHidden/>
               </w:rPr>
-              <w:instrText xml:space="preserve"> PAGEREF _Toc238807544 \h </w:instrText>
+              <w:instrText xml:space="preserve"> PAGEREF _Toc242003382 \h </w:instrText>
             </w:r>
             <w:r>
               <w:rPr>
@@ -606,7 +2216,7 @@
                 <w:noProof/>
                 <w:webHidden/>
               </w:rPr>
-              <w:t>2</w:t>
+              <w:t>22</w:t>
             </w:r>
             <w:r>
               <w:rPr>
@@ -632,19 +2242,8 @@
       <w:r>
         <w:br w:type="page"/>
       </w:r>
-    </w:p>
-    <w:p>
-      <w:pPr>
-        <w:pStyle w:val="Titre1"/>
-        <w:rPr>
-          <w:color w:val="auto"/>
-        </w:rPr>
-      </w:pPr>
-      <w:bookmarkStart w:id="0" w:name="_Toc238807538"/>
-      <w:r>
-        <w:rPr>
-          <w:color w:val="auto"/>
-        </w:rPr>
+      <w:bookmarkStart w:id="0" w:name="_Toc242003353"/>
+      <w:r>
         <w:lastRenderedPageBreak/>
         <w:t>Introduction / Analyse du cahier des charges</w:t>
       </w:r>
@@ -658,7 +2257,7 @@
           <w:color w:val="auto"/>
         </w:rPr>
       </w:pPr>
-      <w:bookmarkStart w:id="1" w:name="_Toc238807539"/>
+      <w:bookmarkStart w:id="1" w:name="_Toc242003354"/>
       <w:r>
         <w:rPr>
           <w:color w:val="auto"/>
@@ -747,18 +2346,7 @@
           <w:color w:val="BF4E14" w:themeColor="accent2" w:themeShade="BF"/>
           <w:u w:val="single"/>
         </w:rPr>
-        <w:t xml:space="preserve">2 </w:t>
-      </w:r>
-      <w:r>
-        <w:rPr>
-          <w:b/>
-          <w:bCs/>
-          <w:i/>
-          <w:iCs/>
-          <w:color w:val="BF4E14" w:themeColor="accent2" w:themeShade="BF"/>
-          <w:u w:val="single"/>
-        </w:rPr>
-        <w:t>lettres</w:t>
+        <w:t>2 lettres</w:t>
       </w:r>
       <w:r>
         <w:rPr>
@@ -778,18 +2366,7 @@
           <w:color w:val="124F1A" w:themeColor="accent3" w:themeShade="BF"/>
           <w:u w:val="single"/>
         </w:rPr>
-        <w:t xml:space="preserve">jusqu’à 6 </w:t>
-      </w:r>
-      <w:r>
-        <w:rPr>
-          <w:b/>
-          <w:bCs/>
-          <w:i/>
-          <w:iCs/>
-          <w:color w:val="124F1A" w:themeColor="accent3" w:themeShade="BF"/>
-          <w:u w:val="single"/>
-        </w:rPr>
-        <w:t>chiffres</w:t>
+        <w:t>jusqu’à 6 chiffres</w:t>
       </w:r>
       <w:r>
         <w:t>".</w:t>
@@ -849,10 +2426,7 @@
         <w:t xml:space="preserve">: </w:t>
       </w:r>
       <w:r>
-        <w:t xml:space="preserve">L’utilisateur peut chercher un véhicule en utilisant le système de recherche. </w:t>
-      </w:r>
-      <w:r>
-        <w:t xml:space="preserve">Si une correspondance est trouvée, </w:t>
+        <w:t xml:space="preserve">L’utilisateur peut chercher un véhicule en utilisant le système de recherche. Si une correspondance est trouvée, </w:t>
       </w:r>
       <w:r>
         <w:rPr>
@@ -912,10 +2486,7 @@
         <w:t>afficher son heure d’entrée et de sortie et le montant payé</w:t>
       </w:r>
       <w:r>
-        <w:t xml:space="preserve">. Si non, annulé l’action. En revanche si aucune correspondance est trouvée, afficher un message </w:t>
-      </w:r>
-      <w:r>
-        <w:t>pour dire à l’utilisateur que aucun résultat n’a pu être trouvé.</w:t>
+        <w:t>. Si non, annulé l’action. En revanche si aucune correspondance est trouvée, afficher un message pour dire à l’utilisateur que aucun résultat n’a pu être trouvé.</w:t>
       </w:r>
     </w:p>
     <w:p>
@@ -1048,15 +2619,7 @@
         <w:t xml:space="preserve"> </w:t>
       </w:r>
       <w:r>
-        <w:t xml:space="preserve">Utilisé un </w:t>
-      </w:r>
-      <w:proofErr w:type="spellStart"/>
-      <w:r>
-        <w:t>timer</w:t>
-      </w:r>
-      <w:proofErr w:type="spellEnd"/>
-      <w:r>
-        <w:t xml:space="preserve"> qui s’incrémentera chaque seconde. Une seconde sera égale à une minute.</w:t>
+        <w:t>Utilisé un timer qui s’incrémentera chaque seconde. Une seconde sera égale à une minute.</w:t>
       </w:r>
     </w:p>
     <w:p>
@@ -1246,33 +2809,17 @@
         <w:t xml:space="preserve">. On va </w:t>
       </w:r>
       <w:r>
-        <w:t xml:space="preserve">vérifier si le string est cohérent pour savoir si c’est une plaque d’immatriculation, si cela ne fonctionne pas, essayer de le transformer en type INT (pour savoir si c’est un numéro de place), si ça ne fonctionne pas, </w:t>
-      </w:r>
-      <w:r>
-        <w:t>appeler une autre méthode</w:t>
-      </w:r>
-      <w:r>
-        <w:t xml:space="preserve"> </w:t>
-      </w:r>
-      <w:r>
-        <w:t xml:space="preserve">(soit pour afficher les infos du véhicule, soit le faire sortir. Dont l’utilité du paramètre booléen) puis lui donner comme paramètre un texte écrit comme ce ci </w:t>
+        <w:t xml:space="preserve">vérifier si le string est cohérent pour savoir si c’est une plaque d’immatriculation, si cela ne fonctionne pas, essayer de le transformer en type INT (pour savoir si c’est un numéro de place), si ça ne fonctionne pas, appeler une autre méthode (soit pour afficher les infos du véhicule, soit le faire sortir. Dont l’utilité du paramètre booléen) puis lui donner comme paramètre un texte écrit comme ce ci </w:t>
       </w:r>
       <w:r>
         <w:t>"</w:t>
       </w:r>
-      <w:proofErr w:type="spellStart"/>
       <w:r>
         <w:t>nothing</w:t>
       </w:r>
-      <w:proofErr w:type="spellEnd"/>
-      <w:r>
-        <w:t xml:space="preserve"> </w:t>
-      </w:r>
-      <w:proofErr w:type="spellStart"/>
-      <w:r>
-        <w:t>found</w:t>
-      </w:r>
-      <w:proofErr w:type="spellEnd"/>
+      <w:r>
+        <w:t xml:space="preserve"> found</w:t>
+      </w:r>
       <w:r>
         <w:t>"</w:t>
       </w:r>
@@ -1360,19 +2907,9 @@
       <w:r>
         <w:t>"</w:t>
       </w:r>
-      <w:proofErr w:type="spellStart"/>
-      <w:r>
-        <w:t>nothing</w:t>
-      </w:r>
-      <w:proofErr w:type="spellEnd"/>
-      <w:r>
-        <w:t xml:space="preserve"> </w:t>
-      </w:r>
-      <w:proofErr w:type="spellStart"/>
-      <w:r>
-        <w:t>found</w:t>
-      </w:r>
-      <w:proofErr w:type="spellEnd"/>
+      <w:r>
+        <w:t>nothing found</w:t>
+      </w:r>
       <w:r>
         <w:t>"</w:t>
       </w:r>
@@ -1424,19 +2961,7 @@
         <w:t xml:space="preserve"> </w:t>
       </w:r>
       <w:r>
-        <w:t xml:space="preserve">pour créer une nouvelle méthode pour </w:t>
-      </w:r>
-      <w:r>
-        <w:t>faire sortir</w:t>
-      </w:r>
-      <w:r>
-        <w:t xml:space="preserve"> </w:t>
-      </w:r>
-      <w:r>
-        <w:t>un véhicule du parking</w:t>
-      </w:r>
-      <w:r>
-        <w:t>. La méthode aura comme paramètre une variable de type string. On vérifie si le string est un numéro de plaque cohérent.</w:t>
+        <w:t>pour créer une nouvelle méthode pour faire sortir un véhicule du parking. La méthode aura comme paramètre une variable de type string. On vérifie si le string est un numéro de plaque cohérent.</w:t>
       </w:r>
     </w:p>
     <w:p>
@@ -1468,71 +2993,58 @@
       <w:r>
         <w:t>"</w:t>
       </w:r>
-      <w:proofErr w:type="spellStart"/>
-      <w:r>
-        <w:t>nothing</w:t>
-      </w:r>
-      <w:proofErr w:type="spellEnd"/>
-      <w:r>
+      <w:r>
+        <w:t>nothing found</w:t>
+      </w:r>
+      <w:r>
+        <w:t>"</w:t>
+      </w:r>
+      <w:r>
+        <w:t xml:space="preserve">. Si c’est le cas, </w:t>
+      </w:r>
+      <w:r>
+        <w:t>afficher un message pour dire à l’utilisateur que aucun résultat n’a pu être trouvé</w:t>
+      </w:r>
+      <w:r>
+        <w:t xml:space="preserve">. Si ce n’est pas le cas, afficher un message d’erreur comme </w:t>
+      </w:r>
+      <w:r>
+        <w:t>"</w:t>
+      </w:r>
+      <w:r>
+        <w:t>Un problème c’est produit.</w:t>
+      </w:r>
+      <w:r>
+        <w:t>"</w:t>
+      </w:r>
+      <w:r>
+        <w:t> ;</w:t>
+      </w:r>
+    </w:p>
+    <w:p>
+      <w:r>
+        <w:rPr>
+          <w:color w:val="EE0000"/>
+        </w:rPr>
+        <w:t>6 </w:t>
+      </w:r>
+      <w:r>
+        <w:t xml:space="preserve">: </w:t>
+      </w:r>
+      <w:r>
+        <w:rPr>
+          <w:color w:val="7030A0"/>
+        </w:rPr>
+        <w:t>Utiliser la classe statique</w:t>
+      </w:r>
+      <w:r>
+        <w:rPr>
+          <w:color w:val="7030A0"/>
+        </w:rPr>
         <w:t xml:space="preserve"> </w:t>
       </w:r>
-      <w:proofErr w:type="spellStart"/>
-      <w:r>
-        <w:t>found</w:t>
-      </w:r>
-      <w:proofErr w:type="spellEnd"/>
-      <w:r>
-        <w:t>"</w:t>
-      </w:r>
-      <w:r>
-        <w:t xml:space="preserve">. Si c’est le cas, </w:t>
-      </w:r>
-      <w:r>
-        <w:t>afficher un message pour dire à l’utilisateur que aucun résultat n’a pu être trouvé</w:t>
-      </w:r>
-      <w:r>
-        <w:t xml:space="preserve">. Si ce n’est pas le cas, afficher un message d’erreur comme </w:t>
-      </w:r>
-      <w:r>
-        <w:t>"</w:t>
-      </w:r>
-      <w:r>
-        <w:t>Un problème c’est produit.</w:t>
-      </w:r>
-      <w:r>
-        <w:t>"</w:t>
-      </w:r>
-      <w:r>
-        <w:t> ;</w:t>
-      </w:r>
-    </w:p>
-    <w:p>
-      <w:r>
-        <w:rPr>
-          <w:color w:val="EE0000"/>
-        </w:rPr>
-        <w:t>6 </w:t>
-      </w:r>
-      <w:r>
-        <w:t xml:space="preserve">: </w:t>
-      </w:r>
-      <w:r>
-        <w:rPr>
-          <w:color w:val="7030A0"/>
-        </w:rPr>
-        <w:t>Utiliser la classe statique</w:t>
-      </w:r>
-      <w:r>
-        <w:rPr>
-          <w:color w:val="7030A0"/>
-        </w:rPr>
-        <w:t xml:space="preserve"> </w:t>
-      </w:r>
-      <w:r>
-        <w:t>pour</w:t>
-      </w:r>
-      <w:r>
-        <w:t xml:space="preserve"> créer une nouvelle méthode pour afficher le parking.</w:t>
+      <w:r>
+        <w:t>pour créer une nouvelle méthode pour afficher le parking.</w:t>
       </w:r>
       <w:r>
         <w:br/>
@@ -1562,10 +3074,7 @@
         <w:t xml:space="preserve"> </w:t>
       </w:r>
       <w:r>
-        <w:t>pour créer une nouvelle méthode</w:t>
-      </w:r>
-      <w:r>
-        <w:t xml:space="preserve"> pour afficher diverse stats et information.</w:t>
+        <w:t>pour créer une nouvelle méthode pour afficher diverse stats et information.</w:t>
       </w:r>
     </w:p>
     <w:p>
@@ -1591,10 +3100,7 @@
         <w:t xml:space="preserve"> </w:t>
       </w:r>
       <w:r>
-        <w:t>pour</w:t>
-      </w:r>
-      <w:r>
-        <w:t xml:space="preserve"> créer une nouvelle méthode pour afficher l’historique des transactions.</w:t>
+        <w:t>pour créer une nouvelle méthode pour afficher l’historique des transactions.</w:t>
       </w:r>
     </w:p>
     <w:p>
@@ -1609,7 +3115,7 @@
           <w:color w:val="auto"/>
         </w:rPr>
       </w:pPr>
-      <w:bookmarkStart w:id="2" w:name="_Toc238807540"/>
+      <w:bookmarkStart w:id="2" w:name="_Toc242003355"/>
       <w:r>
         <w:rPr>
           <w:color w:val="auto"/>
@@ -1621,35 +3127,1911 @@
     </w:p>
     <w:p>
       <w:pPr>
-        <w:pStyle w:val="Titre1"/>
-        <w:rPr>
-          <w:color w:val="auto"/>
-        </w:rPr>
+        <w:pStyle w:val="Titre2"/>
       </w:pPr>
-      <w:bookmarkStart w:id="3" w:name="_Toc238807541"/>
-      <w:r>
-        <w:rPr>
-          <w:color w:val="auto"/>
-        </w:rPr>
-        <w:t>Tests</w:t>
+      <w:bookmarkStart w:id="3" w:name="_Toc242003356"/>
+      <w:r>
+        <w:t>Program.cs</w:t>
       </w:r>
       <w:bookmarkEnd w:id="3"/>
+    </w:p>
+    <w:p>
+      <w:r>
+        <w:t xml:space="preserve">Dans le fichier « program » il est principalement vide. </w:t>
+      </w:r>
+      <w:r>
+        <w:t>La seule action</w:t>
+      </w:r>
+      <w:r>
+        <w:t xml:space="preserve"> qu’elle effectue c’est d’appeler une classe nommée « PlayGame ».</w:t>
+      </w:r>
+    </w:p>
+    <w:p>
+      <w:pPr>
+        <w:jc w:val="center"/>
+      </w:pPr>
+      <w:r>
+        <w:rPr>
+          <w:noProof/>
+        </w:rPr>
+        <w:drawing>
+          <wp:inline distT="0" distB="0" distL="0" distR="0" wp14:anchorId="4492B7CA" wp14:editId="1170FD9C">
+            <wp:extent cx="2940201" cy="1911448"/>
+            <wp:effectExtent l="0" t="0" r="0" b="0"/>
+            <wp:docPr id="849562905" name="Image 3"/>
+            <wp:cNvGraphicFramePr>
+              <a:graphicFrameLocks xmlns:a="http://schemas.openxmlformats.org/drawingml/2006/main" noChangeAspect="1"/>
+            </wp:cNvGraphicFramePr>
+            <a:graphic xmlns:a="http://schemas.openxmlformats.org/drawingml/2006/main">
+              <a:graphicData uri="http://schemas.openxmlformats.org/drawingml/2006/picture">
+                <pic:pic xmlns:pic="http://schemas.openxmlformats.org/drawingml/2006/picture">
+                  <pic:nvPicPr>
+                    <pic:cNvPr id="849562905" name="Image 849562905"/>
+                    <pic:cNvPicPr/>
+                  </pic:nvPicPr>
+                  <pic:blipFill>
+                    <a:blip r:embed="rId8">
+                      <a:extLst>
+                        <a:ext uri="{28A0092B-C50C-407E-A947-70E740481C1C}">
+                          <a14:useLocalDpi xmlns:a14="http://schemas.microsoft.com/office/drawing/2010/main" val="0"/>
+                        </a:ext>
+                      </a:extLst>
+                    </a:blip>
+                    <a:stretch>
+                      <a:fillRect/>
+                    </a:stretch>
+                  </pic:blipFill>
+                  <pic:spPr>
+                    <a:xfrm>
+                      <a:off x="0" y="0"/>
+                      <a:ext cx="2940201" cy="1911448"/>
+                    </a:xfrm>
+                    <a:prstGeom prst="rect">
+                      <a:avLst/>
+                    </a:prstGeom>
+                  </pic:spPr>
+                </pic:pic>
+              </a:graphicData>
+            </a:graphic>
+          </wp:inline>
+        </w:drawing>
+      </w:r>
+    </w:p>
+    <w:p>
+      <w:r>
+        <w:br w:type="page"/>
+      </w:r>
+    </w:p>
+    <w:p>
+      <w:pPr>
+        <w:pStyle w:val="Titre2"/>
+      </w:pPr>
+      <w:bookmarkStart w:id="4" w:name="_Toc242003357"/>
+      <w:r>
+        <w:lastRenderedPageBreak/>
+        <w:t>PlayGame.cs</w:t>
+      </w:r>
+      <w:bookmarkEnd w:id="4"/>
+    </w:p>
+    <w:p>
+      <w:r>
+        <w:t>Dans cette classe il s</w:t>
+      </w:r>
+      <w:r>
+        <w:t>e situe 3 méthodes.</w:t>
+      </w:r>
+      <w:r>
+        <w:t xml:space="preserve"> Elle exécute une loop qui permet au programme de tourner continuellement jusqu’à ce que l’utilisateur décide d’arrêter le programme.</w:t>
+      </w:r>
+    </w:p>
+    <w:p>
+      <w:pPr>
+        <w:pStyle w:val="Titre3"/>
+        <w:ind w:firstLine="708"/>
+      </w:pPr>
+      <w:bookmarkStart w:id="5" w:name="_Toc242003358"/>
+      <w:r>
+        <w:t>StartProgram</w:t>
+      </w:r>
+      <w:bookmarkEnd w:id="5"/>
+    </w:p>
+    <w:p>
+      <w:pPr>
+        <w:jc w:val="center"/>
+        <w:rPr>
+          <w:lang w:val="en-GB"/>
+        </w:rPr>
+      </w:pPr>
+      <w:r>
+        <w:rPr>
+          <w:noProof/>
+          <w:lang w:val="en-GB"/>
+        </w:rPr>
+        <w:drawing>
+          <wp:inline distT="0" distB="0" distL="0" distR="0" wp14:anchorId="56DF3C27" wp14:editId="5385300E">
+            <wp:extent cx="4294836" cy="2552831"/>
+            <wp:effectExtent l="0" t="0" r="0" b="0"/>
+            <wp:docPr id="924650707" name="Image 4"/>
+            <wp:cNvGraphicFramePr>
+              <a:graphicFrameLocks xmlns:a="http://schemas.openxmlformats.org/drawingml/2006/main" noChangeAspect="1"/>
+            </wp:cNvGraphicFramePr>
+            <a:graphic xmlns:a="http://schemas.openxmlformats.org/drawingml/2006/main">
+              <a:graphicData uri="http://schemas.openxmlformats.org/drawingml/2006/picture">
+                <pic:pic xmlns:pic="http://schemas.openxmlformats.org/drawingml/2006/picture">
+                  <pic:nvPicPr>
+                    <pic:cNvPr id="924650707" name="Image 4"/>
+                    <pic:cNvPicPr/>
+                  </pic:nvPicPr>
+                  <pic:blipFill>
+                    <a:blip r:embed="rId9">
+                      <a:extLst>
+                        <a:ext uri="{28A0092B-C50C-407E-A947-70E740481C1C}">
+                          <a14:useLocalDpi xmlns:a14="http://schemas.microsoft.com/office/drawing/2010/main" val="0"/>
+                        </a:ext>
+                      </a:extLst>
+                    </a:blip>
+                    <a:stretch>
+                      <a:fillRect/>
+                    </a:stretch>
+                  </pic:blipFill>
+                  <pic:spPr>
+                    <a:xfrm>
+                      <a:off x="0" y="0"/>
+                      <a:ext cx="4294836" cy="2552831"/>
+                    </a:xfrm>
+                    <a:prstGeom prst="rect">
+                      <a:avLst/>
+                    </a:prstGeom>
+                  </pic:spPr>
+                </pic:pic>
+              </a:graphicData>
+            </a:graphic>
+          </wp:inline>
+        </w:drawing>
+      </w:r>
+    </w:p>
+    <w:p>
+      <w:r>
+        <w:t xml:space="preserve">Dans </w:t>
+      </w:r>
+      <w:r>
+        <w:t>cette méthode on commence par appelé « InitiateParking »</w:t>
+      </w:r>
+      <w:r>
+        <w:t xml:space="preserve"> </w:t>
+      </w:r>
+      <w:r>
+        <w:t xml:space="preserve">(qui permet simplement d’initialiser le parking) </w:t>
+      </w:r>
+      <w:r>
+        <w:t>en premier. Ensuit</w:t>
+      </w:r>
+      <w:r>
+        <w:t xml:space="preserve">e </w:t>
+      </w:r>
+      <w:r>
+        <w:t>on commence une boucle avec « continueProgram » (</w:t>
+      </w:r>
+      <w:r>
+        <w:t xml:space="preserve">un booléen </w:t>
+      </w:r>
+      <w:r>
+        <w:t>déclaré tout en haut de la capture) qui va faire en sorte que le menu et continuellement afficher puis de mettre à jour la variable « continueProgram ».</w:t>
+      </w:r>
+    </w:p>
+    <w:p>
+      <w:r>
+        <w:br w:type="page"/>
+      </w:r>
+    </w:p>
+    <w:p>
+      <w:pPr>
+        <w:pStyle w:val="Titre2"/>
+      </w:pPr>
+      <w:bookmarkStart w:id="6" w:name="_Toc242003359"/>
+      <w:r>
+        <w:lastRenderedPageBreak/>
+        <w:t>Menu.cs</w:t>
+      </w:r>
+      <w:bookmarkEnd w:id="6"/>
+    </w:p>
+    <w:p>
+      <w:r>
+        <w:t>Cette classe statique permet d’afficher le menu puis gérer les inputs de l’utilisateur.</w:t>
+      </w:r>
+      <w:r>
+        <w:t xml:space="preserve"> La deuxième plus grande classe de ce projet.</w:t>
+      </w:r>
+    </w:p>
+    <w:p>
+      <w:pPr>
+        <w:pStyle w:val="Titre3"/>
+        <w:ind w:firstLine="708"/>
+      </w:pPr>
+      <w:bookmarkStart w:id="7" w:name="_Toc242003360"/>
+      <w:r>
+        <w:t>DisplayMenu</w:t>
+      </w:r>
+      <w:bookmarkEnd w:id="7"/>
+    </w:p>
+    <w:p>
+      <w:pPr>
+        <w:jc w:val="center"/>
+      </w:pPr>
+      <w:r>
+        <w:rPr>
+          <w:noProof/>
+        </w:rPr>
+        <w:drawing>
+          <wp:inline distT="0" distB="0" distL="0" distR="0" wp14:anchorId="2AA6B406" wp14:editId="3CE323D4">
+            <wp:extent cx="3853180" cy="2576830"/>
+            <wp:effectExtent l="0" t="0" r="0" b="0"/>
+            <wp:docPr id="538632902" name="Image 1"/>
+            <wp:cNvGraphicFramePr>
+              <a:graphicFrameLocks xmlns:a="http://schemas.openxmlformats.org/drawingml/2006/main" noChangeAspect="1"/>
+            </wp:cNvGraphicFramePr>
+            <a:graphic xmlns:a="http://schemas.openxmlformats.org/drawingml/2006/main">
+              <a:graphicData uri="http://schemas.openxmlformats.org/drawingml/2006/picture">
+                <pic:pic xmlns:pic="http://schemas.openxmlformats.org/drawingml/2006/picture">
+                  <pic:nvPicPr>
+                    <pic:cNvPr id="0" name="Picture 1"/>
+                    <pic:cNvPicPr>
+                      <a:picLocks noChangeAspect="1" noChangeArrowheads="1"/>
+                    </pic:cNvPicPr>
+                  </pic:nvPicPr>
+                  <pic:blipFill>
+                    <a:blip r:embed="rId10">
+                      <a:extLst>
+                        <a:ext uri="{28A0092B-C50C-407E-A947-70E740481C1C}">
+                          <a14:useLocalDpi xmlns:a14="http://schemas.microsoft.com/office/drawing/2010/main" val="0"/>
+                        </a:ext>
+                      </a:extLst>
+                    </a:blip>
+                    <a:srcRect/>
+                    <a:stretch>
+                      <a:fillRect/>
+                    </a:stretch>
+                  </pic:blipFill>
+                  <pic:spPr bwMode="auto">
+                    <a:xfrm>
+                      <a:off x="0" y="0"/>
+                      <a:ext cx="3853180" cy="2576830"/>
+                    </a:xfrm>
+                    <a:prstGeom prst="rect">
+                      <a:avLst/>
+                    </a:prstGeom>
+                    <a:noFill/>
+                    <a:ln>
+                      <a:noFill/>
+                    </a:ln>
+                  </pic:spPr>
+                </pic:pic>
+              </a:graphicData>
+            </a:graphic>
+          </wp:inline>
+        </w:drawing>
+      </w:r>
+    </w:p>
+    <w:p>
+      <w:r>
+        <w:t>Une simple méthode permettant d’afficher</w:t>
+      </w:r>
+      <w:r>
+        <w:t xml:space="preserve"> le menu. Une boucle foreach pour afficher chaque option (stocker dans un tableau private au début du code) disponible pour l’utilisateur. « optionIndex » permet à l’utilisateur de savoir quelle numéro entrer pour utiliser cette option-ci ou </w:t>
+      </w:r>
+      <w:r>
+        <w:t>celle-là</w:t>
+      </w:r>
+      <w:r>
+        <w:t>.</w:t>
+      </w:r>
+    </w:p>
+    <w:p>
+      <w:r>
+        <w:br w:type="page"/>
+      </w:r>
+    </w:p>
+    <w:p>
+      <w:pPr>
+        <w:pStyle w:val="Titre3"/>
+      </w:pPr>
+      <w:r>
+        <w:lastRenderedPageBreak/>
+        <w:tab/>
+      </w:r>
+      <w:bookmarkStart w:id="8" w:name="_Toc242003361"/>
+      <w:r>
+        <w:t>UserInputHandler</w:t>
+      </w:r>
+      <w:bookmarkEnd w:id="8"/>
+    </w:p>
+    <w:p>
+      <w:pPr>
+        <w:jc w:val="center"/>
+      </w:pPr>
+      <w:r>
+        <w:rPr>
+          <w:noProof/>
+        </w:rPr>
+        <w:drawing>
+          <wp:inline distT="0" distB="0" distL="0" distR="0" wp14:anchorId="6A3A66C0" wp14:editId="0DE1E896">
+            <wp:extent cx="4077970" cy="2420620"/>
+            <wp:effectExtent l="0" t="0" r="0" b="0"/>
+            <wp:docPr id="1002319667" name="Image 2"/>
+            <wp:cNvGraphicFramePr>
+              <a:graphicFrameLocks xmlns:a="http://schemas.openxmlformats.org/drawingml/2006/main" noChangeAspect="1"/>
+            </wp:cNvGraphicFramePr>
+            <a:graphic xmlns:a="http://schemas.openxmlformats.org/drawingml/2006/main">
+              <a:graphicData uri="http://schemas.openxmlformats.org/drawingml/2006/picture">
+                <pic:pic xmlns:pic="http://schemas.openxmlformats.org/drawingml/2006/picture">
+                  <pic:nvPicPr>
+                    <pic:cNvPr id="0" name="Picture 2"/>
+                    <pic:cNvPicPr>
+                      <a:picLocks noChangeAspect="1" noChangeArrowheads="1"/>
+                    </pic:cNvPicPr>
+                  </pic:nvPicPr>
+                  <pic:blipFill>
+                    <a:blip r:embed="rId11">
+                      <a:extLst>
+                        <a:ext uri="{28A0092B-C50C-407E-A947-70E740481C1C}">
+                          <a14:useLocalDpi xmlns:a14="http://schemas.microsoft.com/office/drawing/2010/main" val="0"/>
+                        </a:ext>
+                      </a:extLst>
+                    </a:blip>
+                    <a:srcRect/>
+                    <a:stretch>
+                      <a:fillRect/>
+                    </a:stretch>
+                  </pic:blipFill>
+                  <pic:spPr bwMode="auto">
+                    <a:xfrm>
+                      <a:off x="0" y="0"/>
+                      <a:ext cx="4077970" cy="2420620"/>
+                    </a:xfrm>
+                    <a:prstGeom prst="rect">
+                      <a:avLst/>
+                    </a:prstGeom>
+                    <a:noFill/>
+                    <a:ln>
+                      <a:noFill/>
+                    </a:ln>
+                  </pic:spPr>
+                </pic:pic>
+              </a:graphicData>
+            </a:graphic>
+          </wp:inline>
+        </w:drawing>
+      </w:r>
+    </w:p>
+    <w:p>
+      <w:r>
+        <w:t>Elle est souvent appelée dans le code. Elle va</w:t>
+      </w:r>
+      <w:r>
+        <w:t xml:space="preserve"> gérer ce que l’utilisateur entre comme option (ex : « 5 » pour l’option numéro 5). Si la saisie de l’utilisateur ne peut pas être converti en int, on va supprimer son input (grâce à la méthode « CheckCorrectInput » qui est utiliser seulement pour effacer la saisie du joueur pour avoir une console propre)</w:t>
+      </w:r>
+      <w:r>
+        <w:t>. Car effacer l’entièreté de la console serait problématique vu qu’on aurait besoin de re-</w:t>
+      </w:r>
+      <w:r>
+        <w:t>appeler « DisplayMenu » simplement pour afficher un texte « Entrer votre choix : ».</w:t>
+      </w:r>
+    </w:p>
+    <w:p>
+      <w:r>
+        <w:t>Si c’est bien un nombre, on va vérifier s’il est trop grand ou petit. Si oui</w:t>
+      </w:r>
+      <w:r>
+        <w:t xml:space="preserve"> </w:t>
+      </w:r>
+      <w:r>
+        <w:t xml:space="preserve">on va dire à l’utilisateur </w:t>
+      </w:r>
+      <w:r>
+        <w:t>de choisir un nombre dans la plage de valeur correcte. On va attendre 1.5 secondes (pour laisser l’utilisateur le temp de lire le message) avant d’appeler « UserInputHandler » une fois de plus.</w:t>
+      </w:r>
+    </w:p>
+    <w:p>
+      <w:r>
+        <w:t xml:space="preserve">Si tout est bon, l’option choisi par l’utilisateur va être </w:t>
+      </w:r>
+      <w:r>
+        <w:t>exécuté grâce a une méthode qui contient un simple « switch case » pour appeler la méthode correspondante à l’option.</w:t>
+      </w:r>
+    </w:p>
+    <w:p>
+      <w:r>
+        <w:br w:type="page"/>
+      </w:r>
+    </w:p>
+    <w:p>
+      <w:pPr>
+        <w:pStyle w:val="Titre3"/>
+      </w:pPr>
+      <w:r>
+        <w:lastRenderedPageBreak/>
+        <w:tab/>
+      </w:r>
+      <w:bookmarkStart w:id="9" w:name="_Toc242003362"/>
+      <w:r>
+        <w:t>EnterVehicle</w:t>
+      </w:r>
+      <w:bookmarkEnd w:id="9"/>
+    </w:p>
+    <w:p>
+      <w:pPr>
+        <w:jc w:val="center"/>
+      </w:pPr>
+      <w:r>
+        <w:rPr>
+          <w:noProof/>
+        </w:rPr>
+        <w:drawing>
+          <wp:inline distT="0" distB="0" distL="0" distR="0" wp14:anchorId="21CFB329" wp14:editId="51A4B671">
+            <wp:extent cx="5755640" cy="1550035"/>
+            <wp:effectExtent l="0" t="0" r="0" b="0"/>
+            <wp:docPr id="273820517" name="Image 3"/>
+            <wp:cNvGraphicFramePr>
+              <a:graphicFrameLocks xmlns:a="http://schemas.openxmlformats.org/drawingml/2006/main" noChangeAspect="1"/>
+            </wp:cNvGraphicFramePr>
+            <a:graphic xmlns:a="http://schemas.openxmlformats.org/drawingml/2006/main">
+              <a:graphicData uri="http://schemas.openxmlformats.org/drawingml/2006/picture">
+                <pic:pic xmlns:pic="http://schemas.openxmlformats.org/drawingml/2006/picture">
+                  <pic:nvPicPr>
+                    <pic:cNvPr id="0" name="Picture 3"/>
+                    <pic:cNvPicPr>
+                      <a:picLocks noChangeAspect="1" noChangeArrowheads="1"/>
+                    </pic:cNvPicPr>
+                  </pic:nvPicPr>
+                  <pic:blipFill>
+                    <a:blip r:embed="rId12" cstate="print">
+                      <a:extLst>
+                        <a:ext uri="{28A0092B-C50C-407E-A947-70E740481C1C}">
+                          <a14:useLocalDpi xmlns:a14="http://schemas.microsoft.com/office/drawing/2010/main" val="0"/>
+                        </a:ext>
+                      </a:extLst>
+                    </a:blip>
+                    <a:srcRect/>
+                    <a:stretch>
+                      <a:fillRect/>
+                    </a:stretch>
+                  </pic:blipFill>
+                  <pic:spPr bwMode="auto">
+                    <a:xfrm>
+                      <a:off x="0" y="0"/>
+                      <a:ext cx="5755640" cy="1550035"/>
+                    </a:xfrm>
+                    <a:prstGeom prst="rect">
+                      <a:avLst/>
+                    </a:prstGeom>
+                    <a:noFill/>
+                    <a:ln>
+                      <a:noFill/>
+                    </a:ln>
+                  </pic:spPr>
+                </pic:pic>
+              </a:graphicData>
+            </a:graphic>
+          </wp:inline>
+        </w:drawing>
+      </w:r>
+    </w:p>
+    <w:p>
+      <w:r>
+        <w:t xml:space="preserve">Ceci est une des options disponibles. </w:t>
+      </w:r>
+      <w:r>
+        <w:t xml:space="preserve">On va nettoyer la console (pour avoir simplement le texte expliquant </w:t>
+      </w:r>
+      <w:r>
+        <w:t>quel format</w:t>
+      </w:r>
+      <w:r>
+        <w:t xml:space="preserve"> est accepté</w:t>
+      </w:r>
+      <w:r>
+        <w:t xml:space="preserve"> pour que ça soit plus lisible) puis demander d’entrer une plaque. Si la saisie n’est pas vide, on va créer une voiture (la logique pour vérifier si la plaque est bonne ce déroule dans la classe « voiture ». Qui va informer au l’utilisateur si la voiture a bien été ajouté ou non). Faire des retours à la lignes avec « ReturnMultipleLines » (pour plus de lisibilité) puis réafficher le menu.</w:t>
+      </w:r>
+    </w:p>
+    <w:p>
+      <w:r>
+        <w:br w:type="page"/>
+      </w:r>
+    </w:p>
+    <w:p>
+      <w:pPr>
+        <w:pStyle w:val="Titre3"/>
+      </w:pPr>
+      <w:r>
+        <w:lastRenderedPageBreak/>
+        <w:tab/>
+      </w:r>
+      <w:bookmarkStart w:id="10" w:name="_Toc242003363"/>
+      <w:r>
+        <w:t>SearchVehicle</w:t>
+      </w:r>
+      <w:bookmarkEnd w:id="10"/>
+    </w:p>
+    <w:p>
+      <w:pPr>
+        <w:jc w:val="center"/>
+      </w:pPr>
+      <w:r>
+        <w:rPr>
+          <w:noProof/>
+        </w:rPr>
+        <w:drawing>
+          <wp:inline distT="0" distB="0" distL="0" distR="0" wp14:anchorId="632E671E" wp14:editId="39480FC1">
+            <wp:extent cx="5750560" cy="2782570"/>
+            <wp:effectExtent l="0" t="0" r="2540" b="0"/>
+            <wp:docPr id="340283559" name="Image 5"/>
+            <wp:cNvGraphicFramePr>
+              <a:graphicFrameLocks xmlns:a="http://schemas.openxmlformats.org/drawingml/2006/main" noChangeAspect="1"/>
+            </wp:cNvGraphicFramePr>
+            <a:graphic xmlns:a="http://schemas.openxmlformats.org/drawingml/2006/main">
+              <a:graphicData uri="http://schemas.openxmlformats.org/drawingml/2006/picture">
+                <pic:pic xmlns:pic="http://schemas.openxmlformats.org/drawingml/2006/picture">
+                  <pic:nvPicPr>
+                    <pic:cNvPr id="0" name="Picture 5"/>
+                    <pic:cNvPicPr>
+                      <a:picLocks noChangeAspect="1" noChangeArrowheads="1"/>
+                    </pic:cNvPicPr>
+                  </pic:nvPicPr>
+                  <pic:blipFill>
+                    <a:blip r:embed="rId13" cstate="print">
+                      <a:extLst>
+                        <a:ext uri="{28A0092B-C50C-407E-A947-70E740481C1C}">
+                          <a14:useLocalDpi xmlns:a14="http://schemas.microsoft.com/office/drawing/2010/main" val="0"/>
+                        </a:ext>
+                      </a:extLst>
+                    </a:blip>
+                    <a:srcRect/>
+                    <a:stretch>
+                      <a:fillRect/>
+                    </a:stretch>
+                  </pic:blipFill>
+                  <pic:spPr bwMode="auto">
+                    <a:xfrm>
+                      <a:off x="0" y="0"/>
+                      <a:ext cx="5750560" cy="2782570"/>
+                    </a:xfrm>
+                    <a:prstGeom prst="rect">
+                      <a:avLst/>
+                    </a:prstGeom>
+                    <a:noFill/>
+                    <a:ln>
+                      <a:noFill/>
+                    </a:ln>
+                  </pic:spPr>
+                </pic:pic>
+              </a:graphicData>
+            </a:graphic>
+          </wp:inline>
+        </w:drawing>
+      </w:r>
+    </w:p>
+    <w:p>
+      <w:r>
+        <w:t>Une des autres options disponibles. Comme son nom l’indique, elle va rechercher un véhicule. Ducoup cette méthode essaye d’abord de transformer la saisie de l’utilisateur en nombre, si ça fonctionne, ça veut dire que c’est un numéro de place. Sinon, on essaye de faire un match (qui utilise le format des plaques d’immatriculation)</w:t>
+      </w:r>
+      <w:r>
+        <w:t>, si ça fonctionne, c’est une plaque, sinon, l’utilisateur a entré une valeur invalide.</w:t>
+      </w:r>
+    </w:p>
+    <w:p>
+      <w:r>
+        <w:br w:type="page"/>
+      </w:r>
+    </w:p>
+    <w:p>
+      <w:pPr>
+        <w:pStyle w:val="Titre3"/>
+        <w:ind w:firstLine="708"/>
+      </w:pPr>
+      <w:bookmarkStart w:id="11" w:name="_Toc242003364"/>
+      <w:r>
+        <w:lastRenderedPageBreak/>
+        <w:t>CallFindVehicle</w:t>
+      </w:r>
+      <w:bookmarkEnd w:id="11"/>
+    </w:p>
+    <w:p>
+      <w:pPr>
+        <w:jc w:val="center"/>
+      </w:pPr>
+      <w:r>
+        <w:rPr>
+          <w:noProof/>
+        </w:rPr>
+        <w:drawing>
+          <wp:inline distT="0" distB="0" distL="0" distR="0" wp14:anchorId="2FC200CC" wp14:editId="3FA56DD7">
+            <wp:extent cx="5753735" cy="3286125"/>
+            <wp:effectExtent l="0" t="0" r="0" b="9525"/>
+            <wp:docPr id="1039742995" name="Image 7"/>
+            <wp:cNvGraphicFramePr>
+              <a:graphicFrameLocks xmlns:a="http://schemas.openxmlformats.org/drawingml/2006/main" noChangeAspect="1"/>
+            </wp:cNvGraphicFramePr>
+            <a:graphic xmlns:a="http://schemas.openxmlformats.org/drawingml/2006/main">
+              <a:graphicData uri="http://schemas.openxmlformats.org/drawingml/2006/picture">
+                <pic:pic xmlns:pic="http://schemas.openxmlformats.org/drawingml/2006/picture">
+                  <pic:nvPicPr>
+                    <pic:cNvPr id="0" name="Picture 7"/>
+                    <pic:cNvPicPr>
+                      <a:picLocks noChangeAspect="1" noChangeArrowheads="1"/>
+                    </pic:cNvPicPr>
+                  </pic:nvPicPr>
+                  <pic:blipFill>
+                    <a:blip r:embed="rId14">
+                      <a:extLst>
+                        <a:ext uri="{28A0092B-C50C-407E-A947-70E740481C1C}">
+                          <a14:useLocalDpi xmlns:a14="http://schemas.microsoft.com/office/drawing/2010/main" val="0"/>
+                        </a:ext>
+                      </a:extLst>
+                    </a:blip>
+                    <a:srcRect/>
+                    <a:stretch>
+                      <a:fillRect/>
+                    </a:stretch>
+                  </pic:blipFill>
+                  <pic:spPr bwMode="auto">
+                    <a:xfrm>
+                      <a:off x="0" y="0"/>
+                      <a:ext cx="5753735" cy="3286125"/>
+                    </a:xfrm>
+                    <a:prstGeom prst="rect">
+                      <a:avLst/>
+                    </a:prstGeom>
+                    <a:noFill/>
+                    <a:ln>
+                      <a:noFill/>
+                    </a:ln>
+                  </pic:spPr>
+                </pic:pic>
+              </a:graphicData>
+            </a:graphic>
+          </wp:inline>
+        </w:drawing>
+      </w:r>
+    </w:p>
+    <w:p>
+      <w:r>
+        <w:t>Cette méthode va d’abord vérifier si on veut retirer un véhicule. Si c’est le cas on va demander à l’utilisateur s’il est sûr de ça décision (en appelant « UserIsSure). S’il choisit non, on lui informe que l’action a été annulé. S’il choisit oui, alors on va chercher une correspondance pour supprimer le véhicule entrer (la méthode « FindVehicule »).</w:t>
+      </w:r>
+    </w:p>
+    <w:p>
+      <w:r>
+        <w:t>Cependant, si l’utilisateur voulait simplement afficher des informations d’un véhicule, on va donc rien faire de spécial puis appelé « FindVehicule ».</w:t>
+      </w:r>
+    </w:p>
+    <w:p>
+      <w:r>
+        <w:br w:type="page"/>
+      </w:r>
+    </w:p>
+    <w:p>
+      <w:pPr>
+        <w:pStyle w:val="Titre2"/>
+      </w:pPr>
+      <w:bookmarkStart w:id="12" w:name="_Toc242003365"/>
+      <w:r>
+        <w:lastRenderedPageBreak/>
+        <w:t>Parking.cs</w:t>
+      </w:r>
+      <w:bookmarkEnd w:id="12"/>
+    </w:p>
+    <w:p>
+      <w:pPr>
+        <w:pStyle w:val="Titre3"/>
+      </w:pPr>
+      <w:r>
+        <w:tab/>
+      </w:r>
+      <w:bookmarkStart w:id="13" w:name="_Toc242003366"/>
+      <w:r>
+        <w:t>Display</w:t>
+      </w:r>
+      <w:bookmarkEnd w:id="13"/>
+    </w:p>
+    <w:p>
+      <w:pPr>
+        <w:jc w:val="center"/>
+      </w:pPr>
+      <w:r>
+        <w:rPr>
+          <w:noProof/>
+        </w:rPr>
+        <w:drawing>
+          <wp:inline distT="0" distB="0" distL="0" distR="0" wp14:anchorId="16233297" wp14:editId="3B786F8A">
+            <wp:extent cx="4617085" cy="3562350"/>
+            <wp:effectExtent l="0" t="0" r="0" b="0"/>
+            <wp:docPr id="225654148" name="Image 8"/>
+            <wp:cNvGraphicFramePr>
+              <a:graphicFrameLocks xmlns:a="http://schemas.openxmlformats.org/drawingml/2006/main" noChangeAspect="1"/>
+            </wp:cNvGraphicFramePr>
+            <a:graphic xmlns:a="http://schemas.openxmlformats.org/drawingml/2006/main">
+              <a:graphicData uri="http://schemas.openxmlformats.org/drawingml/2006/picture">
+                <pic:pic xmlns:pic="http://schemas.openxmlformats.org/drawingml/2006/picture">
+                  <pic:nvPicPr>
+                    <pic:cNvPr id="0" name="Picture 8"/>
+                    <pic:cNvPicPr>
+                      <a:picLocks noChangeAspect="1" noChangeArrowheads="1"/>
+                    </pic:cNvPicPr>
+                  </pic:nvPicPr>
+                  <pic:blipFill>
+                    <a:blip r:embed="rId15">
+                      <a:extLst>
+                        <a:ext uri="{28A0092B-C50C-407E-A947-70E740481C1C}">
+                          <a14:useLocalDpi xmlns:a14="http://schemas.microsoft.com/office/drawing/2010/main" val="0"/>
+                        </a:ext>
+                      </a:extLst>
+                    </a:blip>
+                    <a:srcRect/>
+                    <a:stretch>
+                      <a:fillRect/>
+                    </a:stretch>
+                  </pic:blipFill>
+                  <pic:spPr bwMode="auto">
+                    <a:xfrm>
+                      <a:off x="0" y="0"/>
+                      <a:ext cx="4617085" cy="3562350"/>
+                    </a:xfrm>
+                    <a:prstGeom prst="rect">
+                      <a:avLst/>
+                    </a:prstGeom>
+                    <a:noFill/>
+                    <a:ln>
+                      <a:noFill/>
+                    </a:ln>
+                  </pic:spPr>
+                </pic:pic>
+              </a:graphicData>
+            </a:graphic>
+          </wp:inline>
+        </w:drawing>
+      </w:r>
+    </w:p>
+    <w:p>
+      <w:r>
+        <w:t>Cette méthode permet d’afficher le parking avec ses statistiques.</w:t>
+      </w:r>
+      <w:r>
+        <w:t xml:space="preserve"> Elle appelle cependant « ParkingSpot » qui va être celui qui va écrire chaque place de parking individuellement avec un certain style</w:t>
+      </w:r>
+      <w:r>
+        <w:t xml:space="preserve"> (ex : « |02:L|</w:t>
+      </w:r>
+      <w:r>
+        <w:t>|0</w:t>
+      </w:r>
+      <w:r>
+        <w:t>3</w:t>
+      </w:r>
+      <w:r>
+        <w:t>:</w:t>
+      </w:r>
+      <w:r>
+        <w:t>X</w:t>
+      </w:r>
+      <w:r>
+        <w:t>|</w:t>
+      </w:r>
+      <w:r>
+        <w:t> »)</w:t>
+      </w:r>
+      <w:r>
+        <w:t>.</w:t>
+      </w:r>
+    </w:p>
+    <w:p>
+      <w:r>
+        <w:br w:type="page"/>
+      </w:r>
+    </w:p>
+    <w:p>
+      <w:pPr>
+        <w:pStyle w:val="Titre3"/>
+      </w:pPr>
+      <w:r>
+        <w:lastRenderedPageBreak/>
+        <w:tab/>
+      </w:r>
+      <w:bookmarkStart w:id="14" w:name="_Toc242003367"/>
+      <w:r>
+        <w:t>CheckParkingSpot</w:t>
+      </w:r>
+      <w:bookmarkEnd w:id="14"/>
+    </w:p>
+    <w:p>
+      <w:pPr>
+        <w:jc w:val="center"/>
+      </w:pPr>
+      <w:r>
+        <w:rPr>
+          <w:noProof/>
+        </w:rPr>
+        <w:drawing>
+          <wp:inline distT="0" distB="0" distL="0" distR="0" wp14:anchorId="08B897AA" wp14:editId="11F6C6DE">
+            <wp:extent cx="5758180" cy="4576445"/>
+            <wp:effectExtent l="0" t="0" r="0" b="0"/>
+            <wp:docPr id="574026173" name="Image 9"/>
+            <wp:cNvGraphicFramePr>
+              <a:graphicFrameLocks xmlns:a="http://schemas.openxmlformats.org/drawingml/2006/main" noChangeAspect="1"/>
+            </wp:cNvGraphicFramePr>
+            <a:graphic xmlns:a="http://schemas.openxmlformats.org/drawingml/2006/main">
+              <a:graphicData uri="http://schemas.openxmlformats.org/drawingml/2006/picture">
+                <pic:pic xmlns:pic="http://schemas.openxmlformats.org/drawingml/2006/picture">
+                  <pic:nvPicPr>
+                    <pic:cNvPr id="0" name="Picture 9"/>
+                    <pic:cNvPicPr>
+                      <a:picLocks noChangeAspect="1" noChangeArrowheads="1"/>
+                    </pic:cNvPicPr>
+                  </pic:nvPicPr>
+                  <pic:blipFill>
+                    <a:blip r:embed="rId16">
+                      <a:extLst>
+                        <a:ext uri="{28A0092B-C50C-407E-A947-70E740481C1C}">
+                          <a14:useLocalDpi xmlns:a14="http://schemas.microsoft.com/office/drawing/2010/main" val="0"/>
+                        </a:ext>
+                      </a:extLst>
+                    </a:blip>
+                    <a:srcRect/>
+                    <a:stretch>
+                      <a:fillRect/>
+                    </a:stretch>
+                  </pic:blipFill>
+                  <pic:spPr bwMode="auto">
+                    <a:xfrm>
+                      <a:off x="0" y="0"/>
+                      <a:ext cx="5758180" cy="4576445"/>
+                    </a:xfrm>
+                    <a:prstGeom prst="rect">
+                      <a:avLst/>
+                    </a:prstGeom>
+                    <a:noFill/>
+                    <a:ln>
+                      <a:noFill/>
+                    </a:ln>
+                  </pic:spPr>
+                </pic:pic>
+              </a:graphicData>
+            </a:graphic>
+          </wp:inline>
+        </w:drawing>
+      </w:r>
+    </w:p>
+    <w:p>
+      <w:r>
+        <w:t>Cette méthode (appeler par « ParkingSpot ») va s’occuper de gérer l’affichage du symbole en fonction de la valeur de la place de parking. Augmenté le nombre de place libre, le nombre de place occupé, etc…</w:t>
+      </w:r>
+    </w:p>
+    <w:p>
+      <w:r>
+        <w:br w:type="page"/>
+      </w:r>
+    </w:p>
+    <w:p>
+      <w:pPr>
+        <w:pStyle w:val="Titre3"/>
+      </w:pPr>
+      <w:r>
+        <w:lastRenderedPageBreak/>
+        <w:tab/>
+      </w:r>
+      <w:bookmarkStart w:id="15" w:name="_Toc242003368"/>
+      <w:r>
+        <w:t>AddVehicle</w:t>
+      </w:r>
+      <w:bookmarkEnd w:id="15"/>
+    </w:p>
+    <w:p>
+      <w:pPr>
+        <w:jc w:val="center"/>
+      </w:pPr>
+      <w:r>
+        <w:rPr>
+          <w:noProof/>
+        </w:rPr>
+        <w:drawing>
+          <wp:inline distT="0" distB="0" distL="0" distR="0" wp14:anchorId="610F059E" wp14:editId="1247F74B">
+            <wp:extent cx="5758180" cy="3213735"/>
+            <wp:effectExtent l="0" t="0" r="0" b="5715"/>
+            <wp:docPr id="1765884206" name="Image 10"/>
+            <wp:cNvGraphicFramePr>
+              <a:graphicFrameLocks xmlns:a="http://schemas.openxmlformats.org/drawingml/2006/main" noChangeAspect="1"/>
+            </wp:cNvGraphicFramePr>
+            <a:graphic xmlns:a="http://schemas.openxmlformats.org/drawingml/2006/main">
+              <a:graphicData uri="http://schemas.openxmlformats.org/drawingml/2006/picture">
+                <pic:pic xmlns:pic="http://schemas.openxmlformats.org/drawingml/2006/picture">
+                  <pic:nvPicPr>
+                    <pic:cNvPr id="0" name="Picture 10"/>
+                    <pic:cNvPicPr>
+                      <a:picLocks noChangeAspect="1" noChangeArrowheads="1"/>
+                    </pic:cNvPicPr>
+                  </pic:nvPicPr>
+                  <pic:blipFill>
+                    <a:blip r:embed="rId17">
+                      <a:extLst>
+                        <a:ext uri="{28A0092B-C50C-407E-A947-70E740481C1C}">
+                          <a14:useLocalDpi xmlns:a14="http://schemas.microsoft.com/office/drawing/2010/main" val="0"/>
+                        </a:ext>
+                      </a:extLst>
+                    </a:blip>
+                    <a:srcRect/>
+                    <a:stretch>
+                      <a:fillRect/>
+                    </a:stretch>
+                  </pic:blipFill>
+                  <pic:spPr bwMode="auto">
+                    <a:xfrm>
+                      <a:off x="0" y="0"/>
+                      <a:ext cx="5758180" cy="3213735"/>
+                    </a:xfrm>
+                    <a:prstGeom prst="rect">
+                      <a:avLst/>
+                    </a:prstGeom>
+                    <a:noFill/>
+                    <a:ln>
+                      <a:noFill/>
+                    </a:ln>
+                  </pic:spPr>
+                </pic:pic>
+              </a:graphicData>
+            </a:graphic>
+          </wp:inline>
+        </w:drawing>
+      </w:r>
+    </w:p>
+    <w:p>
+      <w:r>
+        <w:t xml:space="preserve">C’est ici qu’on rajoute une voiture dans le parking. La place de parking est choisie de manière aléatoire. On vérifie si la place est libre, si oui, on change la valeur de cette place pour qu’elle soit occupé. On créer </w:t>
+      </w:r>
+      <w:r>
+        <w:t xml:space="preserve">et attribut </w:t>
+      </w:r>
+      <w:r>
+        <w:t>un ticket pour la voiture</w:t>
+      </w:r>
+      <w:r>
+        <w:t xml:space="preserve">. Puis on ajoute la voiture dans la liste des voitures qui sont parké. </w:t>
+      </w:r>
+    </w:p>
+    <w:p>
+      <w:r>
+        <w:br w:type="page"/>
+      </w:r>
+    </w:p>
+    <w:p>
+      <w:pPr>
+        <w:pStyle w:val="Titre3"/>
+      </w:pPr>
+      <w:r>
+        <w:lastRenderedPageBreak/>
+        <w:tab/>
+      </w:r>
+      <w:bookmarkStart w:id="16" w:name="_Toc242003369"/>
+      <w:r>
+        <w:t>FindVehicule</w:t>
+      </w:r>
+      <w:bookmarkEnd w:id="16"/>
+    </w:p>
+    <w:p>
+      <w:pPr>
+        <w:jc w:val="center"/>
+      </w:pPr>
+      <w:r>
+        <w:rPr>
+          <w:noProof/>
+        </w:rPr>
+        <w:drawing>
+          <wp:inline distT="0" distB="0" distL="0" distR="0" wp14:anchorId="4E0C9F37" wp14:editId="10AFFD3A">
+            <wp:extent cx="5753735" cy="2458085"/>
+            <wp:effectExtent l="0" t="0" r="0" b="0"/>
+            <wp:docPr id="460749035" name="Image 11"/>
+            <wp:cNvGraphicFramePr>
+              <a:graphicFrameLocks xmlns:a="http://schemas.openxmlformats.org/drawingml/2006/main" noChangeAspect="1"/>
+            </wp:cNvGraphicFramePr>
+            <a:graphic xmlns:a="http://schemas.openxmlformats.org/drawingml/2006/main">
+              <a:graphicData uri="http://schemas.openxmlformats.org/drawingml/2006/picture">
+                <pic:pic xmlns:pic="http://schemas.openxmlformats.org/drawingml/2006/picture">
+                  <pic:nvPicPr>
+                    <pic:cNvPr id="0" name="Picture 11"/>
+                    <pic:cNvPicPr>
+                      <a:picLocks noChangeAspect="1" noChangeArrowheads="1"/>
+                    </pic:cNvPicPr>
+                  </pic:nvPicPr>
+                  <pic:blipFill>
+                    <a:blip r:embed="rId18" cstate="print">
+                      <a:extLst>
+                        <a:ext uri="{28A0092B-C50C-407E-A947-70E740481C1C}">
+                          <a14:useLocalDpi xmlns:a14="http://schemas.microsoft.com/office/drawing/2010/main" val="0"/>
+                        </a:ext>
+                      </a:extLst>
+                    </a:blip>
+                    <a:srcRect/>
+                    <a:stretch>
+                      <a:fillRect/>
+                    </a:stretch>
+                  </pic:blipFill>
+                  <pic:spPr bwMode="auto">
+                    <a:xfrm>
+                      <a:off x="0" y="0"/>
+                      <a:ext cx="5753735" cy="2458085"/>
+                    </a:xfrm>
+                    <a:prstGeom prst="rect">
+                      <a:avLst/>
+                    </a:prstGeom>
+                    <a:noFill/>
+                    <a:ln>
+                      <a:noFill/>
+                    </a:ln>
+                  </pic:spPr>
+                </pic:pic>
+              </a:graphicData>
+            </a:graphic>
+          </wp:inline>
+        </w:drawing>
+      </w:r>
+    </w:p>
+    <w:p>
+      <w:r>
+        <w:t>Ici on va rechercher un véhicule via sa plaque d’immatriculation ou son numéro de place. La méthode « FindVehicleCondition » va simplement vérifier s’il trouve une correspondance ou non. Si aucune correspondance est trouvé, on l’informe à l’utilisateur.</w:t>
+      </w:r>
+    </w:p>
+    <w:p>
+      <w:r>
+        <w:br w:type="page"/>
+      </w:r>
+    </w:p>
+    <w:p>
+      <w:pPr>
+        <w:pStyle w:val="Titre3"/>
+      </w:pPr>
+      <w:r>
+        <w:lastRenderedPageBreak/>
+        <w:tab/>
+      </w:r>
+      <w:bookmarkStart w:id="17" w:name="_Toc242003370"/>
+      <w:r>
+        <w:t>FindVehicleReturn</w:t>
+      </w:r>
+      <w:bookmarkEnd w:id="17"/>
+    </w:p>
+    <w:p>
+      <w:pPr>
+        <w:jc w:val="center"/>
+      </w:pPr>
+      <w:r>
+        <w:rPr>
+          <w:noProof/>
+        </w:rPr>
+        <w:drawing>
+          <wp:inline distT="0" distB="0" distL="0" distR="0" wp14:anchorId="6188A1EA" wp14:editId="56FB11BB">
+            <wp:extent cx="5758180" cy="2503170"/>
+            <wp:effectExtent l="0" t="0" r="0" b="0"/>
+            <wp:docPr id="401606834" name="Image 12"/>
+            <wp:cNvGraphicFramePr>
+              <a:graphicFrameLocks xmlns:a="http://schemas.openxmlformats.org/drawingml/2006/main" noChangeAspect="1"/>
+            </wp:cNvGraphicFramePr>
+            <a:graphic xmlns:a="http://schemas.openxmlformats.org/drawingml/2006/main">
+              <a:graphicData uri="http://schemas.openxmlformats.org/drawingml/2006/picture">
+                <pic:pic xmlns:pic="http://schemas.openxmlformats.org/drawingml/2006/picture">
+                  <pic:nvPicPr>
+                    <pic:cNvPr id="0" name="Picture 12"/>
+                    <pic:cNvPicPr>
+                      <a:picLocks noChangeAspect="1" noChangeArrowheads="1"/>
+                    </pic:cNvPicPr>
+                  </pic:nvPicPr>
+                  <pic:blipFill>
+                    <a:blip r:embed="rId19">
+                      <a:extLst>
+                        <a:ext uri="{28A0092B-C50C-407E-A947-70E740481C1C}">
+                          <a14:useLocalDpi xmlns:a14="http://schemas.microsoft.com/office/drawing/2010/main" val="0"/>
+                        </a:ext>
+                      </a:extLst>
+                    </a:blip>
+                    <a:srcRect/>
+                    <a:stretch>
+                      <a:fillRect/>
+                    </a:stretch>
+                  </pic:blipFill>
+                  <pic:spPr bwMode="auto">
+                    <a:xfrm>
+                      <a:off x="0" y="0"/>
+                      <a:ext cx="5758180" cy="2503170"/>
+                    </a:xfrm>
+                    <a:prstGeom prst="rect">
+                      <a:avLst/>
+                    </a:prstGeom>
+                    <a:noFill/>
+                    <a:ln>
+                      <a:noFill/>
+                    </a:ln>
+                  </pic:spPr>
+                </pic:pic>
+              </a:graphicData>
+            </a:graphic>
+          </wp:inline>
+        </w:drawing>
+      </w:r>
+    </w:p>
+    <w:p>
+      <w:r>
+        <w:t>Appeler par la méthode « FindVehicleCondition » (si une correspondance a été trouvé) elle permet d’effectuer une action. Soit afficher les informations du véhicule, soit le faire sortir du parking.</w:t>
+      </w:r>
+    </w:p>
+    <w:p>
+      <w:r>
+        <w:br w:type="page"/>
+      </w:r>
+    </w:p>
+    <w:p>
+      <w:pPr>
+        <w:pStyle w:val="Titre3"/>
+      </w:pPr>
+      <w:r>
+        <w:lastRenderedPageBreak/>
+        <w:tab/>
+      </w:r>
+      <w:bookmarkStart w:id="18" w:name="_Toc242003371"/>
+      <w:r>
+        <w:t>StatParking</w:t>
+      </w:r>
+      <w:bookmarkEnd w:id="18"/>
+    </w:p>
+    <w:p>
+      <w:r>
+        <w:rPr>
+          <w:noProof/>
+        </w:rPr>
+        <w:drawing>
+          <wp:inline distT="0" distB="0" distL="0" distR="0" wp14:anchorId="28B65BB5" wp14:editId="0265E590">
+            <wp:extent cx="5753735" cy="1552575"/>
+            <wp:effectExtent l="0" t="0" r="0" b="9525"/>
+            <wp:docPr id="925377937" name="Image 13"/>
+            <wp:cNvGraphicFramePr>
+              <a:graphicFrameLocks xmlns:a="http://schemas.openxmlformats.org/drawingml/2006/main" noChangeAspect="1"/>
+            </wp:cNvGraphicFramePr>
+            <a:graphic xmlns:a="http://schemas.openxmlformats.org/drawingml/2006/main">
+              <a:graphicData uri="http://schemas.openxmlformats.org/drawingml/2006/picture">
+                <pic:pic xmlns:pic="http://schemas.openxmlformats.org/drawingml/2006/picture">
+                  <pic:nvPicPr>
+                    <pic:cNvPr id="0" name="Picture 13"/>
+                    <pic:cNvPicPr>
+                      <a:picLocks noChangeAspect="1" noChangeArrowheads="1"/>
+                    </pic:cNvPicPr>
+                  </pic:nvPicPr>
+                  <pic:blipFill>
+                    <a:blip r:embed="rId20" cstate="print">
+                      <a:extLst>
+                        <a:ext uri="{28A0092B-C50C-407E-A947-70E740481C1C}">
+                          <a14:useLocalDpi xmlns:a14="http://schemas.microsoft.com/office/drawing/2010/main" val="0"/>
+                        </a:ext>
+                      </a:extLst>
+                    </a:blip>
+                    <a:srcRect/>
+                    <a:stretch>
+                      <a:fillRect/>
+                    </a:stretch>
+                  </pic:blipFill>
+                  <pic:spPr bwMode="auto">
+                    <a:xfrm>
+                      <a:off x="0" y="0"/>
+                      <a:ext cx="5753735" cy="1552575"/>
+                    </a:xfrm>
+                    <a:prstGeom prst="rect">
+                      <a:avLst/>
+                    </a:prstGeom>
+                    <a:noFill/>
+                    <a:ln>
+                      <a:noFill/>
+                    </a:ln>
+                  </pic:spPr>
+                </pic:pic>
+              </a:graphicData>
+            </a:graphic>
+          </wp:inline>
+        </w:drawing>
+      </w:r>
+    </w:p>
+    <w:p>
+      <w:r>
+        <w:t>Cette méthode va soit afficher les statistiques du parking (action automatique lors de l’affichage du parking). Les statistiques quotidiennes (action de l’utilisateur) ou l’historique des transactions (action de l’utilisateur).</w:t>
+      </w:r>
+    </w:p>
+    <w:p>
+      <w:r>
+        <w:br w:type="page"/>
+      </w:r>
     </w:p>
     <w:p>
       <w:pPr>
         <w:pStyle w:val="Titre1"/>
+      </w:pPr>
+      <w:bookmarkStart w:id="19" w:name="_Toc242003372"/>
+      <w:r>
+        <w:lastRenderedPageBreak/>
+        <w:t>Voiture.cs</w:t>
+      </w:r>
+      <w:bookmarkEnd w:id="19"/>
+    </w:p>
+    <w:p>
+      <w:pPr>
+        <w:pStyle w:val="Titre3"/>
+      </w:pPr>
+      <w:r>
+        <w:tab/>
+      </w:r>
+      <w:bookmarkStart w:id="20" w:name="_Toc242003373"/>
+      <w:r>
+        <w:t>LicensingPlate</w:t>
+      </w:r>
+      <w:bookmarkEnd w:id="20"/>
+    </w:p>
+    <w:p>
+      <w:pPr>
+        <w:jc w:val="center"/>
+      </w:pPr>
+      <w:r>
+        <w:rPr>
+          <w:noProof/>
+        </w:rPr>
+        <w:drawing>
+          <wp:inline distT="0" distB="0" distL="0" distR="0" wp14:anchorId="4B3DB82A" wp14:editId="4311A714">
+            <wp:extent cx="5758180" cy="3209290"/>
+            <wp:effectExtent l="0" t="0" r="0" b="0"/>
+            <wp:docPr id="1527597661" name="Image 14"/>
+            <wp:cNvGraphicFramePr>
+              <a:graphicFrameLocks xmlns:a="http://schemas.openxmlformats.org/drawingml/2006/main" noChangeAspect="1"/>
+            </wp:cNvGraphicFramePr>
+            <a:graphic xmlns:a="http://schemas.openxmlformats.org/drawingml/2006/main">
+              <a:graphicData uri="http://schemas.openxmlformats.org/drawingml/2006/picture">
+                <pic:pic xmlns:pic="http://schemas.openxmlformats.org/drawingml/2006/picture">
+                  <pic:nvPicPr>
+                    <pic:cNvPr id="0" name="Picture 14"/>
+                    <pic:cNvPicPr>
+                      <a:picLocks noChangeAspect="1" noChangeArrowheads="1"/>
+                    </pic:cNvPicPr>
+                  </pic:nvPicPr>
+                  <pic:blipFill>
+                    <a:blip r:embed="rId21">
+                      <a:extLst>
+                        <a:ext uri="{28A0092B-C50C-407E-A947-70E740481C1C}">
+                          <a14:useLocalDpi xmlns:a14="http://schemas.microsoft.com/office/drawing/2010/main" val="0"/>
+                        </a:ext>
+                      </a:extLst>
+                    </a:blip>
+                    <a:srcRect/>
+                    <a:stretch>
+                      <a:fillRect/>
+                    </a:stretch>
+                  </pic:blipFill>
+                  <pic:spPr bwMode="auto">
+                    <a:xfrm>
+                      <a:off x="0" y="0"/>
+                      <a:ext cx="5758180" cy="3209290"/>
+                    </a:xfrm>
+                    <a:prstGeom prst="rect">
+                      <a:avLst/>
+                    </a:prstGeom>
+                    <a:noFill/>
+                    <a:ln>
+                      <a:noFill/>
+                    </a:ln>
+                  </pic:spPr>
+                </pic:pic>
+              </a:graphicData>
+            </a:graphic>
+          </wp:inline>
+        </w:drawing>
+      </w:r>
+    </w:p>
+    <w:p>
+      <w:r>
+        <w:t>C’est ici qu’on vérifie si la plaque d’immatriculation est écrite dans un format correct ou non. Puis informer l’utilisateur si son véhicule a été ajouté au parking ou non.</w:t>
+      </w:r>
+    </w:p>
+    <w:p>
+      <w:pPr>
+        <w:pStyle w:val="Titre3"/>
+        <w:ind w:firstLine="708"/>
+      </w:pPr>
+      <w:bookmarkStart w:id="21" w:name="_Toc242003374"/>
+      <w:r>
+        <w:t>Constructeur</w:t>
+      </w:r>
+      <w:bookmarkEnd w:id="21"/>
+    </w:p>
+    <w:p>
+      <w:pPr>
+        <w:jc w:val="center"/>
+      </w:pPr>
+      <w:r>
+        <w:rPr>
+          <w:noProof/>
+        </w:rPr>
+        <w:drawing>
+          <wp:inline distT="0" distB="0" distL="0" distR="0" wp14:anchorId="0B38F71C" wp14:editId="2DF6B014">
+            <wp:extent cx="2743200" cy="1493520"/>
+            <wp:effectExtent l="0" t="0" r="0" b="0"/>
+            <wp:docPr id="1680372306" name="Image 15"/>
+            <wp:cNvGraphicFramePr>
+              <a:graphicFrameLocks xmlns:a="http://schemas.openxmlformats.org/drawingml/2006/main" noChangeAspect="1"/>
+            </wp:cNvGraphicFramePr>
+            <a:graphic xmlns:a="http://schemas.openxmlformats.org/drawingml/2006/main">
+              <a:graphicData uri="http://schemas.openxmlformats.org/drawingml/2006/picture">
+                <pic:pic xmlns:pic="http://schemas.openxmlformats.org/drawingml/2006/picture">
+                  <pic:nvPicPr>
+                    <pic:cNvPr id="0" name="Picture 15"/>
+                    <pic:cNvPicPr>
+                      <a:picLocks noChangeAspect="1" noChangeArrowheads="1"/>
+                    </pic:cNvPicPr>
+                  </pic:nvPicPr>
+                  <pic:blipFill>
+                    <a:blip r:embed="rId22">
+                      <a:extLst>
+                        <a:ext uri="{28A0092B-C50C-407E-A947-70E740481C1C}">
+                          <a14:useLocalDpi xmlns:a14="http://schemas.microsoft.com/office/drawing/2010/main" val="0"/>
+                        </a:ext>
+                      </a:extLst>
+                    </a:blip>
+                    <a:srcRect/>
+                    <a:stretch>
+                      <a:fillRect/>
+                    </a:stretch>
+                  </pic:blipFill>
+                  <pic:spPr bwMode="auto">
+                    <a:xfrm>
+                      <a:off x="0" y="0"/>
+                      <a:ext cx="2743200" cy="1493520"/>
+                    </a:xfrm>
+                    <a:prstGeom prst="rect">
+                      <a:avLst/>
+                    </a:prstGeom>
+                    <a:noFill/>
+                    <a:ln>
+                      <a:noFill/>
+                    </a:ln>
+                  </pic:spPr>
+                </pic:pic>
+              </a:graphicData>
+            </a:graphic>
+          </wp:inline>
+        </w:drawing>
+      </w:r>
+    </w:p>
+    <w:p>
+      <w:r>
+        <w:t>Le constructeur. Si le véhicule est valid, on l’ajoute automatiquement au parking, sinon, on ne fait rien.</w:t>
+      </w:r>
+    </w:p>
+    <w:p>
+      <w:r>
+        <w:br w:type="page"/>
+      </w:r>
+    </w:p>
+    <w:p>
+      <w:pPr>
+        <w:pStyle w:val="Titre1"/>
+      </w:pPr>
+      <w:bookmarkStart w:id="22" w:name="_Toc242003375"/>
+      <w:r>
+        <w:lastRenderedPageBreak/>
+        <w:t>Ticket.cs</w:t>
+      </w:r>
+      <w:bookmarkEnd w:id="22"/>
+    </w:p>
+    <w:p>
+      <w:pPr>
+        <w:pStyle w:val="Titre3"/>
+      </w:pPr>
+      <w:r>
+        <w:tab/>
+      </w:r>
+      <w:bookmarkStart w:id="23" w:name="_Toc242003376"/>
+      <w:r>
+        <w:t>Constructeur</w:t>
+      </w:r>
+      <w:bookmarkEnd w:id="23"/>
+    </w:p>
+    <w:p>
+      <w:pPr>
+        <w:jc w:val="center"/>
+      </w:pPr>
+      <w:r>
+        <w:rPr>
+          <w:noProof/>
+        </w:rPr>
+        <w:drawing>
+          <wp:inline distT="0" distB="0" distL="0" distR="0" wp14:anchorId="4A62093C" wp14:editId="17074266">
+            <wp:extent cx="3300095" cy="1294765"/>
+            <wp:effectExtent l="0" t="0" r="0" b="635"/>
+            <wp:docPr id="1336934594" name="Image 16"/>
+            <wp:cNvGraphicFramePr>
+              <a:graphicFrameLocks xmlns:a="http://schemas.openxmlformats.org/drawingml/2006/main" noChangeAspect="1"/>
+            </wp:cNvGraphicFramePr>
+            <a:graphic xmlns:a="http://schemas.openxmlformats.org/drawingml/2006/main">
+              <a:graphicData uri="http://schemas.openxmlformats.org/drawingml/2006/picture">
+                <pic:pic xmlns:pic="http://schemas.openxmlformats.org/drawingml/2006/picture">
+                  <pic:nvPicPr>
+                    <pic:cNvPr id="0" name="Picture 16"/>
+                    <pic:cNvPicPr>
+                      <a:picLocks noChangeAspect="1" noChangeArrowheads="1"/>
+                    </pic:cNvPicPr>
+                  </pic:nvPicPr>
+                  <pic:blipFill>
+                    <a:blip r:embed="rId23">
+                      <a:extLst>
+                        <a:ext uri="{28A0092B-C50C-407E-A947-70E740481C1C}">
+                          <a14:useLocalDpi xmlns:a14="http://schemas.microsoft.com/office/drawing/2010/main" val="0"/>
+                        </a:ext>
+                      </a:extLst>
+                    </a:blip>
+                    <a:srcRect/>
+                    <a:stretch>
+                      <a:fillRect/>
+                    </a:stretch>
+                  </pic:blipFill>
+                  <pic:spPr bwMode="auto">
+                    <a:xfrm>
+                      <a:off x="0" y="0"/>
+                      <a:ext cx="3300095" cy="1294765"/>
+                    </a:xfrm>
+                    <a:prstGeom prst="rect">
+                      <a:avLst/>
+                    </a:prstGeom>
+                    <a:noFill/>
+                    <a:ln>
+                      <a:noFill/>
+                    </a:ln>
+                  </pic:spPr>
+                </pic:pic>
+              </a:graphicData>
+            </a:graphic>
+          </wp:inline>
+        </w:drawing>
+      </w:r>
+    </w:p>
+    <w:p>
+      <w:r>
+        <w:t>On va mettre l’heure d’entrée à l’heure actuel. Lui donné son numéro de place, son tarif horaire, puis lui mettre qu’il est parké (son véhicule parent).</w:t>
+      </w:r>
+    </w:p>
+    <w:p>
+      <w:pPr>
+        <w:pStyle w:val="Titre3"/>
+      </w:pPr>
+      <w:r>
+        <w:tab/>
+      </w:r>
+      <w:bookmarkStart w:id="24" w:name="_Toc242003377"/>
+      <w:r>
+        <w:t>Calc</w:t>
+      </w:r>
+      <w:bookmarkEnd w:id="24"/>
+    </w:p>
+    <w:p>
+      <w:pPr>
+        <w:jc w:val="center"/>
+      </w:pPr>
+      <w:r>
+        <w:rPr>
+          <w:noProof/>
+        </w:rPr>
+        <w:drawing>
+          <wp:inline distT="0" distB="0" distL="0" distR="0" wp14:anchorId="57139524" wp14:editId="64ACC77C">
+            <wp:extent cx="5224145" cy="1792605"/>
+            <wp:effectExtent l="0" t="0" r="0" b="0"/>
+            <wp:docPr id="24933831" name="Image 17"/>
+            <wp:cNvGraphicFramePr>
+              <a:graphicFrameLocks xmlns:a="http://schemas.openxmlformats.org/drawingml/2006/main" noChangeAspect="1"/>
+            </wp:cNvGraphicFramePr>
+            <a:graphic xmlns:a="http://schemas.openxmlformats.org/drawingml/2006/main">
+              <a:graphicData uri="http://schemas.openxmlformats.org/drawingml/2006/picture">
+                <pic:pic xmlns:pic="http://schemas.openxmlformats.org/drawingml/2006/picture">
+                  <pic:nvPicPr>
+                    <pic:cNvPr id="0" name="Picture 17"/>
+                    <pic:cNvPicPr>
+                      <a:picLocks noChangeAspect="1" noChangeArrowheads="1"/>
+                    </pic:cNvPicPr>
+                  </pic:nvPicPr>
+                  <pic:blipFill>
+                    <a:blip r:embed="rId24">
+                      <a:extLst>
+                        <a:ext uri="{28A0092B-C50C-407E-A947-70E740481C1C}">
+                          <a14:useLocalDpi xmlns:a14="http://schemas.microsoft.com/office/drawing/2010/main" val="0"/>
+                        </a:ext>
+                      </a:extLst>
+                    </a:blip>
+                    <a:srcRect/>
+                    <a:stretch>
+                      <a:fillRect/>
+                    </a:stretch>
+                  </pic:blipFill>
+                  <pic:spPr bwMode="auto">
+                    <a:xfrm>
+                      <a:off x="0" y="0"/>
+                      <a:ext cx="5224145" cy="1792605"/>
+                    </a:xfrm>
+                    <a:prstGeom prst="rect">
+                      <a:avLst/>
+                    </a:prstGeom>
+                    <a:noFill/>
+                    <a:ln>
+                      <a:noFill/>
+                    </a:ln>
+                  </pic:spPr>
+                </pic:pic>
+              </a:graphicData>
+            </a:graphic>
+          </wp:inline>
+        </w:drawing>
+      </w:r>
+    </w:p>
+    <w:p>
+      <w:r>
+        <w:t>Cette méthode est exécutée quand le véhicule sort du parking. Le tarif horaire est calculé en fonction du nombre de seconde que le véhicule est resté dans le parking (un parking très couteux).</w:t>
+      </w:r>
+    </w:p>
+    <w:p>
+      <w:pPr>
+        <w:pStyle w:val="Titre3"/>
+        <w:ind w:firstLine="708"/>
+      </w:pPr>
+      <w:bookmarkStart w:id="25" w:name="_Toc242003378"/>
+      <w:r>
+        <w:t>GetCurrentParkedTime</w:t>
+      </w:r>
+      <w:bookmarkEnd w:id="25"/>
+    </w:p>
+    <w:p>
+      <w:r>
+        <w:t>Cette méthode qui fait 2 lignes de code permet simplement de calculer le temp de stationnement actuel (utiliser pour les statistiques quotidiennes).</w:t>
+      </w:r>
+    </w:p>
+    <w:p>
+      <w:r>
+        <w:br w:type="page"/>
+      </w:r>
+    </w:p>
+    <w:p>
+      <w:pPr>
+        <w:pStyle w:val="Titre1"/>
         <w:rPr>
           <w:color w:val="auto"/>
         </w:rPr>
       </w:pPr>
-      <w:bookmarkStart w:id="4" w:name="_Toc238807542"/>
+      <w:bookmarkStart w:id="26" w:name="_Toc242003379"/>
       <w:r>
         <w:rPr>
           <w:color w:val="auto"/>
         </w:rPr>
+        <w:lastRenderedPageBreak/>
+        <w:t>Tests</w:t>
+      </w:r>
+      <w:bookmarkEnd w:id="26"/>
+    </w:p>
+    <w:p>
+      <w:r>
+        <w:t>Êtes-vous sûr de vouloir retirer ce véhicule ? Oui = 1. Non = 0.</w:t>
+      </w:r>
+    </w:p>
+    <w:p>
+      <w:r>
+        <w:t>Valeur entrer : r</w:t>
+      </w:r>
+    </w:p>
+    <w:p>
+      <w:r>
+        <w:rPr>
+          <w:noProof/>
+        </w:rPr>
+        <w:drawing>
+          <wp:inline distT="0" distB="0" distL="0" distR="0" wp14:anchorId="70F9BB68" wp14:editId="2772319D">
+            <wp:extent cx="2064385" cy="366395"/>
+            <wp:effectExtent l="0" t="0" r="0" b="0"/>
+            <wp:docPr id="993349028" name="Image 18"/>
+            <wp:cNvGraphicFramePr>
+              <a:graphicFrameLocks xmlns:a="http://schemas.openxmlformats.org/drawingml/2006/main" noChangeAspect="1"/>
+            </wp:cNvGraphicFramePr>
+            <a:graphic xmlns:a="http://schemas.openxmlformats.org/drawingml/2006/main">
+              <a:graphicData uri="http://schemas.openxmlformats.org/drawingml/2006/picture">
+                <pic:pic xmlns:pic="http://schemas.openxmlformats.org/drawingml/2006/picture">
+                  <pic:nvPicPr>
+                    <pic:cNvPr id="0" name="Picture 18"/>
+                    <pic:cNvPicPr>
+                      <a:picLocks noChangeAspect="1" noChangeArrowheads="1"/>
+                    </pic:cNvPicPr>
+                  </pic:nvPicPr>
+                  <pic:blipFill>
+                    <a:blip r:embed="rId25">
+                      <a:extLst>
+                        <a:ext uri="{28A0092B-C50C-407E-A947-70E740481C1C}">
+                          <a14:useLocalDpi xmlns:a14="http://schemas.microsoft.com/office/drawing/2010/main" val="0"/>
+                        </a:ext>
+                      </a:extLst>
+                    </a:blip>
+                    <a:srcRect/>
+                    <a:stretch>
+                      <a:fillRect/>
+                    </a:stretch>
+                  </pic:blipFill>
+                  <pic:spPr bwMode="auto">
+                    <a:xfrm>
+                      <a:off x="0" y="0"/>
+                      <a:ext cx="2064385" cy="366395"/>
+                    </a:xfrm>
+                    <a:prstGeom prst="rect">
+                      <a:avLst/>
+                    </a:prstGeom>
+                    <a:noFill/>
+                    <a:ln>
+                      <a:noFill/>
+                    </a:ln>
+                  </pic:spPr>
+                </pic:pic>
+              </a:graphicData>
+            </a:graphic>
+          </wp:inline>
+        </w:drawing>
+      </w:r>
+    </w:p>
+    <w:p/>
+    <w:p>
+      <w:r>
+        <w:t>Format incorrecte pour l’ajout d’un véhicule</w:t>
+      </w:r>
+    </w:p>
+    <w:p>
+      <w:r>
+        <w:rPr>
+          <w:noProof/>
+        </w:rPr>
+        <w:drawing>
+          <wp:inline distT="0" distB="0" distL="0" distR="0" wp14:anchorId="4FB78592" wp14:editId="55859703">
+            <wp:extent cx="5758180" cy="715010"/>
+            <wp:effectExtent l="0" t="0" r="0" b="8890"/>
+            <wp:docPr id="1003939034" name="Image 19"/>
+            <wp:cNvGraphicFramePr>
+              <a:graphicFrameLocks xmlns:a="http://schemas.openxmlformats.org/drawingml/2006/main" noChangeAspect="1"/>
+            </wp:cNvGraphicFramePr>
+            <a:graphic xmlns:a="http://schemas.openxmlformats.org/drawingml/2006/main">
+              <a:graphicData uri="http://schemas.openxmlformats.org/drawingml/2006/picture">
+                <pic:pic xmlns:pic="http://schemas.openxmlformats.org/drawingml/2006/picture">
+                  <pic:nvPicPr>
+                    <pic:cNvPr id="0" name="Picture 19"/>
+                    <pic:cNvPicPr>
+                      <a:picLocks noChangeAspect="1" noChangeArrowheads="1"/>
+                    </pic:cNvPicPr>
+                  </pic:nvPicPr>
+                  <pic:blipFill>
+                    <a:blip r:embed="rId26">
+                      <a:extLst>
+                        <a:ext uri="{28A0092B-C50C-407E-A947-70E740481C1C}">
+                          <a14:useLocalDpi xmlns:a14="http://schemas.microsoft.com/office/drawing/2010/main" val="0"/>
+                        </a:ext>
+                      </a:extLst>
+                    </a:blip>
+                    <a:srcRect/>
+                    <a:stretch>
+                      <a:fillRect/>
+                    </a:stretch>
+                  </pic:blipFill>
+                  <pic:spPr bwMode="auto">
+                    <a:xfrm>
+                      <a:off x="0" y="0"/>
+                      <a:ext cx="5758180" cy="715010"/>
+                    </a:xfrm>
+                    <a:prstGeom prst="rect">
+                      <a:avLst/>
+                    </a:prstGeom>
+                    <a:noFill/>
+                    <a:ln>
+                      <a:noFill/>
+                    </a:ln>
+                  </pic:spPr>
+                </pic:pic>
+              </a:graphicData>
+            </a:graphic>
+          </wp:inline>
+        </w:drawing>
+      </w:r>
+    </w:p>
+    <w:p/>
+    <w:p>
+      <w:r>
+        <w:t>Valeur d’option trop grande et trop petite</w:t>
+      </w:r>
+    </w:p>
+    <w:p>
+      <w:r>
+        <w:rPr>
+          <w:noProof/>
+        </w:rPr>
+        <w:drawing>
+          <wp:inline distT="0" distB="0" distL="0" distR="0" wp14:anchorId="50FCA849" wp14:editId="586EF6BC">
+            <wp:extent cx="3702685" cy="706120"/>
+            <wp:effectExtent l="0" t="0" r="0" b="0"/>
+            <wp:docPr id="821205103" name="Image 20"/>
+            <wp:cNvGraphicFramePr>
+              <a:graphicFrameLocks xmlns:a="http://schemas.openxmlformats.org/drawingml/2006/main" noChangeAspect="1"/>
+            </wp:cNvGraphicFramePr>
+            <a:graphic xmlns:a="http://schemas.openxmlformats.org/drawingml/2006/main">
+              <a:graphicData uri="http://schemas.openxmlformats.org/drawingml/2006/picture">
+                <pic:pic xmlns:pic="http://schemas.openxmlformats.org/drawingml/2006/picture">
+                  <pic:nvPicPr>
+                    <pic:cNvPr id="0" name="Picture 20"/>
+                    <pic:cNvPicPr>
+                      <a:picLocks noChangeAspect="1" noChangeArrowheads="1"/>
+                    </pic:cNvPicPr>
+                  </pic:nvPicPr>
+                  <pic:blipFill>
+                    <a:blip r:embed="rId27">
+                      <a:extLst>
+                        <a:ext uri="{28A0092B-C50C-407E-A947-70E740481C1C}">
+                          <a14:useLocalDpi xmlns:a14="http://schemas.microsoft.com/office/drawing/2010/main" val="0"/>
+                        </a:ext>
+                      </a:extLst>
+                    </a:blip>
+                    <a:srcRect/>
+                    <a:stretch>
+                      <a:fillRect/>
+                    </a:stretch>
+                  </pic:blipFill>
+                  <pic:spPr bwMode="auto">
+                    <a:xfrm>
+                      <a:off x="0" y="0"/>
+                      <a:ext cx="3702685" cy="706120"/>
+                    </a:xfrm>
+                    <a:prstGeom prst="rect">
+                      <a:avLst/>
+                    </a:prstGeom>
+                    <a:noFill/>
+                    <a:ln>
+                      <a:noFill/>
+                    </a:ln>
+                  </pic:spPr>
+                </pic:pic>
+              </a:graphicData>
+            </a:graphic>
+          </wp:inline>
+        </w:drawing>
+      </w:r>
+      <w:r>
+        <w:rPr>
+          <w:noProof/>
+        </w:rPr>
+        <w:drawing>
+          <wp:inline distT="0" distB="0" distL="0" distR="0" wp14:anchorId="3884D3A0" wp14:editId="0BD3ADD2">
+            <wp:extent cx="3702685" cy="724535"/>
+            <wp:effectExtent l="0" t="0" r="0" b="0"/>
+            <wp:docPr id="96872843" name="Image 21"/>
+            <wp:cNvGraphicFramePr>
+              <a:graphicFrameLocks xmlns:a="http://schemas.openxmlformats.org/drawingml/2006/main" noChangeAspect="1"/>
+            </wp:cNvGraphicFramePr>
+            <a:graphic xmlns:a="http://schemas.openxmlformats.org/drawingml/2006/main">
+              <a:graphicData uri="http://schemas.openxmlformats.org/drawingml/2006/picture">
+                <pic:pic xmlns:pic="http://schemas.openxmlformats.org/drawingml/2006/picture">
+                  <pic:nvPicPr>
+                    <pic:cNvPr id="0" name="Picture 21"/>
+                    <pic:cNvPicPr>
+                      <a:picLocks noChangeAspect="1" noChangeArrowheads="1"/>
+                    </pic:cNvPicPr>
+                  </pic:nvPicPr>
+                  <pic:blipFill>
+                    <a:blip r:embed="rId28">
+                      <a:extLst>
+                        <a:ext uri="{28A0092B-C50C-407E-A947-70E740481C1C}">
+                          <a14:useLocalDpi xmlns:a14="http://schemas.microsoft.com/office/drawing/2010/main" val="0"/>
+                        </a:ext>
+                      </a:extLst>
+                    </a:blip>
+                    <a:srcRect/>
+                    <a:stretch>
+                      <a:fillRect/>
+                    </a:stretch>
+                  </pic:blipFill>
+                  <pic:spPr bwMode="auto">
+                    <a:xfrm>
+                      <a:off x="0" y="0"/>
+                      <a:ext cx="3702685" cy="724535"/>
+                    </a:xfrm>
+                    <a:prstGeom prst="rect">
+                      <a:avLst/>
+                    </a:prstGeom>
+                    <a:noFill/>
+                    <a:ln>
+                      <a:noFill/>
+                    </a:ln>
+                  </pic:spPr>
+                </pic:pic>
+              </a:graphicData>
+            </a:graphic>
+          </wp:inline>
+        </w:drawing>
+      </w:r>
+    </w:p>
+    <w:p/>
+    <w:p>
+      <w:r>
+        <w:t>Rechercher un véhicule inexistant</w:t>
+      </w:r>
+    </w:p>
+    <w:p>
+      <w:r>
+        <w:rPr>
+          <w:noProof/>
+        </w:rPr>
+        <w:drawing>
+          <wp:inline distT="0" distB="0" distL="0" distR="0" wp14:anchorId="0C249864" wp14:editId="045475B0">
+            <wp:extent cx="5758180" cy="891540"/>
+            <wp:effectExtent l="0" t="0" r="0" b="3810"/>
+            <wp:docPr id="1093832271" name="Image 22"/>
+            <wp:cNvGraphicFramePr>
+              <a:graphicFrameLocks xmlns:a="http://schemas.openxmlformats.org/drawingml/2006/main" noChangeAspect="1"/>
+            </wp:cNvGraphicFramePr>
+            <a:graphic xmlns:a="http://schemas.openxmlformats.org/drawingml/2006/main">
+              <a:graphicData uri="http://schemas.openxmlformats.org/drawingml/2006/picture">
+                <pic:pic xmlns:pic="http://schemas.openxmlformats.org/drawingml/2006/picture">
+                  <pic:nvPicPr>
+                    <pic:cNvPr id="0" name="Picture 22"/>
+                    <pic:cNvPicPr>
+                      <a:picLocks noChangeAspect="1" noChangeArrowheads="1"/>
+                    </pic:cNvPicPr>
+                  </pic:nvPicPr>
+                  <pic:blipFill>
+                    <a:blip r:embed="rId29">
+                      <a:extLst>
+                        <a:ext uri="{28A0092B-C50C-407E-A947-70E740481C1C}">
+                          <a14:useLocalDpi xmlns:a14="http://schemas.microsoft.com/office/drawing/2010/main" val="0"/>
+                        </a:ext>
+                      </a:extLst>
+                    </a:blip>
+                    <a:srcRect/>
+                    <a:stretch>
+                      <a:fillRect/>
+                    </a:stretch>
+                  </pic:blipFill>
+                  <pic:spPr bwMode="auto">
+                    <a:xfrm>
+                      <a:off x="0" y="0"/>
+                      <a:ext cx="5758180" cy="891540"/>
+                    </a:xfrm>
+                    <a:prstGeom prst="rect">
+                      <a:avLst/>
+                    </a:prstGeom>
+                    <a:noFill/>
+                    <a:ln>
+                      <a:noFill/>
+                    </a:ln>
+                  </pic:spPr>
+                </pic:pic>
+              </a:graphicData>
+            </a:graphic>
+          </wp:inline>
+        </w:drawing>
+      </w:r>
+    </w:p>
+    <w:p>
+      <w:r>
+        <w:br w:type="page"/>
+      </w:r>
+    </w:p>
+    <w:p>
+      <w:pPr>
+        <w:pStyle w:val="Titre1"/>
+        <w:rPr>
+          <w:color w:val="auto"/>
+        </w:rPr>
+      </w:pPr>
+      <w:bookmarkStart w:id="27" w:name="_Toc242003380"/>
+      <w:r>
+        <w:rPr>
+          <w:color w:val="auto"/>
+        </w:rPr>
+        <w:lastRenderedPageBreak/>
         <w:t>Conclusion</w:t>
       </w:r>
-      <w:bookmarkEnd w:id="4"/>
+      <w:bookmarkEnd w:id="27"/>
     </w:p>
     <w:p>
       <w:pPr>
@@ -1659,16 +5041,28 @@
           <w:color w:val="auto"/>
         </w:rPr>
       </w:pPr>
-      <w:bookmarkStart w:id="5" w:name="_Toc238807543"/>
+      <w:bookmarkStart w:id="28" w:name="_Toc242003381"/>
       <w:r>
         <w:rPr>
           <w:color w:val="auto"/>
         </w:rPr>
         <w:t>Bilan personnel</w:t>
       </w:r>
-      <w:bookmarkEnd w:id="5"/>
-    </w:p>
-    <w:p/>
+      <w:bookmarkEnd w:id="28"/>
+    </w:p>
+    <w:p>
+      <w:r>
+        <w:t xml:space="preserve">Sur ce projet je trouve que j’ai fait un bon travail à comprendre comment utiliser les objets, et comment les manipulés. Mais je trouve que j’aurais pu faire un meilleur travaille </w:t>
+      </w:r>
+      <w:r>
+        <w:t>à rédiger mon rapport.</w:t>
+      </w:r>
+    </w:p>
+    <w:p>
+      <w:r>
+        <w:t>À par ça je suis satisfait, j’ai évité le plus possible la redondance dans mon code, j’ai bien commenté, bien nommé mes variables, etc…</w:t>
+      </w:r>
+    </w:p>
     <w:p>
       <w:pPr>
         <w:pStyle w:val="Titre2"/>
@@ -1677,18 +5071,246 @@
           <w:color w:val="auto"/>
         </w:rPr>
       </w:pPr>
-      <w:bookmarkStart w:id="6" w:name="_Toc238807544"/>
+      <w:bookmarkStart w:id="29" w:name="_Toc242003382"/>
       <w:r>
         <w:rPr>
           <w:color w:val="auto"/>
         </w:rPr>
         <w:t>Bilan des fonctionnalités</w:t>
       </w:r>
-      <w:bookmarkEnd w:id="6"/>
-    </w:p>
+      <w:bookmarkEnd w:id="29"/>
+    </w:p>
+    <w:p>
+      <w:r>
+        <w:t>Listes des fonctionnalités présentes et leur état de fonctionnement :</w:t>
+      </w:r>
+    </w:p>
+    <w:tbl>
+      <w:tblPr>
+        <w:tblStyle w:val="Grilledutableau"/>
+        <w:tblW w:w="0" w:type="auto"/>
+        <w:tblLook w:val="04A0" w:firstRow="1" w:lastRow="0" w:firstColumn="1" w:lastColumn="0" w:noHBand="0" w:noVBand="1"/>
+      </w:tblPr>
+      <w:tblGrid>
+        <w:gridCol w:w="4531"/>
+        <w:gridCol w:w="4531"/>
+      </w:tblGrid>
+      <w:tr>
+        <w:tc>
+          <w:tcPr>
+            <w:tcW w:w="4531" w:type="dxa"/>
+          </w:tcPr>
+          <w:p>
+            <w:pPr>
+              <w:jc w:val="center"/>
+              <w:rPr>
+                <w:b/>
+                <w:bCs/>
+              </w:rPr>
+            </w:pPr>
+            <w:r>
+              <w:rPr>
+                <w:b/>
+                <w:bCs/>
+              </w:rPr>
+              <w:t>Fonctionnalité</w:t>
+            </w:r>
+          </w:p>
+        </w:tc>
+        <w:tc>
+          <w:tcPr>
+            <w:tcW w:w="4531" w:type="dxa"/>
+          </w:tcPr>
+          <w:p>
+            <w:pPr>
+              <w:jc w:val="center"/>
+              <w:rPr>
+                <w:b/>
+                <w:bCs/>
+              </w:rPr>
+            </w:pPr>
+            <w:r>
+              <w:rPr>
+                <w:b/>
+                <w:bCs/>
+              </w:rPr>
+              <w:t>État de fonctionnement</w:t>
+            </w:r>
+          </w:p>
+        </w:tc>
+      </w:tr>
+      <w:tr>
+        <w:tc>
+          <w:tcPr>
+            <w:tcW w:w="4531" w:type="dxa"/>
+          </w:tcPr>
+          <w:p>
+            <w:pPr>
+              <w:jc w:val="center"/>
+            </w:pPr>
+            <w:r>
+              <w:t>Ajouter un véhicule</w:t>
+            </w:r>
+          </w:p>
+        </w:tc>
+        <w:tc>
+          <w:tcPr>
+            <w:tcW w:w="4531" w:type="dxa"/>
+          </w:tcPr>
+          <w:p>
+            <w:pPr>
+              <w:jc w:val="center"/>
+            </w:pPr>
+            <w:r>
+              <w:t>100% fonctionnel</w:t>
+            </w:r>
+          </w:p>
+        </w:tc>
+      </w:tr>
+      <w:tr>
+        <w:tc>
+          <w:tcPr>
+            <w:tcW w:w="4531" w:type="dxa"/>
+          </w:tcPr>
+          <w:p>
+            <w:pPr>
+              <w:jc w:val="center"/>
+            </w:pPr>
+            <w:r>
+              <w:t>Rechercher un véhicule</w:t>
+            </w:r>
+          </w:p>
+        </w:tc>
+        <w:tc>
+          <w:tcPr>
+            <w:tcW w:w="4531" w:type="dxa"/>
+          </w:tcPr>
+          <w:p>
+            <w:pPr>
+              <w:jc w:val="center"/>
+            </w:pPr>
+            <w:r>
+              <w:t>100% fonctionnel</w:t>
+            </w:r>
+          </w:p>
+        </w:tc>
+      </w:tr>
+      <w:tr>
+        <w:tc>
+          <w:tcPr>
+            <w:tcW w:w="4531" w:type="dxa"/>
+          </w:tcPr>
+          <w:p>
+            <w:pPr>
+              <w:jc w:val="center"/>
+            </w:pPr>
+            <w:r>
+              <w:t>Retirer un véhicule</w:t>
+            </w:r>
+          </w:p>
+        </w:tc>
+        <w:tc>
+          <w:tcPr>
+            <w:tcW w:w="4531" w:type="dxa"/>
+          </w:tcPr>
+          <w:p>
+            <w:pPr>
+              <w:jc w:val="center"/>
+            </w:pPr>
+            <w:r>
+              <w:t>100% fonctionnel</w:t>
+            </w:r>
+          </w:p>
+        </w:tc>
+      </w:tr>
+      <w:tr>
+        <w:tc>
+          <w:tcPr>
+            <w:tcW w:w="4531" w:type="dxa"/>
+          </w:tcPr>
+          <w:p>
+            <w:pPr>
+              <w:jc w:val="center"/>
+            </w:pPr>
+            <w:r>
+              <w:t>Afficher l’état du parking</w:t>
+            </w:r>
+          </w:p>
+        </w:tc>
+        <w:tc>
+          <w:tcPr>
+            <w:tcW w:w="4531" w:type="dxa"/>
+          </w:tcPr>
+          <w:p>
+            <w:pPr>
+              <w:jc w:val="center"/>
+            </w:pPr>
+            <w:r>
+              <w:t>100% fonctionnel</w:t>
+            </w:r>
+          </w:p>
+        </w:tc>
+      </w:tr>
+      <w:tr>
+        <w:tc>
+          <w:tcPr>
+            <w:tcW w:w="4531" w:type="dxa"/>
+          </w:tcPr>
+          <w:p>
+            <w:pPr>
+              <w:jc w:val="center"/>
+            </w:pPr>
+            <w:r>
+              <w:t>Afficher les stats du jour</w:t>
+            </w:r>
+          </w:p>
+        </w:tc>
+        <w:tc>
+          <w:tcPr>
+            <w:tcW w:w="4531" w:type="dxa"/>
+          </w:tcPr>
+          <w:p>
+            <w:pPr>
+              <w:jc w:val="center"/>
+            </w:pPr>
+            <w:r>
+              <w:t>100% fonctionnel</w:t>
+            </w:r>
+          </w:p>
+        </w:tc>
+      </w:tr>
+      <w:tr>
+        <w:tc>
+          <w:tcPr>
+            <w:tcW w:w="4531" w:type="dxa"/>
+          </w:tcPr>
+          <w:p>
+            <w:pPr>
+              <w:jc w:val="center"/>
+            </w:pPr>
+            <w:r>
+              <w:t>Afficher l’historique des transactions</w:t>
+            </w:r>
+          </w:p>
+        </w:tc>
+        <w:tc>
+          <w:tcPr>
+            <w:tcW w:w="4531" w:type="dxa"/>
+          </w:tcPr>
+          <w:p>
+            <w:pPr>
+              <w:jc w:val="center"/>
+            </w:pPr>
+            <w:r>
+              <w:t>100% fonctionnel</w:t>
+            </w:r>
+          </w:p>
+        </w:tc>
+      </w:tr>
+    </w:tbl>
     <w:p/>
     <w:sectPr>
-      <w:footerReference w:type="default" r:id="rId8"/>
+      <w:footerReference w:type="default" r:id="rId30"/>
       <w:pgSz w:w="11906" w:h="16838"/>
       <w:pgMar w:top="1417" w:right="1417" w:bottom="1417" w:left="1417" w:header="708" w:footer="708" w:gutter="0"/>
       <w:pgNumType w:start="0"/>
@@ -2565,7 +6187,6 @@
     <w:next w:val="Normal"/>
     <w:link w:val="Titre3Car"/>
     <w:uiPriority w:val="9"/>
-    <w:semiHidden/>
     <w:unhideWhenUsed/>
     <w:qFormat/>
     <w:rsid w:val="00A2254D"/>
@@ -2772,7 +6393,6 @@
     <w:basedOn w:val="Policepardfaut"/>
     <w:link w:val="Titre3"/>
     <w:uiPriority w:val="9"/>
-    <w:semiHidden/>
     <w:rsid w:val="00A2254D"/>
     <w:rPr>
       <w:rFonts w:eastAsiaTheme="majorEastAsia" w:cstheme="majorBidi"/>
@@ -3204,6 +6824,19 @@
       <w:shd w:val="clear" w:color="auto" w:fill="E1DFDD"/>
     </w:rPr>
   </w:style>
+  <w:style w:type="paragraph" w:styleId="TM3">
+    <w:name w:val="toc 3"/>
+    <w:basedOn w:val="Normal"/>
+    <w:next w:val="Normal"/>
+    <w:autoRedefine/>
+    <w:uiPriority w:val="39"/>
+    <w:unhideWhenUsed/>
+    <w:rsid w:val="00901E14"/>
+    <w:pPr>
+      <w:spacing w:after="100"/>
+      <w:ind w:left="480"/>
+    </w:pPr>
+  </w:style>
 </w:styles>
 </file>
 
@@ -3305,20 +6938,24 @@
     <w:rsid w:val="00026023"/>
     <w:rsid w:val="000805B5"/>
     <w:rsid w:val="000B25E6"/>
+    <w:rsid w:val="00211AEE"/>
     <w:rsid w:val="002907FD"/>
     <w:rsid w:val="002C61A5"/>
     <w:rsid w:val="00482DE2"/>
+    <w:rsid w:val="005B37DF"/>
     <w:rsid w:val="005D009D"/>
     <w:rsid w:val="005E5E67"/>
     <w:rsid w:val="006242E2"/>
     <w:rsid w:val="00665836"/>
     <w:rsid w:val="009068F7"/>
+    <w:rsid w:val="009E71B4"/>
     <w:rsid w:val="00A4481E"/>
     <w:rsid w:val="00AC09D7"/>
     <w:rsid w:val="00BA66F6"/>
     <w:rsid w:val="00C15624"/>
     <w:rsid w:val="00CD419C"/>
     <w:rsid w:val="00DF50E4"/>
+    <w:rsid w:val="00F04970"/>
     <w:rsid w:val="00FF1E6D"/>
   </w:rsids>
   <m:mathPr>
@@ -3336,7 +6973,7 @@
   </m:mathPr>
   <w:themeFontLang w:val="fr-CH"/>
   <w:clrSchemeMapping w:bg1="light1" w:t1="dark1" w:bg2="light2" w:t2="dark2" w:accent1="accent1" w:accent2="accent2" w:accent3="accent3" w:accent4="accent4" w:accent5="accent5" w:accent6="accent6" w:hyperlink="hyperlink" w:followedHyperlink="followedHyperlink"/>
-  <w:decimalSymbol w:val="."/>
+  <w:decimalSymbol w:val=","/>
   <w:listSeparator w:val=";"/>
   <w15:chartTrackingRefBased/>
 </w:settings>

</xml_diff>

<commit_message>
(doc(IA et pied de page): Documenter l'utilisation de l'IA et modification du pied de page (nom de l'auteur et du fichier)
</commit_message>
<xml_diff>
--- a/R-320-NicolasMarques-Rapport.docx
+++ b/R-320-NicolasMarques-Rapport.docx
@@ -139,7 +139,7 @@
           <w:r>
             <w:fldChar w:fldCharType="separate"/>
           </w:r>
-          <w:hyperlink w:anchor="_Toc242090661" w:history="1">
+          <w:hyperlink w:anchor="_Toc242092008" w:history="1">
             <w:r>
               <w:rPr>
                 <w:rStyle w:val="Lienhypertexte"/>
@@ -166,7 +166,7 @@
                 <w:noProof/>
                 <w:webHidden/>
               </w:rPr>
-              <w:instrText xml:space="preserve"> PAGEREF _Toc242090661 \h </w:instrText>
+              <w:instrText xml:space="preserve"> PAGEREF _Toc242092008 \h </w:instrText>
             </w:r>
             <w:r>
               <w:rPr>
@@ -186,7 +186,7 @@
                 <w:noProof/>
                 <w:webHidden/>
               </w:rPr>
-              <w:t>2</w:t>
+              <w:t>3</w:t>
             </w:r>
             <w:r>
               <w:rPr>
@@ -209,7 +209,7 @@
               <w:lang w:eastAsia="fr-CH"/>
             </w:rPr>
           </w:pPr>
-          <w:hyperlink w:anchor="_Toc242090662" w:history="1">
+          <w:hyperlink w:anchor="_Toc242092009" w:history="1">
             <w:r>
               <w:rPr>
                 <w:rStyle w:val="Lienhypertexte"/>
@@ -236,7 +236,7 @@
                 <w:noProof/>
                 <w:webHidden/>
               </w:rPr>
-              <w:instrText xml:space="preserve"> PAGEREF _Toc242090662 \h </w:instrText>
+              <w:instrText xml:space="preserve"> PAGEREF _Toc242092009 \h </w:instrText>
             </w:r>
             <w:r>
               <w:rPr>
@@ -256,7 +256,7 @@
                 <w:noProof/>
                 <w:webHidden/>
               </w:rPr>
-              <w:t>5</w:t>
+              <w:t>6</w:t>
             </w:r>
             <w:r>
               <w:rPr>
@@ -279,7 +279,7 @@
               <w:lang w:eastAsia="fr-CH"/>
             </w:rPr>
           </w:pPr>
-          <w:hyperlink w:anchor="_Toc242090663" w:history="1">
+          <w:hyperlink w:anchor="_Toc242092010" w:history="1">
             <w:r>
               <w:rPr>
                 <w:rStyle w:val="Lienhypertexte"/>
@@ -306,7 +306,7 @@
                 <w:noProof/>
                 <w:webHidden/>
               </w:rPr>
-              <w:instrText xml:space="preserve"> PAGEREF _Toc242090663 \h </w:instrText>
+              <w:instrText xml:space="preserve"> PAGEREF _Toc242092010 \h </w:instrText>
             </w:r>
             <w:r>
               <w:rPr>
@@ -326,7 +326,7 @@
                 <w:noProof/>
                 <w:webHidden/>
               </w:rPr>
-              <w:t>5</w:t>
+              <w:t>6</w:t>
             </w:r>
             <w:r>
               <w:rPr>
@@ -349,7 +349,7 @@
               <w:lang w:eastAsia="fr-CH"/>
             </w:rPr>
           </w:pPr>
-          <w:hyperlink w:anchor="_Toc242090664" w:history="1">
+          <w:hyperlink w:anchor="_Toc242092011" w:history="1">
             <w:r>
               <w:rPr>
                 <w:rStyle w:val="Lienhypertexte"/>
@@ -376,7 +376,7 @@
                 <w:noProof/>
                 <w:webHidden/>
               </w:rPr>
-              <w:instrText xml:space="preserve"> PAGEREF _Toc242090664 \h </w:instrText>
+              <w:instrText xml:space="preserve"> PAGEREF _Toc242092011 \h </w:instrText>
             </w:r>
             <w:r>
               <w:rPr>
@@ -396,7 +396,7 @@
                 <w:noProof/>
                 <w:webHidden/>
               </w:rPr>
-              <w:t>6</w:t>
+              <w:t>7</w:t>
             </w:r>
             <w:r>
               <w:rPr>
@@ -419,7 +419,7 @@
               <w:lang w:eastAsia="fr-CH"/>
             </w:rPr>
           </w:pPr>
-          <w:hyperlink w:anchor="_Toc242090665" w:history="1">
+          <w:hyperlink w:anchor="_Toc242092012" w:history="1">
             <w:r>
               <w:rPr>
                 <w:rStyle w:val="Lienhypertexte"/>
@@ -446,7 +446,7 @@
                 <w:noProof/>
                 <w:webHidden/>
               </w:rPr>
-              <w:instrText xml:space="preserve"> PAGEREF _Toc242090665 \h </w:instrText>
+              <w:instrText xml:space="preserve"> PAGEREF _Toc242092012 \h </w:instrText>
             </w:r>
             <w:r>
               <w:rPr>
@@ -466,7 +466,7 @@
                 <w:noProof/>
                 <w:webHidden/>
               </w:rPr>
-              <w:t>6</w:t>
+              <w:t>7</w:t>
             </w:r>
             <w:r>
               <w:rPr>
@@ -489,7 +489,7 @@
               <w:lang w:eastAsia="fr-CH"/>
             </w:rPr>
           </w:pPr>
-          <w:hyperlink w:anchor="_Toc242090666" w:history="1">
+          <w:hyperlink w:anchor="_Toc242092013" w:history="1">
             <w:r>
               <w:rPr>
                 <w:rStyle w:val="Lienhypertexte"/>
@@ -516,7 +516,7 @@
                 <w:noProof/>
                 <w:webHidden/>
               </w:rPr>
-              <w:instrText xml:space="preserve"> PAGEREF _Toc242090666 \h </w:instrText>
+              <w:instrText xml:space="preserve"> PAGEREF _Toc242092013 \h </w:instrText>
             </w:r>
             <w:r>
               <w:rPr>
@@ -536,7 +536,7 @@
                 <w:noProof/>
                 <w:webHidden/>
               </w:rPr>
-              <w:t>7</w:t>
+              <w:t>8</w:t>
             </w:r>
             <w:r>
               <w:rPr>
@@ -559,7 +559,7 @@
               <w:lang w:eastAsia="fr-CH"/>
             </w:rPr>
           </w:pPr>
-          <w:hyperlink w:anchor="_Toc242090667" w:history="1">
+          <w:hyperlink w:anchor="_Toc242092014" w:history="1">
             <w:r>
               <w:rPr>
                 <w:rStyle w:val="Lienhypertexte"/>
@@ -586,7 +586,7 @@
                 <w:noProof/>
                 <w:webHidden/>
               </w:rPr>
-              <w:instrText xml:space="preserve"> PAGEREF _Toc242090667 \h </w:instrText>
+              <w:instrText xml:space="preserve"> PAGEREF _Toc242092014 \h </w:instrText>
             </w:r>
             <w:r>
               <w:rPr>
@@ -606,7 +606,7 @@
                 <w:noProof/>
                 <w:webHidden/>
               </w:rPr>
-              <w:t>7</w:t>
+              <w:t>8</w:t>
             </w:r>
             <w:r>
               <w:rPr>
@@ -629,7 +629,7 @@
               <w:lang w:eastAsia="fr-CH"/>
             </w:rPr>
           </w:pPr>
-          <w:hyperlink w:anchor="_Toc242090668" w:history="1">
+          <w:hyperlink w:anchor="_Toc242092015" w:history="1">
             <w:r>
               <w:rPr>
                 <w:rStyle w:val="Lienhypertexte"/>
@@ -656,7 +656,7 @@
                 <w:noProof/>
                 <w:webHidden/>
               </w:rPr>
-              <w:instrText xml:space="preserve"> PAGEREF _Toc242090668 \h </w:instrText>
+              <w:instrText xml:space="preserve"> PAGEREF _Toc242092015 \h </w:instrText>
             </w:r>
             <w:r>
               <w:rPr>
@@ -676,7 +676,7 @@
                 <w:noProof/>
                 <w:webHidden/>
               </w:rPr>
-              <w:t>8</w:t>
+              <w:t>9</w:t>
             </w:r>
             <w:r>
               <w:rPr>
@@ -699,7 +699,7 @@
               <w:lang w:eastAsia="fr-CH"/>
             </w:rPr>
           </w:pPr>
-          <w:hyperlink w:anchor="_Toc242090669" w:history="1">
+          <w:hyperlink w:anchor="_Toc242092016" w:history="1">
             <w:r>
               <w:rPr>
                 <w:rStyle w:val="Lienhypertexte"/>
@@ -726,7 +726,7 @@
                 <w:noProof/>
                 <w:webHidden/>
               </w:rPr>
-              <w:instrText xml:space="preserve"> PAGEREF _Toc242090669 \h </w:instrText>
+              <w:instrText xml:space="preserve"> PAGEREF _Toc242092016 \h </w:instrText>
             </w:r>
             <w:r>
               <w:rPr>
@@ -746,7 +746,7 @@
                 <w:noProof/>
                 <w:webHidden/>
               </w:rPr>
-              <w:t>9</w:t>
+              <w:t>10</w:t>
             </w:r>
             <w:r>
               <w:rPr>
@@ -769,7 +769,7 @@
               <w:lang w:eastAsia="fr-CH"/>
             </w:rPr>
           </w:pPr>
-          <w:hyperlink w:anchor="_Toc242090670" w:history="1">
+          <w:hyperlink w:anchor="_Toc242092017" w:history="1">
             <w:r>
               <w:rPr>
                 <w:rStyle w:val="Lienhypertexte"/>
@@ -796,7 +796,7 @@
                 <w:noProof/>
                 <w:webHidden/>
               </w:rPr>
-              <w:instrText xml:space="preserve"> PAGEREF _Toc242090670 \h </w:instrText>
+              <w:instrText xml:space="preserve"> PAGEREF _Toc242092017 \h </w:instrText>
             </w:r>
             <w:r>
               <w:rPr>
@@ -816,7 +816,7 @@
                 <w:noProof/>
                 <w:webHidden/>
               </w:rPr>
-              <w:t>10</w:t>
+              <w:t>11</w:t>
             </w:r>
             <w:r>
               <w:rPr>
@@ -839,7 +839,7 @@
               <w:lang w:eastAsia="fr-CH"/>
             </w:rPr>
           </w:pPr>
-          <w:hyperlink w:anchor="_Toc242090671" w:history="1">
+          <w:hyperlink w:anchor="_Toc242092018" w:history="1">
             <w:r>
               <w:rPr>
                 <w:rStyle w:val="Lienhypertexte"/>
@@ -866,7 +866,7 @@
                 <w:noProof/>
                 <w:webHidden/>
               </w:rPr>
-              <w:instrText xml:space="preserve"> PAGEREF _Toc242090671 \h </w:instrText>
+              <w:instrText xml:space="preserve"> PAGEREF _Toc242092018 \h </w:instrText>
             </w:r>
             <w:r>
               <w:rPr>
@@ -886,7 +886,7 @@
                 <w:noProof/>
                 <w:webHidden/>
               </w:rPr>
-              <w:t>11</w:t>
+              <w:t>12</w:t>
             </w:r>
             <w:r>
               <w:rPr>
@@ -909,7 +909,7 @@
               <w:lang w:eastAsia="fr-CH"/>
             </w:rPr>
           </w:pPr>
-          <w:hyperlink w:anchor="_Toc242090672" w:history="1">
+          <w:hyperlink w:anchor="_Toc242092019" w:history="1">
             <w:r>
               <w:rPr>
                 <w:rStyle w:val="Lienhypertexte"/>
@@ -936,7 +936,7 @@
                 <w:noProof/>
                 <w:webHidden/>
               </w:rPr>
-              <w:instrText xml:space="preserve"> PAGEREF _Toc242090672 \h </w:instrText>
+              <w:instrText xml:space="preserve"> PAGEREF _Toc242092019 \h </w:instrText>
             </w:r>
             <w:r>
               <w:rPr>
@@ -956,7 +956,7 @@
                 <w:noProof/>
                 <w:webHidden/>
               </w:rPr>
-              <w:t>12</w:t>
+              <w:t>13</w:t>
             </w:r>
             <w:r>
               <w:rPr>
@@ -979,7 +979,7 @@
               <w:lang w:eastAsia="fr-CH"/>
             </w:rPr>
           </w:pPr>
-          <w:hyperlink w:anchor="_Toc242090673" w:history="1">
+          <w:hyperlink w:anchor="_Toc242092020" w:history="1">
             <w:r>
               <w:rPr>
                 <w:rStyle w:val="Lienhypertexte"/>
@@ -1006,7 +1006,7 @@
                 <w:noProof/>
                 <w:webHidden/>
               </w:rPr>
-              <w:instrText xml:space="preserve"> PAGEREF _Toc242090673 \h </w:instrText>
+              <w:instrText xml:space="preserve"> PAGEREF _Toc242092020 \h </w:instrText>
             </w:r>
             <w:r>
               <w:rPr>
@@ -1026,7 +1026,7 @@
                 <w:noProof/>
                 <w:webHidden/>
               </w:rPr>
-              <w:t>12</w:t>
+              <w:t>13</w:t>
             </w:r>
             <w:r>
               <w:rPr>
@@ -1049,7 +1049,7 @@
               <w:lang w:eastAsia="fr-CH"/>
             </w:rPr>
           </w:pPr>
-          <w:hyperlink w:anchor="_Toc242090674" w:history="1">
+          <w:hyperlink w:anchor="_Toc242092021" w:history="1">
             <w:r>
               <w:rPr>
                 <w:rStyle w:val="Lienhypertexte"/>
@@ -1076,7 +1076,7 @@
                 <w:noProof/>
                 <w:webHidden/>
               </w:rPr>
-              <w:instrText xml:space="preserve"> PAGEREF _Toc242090674 \h </w:instrText>
+              <w:instrText xml:space="preserve"> PAGEREF _Toc242092021 \h </w:instrText>
             </w:r>
             <w:r>
               <w:rPr>
@@ -1096,7 +1096,7 @@
                 <w:noProof/>
                 <w:webHidden/>
               </w:rPr>
-              <w:t>13</w:t>
+              <w:t>14</w:t>
             </w:r>
             <w:r>
               <w:rPr>
@@ -1119,7 +1119,7 @@
               <w:lang w:eastAsia="fr-CH"/>
             </w:rPr>
           </w:pPr>
-          <w:hyperlink w:anchor="_Toc242090675" w:history="1">
+          <w:hyperlink w:anchor="_Toc242092022" w:history="1">
             <w:r>
               <w:rPr>
                 <w:rStyle w:val="Lienhypertexte"/>
@@ -1146,7 +1146,7 @@
                 <w:noProof/>
                 <w:webHidden/>
               </w:rPr>
-              <w:instrText xml:space="preserve"> PAGEREF _Toc242090675 \h </w:instrText>
+              <w:instrText xml:space="preserve"> PAGEREF _Toc242092022 \h </w:instrText>
             </w:r>
             <w:r>
               <w:rPr>
@@ -1166,7 +1166,7 @@
                 <w:noProof/>
                 <w:webHidden/>
               </w:rPr>
-              <w:t>14</w:t>
+              <w:t>15</w:t>
             </w:r>
             <w:r>
               <w:rPr>
@@ -1189,7 +1189,7 @@
               <w:lang w:eastAsia="fr-CH"/>
             </w:rPr>
           </w:pPr>
-          <w:hyperlink w:anchor="_Toc242090676" w:history="1">
+          <w:hyperlink w:anchor="_Toc242092023" w:history="1">
             <w:r>
               <w:rPr>
                 <w:rStyle w:val="Lienhypertexte"/>
@@ -1216,7 +1216,7 @@
                 <w:noProof/>
                 <w:webHidden/>
               </w:rPr>
-              <w:instrText xml:space="preserve"> PAGEREF _Toc242090676 \h </w:instrText>
+              <w:instrText xml:space="preserve"> PAGEREF _Toc242092023 \h </w:instrText>
             </w:r>
             <w:r>
               <w:rPr>
@@ -1236,7 +1236,7 @@
                 <w:noProof/>
                 <w:webHidden/>
               </w:rPr>
-              <w:t>15</w:t>
+              <w:t>16</w:t>
             </w:r>
             <w:r>
               <w:rPr>
@@ -1259,7 +1259,7 @@
               <w:lang w:eastAsia="fr-CH"/>
             </w:rPr>
           </w:pPr>
-          <w:hyperlink w:anchor="_Toc242090677" w:history="1">
+          <w:hyperlink w:anchor="_Toc242092024" w:history="1">
             <w:r>
               <w:rPr>
                 <w:rStyle w:val="Lienhypertexte"/>
@@ -1286,7 +1286,7 @@
                 <w:noProof/>
                 <w:webHidden/>
               </w:rPr>
-              <w:instrText xml:space="preserve"> PAGEREF _Toc242090677 \h </w:instrText>
+              <w:instrText xml:space="preserve"> PAGEREF _Toc242092024 \h </w:instrText>
             </w:r>
             <w:r>
               <w:rPr>
@@ -1306,7 +1306,7 @@
                 <w:noProof/>
                 <w:webHidden/>
               </w:rPr>
-              <w:t>16</w:t>
+              <w:t>17</w:t>
             </w:r>
             <w:r>
               <w:rPr>
@@ -1329,7 +1329,7 @@
               <w:lang w:eastAsia="fr-CH"/>
             </w:rPr>
           </w:pPr>
-          <w:hyperlink w:anchor="_Toc242090678" w:history="1">
+          <w:hyperlink w:anchor="_Toc242092025" w:history="1">
             <w:r>
               <w:rPr>
                 <w:rStyle w:val="Lienhypertexte"/>
@@ -1356,7 +1356,7 @@
                 <w:noProof/>
                 <w:webHidden/>
               </w:rPr>
-              <w:instrText xml:space="preserve"> PAGEREF _Toc242090678 \h </w:instrText>
+              <w:instrText xml:space="preserve"> PAGEREF _Toc242092025 \h </w:instrText>
             </w:r>
             <w:r>
               <w:rPr>
@@ -1376,7 +1376,7 @@
                 <w:noProof/>
                 <w:webHidden/>
               </w:rPr>
-              <w:t>17</w:t>
+              <w:t>18</w:t>
             </w:r>
             <w:r>
               <w:rPr>
@@ -1399,7 +1399,7 @@
               <w:lang w:eastAsia="fr-CH"/>
             </w:rPr>
           </w:pPr>
-          <w:hyperlink w:anchor="_Toc242090679" w:history="1">
+          <w:hyperlink w:anchor="_Toc242092026" w:history="1">
             <w:r>
               <w:rPr>
                 <w:rStyle w:val="Lienhypertexte"/>
@@ -1426,7 +1426,7 @@
                 <w:noProof/>
                 <w:webHidden/>
               </w:rPr>
-              <w:instrText xml:space="preserve"> PAGEREF _Toc242090679 \h </w:instrText>
+              <w:instrText xml:space="preserve"> PAGEREF _Toc242092026 \h </w:instrText>
             </w:r>
             <w:r>
               <w:rPr>
@@ -1446,7 +1446,7 @@
                 <w:noProof/>
                 <w:webHidden/>
               </w:rPr>
-              <w:t>18</w:t>
+              <w:t>19</w:t>
             </w:r>
             <w:r>
               <w:rPr>
@@ -1469,7 +1469,7 @@
               <w:lang w:eastAsia="fr-CH"/>
             </w:rPr>
           </w:pPr>
-          <w:hyperlink w:anchor="_Toc242090680" w:history="1">
+          <w:hyperlink w:anchor="_Toc242092027" w:history="1">
             <w:r>
               <w:rPr>
                 <w:rStyle w:val="Lienhypertexte"/>
@@ -1496,7 +1496,7 @@
                 <w:noProof/>
                 <w:webHidden/>
               </w:rPr>
-              <w:instrText xml:space="preserve"> PAGEREF _Toc242090680 \h </w:instrText>
+              <w:instrText xml:space="preserve"> PAGEREF _Toc242092027 \h </w:instrText>
             </w:r>
             <w:r>
               <w:rPr>
@@ -1516,7 +1516,7 @@
                 <w:noProof/>
                 <w:webHidden/>
               </w:rPr>
-              <w:t>18</w:t>
+              <w:t>19</w:t>
             </w:r>
             <w:r>
               <w:rPr>
@@ -1539,7 +1539,7 @@
               <w:lang w:eastAsia="fr-CH"/>
             </w:rPr>
           </w:pPr>
-          <w:hyperlink w:anchor="_Toc242090681" w:history="1">
+          <w:hyperlink w:anchor="_Toc242092028" w:history="1">
             <w:r>
               <w:rPr>
                 <w:rStyle w:val="Lienhypertexte"/>
@@ -1566,7 +1566,7 @@
                 <w:noProof/>
                 <w:webHidden/>
               </w:rPr>
-              <w:instrText xml:space="preserve"> PAGEREF _Toc242090681 \h </w:instrText>
+              <w:instrText xml:space="preserve"> PAGEREF _Toc242092028 \h </w:instrText>
             </w:r>
             <w:r>
               <w:rPr>
@@ -1586,7 +1586,7 @@
                 <w:noProof/>
                 <w:webHidden/>
               </w:rPr>
-              <w:t>18</w:t>
+              <w:t>19</w:t>
             </w:r>
             <w:r>
               <w:rPr>
@@ -1609,7 +1609,7 @@
               <w:lang w:eastAsia="fr-CH"/>
             </w:rPr>
           </w:pPr>
-          <w:hyperlink w:anchor="_Toc242090682" w:history="1">
+          <w:hyperlink w:anchor="_Toc242092029" w:history="1">
             <w:r>
               <w:rPr>
                 <w:rStyle w:val="Lienhypertexte"/>
@@ -1636,7 +1636,7 @@
                 <w:noProof/>
                 <w:webHidden/>
               </w:rPr>
-              <w:instrText xml:space="preserve"> PAGEREF _Toc242090682 \h </w:instrText>
+              <w:instrText xml:space="preserve"> PAGEREF _Toc242092029 \h </w:instrText>
             </w:r>
             <w:r>
               <w:rPr>
@@ -1656,7 +1656,7 @@
                 <w:noProof/>
                 <w:webHidden/>
               </w:rPr>
-              <w:t>19</w:t>
+              <w:t>20</w:t>
             </w:r>
             <w:r>
               <w:rPr>
@@ -1679,7 +1679,7 @@
               <w:lang w:eastAsia="fr-CH"/>
             </w:rPr>
           </w:pPr>
-          <w:hyperlink w:anchor="_Toc242090683" w:history="1">
+          <w:hyperlink w:anchor="_Toc242092030" w:history="1">
             <w:r>
               <w:rPr>
                 <w:rStyle w:val="Lienhypertexte"/>
@@ -1706,7 +1706,7 @@
                 <w:noProof/>
                 <w:webHidden/>
               </w:rPr>
-              <w:instrText xml:space="preserve"> PAGEREF _Toc242090683 \h </w:instrText>
+              <w:instrText xml:space="preserve"> PAGEREF _Toc242092030 \h </w:instrText>
             </w:r>
             <w:r>
               <w:rPr>
@@ -1726,7 +1726,7 @@
                 <w:noProof/>
                 <w:webHidden/>
               </w:rPr>
-              <w:t>19</w:t>
+              <w:t>20</w:t>
             </w:r>
             <w:r>
               <w:rPr>
@@ -1749,7 +1749,7 @@
               <w:lang w:eastAsia="fr-CH"/>
             </w:rPr>
           </w:pPr>
-          <w:hyperlink w:anchor="_Toc242090684" w:history="1">
+          <w:hyperlink w:anchor="_Toc242092031" w:history="1">
             <w:r>
               <w:rPr>
                 <w:rStyle w:val="Lienhypertexte"/>
@@ -1776,7 +1776,7 @@
                 <w:noProof/>
                 <w:webHidden/>
               </w:rPr>
-              <w:instrText xml:space="preserve"> PAGEREF _Toc242090684 \h </w:instrText>
+              <w:instrText xml:space="preserve"> PAGEREF _Toc242092031 \h </w:instrText>
             </w:r>
             <w:r>
               <w:rPr>
@@ -1796,7 +1796,7 @@
                 <w:noProof/>
                 <w:webHidden/>
               </w:rPr>
-              <w:t>19</w:t>
+              <w:t>20</w:t>
             </w:r>
             <w:r>
               <w:rPr>
@@ -1819,7 +1819,7 @@
               <w:lang w:eastAsia="fr-CH"/>
             </w:rPr>
           </w:pPr>
-          <w:hyperlink w:anchor="_Toc242090685" w:history="1">
+          <w:hyperlink w:anchor="_Toc242092032" w:history="1">
             <w:r>
               <w:rPr>
                 <w:rStyle w:val="Lienhypertexte"/>
@@ -1846,7 +1846,7 @@
                 <w:noProof/>
                 <w:webHidden/>
               </w:rPr>
-              <w:instrText xml:space="preserve"> PAGEREF _Toc242090685 \h </w:instrText>
+              <w:instrText xml:space="preserve"> PAGEREF _Toc242092032 \h </w:instrText>
             </w:r>
             <w:r>
               <w:rPr>
@@ -1866,7 +1866,7 @@
                 <w:noProof/>
                 <w:webHidden/>
               </w:rPr>
-              <w:t>19</w:t>
+              <w:t>20</w:t>
             </w:r>
             <w:r>
               <w:rPr>
@@ -1889,7 +1889,7 @@
               <w:lang w:eastAsia="fr-CH"/>
             </w:rPr>
           </w:pPr>
-          <w:hyperlink w:anchor="_Toc242090686" w:history="1">
+          <w:hyperlink w:anchor="_Toc242092033" w:history="1">
             <w:r>
               <w:rPr>
                 <w:rStyle w:val="Lienhypertexte"/>
@@ -1916,7 +1916,7 @@
                 <w:noProof/>
                 <w:webHidden/>
               </w:rPr>
-              <w:instrText xml:space="preserve"> PAGEREF _Toc242090686 \h </w:instrText>
+              <w:instrText xml:space="preserve"> PAGEREF _Toc242092033 \h </w:instrText>
             </w:r>
             <w:r>
               <w:rPr>
@@ -1936,7 +1936,7 @@
                 <w:noProof/>
                 <w:webHidden/>
               </w:rPr>
-              <w:t>20</w:t>
+              <w:t>21</w:t>
             </w:r>
             <w:r>
               <w:rPr>
@@ -1959,27 +1959,13 @@
               <w:lang w:eastAsia="fr-CH"/>
             </w:rPr>
           </w:pPr>
-          <w:hyperlink w:anchor="_Toc242090687" w:history="1">
+          <w:hyperlink w:anchor="_Toc242092034" w:history="1">
             <w:r>
               <w:rPr>
                 <w:rStyle w:val="Lienhypertexte"/>
                 <w:noProof/>
               </w:rPr>
-              <w:t>CheckParkingSp</w:t>
-            </w:r>
-            <w:r>
-              <w:rPr>
-                <w:rStyle w:val="Lienhypertexte"/>
-                <w:noProof/>
-              </w:rPr>
-              <w:t>o</w:t>
-            </w:r>
-            <w:r>
-              <w:rPr>
-                <w:rStyle w:val="Lienhypertexte"/>
-                <w:noProof/>
-              </w:rPr>
-              <w:t>t_IsFree_Result_X</w:t>
+              <w:t>CheckParkingSpot_IsFree_Result_X</w:t>
             </w:r>
             <w:r>
               <w:rPr>
@@ -2000,7 +1986,7 @@
                 <w:noProof/>
                 <w:webHidden/>
               </w:rPr>
-              <w:instrText xml:space="preserve"> PAGEREF _Toc242090687 \h </w:instrText>
+              <w:instrText xml:space="preserve"> PAGEREF _Toc242092034 \h </w:instrText>
             </w:r>
             <w:r>
               <w:rPr>
@@ -2020,7 +2006,7 @@
                 <w:noProof/>
                 <w:webHidden/>
               </w:rPr>
-              <w:t>20</w:t>
+              <w:t>21</w:t>
             </w:r>
             <w:r>
               <w:rPr>
@@ -2043,7 +2029,7 @@
               <w:lang w:eastAsia="fr-CH"/>
             </w:rPr>
           </w:pPr>
-          <w:hyperlink w:anchor="_Toc242090688" w:history="1">
+          <w:hyperlink w:anchor="_Toc242092035" w:history="1">
             <w:r>
               <w:rPr>
                 <w:rStyle w:val="Lienhypertexte"/>
@@ -2070,7 +2056,7 @@
                 <w:noProof/>
                 <w:webHidden/>
               </w:rPr>
-              <w:instrText xml:space="preserve"> PAGEREF _Toc242090688 \h </w:instrText>
+              <w:instrText xml:space="preserve"> PAGEREF _Toc242092035 \h </w:instrText>
             </w:r>
             <w:r>
               <w:rPr>
@@ -2090,7 +2076,7 @@
                 <w:noProof/>
                 <w:webHidden/>
               </w:rPr>
-              <w:t>21</w:t>
+              <w:t>22</w:t>
             </w:r>
             <w:r>
               <w:rPr>
@@ -2113,7 +2099,7 @@
               <w:lang w:eastAsia="fr-CH"/>
             </w:rPr>
           </w:pPr>
-          <w:hyperlink w:anchor="_Toc242090689" w:history="1">
+          <w:hyperlink w:anchor="_Toc242092036" w:history="1">
             <w:r>
               <w:rPr>
                 <w:rStyle w:val="Lienhypertexte"/>
@@ -2140,7 +2126,7 @@
                 <w:noProof/>
                 <w:webHidden/>
               </w:rPr>
-              <w:instrText xml:space="preserve"> PAGEREF _Toc242090689 \h </w:instrText>
+              <w:instrText xml:space="preserve"> PAGEREF _Toc242092036 \h </w:instrText>
             </w:r>
             <w:r>
               <w:rPr>
@@ -2160,7 +2146,7 @@
                 <w:noProof/>
                 <w:webHidden/>
               </w:rPr>
-              <w:t>21</w:t>
+              <w:t>22</w:t>
             </w:r>
             <w:r>
               <w:rPr>
@@ -2183,12 +2169,82 @@
               <w:lang w:eastAsia="fr-CH"/>
             </w:rPr>
           </w:pPr>
-          <w:hyperlink w:anchor="_Toc242090690" w:history="1">
+          <w:hyperlink w:anchor="_Toc242092037" w:history="1">
             <w:r>
               <w:rPr>
                 <w:rStyle w:val="Lienhypertexte"/>
                 <w:noProof/>
               </w:rPr>
+              <w:t>Utilisiation de l’IA</w:t>
+            </w:r>
+            <w:r>
+              <w:rPr>
+                <w:noProof/>
+                <w:webHidden/>
+              </w:rPr>
+              <w:tab/>
+            </w:r>
+            <w:r>
+              <w:rPr>
+                <w:noProof/>
+                <w:webHidden/>
+              </w:rPr>
+              <w:fldChar w:fldCharType="begin"/>
+            </w:r>
+            <w:r>
+              <w:rPr>
+                <w:noProof/>
+                <w:webHidden/>
+              </w:rPr>
+              <w:instrText xml:space="preserve"> PAGEREF _Toc242092037 \h </w:instrText>
+            </w:r>
+            <w:r>
+              <w:rPr>
+                <w:noProof/>
+                <w:webHidden/>
+              </w:rPr>
+            </w:r>
+            <w:r>
+              <w:rPr>
+                <w:noProof/>
+                <w:webHidden/>
+              </w:rPr>
+              <w:fldChar w:fldCharType="separate"/>
+            </w:r>
+            <w:r>
+              <w:rPr>
+                <w:noProof/>
+                <w:webHidden/>
+              </w:rPr>
+              <w:t>22</w:t>
+            </w:r>
+            <w:r>
+              <w:rPr>
+                <w:noProof/>
+                <w:webHidden/>
+              </w:rPr>
+              <w:fldChar w:fldCharType="end"/>
+            </w:r>
+          </w:hyperlink>
+        </w:p>
+        <w:p>
+          <w:pPr>
+            <w:pStyle w:val="TM2"/>
+            <w:tabs>
+              <w:tab w:val="right" w:leader="dot" w:pos="9062"/>
+            </w:tabs>
+            <w:rPr>
+              <w:rFonts w:eastAsiaTheme="minorEastAsia"/>
+              <w:noProof/>
+              <w:lang w:eastAsia="fr-CH"/>
+            </w:rPr>
+          </w:pPr>
+          <w:hyperlink w:anchor="_Toc242092038" w:history="1">
+            <w:r>
+              <w:rPr>
+                <w:rStyle w:val="Lienhypertexte"/>
+                <w:noProof/>
+              </w:rPr>
               <w:t>Bilan des fonctionnalités</w:t>
             </w:r>
             <w:r>
@@ -2210,7 +2266,7 @@
                 <w:noProof/>
                 <w:webHidden/>
               </w:rPr>
-              <w:instrText xml:space="preserve"> PAGEREF _Toc242090690 \h </w:instrText>
+              <w:instrText xml:space="preserve"> PAGEREF _Toc242092038 \h </w:instrText>
             </w:r>
             <w:r>
               <w:rPr>
@@ -2230,7 +2286,7 @@
                 <w:noProof/>
                 <w:webHidden/>
               </w:rPr>
-              <w:t>21</w:t>
+              <w:t>22</w:t>
             </w:r>
             <w:r>
               <w:rPr>
@@ -2247,6 +2303,7 @@
               <w:b/>
               <w:bCs/>
             </w:rPr>
+            <w:lastRenderedPageBreak/>
             <w:fldChar w:fldCharType="end"/>
           </w:r>
         </w:p>
@@ -2269,7 +2326,7 @@
           <w:color w:val="auto"/>
         </w:rPr>
       </w:pPr>
-      <w:bookmarkStart w:id="0" w:name="_Toc242090661"/>
+      <w:bookmarkStart w:id="0" w:name="_Toc242092008"/>
       <w:r>
         <w:rPr>
           <w:color w:val="auto"/>
@@ -3174,7 +3231,7 @@
           <w:color w:val="auto"/>
         </w:rPr>
       </w:pPr>
-      <w:bookmarkStart w:id="1" w:name="_Toc242090662"/>
+      <w:bookmarkStart w:id="1" w:name="_Toc242092009"/>
       <w:r>
         <w:rPr>
           <w:color w:val="auto"/>
@@ -3188,7 +3245,7 @@
       <w:pPr>
         <w:pStyle w:val="Titre2"/>
       </w:pPr>
-      <w:bookmarkStart w:id="2" w:name="_Toc242090663"/>
+      <w:bookmarkStart w:id="2" w:name="_Toc242092010"/>
       <w:proofErr w:type="spellStart"/>
       <w:r>
         <w:t>Program.cs</w:t>
@@ -3275,7 +3332,7 @@
       <w:pPr>
         <w:pStyle w:val="Titre2"/>
       </w:pPr>
-      <w:bookmarkStart w:id="3" w:name="_Toc242090664"/>
+      <w:bookmarkStart w:id="3" w:name="_Toc242092011"/>
       <w:proofErr w:type="spellStart"/>
       <w:r>
         <w:lastRenderedPageBreak/>
@@ -3308,7 +3365,7 @@
         <w:pStyle w:val="Titre3"/>
         <w:ind w:firstLine="708"/>
       </w:pPr>
-      <w:bookmarkStart w:id="4" w:name="_Toc242090665"/>
+      <w:bookmarkStart w:id="4" w:name="_Toc242092012"/>
       <w:proofErr w:type="spellStart"/>
       <w:r>
         <w:t>StartProgram</w:t>
@@ -3433,7 +3490,7 @@
       <w:pPr>
         <w:pStyle w:val="Titre2"/>
       </w:pPr>
-      <w:bookmarkStart w:id="5" w:name="_Toc242090666"/>
+      <w:bookmarkStart w:id="5" w:name="_Toc242092013"/>
       <w:proofErr w:type="spellStart"/>
       <w:r>
         <w:lastRenderedPageBreak/>
@@ -3455,7 +3512,7 @@
         <w:pStyle w:val="Titre3"/>
         <w:ind w:firstLine="708"/>
       </w:pPr>
-      <w:bookmarkStart w:id="6" w:name="_Toc242090667"/>
+      <w:bookmarkStart w:id="6" w:name="_Toc242092014"/>
       <w:proofErr w:type="spellStart"/>
       <w:r>
         <w:t>DisplayMenu</w:t>
@@ -3582,7 +3639,7 @@
         <w:lastRenderedPageBreak/>
         <w:tab/>
       </w:r>
-      <w:bookmarkStart w:id="7" w:name="_Toc242090668"/>
+      <w:bookmarkStart w:id="7" w:name="_Toc242092015"/>
       <w:proofErr w:type="spellStart"/>
       <w:r>
         <w:t>UserInputHandler</w:t>
@@ -3737,7 +3794,7 @@
         <w:lastRenderedPageBreak/>
         <w:tab/>
       </w:r>
-      <w:bookmarkStart w:id="8" w:name="_Toc242090669"/>
+      <w:bookmarkStart w:id="8" w:name="_Toc242092016"/>
       <w:proofErr w:type="spellStart"/>
       <w:r>
         <w:t>EnterVehicle</w:t>
@@ -3754,7 +3811,7 @@
           <w:noProof/>
         </w:rPr>
         <w:drawing>
-          <wp:inline distT="0" distB="0" distL="0" distR="0" wp14:anchorId="21CFB329" wp14:editId="518CD105">
+          <wp:inline distT="0" distB="0" distL="0" distR="0" wp14:anchorId="21CFB329" wp14:editId="76BA4BBA">
             <wp:extent cx="5755640" cy="1550035"/>
             <wp:effectExtent l="0" t="0" r="0" b="0"/>
             <wp:docPr id="273820517" name="Image 3"/>
@@ -3841,7 +3898,7 @@
         <w:lastRenderedPageBreak/>
         <w:tab/>
       </w:r>
-      <w:bookmarkStart w:id="9" w:name="_Toc242090670"/>
+      <w:bookmarkStart w:id="9" w:name="_Toc242092017"/>
       <w:proofErr w:type="spellStart"/>
       <w:r>
         <w:t>SearchVehicle</w:t>
@@ -3925,7 +3982,7 @@
         <w:pStyle w:val="Titre3"/>
         <w:ind w:firstLine="708"/>
       </w:pPr>
-      <w:bookmarkStart w:id="10" w:name="_Toc242090671"/>
+      <w:bookmarkStart w:id="10" w:name="_Toc242092018"/>
       <w:proofErr w:type="spellStart"/>
       <w:r>
         <w:lastRenderedPageBreak/>
@@ -4043,7 +4100,7 @@
       <w:pPr>
         <w:pStyle w:val="Titre2"/>
       </w:pPr>
-      <w:bookmarkStart w:id="11" w:name="_Toc242090672"/>
+      <w:bookmarkStart w:id="11" w:name="_Toc242092019"/>
       <w:proofErr w:type="spellStart"/>
       <w:r>
         <w:lastRenderedPageBreak/>
@@ -4059,7 +4116,7 @@
       <w:r>
         <w:tab/>
       </w:r>
-      <w:bookmarkStart w:id="12" w:name="_Toc242090673"/>
+      <w:bookmarkStart w:id="12" w:name="_Toc242092020"/>
       <w:r>
         <w:t>Display</w:t>
       </w:r>
@@ -4178,7 +4235,7 @@
         <w:lastRenderedPageBreak/>
         <w:tab/>
       </w:r>
-      <w:bookmarkStart w:id="13" w:name="_Toc242090674"/>
+      <w:bookmarkStart w:id="13" w:name="_Toc242092021"/>
       <w:proofErr w:type="spellStart"/>
       <w:r>
         <w:t>CheckParkingSpot</w:t>
@@ -4270,7 +4327,7 @@
         <w:lastRenderedPageBreak/>
         <w:tab/>
       </w:r>
-      <w:bookmarkStart w:id="14" w:name="_Toc242090675"/>
+      <w:bookmarkStart w:id="14" w:name="_Toc242092022"/>
       <w:proofErr w:type="spellStart"/>
       <w:r>
         <w:t>AddVehicle</w:t>
@@ -4371,7 +4428,7 @@
         <w:lastRenderedPageBreak/>
         <w:tab/>
       </w:r>
-      <w:bookmarkStart w:id="15" w:name="_Toc242090676"/>
+      <w:bookmarkStart w:id="15" w:name="_Toc242092023"/>
       <w:proofErr w:type="spellStart"/>
       <w:r>
         <w:t>FindVehicule</w:t>
@@ -4388,7 +4445,7 @@
           <w:noProof/>
         </w:rPr>
         <w:drawing>
-          <wp:inline distT="0" distB="0" distL="0" distR="0" wp14:anchorId="4E0C9F37" wp14:editId="620E16C8">
+          <wp:inline distT="0" distB="0" distL="0" distR="0" wp14:anchorId="4E0C9F37" wp14:editId="6E561040">
             <wp:extent cx="5753735" cy="2458085"/>
             <wp:effectExtent l="0" t="0" r="0" b="0"/>
             <wp:docPr id="460749035" name="Image 11"/>
@@ -4471,7 +4528,7 @@
         <w:lastRenderedPageBreak/>
         <w:tab/>
       </w:r>
-      <w:bookmarkStart w:id="16" w:name="_Toc242090677"/>
+      <w:bookmarkStart w:id="16" w:name="_Toc242092024"/>
       <w:proofErr w:type="spellStart"/>
       <w:r>
         <w:t>FindVehicleReturn</w:t>
@@ -4563,7 +4620,7 @@
         <w:lastRenderedPageBreak/>
         <w:tab/>
       </w:r>
-      <w:bookmarkStart w:id="17" w:name="_Toc242090678"/>
+      <w:bookmarkStart w:id="17" w:name="_Toc242092025"/>
       <w:proofErr w:type="spellStart"/>
       <w:r>
         <w:t>StatParking</w:t>
@@ -4577,7 +4634,7 @@
           <w:noProof/>
         </w:rPr>
         <w:drawing>
-          <wp:inline distT="0" distB="0" distL="0" distR="0" wp14:anchorId="28B65BB5" wp14:editId="279D8BEF">
+          <wp:inline distT="0" distB="0" distL="0" distR="0" wp14:anchorId="28B65BB5" wp14:editId="4071F1CD">
             <wp:extent cx="5753735" cy="1552575"/>
             <wp:effectExtent l="0" t="0" r="0" b="9525"/>
             <wp:docPr id="925377937" name="Image 13"/>
@@ -4640,7 +4697,7 @@
       <w:pPr>
         <w:pStyle w:val="Titre1"/>
       </w:pPr>
-      <w:bookmarkStart w:id="18" w:name="_Toc242090679"/>
+      <w:bookmarkStart w:id="18" w:name="_Toc242092026"/>
       <w:proofErr w:type="spellStart"/>
       <w:r>
         <w:lastRenderedPageBreak/>
@@ -4656,7 +4713,7 @@
       <w:r>
         <w:tab/>
       </w:r>
-      <w:bookmarkStart w:id="19" w:name="_Toc242090680"/>
+      <w:bookmarkStart w:id="19" w:name="_Toc242092027"/>
       <w:proofErr w:type="spellStart"/>
       <w:r>
         <w:t>LicensingPlate</w:t>
@@ -4732,7 +4789,7 @@
         <w:pStyle w:val="Titre3"/>
         <w:ind w:firstLine="708"/>
       </w:pPr>
-      <w:bookmarkStart w:id="20" w:name="_Toc242090681"/>
+      <w:bookmarkStart w:id="20" w:name="_Toc242092028"/>
       <w:r>
         <w:t>Constructeur</w:t>
       </w:r>
@@ -4818,7 +4875,7 @@
       <w:pPr>
         <w:pStyle w:val="Titre1"/>
       </w:pPr>
-      <w:bookmarkStart w:id="21" w:name="_Toc242090682"/>
+      <w:bookmarkStart w:id="21" w:name="_Toc242092029"/>
       <w:proofErr w:type="spellStart"/>
       <w:r>
         <w:lastRenderedPageBreak/>
@@ -4834,7 +4891,7 @@
       <w:r>
         <w:tab/>
       </w:r>
-      <w:bookmarkStart w:id="22" w:name="_Toc242090683"/>
+      <w:bookmarkStart w:id="22" w:name="_Toc242092030"/>
       <w:r>
         <w:t>Constructeur</w:t>
       </w:r>
@@ -4918,7 +4975,7 @@
       <w:r>
         <w:tab/>
       </w:r>
-      <w:bookmarkStart w:id="23" w:name="_Toc242090684"/>
+      <w:bookmarkStart w:id="23" w:name="_Toc242092031"/>
       <w:r>
         <w:t>Calc</w:t>
       </w:r>
@@ -4992,7 +5049,7 @@
         <w:pStyle w:val="Titre3"/>
         <w:ind w:firstLine="708"/>
       </w:pPr>
-      <w:bookmarkStart w:id="24" w:name="_Toc242090685"/>
+      <w:bookmarkStart w:id="24" w:name="_Toc242092032"/>
       <w:proofErr w:type="spellStart"/>
       <w:r>
         <w:t>GetCurrentParkedTime</w:t>
@@ -5017,7 +5074,7 @@
           <w:color w:val="auto"/>
         </w:rPr>
       </w:pPr>
-      <w:bookmarkStart w:id="25" w:name="_Toc242090686"/>
+      <w:bookmarkStart w:id="25" w:name="_Toc242092033"/>
       <w:r>
         <w:rPr>
           <w:color w:val="auto"/>
@@ -5031,7 +5088,7 @@
       <w:pPr>
         <w:pStyle w:val="Titre2"/>
       </w:pPr>
-      <w:bookmarkStart w:id="26" w:name="_Toc242090687"/>
+      <w:bookmarkStart w:id="26" w:name="_Toc242092034"/>
       <w:proofErr w:type="spellStart"/>
       <w:r>
         <w:t>CheckParkingSpot_IsFree_Result_X</w:t>
@@ -5072,6 +5129,9 @@
         <w:jc w:val="center"/>
       </w:pPr>
       <w:r>
+        <w:rPr>
+          <w:noProof/>
+        </w:rPr>
         <w:drawing>
           <wp:inline distT="0" distB="0" distL="0" distR="0" wp14:anchorId="0F6811CC" wp14:editId="2B243665">
             <wp:extent cx="5760720" cy="1386205"/>
@@ -5121,7 +5181,7 @@
           <w:color w:val="auto"/>
         </w:rPr>
       </w:pPr>
-      <w:bookmarkStart w:id="27" w:name="_Toc242090688"/>
+      <w:bookmarkStart w:id="27" w:name="_Toc242092035"/>
       <w:r>
         <w:rPr>
           <w:color w:val="auto"/>
@@ -5139,7 +5199,7 @@
           <w:color w:val="auto"/>
         </w:rPr>
       </w:pPr>
-      <w:bookmarkStart w:id="28" w:name="_Toc242090689"/>
+      <w:bookmarkStart w:id="28" w:name="_Toc242092036"/>
       <w:r>
         <w:rPr>
           <w:color w:val="auto"/>
@@ -5177,14 +5237,44 @@
           <w:color w:val="auto"/>
         </w:rPr>
       </w:pPr>
-      <w:bookmarkStart w:id="29" w:name="_Toc242090690"/>
+      <w:bookmarkStart w:id="29" w:name="_Toc242092037"/>
+      <w:proofErr w:type="spellStart"/>
       <w:r>
         <w:rPr>
           <w:color w:val="auto"/>
         </w:rPr>
+        <w:t>Utilisiation</w:t>
+      </w:r>
+      <w:proofErr w:type="spellEnd"/>
+      <w:r>
+        <w:rPr>
+          <w:color w:val="auto"/>
+        </w:rPr>
+        <w:t xml:space="preserve"> de l’IA</w:t>
+      </w:r>
+      <w:bookmarkEnd w:id="29"/>
+    </w:p>
+    <w:p>
+      <w:r>
+        <w:t>J’ai utilisé l’IA pour m’aider à rédiger mon rapport (faut rajouter les 2 prompts).</w:t>
+      </w:r>
+    </w:p>
+    <w:p>
+      <w:pPr>
+        <w:pStyle w:val="Titre2"/>
+        <w:ind w:left="708"/>
+        <w:rPr>
+          <w:color w:val="auto"/>
+        </w:rPr>
+      </w:pPr>
+      <w:bookmarkStart w:id="30" w:name="_Toc242092038"/>
+      <w:r>
+        <w:rPr>
+          <w:color w:val="auto"/>
+        </w:rPr>
         <w:t>Bilan des fonctionnalités</w:t>
       </w:r>
-      <w:bookmarkEnd w:id="29"/>
+      <w:bookmarkEnd w:id="30"/>
     </w:p>
     <w:p>
       <w:r>
@@ -5487,7 +5577,7 @@
             <w:sz w:val="18"/>
             <w:szCs w:val="18"/>
           </w:rPr>
-          <w:t>Juliana Mendes Baptista</w:t>
+          <w:t>Nicolas Marques</w:t>
         </w:r>
       </w:sdtContent>
     </w:sdt>
@@ -5574,7 +5664,14 @@
                 <w:sz w:val="18"/>
                 <w:szCs w:val="18"/>
               </w:rPr>
-              <w:t>R_pu81umy_projetMaison.docx</w:t>
+              <w:t>R-320-NicolasMarques-Rapport</w:t>
+            </w:r>
+            <w:r>
+              <w:rPr>
+                <w:sz w:val="18"/>
+                <w:szCs w:val="18"/>
+              </w:rPr>
+              <w:t>.docx</w:t>
             </w:r>
             <w:r>
               <w:rPr>
@@ -7055,14 +7152,18 @@
     <w:rsid w:val="005E5E67"/>
     <w:rsid w:val="006242E2"/>
     <w:rsid w:val="00665836"/>
+    <w:rsid w:val="007946E6"/>
     <w:rsid w:val="009068F7"/>
+    <w:rsid w:val="009851C5"/>
     <w:rsid w:val="009E71B4"/>
     <w:rsid w:val="00A4481E"/>
     <w:rsid w:val="00AC09D7"/>
+    <w:rsid w:val="00B42BEF"/>
     <w:rsid w:val="00BA66F6"/>
     <w:rsid w:val="00C15624"/>
     <w:rsid w:val="00CD419C"/>
     <w:rsid w:val="00DF50E4"/>
+    <w:rsid w:val="00E232B9"/>
     <w:rsid w:val="00F04970"/>
     <w:rsid w:val="00FF1E6D"/>
   </w:rsids>

</xml_diff>

<commit_message>
feat test unitaire: Ajouter un nouvelle test unitaire pour continuer d'améliorer mon rapport pour la section (tests)
</commit_message>
<xml_diff>
--- a/R-320-NicolasMarques-Rapport.docx
+++ b/R-320-NicolasMarques-Rapport.docx
@@ -139,7 +139,7 @@
           <w:r>
             <w:fldChar w:fldCharType="separate"/>
           </w:r>
-          <w:hyperlink w:anchor="_Toc242092008" w:history="1">
+          <w:hyperlink w:anchor="_Toc242094222" w:history="1">
             <w:r>
               <w:rPr>
                 <w:rStyle w:val="Lienhypertexte"/>
@@ -166,7 +166,7 @@
                 <w:noProof/>
                 <w:webHidden/>
               </w:rPr>
-              <w:instrText xml:space="preserve"> PAGEREF _Toc242092008 \h </w:instrText>
+              <w:instrText xml:space="preserve"> PAGEREF _Toc242094222 \h </w:instrText>
             </w:r>
             <w:r>
               <w:rPr>
@@ -209,7 +209,7 @@
               <w:lang w:eastAsia="fr-CH"/>
             </w:rPr>
           </w:pPr>
-          <w:hyperlink w:anchor="_Toc242092009" w:history="1">
+          <w:hyperlink w:anchor="_Toc242094223" w:history="1">
             <w:r>
               <w:rPr>
                 <w:rStyle w:val="Lienhypertexte"/>
@@ -236,7 +236,7 @@
                 <w:noProof/>
                 <w:webHidden/>
               </w:rPr>
-              <w:instrText xml:space="preserve"> PAGEREF _Toc242092009 \h </w:instrText>
+              <w:instrText xml:space="preserve"> PAGEREF _Toc242094223 \h </w:instrText>
             </w:r>
             <w:r>
               <w:rPr>
@@ -279,7 +279,7 @@
               <w:lang w:eastAsia="fr-CH"/>
             </w:rPr>
           </w:pPr>
-          <w:hyperlink w:anchor="_Toc242092010" w:history="1">
+          <w:hyperlink w:anchor="_Toc242094224" w:history="1">
             <w:r>
               <w:rPr>
                 <w:rStyle w:val="Lienhypertexte"/>
@@ -306,7 +306,7 @@
                 <w:noProof/>
                 <w:webHidden/>
               </w:rPr>
-              <w:instrText xml:space="preserve"> PAGEREF _Toc242092010 \h </w:instrText>
+              <w:instrText xml:space="preserve"> PAGEREF _Toc242094224 \h </w:instrText>
             </w:r>
             <w:r>
               <w:rPr>
@@ -349,7 +349,7 @@
               <w:lang w:eastAsia="fr-CH"/>
             </w:rPr>
           </w:pPr>
-          <w:hyperlink w:anchor="_Toc242092011" w:history="1">
+          <w:hyperlink w:anchor="_Toc242094225" w:history="1">
             <w:r>
               <w:rPr>
                 <w:rStyle w:val="Lienhypertexte"/>
@@ -376,7 +376,7 @@
                 <w:noProof/>
                 <w:webHidden/>
               </w:rPr>
-              <w:instrText xml:space="preserve"> PAGEREF _Toc242092011 \h </w:instrText>
+              <w:instrText xml:space="preserve"> PAGEREF _Toc242094225 \h </w:instrText>
             </w:r>
             <w:r>
               <w:rPr>
@@ -419,7 +419,7 @@
               <w:lang w:eastAsia="fr-CH"/>
             </w:rPr>
           </w:pPr>
-          <w:hyperlink w:anchor="_Toc242092012" w:history="1">
+          <w:hyperlink w:anchor="_Toc242094226" w:history="1">
             <w:r>
               <w:rPr>
                 <w:rStyle w:val="Lienhypertexte"/>
@@ -446,7 +446,7 @@
                 <w:noProof/>
                 <w:webHidden/>
               </w:rPr>
-              <w:instrText xml:space="preserve"> PAGEREF _Toc242092012 \h </w:instrText>
+              <w:instrText xml:space="preserve"> PAGEREF _Toc242094226 \h </w:instrText>
             </w:r>
             <w:r>
               <w:rPr>
@@ -489,7 +489,7 @@
               <w:lang w:eastAsia="fr-CH"/>
             </w:rPr>
           </w:pPr>
-          <w:hyperlink w:anchor="_Toc242092013" w:history="1">
+          <w:hyperlink w:anchor="_Toc242094227" w:history="1">
             <w:r>
               <w:rPr>
                 <w:rStyle w:val="Lienhypertexte"/>
@@ -516,7 +516,7 @@
                 <w:noProof/>
                 <w:webHidden/>
               </w:rPr>
-              <w:instrText xml:space="preserve"> PAGEREF _Toc242092013 \h </w:instrText>
+              <w:instrText xml:space="preserve"> PAGEREF _Toc242094227 \h </w:instrText>
             </w:r>
             <w:r>
               <w:rPr>
@@ -559,7 +559,7 @@
               <w:lang w:eastAsia="fr-CH"/>
             </w:rPr>
           </w:pPr>
-          <w:hyperlink w:anchor="_Toc242092014" w:history="1">
+          <w:hyperlink w:anchor="_Toc242094228" w:history="1">
             <w:r>
               <w:rPr>
                 <w:rStyle w:val="Lienhypertexte"/>
@@ -586,7 +586,7 @@
                 <w:noProof/>
                 <w:webHidden/>
               </w:rPr>
-              <w:instrText xml:space="preserve"> PAGEREF _Toc242092014 \h </w:instrText>
+              <w:instrText xml:space="preserve"> PAGEREF _Toc242094228 \h </w:instrText>
             </w:r>
             <w:r>
               <w:rPr>
@@ -629,7 +629,7 @@
               <w:lang w:eastAsia="fr-CH"/>
             </w:rPr>
           </w:pPr>
-          <w:hyperlink w:anchor="_Toc242092015" w:history="1">
+          <w:hyperlink w:anchor="_Toc242094229" w:history="1">
             <w:r>
               <w:rPr>
                 <w:rStyle w:val="Lienhypertexte"/>
@@ -656,7 +656,7 @@
                 <w:noProof/>
                 <w:webHidden/>
               </w:rPr>
-              <w:instrText xml:space="preserve"> PAGEREF _Toc242092015 \h </w:instrText>
+              <w:instrText xml:space="preserve"> PAGEREF _Toc242094229 \h </w:instrText>
             </w:r>
             <w:r>
               <w:rPr>
@@ -699,7 +699,7 @@
               <w:lang w:eastAsia="fr-CH"/>
             </w:rPr>
           </w:pPr>
-          <w:hyperlink w:anchor="_Toc242092016" w:history="1">
+          <w:hyperlink w:anchor="_Toc242094230" w:history="1">
             <w:r>
               <w:rPr>
                 <w:rStyle w:val="Lienhypertexte"/>
@@ -726,7 +726,7 @@
                 <w:noProof/>
                 <w:webHidden/>
               </w:rPr>
-              <w:instrText xml:space="preserve"> PAGEREF _Toc242092016 \h </w:instrText>
+              <w:instrText xml:space="preserve"> PAGEREF _Toc242094230 \h </w:instrText>
             </w:r>
             <w:r>
               <w:rPr>
@@ -769,7 +769,7 @@
               <w:lang w:eastAsia="fr-CH"/>
             </w:rPr>
           </w:pPr>
-          <w:hyperlink w:anchor="_Toc242092017" w:history="1">
+          <w:hyperlink w:anchor="_Toc242094231" w:history="1">
             <w:r>
               <w:rPr>
                 <w:rStyle w:val="Lienhypertexte"/>
@@ -796,7 +796,7 @@
                 <w:noProof/>
                 <w:webHidden/>
               </w:rPr>
-              <w:instrText xml:space="preserve"> PAGEREF _Toc242092017 \h </w:instrText>
+              <w:instrText xml:space="preserve"> PAGEREF _Toc242094231 \h </w:instrText>
             </w:r>
             <w:r>
               <w:rPr>
@@ -839,7 +839,7 @@
               <w:lang w:eastAsia="fr-CH"/>
             </w:rPr>
           </w:pPr>
-          <w:hyperlink w:anchor="_Toc242092018" w:history="1">
+          <w:hyperlink w:anchor="_Toc242094232" w:history="1">
             <w:r>
               <w:rPr>
                 <w:rStyle w:val="Lienhypertexte"/>
@@ -866,7 +866,7 @@
                 <w:noProof/>
                 <w:webHidden/>
               </w:rPr>
-              <w:instrText xml:space="preserve"> PAGEREF _Toc242092018 \h </w:instrText>
+              <w:instrText xml:space="preserve"> PAGEREF _Toc242094232 \h </w:instrText>
             </w:r>
             <w:r>
               <w:rPr>
@@ -909,7 +909,7 @@
               <w:lang w:eastAsia="fr-CH"/>
             </w:rPr>
           </w:pPr>
-          <w:hyperlink w:anchor="_Toc242092019" w:history="1">
+          <w:hyperlink w:anchor="_Toc242094233" w:history="1">
             <w:r>
               <w:rPr>
                 <w:rStyle w:val="Lienhypertexte"/>
@@ -936,7 +936,7 @@
                 <w:noProof/>
                 <w:webHidden/>
               </w:rPr>
-              <w:instrText xml:space="preserve"> PAGEREF _Toc242092019 \h </w:instrText>
+              <w:instrText xml:space="preserve"> PAGEREF _Toc242094233 \h </w:instrText>
             </w:r>
             <w:r>
               <w:rPr>
@@ -979,7 +979,7 @@
               <w:lang w:eastAsia="fr-CH"/>
             </w:rPr>
           </w:pPr>
-          <w:hyperlink w:anchor="_Toc242092020" w:history="1">
+          <w:hyperlink w:anchor="_Toc242094234" w:history="1">
             <w:r>
               <w:rPr>
                 <w:rStyle w:val="Lienhypertexte"/>
@@ -1006,7 +1006,7 @@
                 <w:noProof/>
                 <w:webHidden/>
               </w:rPr>
-              <w:instrText xml:space="preserve"> PAGEREF _Toc242092020 \h </w:instrText>
+              <w:instrText xml:space="preserve"> PAGEREF _Toc242094234 \h </w:instrText>
             </w:r>
             <w:r>
               <w:rPr>
@@ -1049,7 +1049,7 @@
               <w:lang w:eastAsia="fr-CH"/>
             </w:rPr>
           </w:pPr>
-          <w:hyperlink w:anchor="_Toc242092021" w:history="1">
+          <w:hyperlink w:anchor="_Toc242094235" w:history="1">
             <w:r>
               <w:rPr>
                 <w:rStyle w:val="Lienhypertexte"/>
@@ -1076,7 +1076,7 @@
                 <w:noProof/>
                 <w:webHidden/>
               </w:rPr>
-              <w:instrText xml:space="preserve"> PAGEREF _Toc242092021 \h </w:instrText>
+              <w:instrText xml:space="preserve"> PAGEREF _Toc242094235 \h </w:instrText>
             </w:r>
             <w:r>
               <w:rPr>
@@ -1119,7 +1119,7 @@
               <w:lang w:eastAsia="fr-CH"/>
             </w:rPr>
           </w:pPr>
-          <w:hyperlink w:anchor="_Toc242092022" w:history="1">
+          <w:hyperlink w:anchor="_Toc242094236" w:history="1">
             <w:r>
               <w:rPr>
                 <w:rStyle w:val="Lienhypertexte"/>
@@ -1146,7 +1146,7 @@
                 <w:noProof/>
                 <w:webHidden/>
               </w:rPr>
-              <w:instrText xml:space="preserve"> PAGEREF _Toc242092022 \h </w:instrText>
+              <w:instrText xml:space="preserve"> PAGEREF _Toc242094236 \h </w:instrText>
             </w:r>
             <w:r>
               <w:rPr>
@@ -1189,7 +1189,7 @@
               <w:lang w:eastAsia="fr-CH"/>
             </w:rPr>
           </w:pPr>
-          <w:hyperlink w:anchor="_Toc242092023" w:history="1">
+          <w:hyperlink w:anchor="_Toc242094237" w:history="1">
             <w:r>
               <w:rPr>
                 <w:rStyle w:val="Lienhypertexte"/>
@@ -1216,7 +1216,7 @@
                 <w:noProof/>
                 <w:webHidden/>
               </w:rPr>
-              <w:instrText xml:space="preserve"> PAGEREF _Toc242092023 \h </w:instrText>
+              <w:instrText xml:space="preserve"> PAGEREF _Toc242094237 \h </w:instrText>
             </w:r>
             <w:r>
               <w:rPr>
@@ -1259,7 +1259,7 @@
               <w:lang w:eastAsia="fr-CH"/>
             </w:rPr>
           </w:pPr>
-          <w:hyperlink w:anchor="_Toc242092024" w:history="1">
+          <w:hyperlink w:anchor="_Toc242094238" w:history="1">
             <w:r>
               <w:rPr>
                 <w:rStyle w:val="Lienhypertexte"/>
@@ -1286,7 +1286,7 @@
                 <w:noProof/>
                 <w:webHidden/>
               </w:rPr>
-              <w:instrText xml:space="preserve"> PAGEREF _Toc242092024 \h </w:instrText>
+              <w:instrText xml:space="preserve"> PAGEREF _Toc242094238 \h </w:instrText>
             </w:r>
             <w:r>
               <w:rPr>
@@ -1329,7 +1329,7 @@
               <w:lang w:eastAsia="fr-CH"/>
             </w:rPr>
           </w:pPr>
-          <w:hyperlink w:anchor="_Toc242092025" w:history="1">
+          <w:hyperlink w:anchor="_Toc242094239" w:history="1">
             <w:r>
               <w:rPr>
                 <w:rStyle w:val="Lienhypertexte"/>
@@ -1356,7 +1356,7 @@
                 <w:noProof/>
                 <w:webHidden/>
               </w:rPr>
-              <w:instrText xml:space="preserve"> PAGEREF _Toc242092025 \h </w:instrText>
+              <w:instrText xml:space="preserve"> PAGEREF _Toc242094239 \h </w:instrText>
             </w:r>
             <w:r>
               <w:rPr>
@@ -1399,7 +1399,7 @@
               <w:lang w:eastAsia="fr-CH"/>
             </w:rPr>
           </w:pPr>
-          <w:hyperlink w:anchor="_Toc242092026" w:history="1">
+          <w:hyperlink w:anchor="_Toc242094240" w:history="1">
             <w:r>
               <w:rPr>
                 <w:rStyle w:val="Lienhypertexte"/>
@@ -1426,7 +1426,7 @@
                 <w:noProof/>
                 <w:webHidden/>
               </w:rPr>
-              <w:instrText xml:space="preserve"> PAGEREF _Toc242092026 \h </w:instrText>
+              <w:instrText xml:space="preserve"> PAGEREF _Toc242094240 \h </w:instrText>
             </w:r>
             <w:r>
               <w:rPr>
@@ -1469,7 +1469,7 @@
               <w:lang w:eastAsia="fr-CH"/>
             </w:rPr>
           </w:pPr>
-          <w:hyperlink w:anchor="_Toc242092027" w:history="1">
+          <w:hyperlink w:anchor="_Toc242094241" w:history="1">
             <w:r>
               <w:rPr>
                 <w:rStyle w:val="Lienhypertexte"/>
@@ -1496,7 +1496,7 @@
                 <w:noProof/>
                 <w:webHidden/>
               </w:rPr>
-              <w:instrText xml:space="preserve"> PAGEREF _Toc242092027 \h </w:instrText>
+              <w:instrText xml:space="preserve"> PAGEREF _Toc242094241 \h </w:instrText>
             </w:r>
             <w:r>
               <w:rPr>
@@ -1539,7 +1539,7 @@
               <w:lang w:eastAsia="fr-CH"/>
             </w:rPr>
           </w:pPr>
-          <w:hyperlink w:anchor="_Toc242092028" w:history="1">
+          <w:hyperlink w:anchor="_Toc242094242" w:history="1">
             <w:r>
               <w:rPr>
                 <w:rStyle w:val="Lienhypertexte"/>
@@ -1566,7 +1566,7 @@
                 <w:noProof/>
                 <w:webHidden/>
               </w:rPr>
-              <w:instrText xml:space="preserve"> PAGEREF _Toc242092028 \h </w:instrText>
+              <w:instrText xml:space="preserve"> PAGEREF _Toc242094242 \h </w:instrText>
             </w:r>
             <w:r>
               <w:rPr>
@@ -1609,7 +1609,7 @@
               <w:lang w:eastAsia="fr-CH"/>
             </w:rPr>
           </w:pPr>
-          <w:hyperlink w:anchor="_Toc242092029" w:history="1">
+          <w:hyperlink w:anchor="_Toc242094243" w:history="1">
             <w:r>
               <w:rPr>
                 <w:rStyle w:val="Lienhypertexte"/>
@@ -1636,7 +1636,7 @@
                 <w:noProof/>
                 <w:webHidden/>
               </w:rPr>
-              <w:instrText xml:space="preserve"> PAGEREF _Toc242092029 \h </w:instrText>
+              <w:instrText xml:space="preserve"> PAGEREF _Toc242094243 \h </w:instrText>
             </w:r>
             <w:r>
               <w:rPr>
@@ -1679,7 +1679,7 @@
               <w:lang w:eastAsia="fr-CH"/>
             </w:rPr>
           </w:pPr>
-          <w:hyperlink w:anchor="_Toc242092030" w:history="1">
+          <w:hyperlink w:anchor="_Toc242094244" w:history="1">
             <w:r>
               <w:rPr>
                 <w:rStyle w:val="Lienhypertexte"/>
@@ -1706,7 +1706,7 @@
                 <w:noProof/>
                 <w:webHidden/>
               </w:rPr>
-              <w:instrText xml:space="preserve"> PAGEREF _Toc242092030 \h </w:instrText>
+              <w:instrText xml:space="preserve"> PAGEREF _Toc242094244 \h </w:instrText>
             </w:r>
             <w:r>
               <w:rPr>
@@ -1749,7 +1749,7 @@
               <w:lang w:eastAsia="fr-CH"/>
             </w:rPr>
           </w:pPr>
-          <w:hyperlink w:anchor="_Toc242092031" w:history="1">
+          <w:hyperlink w:anchor="_Toc242094245" w:history="1">
             <w:r>
               <w:rPr>
                 <w:rStyle w:val="Lienhypertexte"/>
@@ -1776,7 +1776,7 @@
                 <w:noProof/>
                 <w:webHidden/>
               </w:rPr>
-              <w:instrText xml:space="preserve"> PAGEREF _Toc242092031 \h </w:instrText>
+              <w:instrText xml:space="preserve"> PAGEREF _Toc242094245 \h </w:instrText>
             </w:r>
             <w:r>
               <w:rPr>
@@ -1819,7 +1819,7 @@
               <w:lang w:eastAsia="fr-CH"/>
             </w:rPr>
           </w:pPr>
-          <w:hyperlink w:anchor="_Toc242092032" w:history="1">
+          <w:hyperlink w:anchor="_Toc242094246" w:history="1">
             <w:r>
               <w:rPr>
                 <w:rStyle w:val="Lienhypertexte"/>
@@ -1846,7 +1846,7 @@
                 <w:noProof/>
                 <w:webHidden/>
               </w:rPr>
-              <w:instrText xml:space="preserve"> PAGEREF _Toc242092032 \h </w:instrText>
+              <w:instrText xml:space="preserve"> PAGEREF _Toc242094246 \h </w:instrText>
             </w:r>
             <w:r>
               <w:rPr>
@@ -1889,7 +1889,7 @@
               <w:lang w:eastAsia="fr-CH"/>
             </w:rPr>
           </w:pPr>
-          <w:hyperlink w:anchor="_Toc242092033" w:history="1">
+          <w:hyperlink w:anchor="_Toc242094247" w:history="1">
             <w:r>
               <w:rPr>
                 <w:rStyle w:val="Lienhypertexte"/>
@@ -1916,7 +1916,7 @@
                 <w:noProof/>
                 <w:webHidden/>
               </w:rPr>
-              <w:instrText xml:space="preserve"> PAGEREF _Toc242092033 \h </w:instrText>
+              <w:instrText xml:space="preserve"> PAGEREF _Toc242094247 \h </w:instrText>
             </w:r>
             <w:r>
               <w:rPr>
@@ -1959,13 +1959,13 @@
               <w:lang w:eastAsia="fr-CH"/>
             </w:rPr>
           </w:pPr>
-          <w:hyperlink w:anchor="_Toc242092034" w:history="1">
+          <w:hyperlink w:anchor="_Toc242094248" w:history="1">
             <w:r>
               <w:rPr>
                 <w:rStyle w:val="Lienhypertexte"/>
                 <w:noProof/>
               </w:rPr>
-              <w:t>CheckParkingSpot_IsFree_Result_X</w:t>
+              <w:t>CheckParkingSpot_IsFree_Result_L</w:t>
             </w:r>
             <w:r>
               <w:rPr>
@@ -1986,7 +1986,77 @@
                 <w:noProof/>
                 <w:webHidden/>
               </w:rPr>
-              <w:instrText xml:space="preserve"> PAGEREF _Toc242092034 \h </w:instrText>
+              <w:instrText xml:space="preserve"> PAGEREF _Toc242094248 \h </w:instrText>
+            </w:r>
+            <w:r>
+              <w:rPr>
+                <w:noProof/>
+                <w:webHidden/>
+              </w:rPr>
+            </w:r>
+            <w:r>
+              <w:rPr>
+                <w:noProof/>
+                <w:webHidden/>
+              </w:rPr>
+              <w:fldChar w:fldCharType="separate"/>
+            </w:r>
+            <w:r>
+              <w:rPr>
+                <w:noProof/>
+                <w:webHidden/>
+              </w:rPr>
+              <w:t>21</w:t>
+            </w:r>
+            <w:r>
+              <w:rPr>
+                <w:noProof/>
+                <w:webHidden/>
+              </w:rPr>
+              <w:fldChar w:fldCharType="end"/>
+            </w:r>
+          </w:hyperlink>
+        </w:p>
+        <w:p>
+          <w:pPr>
+            <w:pStyle w:val="TM2"/>
+            <w:tabs>
+              <w:tab w:val="right" w:leader="dot" w:pos="9062"/>
+            </w:tabs>
+            <w:rPr>
+              <w:rFonts w:eastAsiaTheme="minorEastAsia"/>
+              <w:noProof/>
+              <w:lang w:eastAsia="fr-CH"/>
+            </w:rPr>
+          </w:pPr>
+          <w:hyperlink w:anchor="_Toc242094249" w:history="1">
+            <w:r>
+              <w:rPr>
+                <w:rStyle w:val="Lienhypertexte"/>
+                <w:noProof/>
+              </w:rPr>
+              <w:t>GetTotalPaidPrice_Is0_Result_0</w:t>
+            </w:r>
+            <w:r>
+              <w:rPr>
+                <w:noProof/>
+                <w:webHidden/>
+              </w:rPr>
+              <w:tab/>
+            </w:r>
+            <w:r>
+              <w:rPr>
+                <w:noProof/>
+                <w:webHidden/>
+              </w:rPr>
+              <w:fldChar w:fldCharType="begin"/>
+            </w:r>
+            <w:r>
+              <w:rPr>
+                <w:noProof/>
+                <w:webHidden/>
+              </w:rPr>
+              <w:instrText xml:space="preserve"> PAGEREF _Toc242094249 \h </w:instrText>
             </w:r>
             <w:r>
               <w:rPr>
@@ -2029,7 +2099,7 @@
               <w:lang w:eastAsia="fr-CH"/>
             </w:rPr>
           </w:pPr>
-          <w:hyperlink w:anchor="_Toc242092035" w:history="1">
+          <w:hyperlink w:anchor="_Toc242094250" w:history="1">
             <w:r>
               <w:rPr>
                 <w:rStyle w:val="Lienhypertexte"/>
@@ -2056,7 +2126,7 @@
                 <w:noProof/>
                 <w:webHidden/>
               </w:rPr>
-              <w:instrText xml:space="preserve"> PAGEREF _Toc242092035 \h </w:instrText>
+              <w:instrText xml:space="preserve"> PAGEREF _Toc242094250 \h </w:instrText>
             </w:r>
             <w:r>
               <w:rPr>
@@ -2099,7 +2169,7 @@
               <w:lang w:eastAsia="fr-CH"/>
             </w:rPr>
           </w:pPr>
-          <w:hyperlink w:anchor="_Toc242092036" w:history="1">
+          <w:hyperlink w:anchor="_Toc242094251" w:history="1">
             <w:r>
               <w:rPr>
                 <w:rStyle w:val="Lienhypertexte"/>
@@ -2126,7 +2196,7 @@
                 <w:noProof/>
                 <w:webHidden/>
               </w:rPr>
-              <w:instrText xml:space="preserve"> PAGEREF _Toc242092036 \h </w:instrText>
+              <w:instrText xml:space="preserve"> PAGEREF _Toc242094251 \h </w:instrText>
             </w:r>
             <w:r>
               <w:rPr>
@@ -2169,7 +2239,7 @@
               <w:lang w:eastAsia="fr-CH"/>
             </w:rPr>
           </w:pPr>
-          <w:hyperlink w:anchor="_Toc242092037" w:history="1">
+          <w:hyperlink w:anchor="_Toc242094252" w:history="1">
             <w:r>
               <w:rPr>
                 <w:rStyle w:val="Lienhypertexte"/>
@@ -2196,7 +2266,7 @@
                 <w:noProof/>
                 <w:webHidden/>
               </w:rPr>
-              <w:instrText xml:space="preserve"> PAGEREF _Toc242092037 \h </w:instrText>
+              <w:instrText xml:space="preserve"> PAGEREF _Toc242094252 \h </w:instrText>
             </w:r>
             <w:r>
               <w:rPr>
@@ -2239,7 +2309,7 @@
               <w:lang w:eastAsia="fr-CH"/>
             </w:rPr>
           </w:pPr>
-          <w:hyperlink w:anchor="_Toc242092038" w:history="1">
+          <w:hyperlink w:anchor="_Toc242094253" w:history="1">
             <w:r>
               <w:rPr>
                 <w:rStyle w:val="Lienhypertexte"/>
@@ -2266,7 +2336,7 @@
                 <w:noProof/>
                 <w:webHidden/>
               </w:rPr>
-              <w:instrText xml:space="preserve"> PAGEREF _Toc242092038 \h </w:instrText>
+              <w:instrText xml:space="preserve"> PAGEREF _Toc242094253 \h </w:instrText>
             </w:r>
             <w:r>
               <w:rPr>
@@ -2303,7 +2373,6 @@
               <w:b/>
               <w:bCs/>
             </w:rPr>
-            <w:lastRenderedPageBreak/>
             <w:fldChar w:fldCharType="end"/>
           </w:r>
         </w:p>
@@ -2326,7 +2395,7 @@
           <w:color w:val="auto"/>
         </w:rPr>
       </w:pPr>
-      <w:bookmarkStart w:id="0" w:name="_Toc242092008"/>
+      <w:bookmarkStart w:id="0" w:name="_Toc242094222"/>
       <w:r>
         <w:rPr>
           <w:color w:val="auto"/>
@@ -2688,15 +2757,7 @@
         <w:t xml:space="preserve"> </w:t>
       </w:r>
       <w:r>
-        <w:t xml:space="preserve">Utilisé un </w:t>
-      </w:r>
-      <w:proofErr w:type="spellStart"/>
-      <w:r>
-        <w:t>timer</w:t>
-      </w:r>
-      <w:proofErr w:type="spellEnd"/>
-      <w:r>
-        <w:t xml:space="preserve"> qui s’incrémentera chaque seconde. Une seconde sera égale à une minute.</w:t>
+        <w:t>Utilisé un timer qui s’incrémentera chaque seconde. Une seconde sera égale à une minute.</w:t>
       </w:r>
     </w:p>
     <w:p>
@@ -2775,12 +2836,8 @@
       </w:r>
       <w:r>
         <w:br/>
-      </w:r>
-      <w:proofErr w:type="gramStart"/>
-      <w:r>
         <w:t>Puis ensuite</w:t>
       </w:r>
-      <w:proofErr w:type="gramEnd"/>
       <w:r>
         <w:rPr>
           <w:color w:val="7030A0"/>
@@ -2895,50 +2952,35 @@
       <w:r>
         <w:t>"</w:t>
       </w:r>
-      <w:proofErr w:type="spellStart"/>
       <w:r>
         <w:t>nothing</w:t>
       </w:r>
-      <w:proofErr w:type="spellEnd"/>
+      <w:r>
+        <w:t xml:space="preserve"> found</w:t>
+      </w:r>
+      <w:r>
+        <w:t>"</w:t>
+      </w:r>
+      <w:r>
+        <w:t>.</w:t>
+      </w:r>
+      <w:r>
+        <w:br/>
+      </w:r>
+      <w:r>
+        <w:t xml:space="preserve">Cette méthode </w:t>
+      </w:r>
+      <w:r>
+        <w:t>appellera une autre méthode</w:t>
+      </w:r>
       <w:r>
         <w:t xml:space="preserve"> </w:t>
       </w:r>
-      <w:proofErr w:type="spellStart"/>
-      <w:r>
-        <w:t>found</w:t>
-      </w:r>
-      <w:proofErr w:type="spellEnd"/>
-      <w:r>
-        <w:t>"</w:t>
-      </w:r>
-      <w:r>
-        <w:t>.</w:t>
-      </w:r>
-      <w:r>
-        <w:br/>
-      </w:r>
-      <w:r>
-        <w:t xml:space="preserve">Cette méthode </w:t>
-      </w:r>
-      <w:r>
-        <w:t>appellera une autre méthode</w:t>
-      </w:r>
-      <w:r>
-        <w:t xml:space="preserve"> </w:t>
-      </w:r>
       <w:r>
         <w:t>en lui donnant comme paramètre la plaque</w:t>
       </w:r>
       <w:r>
-        <w:t xml:space="preserve"> (si l’utilisateur avait </w:t>
-      </w:r>
-      <w:proofErr w:type="spellStart"/>
-      <w:r>
-        <w:t>entrée</w:t>
-      </w:r>
-      <w:proofErr w:type="spellEnd"/>
-      <w:r>
-        <w:t xml:space="preserve"> un numéro de place, on aurait cherché dans le parking la place en question puis récupéré son numéro de plaque qui l’occupe)</w:t>
+        <w:t xml:space="preserve"> (si l’utilisateur avait entrée un numéro de place, on aurait cherché dans le parking la place en question puis récupéré son numéro de plaque qui l’occupe)</w:t>
       </w:r>
       <w:r>
         <w:t xml:space="preserve"> </w:t>
@@ -3003,19 +3045,9 @@
       <w:r>
         <w:t>"</w:t>
       </w:r>
-      <w:proofErr w:type="spellStart"/>
-      <w:r>
-        <w:t>nothing</w:t>
-      </w:r>
-      <w:proofErr w:type="spellEnd"/>
-      <w:r>
-        <w:t xml:space="preserve"> </w:t>
-      </w:r>
-      <w:proofErr w:type="spellStart"/>
-      <w:r>
-        <w:t>found</w:t>
-      </w:r>
-      <w:proofErr w:type="spellEnd"/>
+      <w:r>
+        <w:t>nothing found</w:t>
+      </w:r>
       <w:r>
         <w:t>"</w:t>
       </w:r>
@@ -3099,19 +3131,9 @@
       <w:r>
         <w:t>"</w:t>
       </w:r>
-      <w:proofErr w:type="spellStart"/>
-      <w:r>
-        <w:t>nothing</w:t>
-      </w:r>
-      <w:proofErr w:type="spellEnd"/>
-      <w:r>
-        <w:t xml:space="preserve"> </w:t>
-      </w:r>
-      <w:proofErr w:type="spellStart"/>
-      <w:r>
-        <w:t>found</w:t>
-      </w:r>
-      <w:proofErr w:type="spellEnd"/>
+      <w:r>
+        <w:t>nothing found</w:t>
+      </w:r>
       <w:r>
         <w:t>"</w:t>
       </w:r>
@@ -3231,7 +3253,7 @@
           <w:color w:val="auto"/>
         </w:rPr>
       </w:pPr>
-      <w:bookmarkStart w:id="1" w:name="_Toc242092009"/>
+      <w:bookmarkStart w:id="1" w:name="_Toc242094223"/>
       <w:r>
         <w:rPr>
           <w:color w:val="auto"/>
@@ -3245,13 +3267,11 @@
       <w:pPr>
         <w:pStyle w:val="Titre2"/>
       </w:pPr>
-      <w:bookmarkStart w:id="2" w:name="_Toc242092010"/>
-      <w:proofErr w:type="spellStart"/>
+      <w:bookmarkStart w:id="2" w:name="_Toc242094224"/>
       <w:r>
         <w:t>Program.cs</w:t>
       </w:r>
       <w:bookmarkEnd w:id="2"/>
-      <w:proofErr w:type="spellEnd"/>
     </w:p>
     <w:p>
       <w:r>
@@ -3261,15 +3281,7 @@
         <w:t>La seule action</w:t>
       </w:r>
       <w:r>
-        <w:t xml:space="preserve"> qu’elle effectue c’est d’appeler une classe nommée « </w:t>
-      </w:r>
-      <w:proofErr w:type="spellStart"/>
-      <w:r>
-        <w:t>PlayGame</w:t>
-      </w:r>
-      <w:proofErr w:type="spellEnd"/>
-      <w:r>
-        <w:t> ».</w:t>
+        <w:t xml:space="preserve"> qu’elle effectue c’est d’appeler une classe nommée « PlayGame ».</w:t>
       </w:r>
     </w:p>
     <w:p>
@@ -3332,14 +3344,12 @@
       <w:pPr>
         <w:pStyle w:val="Titre2"/>
       </w:pPr>
-      <w:bookmarkStart w:id="3" w:name="_Toc242092011"/>
-      <w:proofErr w:type="spellStart"/>
+      <w:bookmarkStart w:id="3" w:name="_Toc242094225"/>
       <w:r>
         <w:lastRenderedPageBreak/>
         <w:t>PlayGame.cs</w:t>
       </w:r>
       <w:bookmarkEnd w:id="3"/>
-      <w:proofErr w:type="spellEnd"/>
     </w:p>
     <w:p>
       <w:r>
@@ -3349,15 +3359,7 @@
         <w:t>e situe 3 méthodes.</w:t>
       </w:r>
       <w:r>
-        <w:t xml:space="preserve"> Elle exécute une </w:t>
-      </w:r>
-      <w:proofErr w:type="spellStart"/>
-      <w:r>
-        <w:t>loop</w:t>
-      </w:r>
-      <w:proofErr w:type="spellEnd"/>
-      <w:r>
-        <w:t xml:space="preserve"> qui permet au programme de tourner continuellement jusqu’à ce que l’utilisateur décide d’arrêter le programme.</w:t>
+        <w:t xml:space="preserve"> Elle exécute une loop qui permet au programme de tourner continuellement jusqu’à ce que l’utilisateur décide d’arrêter le programme.</w:t>
       </w:r>
     </w:p>
     <w:p>
@@ -3365,13 +3367,11 @@
         <w:pStyle w:val="Titre3"/>
         <w:ind w:firstLine="708"/>
       </w:pPr>
-      <w:bookmarkStart w:id="4" w:name="_Toc242092012"/>
-      <w:proofErr w:type="spellStart"/>
+      <w:bookmarkStart w:id="4" w:name="_Toc242094226"/>
       <w:r>
         <w:t>StartProgram</w:t>
       </w:r>
       <w:bookmarkEnd w:id="4"/>
-      <w:proofErr w:type="spellEnd"/>
     </w:p>
     <w:p>
       <w:pPr>
@@ -3433,15 +3433,7 @@
         <w:t xml:space="preserve">Dans </w:t>
       </w:r>
       <w:r>
-        <w:t>cette méthode on commence par appelé « </w:t>
-      </w:r>
-      <w:proofErr w:type="spellStart"/>
-      <w:r>
-        <w:t>InitiateParking</w:t>
-      </w:r>
-      <w:proofErr w:type="spellEnd"/>
-      <w:r>
-        <w:t> »</w:t>
+        <w:t>cette méthode on commence par appelé « InitiateParking »</w:t>
       </w:r>
       <w:r>
         <w:t xml:space="preserve"> </w:t>
@@ -3456,29 +3448,13 @@
         <w:t xml:space="preserve">e </w:t>
       </w:r>
       <w:r>
-        <w:t>on commence une boucle avec « </w:t>
-      </w:r>
-      <w:proofErr w:type="spellStart"/>
-      <w:r>
-        <w:t>continueProgram</w:t>
-      </w:r>
-      <w:proofErr w:type="spellEnd"/>
-      <w:r>
-        <w:t> » (</w:t>
+        <w:t>on commence une boucle avec « continueProgram » (</w:t>
       </w:r>
       <w:r>
         <w:t xml:space="preserve">un booléen </w:t>
       </w:r>
       <w:r>
-        <w:t>déclaré tout en haut de la capture) qui va faire en sorte que le menu et continuellement afficher puis de mettre à jour la variable « </w:t>
-      </w:r>
-      <w:proofErr w:type="spellStart"/>
-      <w:r>
-        <w:t>continueProgram</w:t>
-      </w:r>
-      <w:proofErr w:type="spellEnd"/>
-      <w:r>
-        <w:t> ».</w:t>
+        <w:t>déclaré tout en haut de la capture) qui va faire en sorte que le menu et continuellement afficher puis de mettre à jour la variable « continueProgram ».</w:t>
       </w:r>
     </w:p>
     <w:p>
@@ -3490,14 +3466,12 @@
       <w:pPr>
         <w:pStyle w:val="Titre2"/>
       </w:pPr>
-      <w:bookmarkStart w:id="5" w:name="_Toc242092013"/>
-      <w:proofErr w:type="spellStart"/>
+      <w:bookmarkStart w:id="5" w:name="_Toc242094227"/>
       <w:r>
         <w:lastRenderedPageBreak/>
         <w:t>Menu.cs</w:t>
       </w:r>
       <w:bookmarkEnd w:id="5"/>
-      <w:proofErr w:type="spellEnd"/>
     </w:p>
     <w:p>
       <w:r>
@@ -3512,13 +3486,11 @@
         <w:pStyle w:val="Titre3"/>
         <w:ind w:firstLine="708"/>
       </w:pPr>
-      <w:bookmarkStart w:id="6" w:name="_Toc242092014"/>
-      <w:proofErr w:type="spellStart"/>
+      <w:bookmarkStart w:id="6" w:name="_Toc242094228"/>
       <w:r>
         <w:t>DisplayMenu</w:t>
       </w:r>
       <w:bookmarkEnd w:id="6"/>
-      <w:proofErr w:type="spellEnd"/>
     </w:p>
     <w:p>
       <w:pPr>
@@ -3583,41 +3555,7 @@
         <w:t>Une simple méthode permettant d’afficher</w:t>
       </w:r>
       <w:r>
-        <w:t xml:space="preserve"> le menu. Une boucle </w:t>
-      </w:r>
-      <w:proofErr w:type="spellStart"/>
-      <w:r>
-        <w:t>foreach</w:t>
-      </w:r>
-      <w:proofErr w:type="spellEnd"/>
-      <w:r>
-        <w:t xml:space="preserve"> pour afficher chaque option (stocker dans un tableau </w:t>
-      </w:r>
-      <w:proofErr w:type="spellStart"/>
-      <w:r>
-        <w:t>private</w:t>
-      </w:r>
-      <w:proofErr w:type="spellEnd"/>
-      <w:r>
-        <w:t xml:space="preserve"> au début du code) disponible pour l’utilisateur. « </w:t>
-      </w:r>
-      <w:proofErr w:type="spellStart"/>
-      <w:proofErr w:type="gramStart"/>
-      <w:r>
-        <w:t>optionIndex</w:t>
-      </w:r>
-      <w:proofErr w:type="spellEnd"/>
-      <w:proofErr w:type="gramEnd"/>
-      <w:r>
-        <w:t xml:space="preserve"> » permet à l’utilisateur de savoir </w:t>
-      </w:r>
-      <w:proofErr w:type="gramStart"/>
-      <w:r>
-        <w:t>quelle numéro</w:t>
-      </w:r>
-      <w:proofErr w:type="gramEnd"/>
-      <w:r>
-        <w:t xml:space="preserve"> entrer pour utiliser cette option-ci ou </w:t>
+        <w:t xml:space="preserve"> le menu. Une boucle foreach pour afficher chaque option (stocker dans un tableau private au début du code) disponible pour l’utilisateur. « optionIndex » permet à l’utilisateur de savoir quelle numéro entrer pour utiliser cette option-ci ou </w:t>
       </w:r>
       <w:r>
         <w:t>celle-là</w:t>
@@ -3639,13 +3577,11 @@
         <w:lastRenderedPageBreak/>
         <w:tab/>
       </w:r>
-      <w:bookmarkStart w:id="7" w:name="_Toc242092015"/>
-      <w:proofErr w:type="spellStart"/>
+      <w:bookmarkStart w:id="7" w:name="_Toc242094229"/>
       <w:r>
         <w:t>UserInputHandler</w:t>
       </w:r>
       <w:bookmarkEnd w:id="7"/>
-      <w:proofErr w:type="spellEnd"/>
     </w:p>
     <w:p>
       <w:pPr>
@@ -3710,37 +3646,13 @@
         <w:t>Elle est souvent appelée dans le code. Elle va</w:t>
       </w:r>
       <w:r>
-        <w:t xml:space="preserve"> gérer ce que l’utilisateur entre comme option (ex : « 5 » pour l’option numéro 5). Si la saisie de l’utilisateur ne peut pas être converti en </w:t>
-      </w:r>
-      <w:proofErr w:type="spellStart"/>
-      <w:r>
-        <w:t>int</w:t>
-      </w:r>
-      <w:proofErr w:type="spellEnd"/>
-      <w:r>
-        <w:t>, on va supprimer son input (grâce à la méthode « </w:t>
-      </w:r>
-      <w:proofErr w:type="spellStart"/>
-      <w:r>
-        <w:t>CheckCorrectInput</w:t>
-      </w:r>
-      <w:proofErr w:type="spellEnd"/>
-      <w:r>
-        <w:t> » qui est utiliser seulement pour effacer la saisie du joueur pour avoir une console propre)</w:t>
+        <w:t xml:space="preserve"> gérer ce que l’utilisateur entre comme option (ex : « 5 » pour l’option numéro 5). Si la saisie de l’utilisateur ne peut pas être converti en int, on va supprimer son input (grâce à la méthode « CheckCorrectInput » qui est utiliser seulement pour effacer la saisie du joueur pour avoir une console propre)</w:t>
       </w:r>
       <w:r>
         <w:t>. Car effacer l’entièreté de la console serait problématique vu qu’on aurait besoin de re-</w:t>
       </w:r>
       <w:r>
-        <w:t>appeler « </w:t>
-      </w:r>
-      <w:proofErr w:type="spellStart"/>
-      <w:r>
-        <w:t>DisplayMenu</w:t>
-      </w:r>
-      <w:proofErr w:type="spellEnd"/>
-      <w:r>
-        <w:t> » simplement pour afficher un texte « Entrer votre choix : ».</w:t>
+        <w:t>appeler « DisplayMenu » simplement pour afficher un texte « Entrer votre choix : ».</w:t>
       </w:r>
     </w:p>
     <w:p>
@@ -3754,15 +3666,7 @@
         <w:t xml:space="preserve">on va dire à l’utilisateur </w:t>
       </w:r>
       <w:r>
-        <w:t>de choisir un nombre dans la plage de valeur correcte. On va attendre 1.5 secondes (pour laisser l’utilisateur le temp de lire le message) avant d’appeler « </w:t>
-      </w:r>
-      <w:proofErr w:type="spellStart"/>
-      <w:r>
-        <w:t>UserInputHandler</w:t>
-      </w:r>
-      <w:proofErr w:type="spellEnd"/>
-      <w:r>
-        <w:t> » une fois de plus.</w:t>
+        <w:t>de choisir un nombre dans la plage de valeur correcte. On va attendre 1.5 secondes (pour laisser l’utilisateur le temp de lire le message) avant d’appeler « UserInputHandler » une fois de plus.</w:t>
       </w:r>
     </w:p>
     <w:p>
@@ -3770,15 +3674,7 @@
         <w:t xml:space="preserve">Si tout est bon, l’option choisi par l’utilisateur va être </w:t>
       </w:r>
       <w:r>
-        <w:t xml:space="preserve">exécuté grâce </w:t>
-      </w:r>
-      <w:proofErr w:type="spellStart"/>
-      <w:r>
-        <w:t>a</w:t>
-      </w:r>
-      <w:proofErr w:type="spellEnd"/>
-      <w:r>
-        <w:t xml:space="preserve"> une méthode qui contient un simple « switch case » pour appeler la méthode correspondante à l’option.</w:t>
+        <w:t>exécuté grâce a une méthode qui contient un simple « switch case » pour appeler la méthode correspondante à l’option.</w:t>
       </w:r>
     </w:p>
     <w:p>
@@ -3794,13 +3690,11 @@
         <w:lastRenderedPageBreak/>
         <w:tab/>
       </w:r>
-      <w:bookmarkStart w:id="8" w:name="_Toc242092016"/>
-      <w:proofErr w:type="spellStart"/>
+      <w:bookmarkStart w:id="8" w:name="_Toc242094230"/>
       <w:r>
         <w:t>EnterVehicle</w:t>
       </w:r>
       <w:bookmarkEnd w:id="8"/>
-      <w:proofErr w:type="spellEnd"/>
     </w:p>
     <w:p>
       <w:pPr>
@@ -3811,7 +3705,7 @@
           <w:noProof/>
         </w:rPr>
         <w:drawing>
-          <wp:inline distT="0" distB="0" distL="0" distR="0" wp14:anchorId="21CFB329" wp14:editId="76BA4BBA">
+          <wp:inline distT="0" distB="0" distL="0" distR="0" wp14:anchorId="21CFB329" wp14:editId="38C1C54F">
             <wp:extent cx="5755640" cy="1550035"/>
             <wp:effectExtent l="0" t="0" r="0" b="0"/>
             <wp:docPr id="273820517" name="Image 3"/>
@@ -3874,15 +3768,7 @@
         <w:t xml:space="preserve"> est accepté</w:t>
       </w:r>
       <w:r>
-        <w:t xml:space="preserve"> pour que ça soit plus lisible) puis demander d’entrer une plaque. Si la saisie n’est pas vide, on va créer une voiture (la logique pour vérifier si la plaque est bonne ce déroule dans la classe « voiture ». Qui va informer au l’utilisateur si la voiture a bien été ajouté ou non). Faire des retours à la lignes avec « </w:t>
-      </w:r>
-      <w:proofErr w:type="spellStart"/>
-      <w:r>
-        <w:t>ReturnMultipleLines</w:t>
-      </w:r>
-      <w:proofErr w:type="spellEnd"/>
-      <w:r>
-        <w:t> » (pour plus de lisibilité) puis réafficher le menu.</w:t>
+        <w:t xml:space="preserve"> pour que ça soit plus lisible) puis demander d’entrer une plaque. Si la saisie n’est pas vide, on va créer une voiture (la logique pour vérifier si la plaque est bonne ce déroule dans la classe « voiture ». Qui va informer au l’utilisateur si la voiture a bien été ajouté ou non). Faire des retours à la lignes avec « ReturnMultipleLines » (pour plus de lisibilité) puis réafficher le menu.</w:t>
       </w:r>
     </w:p>
     <w:p>
@@ -3898,13 +3784,11 @@
         <w:lastRenderedPageBreak/>
         <w:tab/>
       </w:r>
-      <w:bookmarkStart w:id="9" w:name="_Toc242092017"/>
-      <w:proofErr w:type="spellStart"/>
+      <w:bookmarkStart w:id="9" w:name="_Toc242094231"/>
       <w:r>
         <w:t>SearchVehicle</w:t>
       </w:r>
       <w:bookmarkEnd w:id="9"/>
-      <w:proofErr w:type="spellEnd"/>
     </w:p>
     <w:p>
       <w:pPr>
@@ -3982,14 +3866,12 @@
         <w:pStyle w:val="Titre3"/>
         <w:ind w:firstLine="708"/>
       </w:pPr>
-      <w:bookmarkStart w:id="10" w:name="_Toc242092018"/>
-      <w:proofErr w:type="spellStart"/>
+      <w:bookmarkStart w:id="10" w:name="_Toc242094232"/>
       <w:r>
         <w:lastRenderedPageBreak/>
         <w:t>CallFindVehicle</w:t>
       </w:r>
       <w:bookmarkEnd w:id="10"/>
-      <w:proofErr w:type="spellEnd"/>
     </w:p>
     <w:p>
       <w:pPr>
@@ -4051,44 +3933,12 @@
     </w:p>
     <w:p>
       <w:r>
-        <w:t xml:space="preserve">Cette méthode va d’abord vérifier si on veut retirer un véhicule. Si c’est le cas on va demander à l’utilisateur s’il est sûr de </w:t>
-      </w:r>
-      <w:proofErr w:type="spellStart"/>
-      <w:r>
-        <w:t>ça</w:t>
-      </w:r>
-      <w:proofErr w:type="spellEnd"/>
-      <w:r>
-        <w:t xml:space="preserve"> décision (en appelant « </w:t>
-      </w:r>
-      <w:proofErr w:type="spellStart"/>
-      <w:r>
-        <w:t>UserIsSure</w:t>
-      </w:r>
-      <w:proofErr w:type="spellEnd"/>
-      <w:r>
-        <w:t>). S’il choisit non, on lui informe que l’action a été annulé. S’il choisit oui, alors on va chercher une correspondance pour supprimer le véhicule entrer (la méthode « </w:t>
-      </w:r>
-      <w:proofErr w:type="spellStart"/>
-      <w:r>
-        <w:t>FindVehicule</w:t>
-      </w:r>
-      <w:proofErr w:type="spellEnd"/>
-      <w:r>
-        <w:t> »).</w:t>
-      </w:r>
-    </w:p>
-    <w:p>
-      <w:r>
-        <w:t>Cependant, si l’utilisateur voulait simplement afficher des informations d’un véhicule, on va donc rien faire de spécial puis appelé « </w:t>
-      </w:r>
-      <w:proofErr w:type="spellStart"/>
-      <w:r>
-        <w:t>FindVehicule</w:t>
-      </w:r>
-      <w:proofErr w:type="spellEnd"/>
-      <w:r>
-        <w:t> ».</w:t>
+        <w:t>Cette méthode va d’abord vérifier si on veut retirer un véhicule. Si c’est le cas on va demander à l’utilisateur s’il est sûr de ça décision (en appelant « UserIsSure). S’il choisit non, on lui informe que l’action a été annulé. S’il choisit oui, alors on va chercher une correspondance pour supprimer le véhicule entrer (la méthode « FindVehicule »).</w:t>
+      </w:r>
+    </w:p>
+    <w:p>
+      <w:r>
+        <w:t>Cependant, si l’utilisateur voulait simplement afficher des informations d’un véhicule, on va donc rien faire de spécial puis appelé « FindVehicule ».</w:t>
       </w:r>
     </w:p>
     <w:p>
@@ -4100,14 +3950,12 @@
       <w:pPr>
         <w:pStyle w:val="Titre2"/>
       </w:pPr>
-      <w:bookmarkStart w:id="11" w:name="_Toc242092019"/>
-      <w:proofErr w:type="spellStart"/>
+      <w:bookmarkStart w:id="11" w:name="_Toc242094233"/>
       <w:r>
         <w:lastRenderedPageBreak/>
         <w:t>Parking.cs</w:t>
       </w:r>
       <w:bookmarkEnd w:id="11"/>
-      <w:proofErr w:type="spellEnd"/>
     </w:p>
     <w:p>
       <w:pPr>
@@ -4116,7 +3964,7 @@
       <w:r>
         <w:tab/>
       </w:r>
-      <w:bookmarkStart w:id="12" w:name="_Toc242092020"/>
+      <w:bookmarkStart w:id="12" w:name="_Toc242094234"/>
       <w:r>
         <w:t>Display</w:t>
       </w:r>
@@ -4185,26 +4033,10 @@
         <w:t>Cette méthode permet d’afficher le parking avec ses statistiques.</w:t>
       </w:r>
       <w:r>
-        <w:t xml:space="preserve"> Elle appelle cependant « </w:t>
-      </w:r>
-      <w:proofErr w:type="spellStart"/>
-      <w:r>
-        <w:t>ParkingSpot</w:t>
-      </w:r>
-      <w:proofErr w:type="spellEnd"/>
-      <w:r>
-        <w:t> » qui va être celui qui va écrire chaque place de parking individuellement avec un certain style</w:t>
-      </w:r>
-      <w:r>
-        <w:t xml:space="preserve"> (ex : « |</w:t>
-      </w:r>
-      <w:proofErr w:type="gramStart"/>
-      <w:r>
-        <w:t>02:L</w:t>
-      </w:r>
-      <w:proofErr w:type="gramEnd"/>
-      <w:r>
-        <w:t>||0</w:t>
+        <w:t xml:space="preserve"> Elle appelle cependant « ParkingSpot » qui va être celui qui va écrire chaque place de parking individuellement avec un certain style</w:t>
+      </w:r>
+      <w:r>
+        <w:t xml:space="preserve"> (ex : « |02:L||0</w:t>
       </w:r>
       <w:r>
         <w:t>3</w:t>
@@ -4235,13 +4067,11 @@
         <w:lastRenderedPageBreak/>
         <w:tab/>
       </w:r>
-      <w:bookmarkStart w:id="13" w:name="_Toc242092021"/>
-      <w:proofErr w:type="spellStart"/>
+      <w:bookmarkStart w:id="13" w:name="_Toc242094235"/>
       <w:r>
         <w:t>CheckParkingSpot</w:t>
       </w:r>
       <w:bookmarkEnd w:id="13"/>
-      <w:proofErr w:type="spellEnd"/>
     </w:p>
     <w:p>
       <w:pPr>
@@ -4303,15 +4133,7 @@
     </w:p>
     <w:p>
       <w:r>
-        <w:t>Cette méthode (appeler par « </w:t>
-      </w:r>
-      <w:proofErr w:type="spellStart"/>
-      <w:r>
-        <w:t>ParkingSpot</w:t>
-      </w:r>
-      <w:proofErr w:type="spellEnd"/>
-      <w:r>
-        <w:t> ») va s’occuper de gérer l’affichage du symbole en fonction de la valeur de la place de parking. Augmenté le nombre de place libre, le nombre de place occupé, etc…</w:t>
+        <w:t>Cette méthode (appeler par « ParkingSpot ») va s’occuper de gérer l’affichage du symbole en fonction de la valeur de la place de parking. Augmenté le nombre de place libre, le nombre de place occupé, etc…</w:t>
       </w:r>
     </w:p>
     <w:p>
@@ -4327,13 +4149,11 @@
         <w:lastRenderedPageBreak/>
         <w:tab/>
       </w:r>
-      <w:bookmarkStart w:id="14" w:name="_Toc242092022"/>
-      <w:proofErr w:type="spellStart"/>
+      <w:bookmarkStart w:id="14" w:name="_Toc242094236"/>
       <w:r>
         <w:t>AddVehicle</w:t>
       </w:r>
       <w:bookmarkEnd w:id="14"/>
-      <w:proofErr w:type="spellEnd"/>
     </w:p>
     <w:p>
       <w:pPr>
@@ -4404,15 +4224,7 @@
         <w:t>un ticket pour la voiture</w:t>
       </w:r>
       <w:r>
-        <w:t xml:space="preserve">. Puis on ajoute la voiture dans la liste des voitures qui sont </w:t>
-      </w:r>
-      <w:proofErr w:type="spellStart"/>
-      <w:r>
-        <w:t>parké</w:t>
-      </w:r>
-      <w:proofErr w:type="spellEnd"/>
-      <w:r>
-        <w:t xml:space="preserve">. </w:t>
+        <w:t xml:space="preserve">. Puis on ajoute la voiture dans la liste des voitures qui sont parké. </w:t>
       </w:r>
     </w:p>
     <w:p>
@@ -4428,13 +4240,11 @@
         <w:lastRenderedPageBreak/>
         <w:tab/>
       </w:r>
-      <w:bookmarkStart w:id="15" w:name="_Toc242092023"/>
-      <w:proofErr w:type="spellStart"/>
+      <w:bookmarkStart w:id="15" w:name="_Toc242094237"/>
       <w:r>
         <w:t>FindVehicule</w:t>
       </w:r>
       <w:bookmarkEnd w:id="15"/>
-      <w:proofErr w:type="spellEnd"/>
     </w:p>
     <w:p>
       <w:pPr>
@@ -4445,7 +4255,7 @@
           <w:noProof/>
         </w:rPr>
         <w:drawing>
-          <wp:inline distT="0" distB="0" distL="0" distR="0" wp14:anchorId="4E0C9F37" wp14:editId="6E561040">
+          <wp:inline distT="0" distB="0" distL="0" distR="0" wp14:anchorId="4E0C9F37" wp14:editId="41641D38">
             <wp:extent cx="5753735" cy="2458085"/>
             <wp:effectExtent l="0" t="0" r="0" b="0"/>
             <wp:docPr id="460749035" name="Image 11"/>
@@ -4496,23 +4306,7 @@
     </w:p>
     <w:p>
       <w:r>
-        <w:t>Ici on va rechercher un véhicule via sa plaque d’immatriculation ou son numéro de place. La méthode « </w:t>
-      </w:r>
-      <w:proofErr w:type="spellStart"/>
-      <w:r>
-        <w:t>FindVehicleCondition</w:t>
-      </w:r>
-      <w:proofErr w:type="spellEnd"/>
-      <w:r>
-        <w:t xml:space="preserve"> » va simplement vérifier s’il trouve une correspondance ou non. Si aucune correspondance est </w:t>
-      </w:r>
-      <w:proofErr w:type="gramStart"/>
-      <w:r>
-        <w:t>trouvé</w:t>
-      </w:r>
-      <w:proofErr w:type="gramEnd"/>
-      <w:r>
-        <w:t>, on l’informe à l’utilisateur.</w:t>
+        <w:t>Ici on va rechercher un véhicule via sa plaque d’immatriculation ou son numéro de place. La méthode « FindVehicleCondition » va simplement vérifier s’il trouve une correspondance ou non. Si aucune correspondance est trouvé, on l’informe à l’utilisateur.</w:t>
       </w:r>
     </w:p>
     <w:p>
@@ -4528,13 +4322,11 @@
         <w:lastRenderedPageBreak/>
         <w:tab/>
       </w:r>
-      <w:bookmarkStart w:id="16" w:name="_Toc242092024"/>
-      <w:proofErr w:type="spellStart"/>
+      <w:bookmarkStart w:id="16" w:name="_Toc242094238"/>
       <w:r>
         <w:t>FindVehicleReturn</w:t>
       </w:r>
       <w:bookmarkEnd w:id="16"/>
-      <w:proofErr w:type="spellEnd"/>
     </w:p>
     <w:p>
       <w:pPr>
@@ -4596,15 +4388,7 @@
     </w:p>
     <w:p>
       <w:r>
-        <w:t>Appeler par la méthode « </w:t>
-      </w:r>
-      <w:proofErr w:type="spellStart"/>
-      <w:r>
-        <w:t>FindVehicleCondition</w:t>
-      </w:r>
-      <w:proofErr w:type="spellEnd"/>
-      <w:r>
-        <w:t> » (si une correspondance a été trouvé) elle permet d’effectuer une action. Soit afficher les informations du véhicule, soit le faire sortir du parking.</w:t>
+        <w:t>Appeler par la méthode « FindVehicleCondition » (si une correspondance a été trouvé) elle permet d’effectuer une action. Soit afficher les informations du véhicule, soit le faire sortir du parking.</w:t>
       </w:r>
     </w:p>
     <w:p>
@@ -4620,13 +4404,11 @@
         <w:lastRenderedPageBreak/>
         <w:tab/>
       </w:r>
-      <w:bookmarkStart w:id="17" w:name="_Toc242092025"/>
-      <w:proofErr w:type="spellStart"/>
+      <w:bookmarkStart w:id="17" w:name="_Toc242094239"/>
       <w:r>
         <w:t>StatParking</w:t>
       </w:r>
       <w:bookmarkEnd w:id="17"/>
-      <w:proofErr w:type="spellEnd"/>
     </w:p>
     <w:p>
       <w:r>
@@ -4634,7 +4416,7 @@
           <w:noProof/>
         </w:rPr>
         <w:drawing>
-          <wp:inline distT="0" distB="0" distL="0" distR="0" wp14:anchorId="28B65BB5" wp14:editId="4071F1CD">
+          <wp:inline distT="0" distB="0" distL="0" distR="0" wp14:anchorId="28B65BB5" wp14:editId="3BB2473F">
             <wp:extent cx="5753735" cy="1552575"/>
             <wp:effectExtent l="0" t="0" r="0" b="9525"/>
             <wp:docPr id="925377937" name="Image 13"/>
@@ -4697,14 +4479,12 @@
       <w:pPr>
         <w:pStyle w:val="Titre1"/>
       </w:pPr>
-      <w:bookmarkStart w:id="18" w:name="_Toc242092026"/>
-      <w:proofErr w:type="spellStart"/>
+      <w:bookmarkStart w:id="18" w:name="_Toc242094240"/>
       <w:r>
         <w:lastRenderedPageBreak/>
         <w:t>Voiture.cs</w:t>
       </w:r>
       <w:bookmarkEnd w:id="18"/>
-      <w:proofErr w:type="spellEnd"/>
     </w:p>
     <w:p>
       <w:pPr>
@@ -4713,13 +4493,11 @@
       <w:r>
         <w:tab/>
       </w:r>
-      <w:bookmarkStart w:id="19" w:name="_Toc242092027"/>
-      <w:proofErr w:type="spellStart"/>
+      <w:bookmarkStart w:id="19" w:name="_Toc242094241"/>
       <w:r>
         <w:t>LicensingPlate</w:t>
       </w:r>
       <w:bookmarkEnd w:id="19"/>
-      <w:proofErr w:type="spellEnd"/>
     </w:p>
     <w:p>
       <w:pPr>
@@ -4789,7 +4567,7 @@
         <w:pStyle w:val="Titre3"/>
         <w:ind w:firstLine="708"/>
       </w:pPr>
-      <w:bookmarkStart w:id="20" w:name="_Toc242092028"/>
+      <w:bookmarkStart w:id="20" w:name="_Toc242094242"/>
       <w:r>
         <w:t>Constructeur</w:t>
       </w:r>
@@ -4855,15 +4633,7 @@
     </w:p>
     <w:p>
       <w:r>
-        <w:t xml:space="preserve">Le constructeur. Si le véhicule est </w:t>
-      </w:r>
-      <w:proofErr w:type="spellStart"/>
-      <w:r>
-        <w:t>valid</w:t>
-      </w:r>
-      <w:proofErr w:type="spellEnd"/>
-      <w:r>
-        <w:t>, on l’ajoute automatiquement au parking, sinon, on ne fait rien.</w:t>
+        <w:t>Le constructeur. Si le véhicule est valid, on l’ajoute automatiquement au parking, sinon, on ne fait rien.</w:t>
       </w:r>
     </w:p>
     <w:p>
@@ -4875,14 +4645,12 @@
       <w:pPr>
         <w:pStyle w:val="Titre1"/>
       </w:pPr>
-      <w:bookmarkStart w:id="21" w:name="_Toc242092029"/>
-      <w:proofErr w:type="spellStart"/>
+      <w:bookmarkStart w:id="21" w:name="_Toc242094243"/>
       <w:r>
         <w:lastRenderedPageBreak/>
         <w:t>Ticket.cs</w:t>
       </w:r>
       <w:bookmarkEnd w:id="21"/>
-      <w:proofErr w:type="spellEnd"/>
     </w:p>
     <w:p>
       <w:pPr>
@@ -4891,7 +4659,7 @@
       <w:r>
         <w:tab/>
       </w:r>
-      <w:bookmarkStart w:id="22" w:name="_Toc242092030"/>
+      <w:bookmarkStart w:id="22" w:name="_Toc242094244"/>
       <w:r>
         <w:t>Constructeur</w:t>
       </w:r>
@@ -4957,15 +4725,7 @@
     </w:p>
     <w:p>
       <w:r>
-        <w:t xml:space="preserve">On va mettre l’heure d’entrée à l’heure actuel. Lui donné son numéro de place, son tarif horaire, puis lui mettre qu’il est </w:t>
-      </w:r>
-      <w:proofErr w:type="spellStart"/>
-      <w:r>
-        <w:t>parké</w:t>
-      </w:r>
-      <w:proofErr w:type="spellEnd"/>
-      <w:r>
-        <w:t xml:space="preserve"> (son véhicule parent).</w:t>
+        <w:t>On va mettre l’heure d’entrée à l’heure actuel. Lui donné son numéro de place, son tarif horaire, puis lui mettre qu’il est parké (son véhicule parent).</w:t>
       </w:r>
     </w:p>
     <w:p>
@@ -4975,7 +4735,7 @@
       <w:r>
         <w:tab/>
       </w:r>
-      <w:bookmarkStart w:id="23" w:name="_Toc242092031"/>
+      <w:bookmarkStart w:id="23" w:name="_Toc242094245"/>
       <w:r>
         <w:t>Calc</w:t>
       </w:r>
@@ -5049,13 +4809,11 @@
         <w:pStyle w:val="Titre3"/>
         <w:ind w:firstLine="708"/>
       </w:pPr>
-      <w:bookmarkStart w:id="24" w:name="_Toc242092032"/>
-      <w:proofErr w:type="spellStart"/>
+      <w:bookmarkStart w:id="24" w:name="_Toc242094246"/>
       <w:r>
         <w:t>GetCurrentParkedTime</w:t>
       </w:r>
       <w:bookmarkEnd w:id="24"/>
-      <w:proofErr w:type="spellEnd"/>
     </w:p>
     <w:p>
       <w:r>
@@ -5074,7 +4832,7 @@
           <w:color w:val="auto"/>
         </w:rPr>
       </w:pPr>
-      <w:bookmarkStart w:id="25" w:name="_Toc242092033"/>
+      <w:bookmarkStart w:id="25" w:name="_Toc242094247"/>
       <w:r>
         <w:rPr>
           <w:color w:val="auto"/>
@@ -5088,41 +4846,71 @@
       <w:pPr>
         <w:pStyle w:val="Titre2"/>
       </w:pPr>
-      <w:bookmarkStart w:id="26" w:name="_Toc242092034"/>
-      <w:proofErr w:type="spellStart"/>
-      <w:r>
-        <w:t>CheckParkingSpot_IsFree_Result_X</w:t>
+      <w:bookmarkStart w:id="26" w:name="_Toc242094248"/>
+      <w:r>
+        <w:t>CheckParkingSpot_IsFree_Result_</w:t>
+      </w:r>
+      <w:r>
+        <w:t>L</w:t>
       </w:r>
       <w:bookmarkEnd w:id="26"/>
-      <w:proofErr w:type="spellEnd"/>
-    </w:p>
-    <w:p>
-      <w:r>
-        <w:t>La valeur entrée dans ce test était = 1. Puis dans « </w:t>
-      </w:r>
-      <w:proofErr w:type="spellStart"/>
-      <w:r>
-        <w:t>CheckParkingSpot</w:t>
-      </w:r>
-      <w:proofErr w:type="spellEnd"/>
-      <w:r>
-        <w:t> »</w:t>
+    </w:p>
+    <w:p>
+      <w:r>
+        <w:t xml:space="preserve">La valeur entrée dans ce test était = </w:t>
+      </w:r>
+      <w:r>
+        <w:t>0</w:t>
+      </w:r>
+      <w:r>
+        <w:t>. Puis dans « CheckParkingSpot »</w:t>
       </w:r>
     </w:p>
     <w:p>
       <w:r>
         <w:t>0 = « L »</w:t>
       </w:r>
-    </w:p>
-    <w:p>
-      <w:r>
+      <w:r>
+        <w:t xml:space="preserve"> (libre)</w:t>
+      </w:r>
+    </w:p>
+    <w:p>
+      <w:pPr>
+        <w:rPr>
+          <w:lang w:val="de-CH"/>
+        </w:rPr>
+      </w:pPr>
+      <w:r>
+        <w:rPr>
+          <w:lang w:val="de-CH"/>
+        </w:rPr>
         <w:t>1= « X »</w:t>
       </w:r>
-    </w:p>
-    <w:p>
-      <w:r>
+      <w:r>
+        <w:rPr>
+          <w:lang w:val="de-CH"/>
+        </w:rPr>
+        <w:t xml:space="preserve"> (occupé)</w:t>
+      </w:r>
+    </w:p>
+    <w:p>
+      <w:pPr>
+        <w:rPr>
+          <w:lang w:val="de-CH"/>
+        </w:rPr>
+      </w:pPr>
+      <w:r>
+        <w:rPr>
+          <w:lang w:val="de-CH"/>
+        </w:rPr>
         <w:t>Default = « E »</w:t>
       </w:r>
+      <w:r>
+        <w:rPr>
+          <w:lang w:val="de-CH"/>
+        </w:rPr>
+        <w:t xml:space="preserve"> (erreur)</w:t>
+      </w:r>
     </w:p>
     <w:p>
       <w:pPr>
@@ -5133,8 +4921,8 @@
           <w:noProof/>
         </w:rPr>
         <w:drawing>
-          <wp:inline distT="0" distB="0" distL="0" distR="0" wp14:anchorId="0F6811CC" wp14:editId="2B243665">
-            <wp:extent cx="5760720" cy="1386205"/>
+          <wp:inline distT="0" distB="0" distL="0" distR="0" wp14:anchorId="0F6811CC" wp14:editId="153EA5D5">
+            <wp:extent cx="4579739" cy="1386205"/>
             <wp:effectExtent l="0" t="0" r="0" b="4445"/>
             <wp:docPr id="1190469909" name="Image 1"/>
             <wp:cNvGraphicFramePr>
@@ -5144,11 +4932,17 @@
               <a:graphicData uri="http://schemas.openxmlformats.org/drawingml/2006/picture">
                 <pic:pic xmlns:pic="http://schemas.openxmlformats.org/drawingml/2006/picture">
                   <pic:nvPicPr>
-                    <pic:cNvPr id="1190469909" name=""/>
+                    <pic:cNvPr id="1190469909" name="Image 1"/>
                     <pic:cNvPicPr/>
                   </pic:nvPicPr>
                   <pic:blipFill>
-                    <a:blip r:embed="rId25"/>
+                    <a:blip r:embed="rId25">
+                      <a:extLst>
+                        <a:ext uri="{28A0092B-C50C-407E-A947-70E740481C1C}">
+                          <a14:useLocalDpi xmlns:a14="http://schemas.microsoft.com/office/drawing/2010/main" val="0"/>
+                        </a:ext>
+                      </a:extLst>
+                    </a:blip>
                     <a:stretch>
                       <a:fillRect/>
                     </a:stretch>
@@ -5156,7 +4950,7 @@
                   <pic:spPr>
                     <a:xfrm>
                       <a:off x="0" y="0"/>
-                      <a:ext cx="5760720" cy="1386205"/>
+                      <a:ext cx="4579739" cy="1386205"/>
                     </a:xfrm>
                     <a:prstGeom prst="rect">
                       <a:avLst/>
@@ -5170,6 +4964,69 @@
       </w:r>
     </w:p>
     <w:p>
+      <w:pPr>
+        <w:pStyle w:val="Titre2"/>
+      </w:pPr>
+      <w:bookmarkStart w:id="27" w:name="_Toc242094249"/>
+      <w:r>
+        <w:t>GetTotalPaidPrice_Is0_Result_0</w:t>
+      </w:r>
+      <w:bookmarkEnd w:id="27"/>
+    </w:p>
+    <w:p>
+      <w:r>
+        <w:t xml:space="preserve">La liste des voitures qui </w:t>
+      </w:r>
+      <w:r>
+        <w:t>ont</w:t>
+      </w:r>
+      <w:r>
+        <w:t xml:space="preserve"> quitté le parking était vide, ce qui veut dire qu’aucun montant n’a été payé.</w:t>
+      </w:r>
+    </w:p>
+    <w:p>
+      <w:pPr>
+        <w:jc w:val="center"/>
+      </w:pPr>
+      <w:r>
+        <w:drawing>
+          <wp:inline distT="0" distB="0" distL="0" distR="0" wp14:anchorId="1872C16A" wp14:editId="6AE0E50C">
+            <wp:extent cx="4518494" cy="1381125"/>
+            <wp:effectExtent l="0" t="0" r="0" b="0"/>
+            <wp:docPr id="715510647" name="Image 1"/>
+            <wp:cNvGraphicFramePr>
+              <a:graphicFrameLocks xmlns:a="http://schemas.openxmlformats.org/drawingml/2006/main" noChangeAspect="1"/>
+            </wp:cNvGraphicFramePr>
+            <a:graphic xmlns:a="http://schemas.openxmlformats.org/drawingml/2006/main">
+              <a:graphicData uri="http://schemas.openxmlformats.org/drawingml/2006/picture">
+                <pic:pic xmlns:pic="http://schemas.openxmlformats.org/drawingml/2006/picture">
+                  <pic:nvPicPr>
+                    <pic:cNvPr id="715510647" name=""/>
+                    <pic:cNvPicPr/>
+                  </pic:nvPicPr>
+                  <pic:blipFill>
+                    <a:blip r:embed="rId26"/>
+                    <a:stretch>
+                      <a:fillRect/>
+                    </a:stretch>
+                  </pic:blipFill>
+                  <pic:spPr>
+                    <a:xfrm>
+                      <a:off x="0" y="0"/>
+                      <a:ext cx="4531500" cy="1385101"/>
+                    </a:xfrm>
+                    <a:prstGeom prst="rect">
+                      <a:avLst/>
+                    </a:prstGeom>
+                  </pic:spPr>
+                </pic:pic>
+              </a:graphicData>
+            </a:graphic>
+          </wp:inline>
+        </w:drawing>
+      </w:r>
+    </w:p>
+    <w:p>
       <w:r>
         <w:br w:type="page"/>
       </w:r>
@@ -5181,7 +5038,7 @@
           <w:color w:val="auto"/>
         </w:rPr>
       </w:pPr>
-      <w:bookmarkStart w:id="27" w:name="_Toc242092035"/>
+      <w:bookmarkStart w:id="28" w:name="_Toc242094250"/>
       <w:r>
         <w:rPr>
           <w:color w:val="auto"/>
@@ -5189,7 +5046,7 @@
         <w:lastRenderedPageBreak/>
         <w:t>Conclusion</w:t>
       </w:r>
-      <w:bookmarkEnd w:id="27"/>
+      <w:bookmarkEnd w:id="28"/>
     </w:p>
     <w:p>
       <w:pPr>
@@ -5199,14 +5056,14 @@
           <w:color w:val="auto"/>
         </w:rPr>
       </w:pPr>
-      <w:bookmarkStart w:id="28" w:name="_Toc242092036"/>
+      <w:bookmarkStart w:id="29" w:name="_Toc242094251"/>
       <w:r>
         <w:rPr>
           <w:color w:val="auto"/>
         </w:rPr>
         <w:t>Bilan personnel</w:t>
       </w:r>
-      <w:bookmarkEnd w:id="28"/>
+      <w:bookmarkEnd w:id="29"/>
     </w:p>
     <w:p>
       <w:r>
@@ -5218,15 +5075,7 @@
     </w:p>
     <w:p>
       <w:r>
-        <w:t xml:space="preserve">À </w:t>
-      </w:r>
-      <w:proofErr w:type="spellStart"/>
-      <w:r>
-        <w:t>par</w:t>
-      </w:r>
-      <w:proofErr w:type="spellEnd"/>
-      <w:r>
-        <w:t xml:space="preserve"> ça je suis satisfait, j’ai évité le plus possible la redondance dans mon code, j’ai bien commenté, bien nommé mes variables, etc…</w:t>
+        <w:t>À par ça je suis satisfait, j’ai évité le plus possible la redondance dans mon code, j’ai bien commenté, bien nommé mes variables, etc…</w:t>
       </w:r>
     </w:p>
     <w:p>
@@ -5237,22 +5086,14 @@
           <w:color w:val="auto"/>
         </w:rPr>
       </w:pPr>
-      <w:bookmarkStart w:id="29" w:name="_Toc242092037"/>
-      <w:proofErr w:type="spellStart"/>
+      <w:bookmarkStart w:id="30" w:name="_Toc242094252"/>
       <w:r>
         <w:rPr>
           <w:color w:val="auto"/>
         </w:rPr>
-        <w:t>Utilisiation</w:t>
-      </w:r>
-      <w:proofErr w:type="spellEnd"/>
-      <w:r>
-        <w:rPr>
-          <w:color w:val="auto"/>
-        </w:rPr>
-        <w:t xml:space="preserve"> de l’IA</w:t>
-      </w:r>
-      <w:bookmarkEnd w:id="29"/>
+        <w:t>Utilisiation de l’IA</w:t>
+      </w:r>
+      <w:bookmarkEnd w:id="30"/>
     </w:p>
     <w:p>
       <w:r>
@@ -5267,14 +5108,14 @@
           <w:color w:val="auto"/>
         </w:rPr>
       </w:pPr>
-      <w:bookmarkStart w:id="30" w:name="_Toc242092038"/>
+      <w:bookmarkStart w:id="31" w:name="_Toc242094253"/>
       <w:r>
         <w:rPr>
           <w:color w:val="auto"/>
         </w:rPr>
         <w:t>Bilan des fonctionnalités</w:t>
       </w:r>
-      <w:bookmarkEnd w:id="30"/>
+      <w:bookmarkEnd w:id="31"/>
     </w:p>
     <w:p>
       <w:r>
@@ -5506,7 +5347,7 @@
     </w:tbl>
     <w:p/>
     <w:sectPr>
-      <w:footerReference w:type="default" r:id="rId26"/>
+      <w:footerReference w:type="default" r:id="rId27"/>
       <w:pgSz w:w="11906" w:h="16838"/>
       <w:pgMar w:top="1417" w:right="1417" w:bottom="1417" w:left="1417" w:header="708" w:footer="708" w:gutter="0"/>
       <w:pgNumType w:start="0"/>
@@ -6541,7 +6382,6 @@
   <w:style w:type="character" w:default="1" w:styleId="Policepardfaut">
     <w:name w:val="Default Paragraph Font"/>
     <w:uiPriority w:val="1"/>
-    <w:semiHidden/>
     <w:unhideWhenUsed/>
   </w:style>
   <w:style w:type="table" w:default="1" w:styleId="TableauNormal">
@@ -7145,6 +6985,7 @@
     <w:rsid w:val="002907FD"/>
     <w:rsid w:val="002C61A5"/>
     <w:rsid w:val="002F06E8"/>
+    <w:rsid w:val="0043780A"/>
     <w:rsid w:val="0048159C"/>
     <w:rsid w:val="00482DE2"/>
     <w:rsid w:val="005B37DF"/>
@@ -7153,6 +6994,7 @@
     <w:rsid w:val="006242E2"/>
     <w:rsid w:val="00665836"/>
     <w:rsid w:val="007946E6"/>
+    <w:rsid w:val="008B5502"/>
     <w:rsid w:val="009068F7"/>
     <w:rsid w:val="009851C5"/>
     <w:rsid w:val="009E71B4"/>

</xml_diff>

<commit_message>
feat test unitaire: Ajout du troisième et dernier test unitaire du projet. Documenter ce test unitaire et l'utilisation de l'IA dans ce projet
</commit_message>
<xml_diff>
--- a/R-320-NicolasMarques-Rapport.docx
+++ b/R-320-NicolasMarques-Rapport.docx
@@ -139,7 +139,7 @@
           <w:r>
             <w:fldChar w:fldCharType="separate"/>
           </w:r>
-          <w:hyperlink w:anchor="_Toc242094222" w:history="1">
+          <w:hyperlink w:anchor="_Toc244241609" w:history="1">
             <w:r>
               <w:rPr>
                 <w:rStyle w:val="Lienhypertexte"/>
@@ -166,7 +166,7 @@
                 <w:noProof/>
                 <w:webHidden/>
               </w:rPr>
-              <w:instrText xml:space="preserve"> PAGEREF _Toc242094222 \h </w:instrText>
+              <w:instrText xml:space="preserve"> PAGEREF _Toc244241609 \h </w:instrText>
             </w:r>
             <w:r>
               <w:rPr>
@@ -209,7 +209,7 @@
               <w:lang w:eastAsia="fr-CH"/>
             </w:rPr>
           </w:pPr>
-          <w:hyperlink w:anchor="_Toc242094223" w:history="1">
+          <w:hyperlink w:anchor="_Toc244241610" w:history="1">
             <w:r>
               <w:rPr>
                 <w:rStyle w:val="Lienhypertexte"/>
@@ -236,7 +236,7 @@
                 <w:noProof/>
                 <w:webHidden/>
               </w:rPr>
-              <w:instrText xml:space="preserve"> PAGEREF _Toc242094223 \h </w:instrText>
+              <w:instrText xml:space="preserve"> PAGEREF _Toc244241610 \h </w:instrText>
             </w:r>
             <w:r>
               <w:rPr>
@@ -279,7 +279,7 @@
               <w:lang w:eastAsia="fr-CH"/>
             </w:rPr>
           </w:pPr>
-          <w:hyperlink w:anchor="_Toc242094224" w:history="1">
+          <w:hyperlink w:anchor="_Toc244241611" w:history="1">
             <w:r>
               <w:rPr>
                 <w:rStyle w:val="Lienhypertexte"/>
@@ -306,7 +306,7 @@
                 <w:noProof/>
                 <w:webHidden/>
               </w:rPr>
-              <w:instrText xml:space="preserve"> PAGEREF _Toc242094224 \h </w:instrText>
+              <w:instrText xml:space="preserve"> PAGEREF _Toc244241611 \h </w:instrText>
             </w:r>
             <w:r>
               <w:rPr>
@@ -349,7 +349,7 @@
               <w:lang w:eastAsia="fr-CH"/>
             </w:rPr>
           </w:pPr>
-          <w:hyperlink w:anchor="_Toc242094225" w:history="1">
+          <w:hyperlink w:anchor="_Toc244241612" w:history="1">
             <w:r>
               <w:rPr>
                 <w:rStyle w:val="Lienhypertexte"/>
@@ -376,7 +376,7 @@
                 <w:noProof/>
                 <w:webHidden/>
               </w:rPr>
-              <w:instrText xml:space="preserve"> PAGEREF _Toc242094225 \h </w:instrText>
+              <w:instrText xml:space="preserve"> PAGEREF _Toc244241612 \h </w:instrText>
             </w:r>
             <w:r>
               <w:rPr>
@@ -419,7 +419,7 @@
               <w:lang w:eastAsia="fr-CH"/>
             </w:rPr>
           </w:pPr>
-          <w:hyperlink w:anchor="_Toc242094226" w:history="1">
+          <w:hyperlink w:anchor="_Toc244241613" w:history="1">
             <w:r>
               <w:rPr>
                 <w:rStyle w:val="Lienhypertexte"/>
@@ -446,7 +446,7 @@
                 <w:noProof/>
                 <w:webHidden/>
               </w:rPr>
-              <w:instrText xml:space="preserve"> PAGEREF _Toc242094226 \h </w:instrText>
+              <w:instrText xml:space="preserve"> PAGEREF _Toc244241613 \h </w:instrText>
             </w:r>
             <w:r>
               <w:rPr>
@@ -489,7 +489,7 @@
               <w:lang w:eastAsia="fr-CH"/>
             </w:rPr>
           </w:pPr>
-          <w:hyperlink w:anchor="_Toc242094227" w:history="1">
+          <w:hyperlink w:anchor="_Toc244241614" w:history="1">
             <w:r>
               <w:rPr>
                 <w:rStyle w:val="Lienhypertexte"/>
@@ -516,7 +516,7 @@
                 <w:noProof/>
                 <w:webHidden/>
               </w:rPr>
-              <w:instrText xml:space="preserve"> PAGEREF _Toc242094227 \h </w:instrText>
+              <w:instrText xml:space="preserve"> PAGEREF _Toc244241614 \h </w:instrText>
             </w:r>
             <w:r>
               <w:rPr>
@@ -559,7 +559,7 @@
               <w:lang w:eastAsia="fr-CH"/>
             </w:rPr>
           </w:pPr>
-          <w:hyperlink w:anchor="_Toc242094228" w:history="1">
+          <w:hyperlink w:anchor="_Toc244241615" w:history="1">
             <w:r>
               <w:rPr>
                 <w:rStyle w:val="Lienhypertexte"/>
@@ -586,7 +586,7 @@
                 <w:noProof/>
                 <w:webHidden/>
               </w:rPr>
-              <w:instrText xml:space="preserve"> PAGEREF _Toc242094228 \h </w:instrText>
+              <w:instrText xml:space="preserve"> PAGEREF _Toc244241615 \h </w:instrText>
             </w:r>
             <w:r>
               <w:rPr>
@@ -629,7 +629,7 @@
               <w:lang w:eastAsia="fr-CH"/>
             </w:rPr>
           </w:pPr>
-          <w:hyperlink w:anchor="_Toc242094229" w:history="1">
+          <w:hyperlink w:anchor="_Toc244241616" w:history="1">
             <w:r>
               <w:rPr>
                 <w:rStyle w:val="Lienhypertexte"/>
@@ -656,7 +656,7 @@
                 <w:noProof/>
                 <w:webHidden/>
               </w:rPr>
-              <w:instrText xml:space="preserve"> PAGEREF _Toc242094229 \h </w:instrText>
+              <w:instrText xml:space="preserve"> PAGEREF _Toc244241616 \h </w:instrText>
             </w:r>
             <w:r>
               <w:rPr>
@@ -699,7 +699,7 @@
               <w:lang w:eastAsia="fr-CH"/>
             </w:rPr>
           </w:pPr>
-          <w:hyperlink w:anchor="_Toc242094230" w:history="1">
+          <w:hyperlink w:anchor="_Toc244241617" w:history="1">
             <w:r>
               <w:rPr>
                 <w:rStyle w:val="Lienhypertexte"/>
@@ -726,7 +726,7 @@
                 <w:noProof/>
                 <w:webHidden/>
               </w:rPr>
-              <w:instrText xml:space="preserve"> PAGEREF _Toc242094230 \h </w:instrText>
+              <w:instrText xml:space="preserve"> PAGEREF _Toc244241617 \h </w:instrText>
             </w:r>
             <w:r>
               <w:rPr>
@@ -769,7 +769,7 @@
               <w:lang w:eastAsia="fr-CH"/>
             </w:rPr>
           </w:pPr>
-          <w:hyperlink w:anchor="_Toc242094231" w:history="1">
+          <w:hyperlink w:anchor="_Toc244241618" w:history="1">
             <w:r>
               <w:rPr>
                 <w:rStyle w:val="Lienhypertexte"/>
@@ -796,7 +796,7 @@
                 <w:noProof/>
                 <w:webHidden/>
               </w:rPr>
-              <w:instrText xml:space="preserve"> PAGEREF _Toc242094231 \h </w:instrText>
+              <w:instrText xml:space="preserve"> PAGEREF _Toc244241618 \h </w:instrText>
             </w:r>
             <w:r>
               <w:rPr>
@@ -839,7 +839,7 @@
               <w:lang w:eastAsia="fr-CH"/>
             </w:rPr>
           </w:pPr>
-          <w:hyperlink w:anchor="_Toc242094232" w:history="1">
+          <w:hyperlink w:anchor="_Toc244241619" w:history="1">
             <w:r>
               <w:rPr>
                 <w:rStyle w:val="Lienhypertexte"/>
@@ -866,7 +866,7 @@
                 <w:noProof/>
                 <w:webHidden/>
               </w:rPr>
-              <w:instrText xml:space="preserve"> PAGEREF _Toc242094232 \h </w:instrText>
+              <w:instrText xml:space="preserve"> PAGEREF _Toc244241619 \h </w:instrText>
             </w:r>
             <w:r>
               <w:rPr>
@@ -909,7 +909,7 @@
               <w:lang w:eastAsia="fr-CH"/>
             </w:rPr>
           </w:pPr>
-          <w:hyperlink w:anchor="_Toc242094233" w:history="1">
+          <w:hyperlink w:anchor="_Toc244241620" w:history="1">
             <w:r>
               <w:rPr>
                 <w:rStyle w:val="Lienhypertexte"/>
@@ -936,7 +936,7 @@
                 <w:noProof/>
                 <w:webHidden/>
               </w:rPr>
-              <w:instrText xml:space="preserve"> PAGEREF _Toc242094233 \h </w:instrText>
+              <w:instrText xml:space="preserve"> PAGEREF _Toc244241620 \h </w:instrText>
             </w:r>
             <w:r>
               <w:rPr>
@@ -979,7 +979,7 @@
               <w:lang w:eastAsia="fr-CH"/>
             </w:rPr>
           </w:pPr>
-          <w:hyperlink w:anchor="_Toc242094234" w:history="1">
+          <w:hyperlink w:anchor="_Toc244241621" w:history="1">
             <w:r>
               <w:rPr>
                 <w:rStyle w:val="Lienhypertexte"/>
@@ -1006,7 +1006,7 @@
                 <w:noProof/>
                 <w:webHidden/>
               </w:rPr>
-              <w:instrText xml:space="preserve"> PAGEREF _Toc242094234 \h </w:instrText>
+              <w:instrText xml:space="preserve"> PAGEREF _Toc244241621 \h </w:instrText>
             </w:r>
             <w:r>
               <w:rPr>
@@ -1049,7 +1049,7 @@
               <w:lang w:eastAsia="fr-CH"/>
             </w:rPr>
           </w:pPr>
-          <w:hyperlink w:anchor="_Toc242094235" w:history="1">
+          <w:hyperlink w:anchor="_Toc244241622" w:history="1">
             <w:r>
               <w:rPr>
                 <w:rStyle w:val="Lienhypertexte"/>
@@ -1076,7 +1076,7 @@
                 <w:noProof/>
                 <w:webHidden/>
               </w:rPr>
-              <w:instrText xml:space="preserve"> PAGEREF _Toc242094235 \h </w:instrText>
+              <w:instrText xml:space="preserve"> PAGEREF _Toc244241622 \h </w:instrText>
             </w:r>
             <w:r>
               <w:rPr>
@@ -1119,7 +1119,7 @@
               <w:lang w:eastAsia="fr-CH"/>
             </w:rPr>
           </w:pPr>
-          <w:hyperlink w:anchor="_Toc242094236" w:history="1">
+          <w:hyperlink w:anchor="_Toc244241623" w:history="1">
             <w:r>
               <w:rPr>
                 <w:rStyle w:val="Lienhypertexte"/>
@@ -1146,7 +1146,7 @@
                 <w:noProof/>
                 <w:webHidden/>
               </w:rPr>
-              <w:instrText xml:space="preserve"> PAGEREF _Toc242094236 \h </w:instrText>
+              <w:instrText xml:space="preserve"> PAGEREF _Toc244241623 \h </w:instrText>
             </w:r>
             <w:r>
               <w:rPr>
@@ -1189,7 +1189,7 @@
               <w:lang w:eastAsia="fr-CH"/>
             </w:rPr>
           </w:pPr>
-          <w:hyperlink w:anchor="_Toc242094237" w:history="1">
+          <w:hyperlink w:anchor="_Toc244241624" w:history="1">
             <w:r>
               <w:rPr>
                 <w:rStyle w:val="Lienhypertexte"/>
@@ -1216,7 +1216,7 @@
                 <w:noProof/>
                 <w:webHidden/>
               </w:rPr>
-              <w:instrText xml:space="preserve"> PAGEREF _Toc242094237 \h </w:instrText>
+              <w:instrText xml:space="preserve"> PAGEREF _Toc244241624 \h </w:instrText>
             </w:r>
             <w:r>
               <w:rPr>
@@ -1259,7 +1259,7 @@
               <w:lang w:eastAsia="fr-CH"/>
             </w:rPr>
           </w:pPr>
-          <w:hyperlink w:anchor="_Toc242094238" w:history="1">
+          <w:hyperlink w:anchor="_Toc244241625" w:history="1">
             <w:r>
               <w:rPr>
                 <w:rStyle w:val="Lienhypertexte"/>
@@ -1286,7 +1286,7 @@
                 <w:noProof/>
                 <w:webHidden/>
               </w:rPr>
-              <w:instrText xml:space="preserve"> PAGEREF _Toc242094238 \h </w:instrText>
+              <w:instrText xml:space="preserve"> PAGEREF _Toc244241625 \h </w:instrText>
             </w:r>
             <w:r>
               <w:rPr>
@@ -1329,7 +1329,7 @@
               <w:lang w:eastAsia="fr-CH"/>
             </w:rPr>
           </w:pPr>
-          <w:hyperlink w:anchor="_Toc242094239" w:history="1">
+          <w:hyperlink w:anchor="_Toc244241626" w:history="1">
             <w:r>
               <w:rPr>
                 <w:rStyle w:val="Lienhypertexte"/>
@@ -1356,7 +1356,7 @@
                 <w:noProof/>
                 <w:webHidden/>
               </w:rPr>
-              <w:instrText xml:space="preserve"> PAGEREF _Toc242094239 \h </w:instrText>
+              <w:instrText xml:space="preserve"> PAGEREF _Toc244241626 \h </w:instrText>
             </w:r>
             <w:r>
               <w:rPr>
@@ -1399,7 +1399,7 @@
               <w:lang w:eastAsia="fr-CH"/>
             </w:rPr>
           </w:pPr>
-          <w:hyperlink w:anchor="_Toc242094240" w:history="1">
+          <w:hyperlink w:anchor="_Toc244241627" w:history="1">
             <w:r>
               <w:rPr>
                 <w:rStyle w:val="Lienhypertexte"/>
@@ -1426,7 +1426,7 @@
                 <w:noProof/>
                 <w:webHidden/>
               </w:rPr>
-              <w:instrText xml:space="preserve"> PAGEREF _Toc242094240 \h </w:instrText>
+              <w:instrText xml:space="preserve"> PAGEREF _Toc244241627 \h </w:instrText>
             </w:r>
             <w:r>
               <w:rPr>
@@ -1469,7 +1469,7 @@
               <w:lang w:eastAsia="fr-CH"/>
             </w:rPr>
           </w:pPr>
-          <w:hyperlink w:anchor="_Toc242094241" w:history="1">
+          <w:hyperlink w:anchor="_Toc244241628" w:history="1">
             <w:r>
               <w:rPr>
                 <w:rStyle w:val="Lienhypertexte"/>
@@ -1496,7 +1496,7 @@
                 <w:noProof/>
                 <w:webHidden/>
               </w:rPr>
-              <w:instrText xml:space="preserve"> PAGEREF _Toc242094241 \h </w:instrText>
+              <w:instrText xml:space="preserve"> PAGEREF _Toc244241628 \h </w:instrText>
             </w:r>
             <w:r>
               <w:rPr>
@@ -1539,7 +1539,7 @@
               <w:lang w:eastAsia="fr-CH"/>
             </w:rPr>
           </w:pPr>
-          <w:hyperlink w:anchor="_Toc242094242" w:history="1">
+          <w:hyperlink w:anchor="_Toc244241629" w:history="1">
             <w:r>
               <w:rPr>
                 <w:rStyle w:val="Lienhypertexte"/>
@@ -1566,7 +1566,7 @@
                 <w:noProof/>
                 <w:webHidden/>
               </w:rPr>
-              <w:instrText xml:space="preserve"> PAGEREF _Toc242094242 \h </w:instrText>
+              <w:instrText xml:space="preserve"> PAGEREF _Toc244241629 \h </w:instrText>
             </w:r>
             <w:r>
               <w:rPr>
@@ -1609,7 +1609,7 @@
               <w:lang w:eastAsia="fr-CH"/>
             </w:rPr>
           </w:pPr>
-          <w:hyperlink w:anchor="_Toc242094243" w:history="1">
+          <w:hyperlink w:anchor="_Toc244241630" w:history="1">
             <w:r>
               <w:rPr>
                 <w:rStyle w:val="Lienhypertexte"/>
@@ -1636,7 +1636,7 @@
                 <w:noProof/>
                 <w:webHidden/>
               </w:rPr>
-              <w:instrText xml:space="preserve"> PAGEREF _Toc242094243 \h </w:instrText>
+              <w:instrText xml:space="preserve"> PAGEREF _Toc244241630 \h </w:instrText>
             </w:r>
             <w:r>
               <w:rPr>
@@ -1679,7 +1679,7 @@
               <w:lang w:eastAsia="fr-CH"/>
             </w:rPr>
           </w:pPr>
-          <w:hyperlink w:anchor="_Toc242094244" w:history="1">
+          <w:hyperlink w:anchor="_Toc244241631" w:history="1">
             <w:r>
               <w:rPr>
                 <w:rStyle w:val="Lienhypertexte"/>
@@ -1706,7 +1706,7 @@
                 <w:noProof/>
                 <w:webHidden/>
               </w:rPr>
-              <w:instrText xml:space="preserve"> PAGEREF _Toc242094244 \h </w:instrText>
+              <w:instrText xml:space="preserve"> PAGEREF _Toc244241631 \h </w:instrText>
             </w:r>
             <w:r>
               <w:rPr>
@@ -1749,7 +1749,7 @@
               <w:lang w:eastAsia="fr-CH"/>
             </w:rPr>
           </w:pPr>
-          <w:hyperlink w:anchor="_Toc242094245" w:history="1">
+          <w:hyperlink w:anchor="_Toc244241632" w:history="1">
             <w:r>
               <w:rPr>
                 <w:rStyle w:val="Lienhypertexte"/>
@@ -1776,7 +1776,7 @@
                 <w:noProof/>
                 <w:webHidden/>
               </w:rPr>
-              <w:instrText xml:space="preserve"> PAGEREF _Toc242094245 \h </w:instrText>
+              <w:instrText xml:space="preserve"> PAGEREF _Toc244241632 \h </w:instrText>
             </w:r>
             <w:r>
               <w:rPr>
@@ -1819,7 +1819,7 @@
               <w:lang w:eastAsia="fr-CH"/>
             </w:rPr>
           </w:pPr>
-          <w:hyperlink w:anchor="_Toc242094246" w:history="1">
+          <w:hyperlink w:anchor="_Toc244241633" w:history="1">
             <w:r>
               <w:rPr>
                 <w:rStyle w:val="Lienhypertexte"/>
@@ -1846,7 +1846,7 @@
                 <w:noProof/>
                 <w:webHidden/>
               </w:rPr>
-              <w:instrText xml:space="preserve"> PAGEREF _Toc242094246 \h </w:instrText>
+              <w:instrText xml:space="preserve"> PAGEREF _Toc244241633 \h </w:instrText>
             </w:r>
             <w:r>
               <w:rPr>
@@ -1889,7 +1889,7 @@
               <w:lang w:eastAsia="fr-CH"/>
             </w:rPr>
           </w:pPr>
-          <w:hyperlink w:anchor="_Toc242094247" w:history="1">
+          <w:hyperlink w:anchor="_Toc244241634" w:history="1">
             <w:r>
               <w:rPr>
                 <w:rStyle w:val="Lienhypertexte"/>
@@ -1916,7 +1916,7 @@
                 <w:noProof/>
                 <w:webHidden/>
               </w:rPr>
-              <w:instrText xml:space="preserve"> PAGEREF _Toc242094247 \h </w:instrText>
+              <w:instrText xml:space="preserve"> PAGEREF _Toc244241634 \h </w:instrText>
             </w:r>
             <w:r>
               <w:rPr>
@@ -1959,7 +1959,7 @@
               <w:lang w:eastAsia="fr-CH"/>
             </w:rPr>
           </w:pPr>
-          <w:hyperlink w:anchor="_Toc242094248" w:history="1">
+          <w:hyperlink w:anchor="_Toc244241635" w:history="1">
             <w:r>
               <w:rPr>
                 <w:rStyle w:val="Lienhypertexte"/>
@@ -1986,7 +1986,7 @@
                 <w:noProof/>
                 <w:webHidden/>
               </w:rPr>
-              <w:instrText xml:space="preserve"> PAGEREF _Toc242094248 \h </w:instrText>
+              <w:instrText xml:space="preserve"> PAGEREF _Toc244241635 \h </w:instrText>
             </w:r>
             <w:r>
               <w:rPr>
@@ -2029,7 +2029,7 @@
               <w:lang w:eastAsia="fr-CH"/>
             </w:rPr>
           </w:pPr>
-          <w:hyperlink w:anchor="_Toc242094249" w:history="1">
+          <w:hyperlink w:anchor="_Toc244241636" w:history="1">
             <w:r>
               <w:rPr>
                 <w:rStyle w:val="Lienhypertexte"/>
@@ -2056,7 +2056,77 @@
                 <w:noProof/>
                 <w:webHidden/>
               </w:rPr>
-              <w:instrText xml:space="preserve"> PAGEREF _Toc242094249 \h </w:instrText>
+              <w:instrText xml:space="preserve"> PAGEREF _Toc244241636 \h </w:instrText>
+            </w:r>
+            <w:r>
+              <w:rPr>
+                <w:noProof/>
+                <w:webHidden/>
+              </w:rPr>
+            </w:r>
+            <w:r>
+              <w:rPr>
+                <w:noProof/>
+                <w:webHidden/>
+              </w:rPr>
+              <w:fldChar w:fldCharType="separate"/>
+            </w:r>
+            <w:r>
+              <w:rPr>
+                <w:noProof/>
+                <w:webHidden/>
+              </w:rPr>
+              <w:t>21</w:t>
+            </w:r>
+            <w:r>
+              <w:rPr>
+                <w:noProof/>
+                <w:webHidden/>
+              </w:rPr>
+              <w:fldChar w:fldCharType="end"/>
+            </w:r>
+          </w:hyperlink>
+        </w:p>
+        <w:p>
+          <w:pPr>
+            <w:pStyle w:val="TM2"/>
+            <w:tabs>
+              <w:tab w:val="right" w:leader="dot" w:pos="9062"/>
+            </w:tabs>
+            <w:rPr>
+              <w:rFonts w:eastAsiaTheme="minorEastAsia"/>
+              <w:noProof/>
+              <w:lang w:eastAsia="fr-CH"/>
+            </w:rPr>
+          </w:pPr>
+          <w:hyperlink w:anchor="_Toc244241637" w:history="1">
+            <w:r>
+              <w:rPr>
+                <w:rStyle w:val="Lienhypertexte"/>
+                <w:noProof/>
+              </w:rPr>
+              <w:t>StatParking_IsDaily_Result_Daily</w:t>
+            </w:r>
+            <w:r>
+              <w:rPr>
+                <w:noProof/>
+                <w:webHidden/>
+              </w:rPr>
+              <w:tab/>
+            </w:r>
+            <w:r>
+              <w:rPr>
+                <w:noProof/>
+                <w:webHidden/>
+              </w:rPr>
+              <w:fldChar w:fldCharType="begin"/>
+            </w:r>
+            <w:r>
+              <w:rPr>
+                <w:noProof/>
+                <w:webHidden/>
+              </w:rPr>
+              <w:instrText xml:space="preserve"> PAGEREF _Toc244241637 \h </w:instrText>
             </w:r>
             <w:r>
               <w:rPr>
@@ -2099,7 +2169,7 @@
               <w:lang w:eastAsia="fr-CH"/>
             </w:rPr>
           </w:pPr>
-          <w:hyperlink w:anchor="_Toc242094250" w:history="1">
+          <w:hyperlink w:anchor="_Toc244241638" w:history="1">
             <w:r>
               <w:rPr>
                 <w:rStyle w:val="Lienhypertexte"/>
@@ -2126,7 +2196,7 @@
                 <w:noProof/>
                 <w:webHidden/>
               </w:rPr>
-              <w:instrText xml:space="preserve"> PAGEREF _Toc242094250 \h </w:instrText>
+              <w:instrText xml:space="preserve"> PAGEREF _Toc244241638 \h </w:instrText>
             </w:r>
             <w:r>
               <w:rPr>
@@ -2169,7 +2239,7 @@
               <w:lang w:eastAsia="fr-CH"/>
             </w:rPr>
           </w:pPr>
-          <w:hyperlink w:anchor="_Toc242094251" w:history="1">
+          <w:hyperlink w:anchor="_Toc244241639" w:history="1">
             <w:r>
               <w:rPr>
                 <w:rStyle w:val="Lienhypertexte"/>
@@ -2196,7 +2266,7 @@
                 <w:noProof/>
                 <w:webHidden/>
               </w:rPr>
-              <w:instrText xml:space="preserve"> PAGEREF _Toc242094251 \h </w:instrText>
+              <w:instrText xml:space="preserve"> PAGEREF _Toc244241639 \h </w:instrText>
             </w:r>
             <w:r>
               <w:rPr>
@@ -2239,7 +2309,7 @@
               <w:lang w:eastAsia="fr-CH"/>
             </w:rPr>
           </w:pPr>
-          <w:hyperlink w:anchor="_Toc242094252" w:history="1">
+          <w:hyperlink w:anchor="_Toc244241640" w:history="1">
             <w:r>
               <w:rPr>
                 <w:rStyle w:val="Lienhypertexte"/>
@@ -2266,7 +2336,7 @@
                 <w:noProof/>
                 <w:webHidden/>
               </w:rPr>
-              <w:instrText xml:space="preserve"> PAGEREF _Toc242094252 \h </w:instrText>
+              <w:instrText xml:space="preserve"> PAGEREF _Toc244241640 \h </w:instrText>
             </w:r>
             <w:r>
               <w:rPr>
@@ -2309,7 +2379,7 @@
               <w:lang w:eastAsia="fr-CH"/>
             </w:rPr>
           </w:pPr>
-          <w:hyperlink w:anchor="_Toc242094253" w:history="1">
+          <w:hyperlink w:anchor="_Toc244241641" w:history="1">
             <w:r>
               <w:rPr>
                 <w:rStyle w:val="Lienhypertexte"/>
@@ -2336,7 +2406,7 @@
                 <w:noProof/>
                 <w:webHidden/>
               </w:rPr>
-              <w:instrText xml:space="preserve"> PAGEREF _Toc242094253 \h </w:instrText>
+              <w:instrText xml:space="preserve"> PAGEREF _Toc244241641 \h </w:instrText>
             </w:r>
             <w:r>
               <w:rPr>
@@ -2395,7 +2465,7 @@
           <w:color w:val="auto"/>
         </w:rPr>
       </w:pPr>
-      <w:bookmarkStart w:id="0" w:name="_Toc242094222"/>
+      <w:bookmarkStart w:id="0" w:name="_Toc244241609"/>
       <w:r>
         <w:rPr>
           <w:color w:val="auto"/>
@@ -2406,19 +2476,7 @@
     </w:p>
     <w:p>
       <w:r>
-        <w:t xml:space="preserve">Le projet est fait sur C# console. C’est un </w:t>
-      </w:r>
-      <w:r>
-        <w:t>"</w:t>
-      </w:r>
-      <w:r>
-        <w:t>simulateur</w:t>
-      </w:r>
-      <w:r>
-        <w:t>"</w:t>
-      </w:r>
-      <w:r>
-        <w:t xml:space="preserve"> de parking.</w:t>
+        <w:t>Le projet est fait sur C# console. C’est un "simulateur" de parking.</w:t>
       </w:r>
       <w:r>
         <w:t xml:space="preserve"> Un projet centré sur la P.O.O.</w:t>
@@ -2757,7 +2815,15 @@
         <w:t xml:space="preserve"> </w:t>
       </w:r>
       <w:r>
-        <w:t>Utilisé un timer qui s’incrémentera chaque seconde. Une seconde sera égale à une minute.</w:t>
+        <w:t xml:space="preserve">Utilisé un </w:t>
+      </w:r>
+      <w:proofErr w:type="spellStart"/>
+      <w:r>
+        <w:t>timer</w:t>
+      </w:r>
+      <w:proofErr w:type="spellEnd"/>
+      <w:r>
+        <w:t xml:space="preserve"> qui s’incrémentera chaque seconde. Une seconde sera égale à une minute.</w:t>
       </w:r>
     </w:p>
     <w:p>
@@ -2836,31 +2902,23 @@
       </w:r>
       <w:r>
         <w:br/>
+      </w:r>
+      <w:proofErr w:type="gramStart"/>
+      <w:r>
         <w:t>Puis ensuite</w:t>
       </w:r>
+      <w:proofErr w:type="gramEnd"/>
       <w:r>
         <w:rPr>
           <w:color w:val="7030A0"/>
         </w:rPr>
-        <w:t xml:space="preserve"> </w:t>
+        <w:t xml:space="preserve"> Utiliser la classe </w:t>
       </w:r>
       <w:r>
         <w:rPr>
           <w:color w:val="7030A0"/>
         </w:rPr>
-        <w:t xml:space="preserve">Utiliser la classe </w:t>
-      </w:r>
-      <w:r>
-        <w:rPr>
-          <w:color w:val="7030A0"/>
-        </w:rPr>
-        <w:t>statique</w:t>
-      </w:r>
-      <w:r>
-        <w:rPr>
-          <w:color w:val="7030A0"/>
-        </w:rPr>
-        <w:t xml:space="preserve"> </w:t>
+        <w:t xml:space="preserve">statique </w:t>
       </w:r>
       <w:r>
         <w:t>pour</w:t>
@@ -2947,21 +3005,25 @@
         <w:t xml:space="preserve">. On va </w:t>
       </w:r>
       <w:r>
-        <w:t xml:space="preserve">vérifier si le string est cohérent pour savoir si c’est une plaque d’immatriculation, si cela ne fonctionne pas, essayer de le transformer en type INT (pour savoir si c’est un numéro de place), si ça ne fonctionne pas, appeler une autre méthode (soit pour afficher les infos du véhicule, soit le faire sortir. Dont l’utilité du paramètre booléen) puis lui donner comme paramètre un texte écrit comme ce ci </w:t>
-      </w:r>
+        <w:t>vérifier si le string est cohérent pour savoir si c’est une plaque d’immatriculation, si cela ne fonctionne pas, essayer de le transformer en type INT (pour savoir si c’est un numéro de place), si ça ne fonctionne pas, appeler une autre méthode (soit pour afficher les infos du véhicule, soit le faire sortir. Dont l’utilité du paramètre booléen) puis lui donner comme paramètre un texte écrit comme ce ci "</w:t>
+      </w:r>
+      <w:proofErr w:type="spellStart"/>
+      <w:r>
+        <w:t>nothing</w:t>
+      </w:r>
+      <w:proofErr w:type="spellEnd"/>
+      <w:r>
+        <w:t xml:space="preserve"> </w:t>
+      </w:r>
+      <w:proofErr w:type="spellStart"/>
+      <w:r>
+        <w:t>found</w:t>
+      </w:r>
+      <w:proofErr w:type="spellEnd"/>
       <w:r>
         <w:t>"</w:t>
       </w:r>
       <w:r>
-        <w:t>nothing</w:t>
-      </w:r>
-      <w:r>
-        <w:t xml:space="preserve"> found</w:t>
-      </w:r>
-      <w:r>
-        <w:t>"</w:t>
-      </w:r>
-      <w:r>
         <w:t>.</w:t>
       </w:r>
       <w:r>
@@ -2980,7 +3042,15 @@
         <w:t>en lui donnant comme paramètre la plaque</w:t>
       </w:r>
       <w:r>
-        <w:t xml:space="preserve"> (si l’utilisateur avait entrée un numéro de place, on aurait cherché dans le parking la place en question puis récupéré son numéro de plaque qui l’occupe)</w:t>
+        <w:t xml:space="preserve"> (si l’utilisateur avait </w:t>
+      </w:r>
+      <w:proofErr w:type="spellStart"/>
+      <w:r>
+        <w:t>entrée</w:t>
+      </w:r>
+      <w:proofErr w:type="spellEnd"/>
+      <w:r>
+        <w:t xml:space="preserve"> un numéro de place, on aurait cherché dans le parking la place en question puis récupéré son numéro de plaque qui l’occupe)</w:t>
       </w:r>
       <w:r>
         <w:t xml:space="preserve"> </w:t>
@@ -3040,37 +3110,23 @@
     </w:p>
     <w:p>
       <w:r>
-        <w:t xml:space="preserve">Si non, vérifier si le string est égal à </w:t>
-      </w:r>
-      <w:r>
-        <w:t>"</w:t>
-      </w:r>
-      <w:r>
-        <w:t>nothing found</w:t>
-      </w:r>
-      <w:r>
-        <w:t>"</w:t>
-      </w:r>
-      <w:r>
-        <w:t xml:space="preserve">. Si c’est le cas, </w:t>
-      </w:r>
-      <w:r>
-        <w:t>afficher un message pour dire à l’utilisateur que aucun résultat n’a pu être trouvé</w:t>
-      </w:r>
-      <w:r>
-        <w:t xml:space="preserve">. Si ce n’est pas le cas, afficher un message d’erreur comme </w:t>
-      </w:r>
-      <w:r>
-        <w:t>"</w:t>
-      </w:r>
-      <w:r>
-        <w:t>Un problème c’est produit.</w:t>
-      </w:r>
-      <w:r>
-        <w:t>"</w:t>
-      </w:r>
-      <w:r>
-        <w:t> ;</w:t>
+        <w:t>Si non, vérifier si le string est égal à "</w:t>
+      </w:r>
+      <w:proofErr w:type="spellStart"/>
+      <w:r>
+        <w:t>nothing</w:t>
+      </w:r>
+      <w:proofErr w:type="spellEnd"/>
+      <w:r>
+        <w:t xml:space="preserve"> </w:t>
+      </w:r>
+      <w:proofErr w:type="spellStart"/>
+      <w:r>
+        <w:t>found</w:t>
+      </w:r>
+      <w:proofErr w:type="spellEnd"/>
+      <w:r>
+        <w:t>". Si c’est le cas, afficher un message pour dire à l’utilisateur que aucun résultat n’a pu être trouvé. Si ce n’est pas le cas, afficher un message d’erreur comme "Un problème c’est produit." ;</w:t>
       </w:r>
     </w:p>
     <w:p/>
@@ -3090,13 +3146,7 @@
         <w:rPr>
           <w:color w:val="7030A0"/>
         </w:rPr>
-        <w:t>Utiliser la classe statique</w:t>
-      </w:r>
-      <w:r>
-        <w:rPr>
-          <w:color w:val="7030A0"/>
-        </w:rPr>
-        <w:t xml:space="preserve"> </w:t>
+        <w:t xml:space="preserve">Utiliser la classe statique </w:t>
       </w:r>
       <w:r>
         <w:t>pour créer une nouvelle méthode pour faire sortir un véhicule du parking. La méthode aura comme paramètre une variable de type string. On vérifie si le string est un numéro de plaque cohérent.</w:t>
@@ -3126,37 +3176,23 @@
     </w:p>
     <w:p>
       <w:r>
-        <w:t xml:space="preserve">Si non, vérifier si le string est égal à </w:t>
-      </w:r>
-      <w:r>
-        <w:t>"</w:t>
-      </w:r>
-      <w:r>
-        <w:t>nothing found</w:t>
-      </w:r>
-      <w:r>
-        <w:t>"</w:t>
-      </w:r>
-      <w:r>
-        <w:t xml:space="preserve">. Si c’est le cas, </w:t>
-      </w:r>
-      <w:r>
-        <w:t>afficher un message pour dire à l’utilisateur que aucun résultat n’a pu être trouvé</w:t>
-      </w:r>
-      <w:r>
-        <w:t xml:space="preserve">. Si ce n’est pas le cas, afficher un message d’erreur comme </w:t>
-      </w:r>
-      <w:r>
-        <w:t>"</w:t>
-      </w:r>
-      <w:r>
-        <w:t>Un problème c’est produit.</w:t>
-      </w:r>
-      <w:r>
-        <w:t>"</w:t>
-      </w:r>
-      <w:r>
-        <w:t> ;</w:t>
+        <w:t>Si non, vérifier si le string est égal à "</w:t>
+      </w:r>
+      <w:proofErr w:type="spellStart"/>
+      <w:r>
+        <w:t>nothing</w:t>
+      </w:r>
+      <w:proofErr w:type="spellEnd"/>
+      <w:r>
+        <w:t xml:space="preserve"> </w:t>
+      </w:r>
+      <w:proofErr w:type="spellStart"/>
+      <w:r>
+        <w:t>found</w:t>
+      </w:r>
+      <w:proofErr w:type="spellEnd"/>
+      <w:r>
+        <w:t>". Si c’est le cas, afficher un message pour dire à l’utilisateur que aucun résultat n’a pu être trouvé. Si ce n’est pas le cas, afficher un message d’erreur comme "Un problème c’est produit." ;</w:t>
       </w:r>
     </w:p>
     <w:p>
@@ -3173,13 +3209,7 @@
         <w:rPr>
           <w:color w:val="7030A0"/>
         </w:rPr>
-        <w:t>Utiliser la classe statique</w:t>
-      </w:r>
-      <w:r>
-        <w:rPr>
-          <w:color w:val="7030A0"/>
-        </w:rPr>
-        <w:t xml:space="preserve"> </w:t>
+        <w:t xml:space="preserve">Utiliser la classe statique </w:t>
       </w:r>
       <w:r>
         <w:t>pour créer une nouvelle méthode pour afficher le parking.</w:t>
@@ -3203,13 +3233,7 @@
         <w:rPr>
           <w:color w:val="7030A0"/>
         </w:rPr>
-        <w:t>Utiliser la classe statique</w:t>
-      </w:r>
-      <w:r>
-        <w:rPr>
-          <w:color w:val="7030A0"/>
-        </w:rPr>
-        <w:t xml:space="preserve"> </w:t>
+        <w:t xml:space="preserve">Utiliser la classe statique </w:t>
       </w:r>
       <w:r>
         <w:t>pour créer une nouvelle méthode pour afficher diverse stats et information.</w:t>
@@ -3229,13 +3253,7 @@
         <w:rPr>
           <w:color w:val="7030A0"/>
         </w:rPr>
-        <w:t>Utiliser la classe statique</w:t>
-      </w:r>
-      <w:r>
-        <w:rPr>
-          <w:color w:val="7030A0"/>
-        </w:rPr>
-        <w:t xml:space="preserve"> </w:t>
+        <w:t xml:space="preserve">Utiliser la classe statique </w:t>
       </w:r>
       <w:r>
         <w:t>pour créer une nouvelle méthode pour afficher l’historique des transactions.</w:t>
@@ -3253,7 +3271,7 @@
           <w:color w:val="auto"/>
         </w:rPr>
       </w:pPr>
-      <w:bookmarkStart w:id="1" w:name="_Toc242094223"/>
+      <w:bookmarkStart w:id="1" w:name="_Toc244241610"/>
       <w:r>
         <w:rPr>
           <w:color w:val="auto"/>
@@ -3267,11 +3285,13 @@
       <w:pPr>
         <w:pStyle w:val="Titre2"/>
       </w:pPr>
-      <w:bookmarkStart w:id="2" w:name="_Toc242094224"/>
+      <w:bookmarkStart w:id="2" w:name="_Toc244241611"/>
+      <w:proofErr w:type="spellStart"/>
       <w:r>
         <w:t>Program.cs</w:t>
       </w:r>
       <w:bookmarkEnd w:id="2"/>
+      <w:proofErr w:type="spellEnd"/>
     </w:p>
     <w:p>
       <w:r>
@@ -3281,7 +3301,15 @@
         <w:t>La seule action</w:t>
       </w:r>
       <w:r>
-        <w:t xml:space="preserve"> qu’elle effectue c’est d’appeler une classe nommée « PlayGame ».</w:t>
+        <w:t xml:space="preserve"> qu’elle effectue c’est d’appeler une classe nommée « </w:t>
+      </w:r>
+      <w:proofErr w:type="spellStart"/>
+      <w:r>
+        <w:t>PlayGame</w:t>
+      </w:r>
+      <w:proofErr w:type="spellEnd"/>
+      <w:r>
+        <w:t> ».</w:t>
       </w:r>
     </w:p>
     <w:p>
@@ -3289,9 +3317,6 @@
         <w:jc w:val="center"/>
       </w:pPr>
       <w:r>
-        <w:rPr>
-          <w:noProof/>
-        </w:rPr>
         <w:drawing>
           <wp:inline distT="0" distB="0" distL="0" distR="0" wp14:anchorId="4492B7CA" wp14:editId="1170FD9C">
             <wp:extent cx="2940201" cy="1911448"/>
@@ -3344,22 +3369,29 @@
       <w:pPr>
         <w:pStyle w:val="Titre2"/>
       </w:pPr>
-      <w:bookmarkStart w:id="3" w:name="_Toc242094225"/>
+      <w:bookmarkStart w:id="3" w:name="_Toc244241612"/>
+      <w:proofErr w:type="spellStart"/>
       <w:r>
         <w:lastRenderedPageBreak/>
         <w:t>PlayGame.cs</w:t>
       </w:r>
       <w:bookmarkEnd w:id="3"/>
-    </w:p>
-    <w:p>
-      <w:r>
-        <w:t>Dans cette classe il s</w:t>
-      </w:r>
-      <w:r>
-        <w:t>e situe 3 méthodes.</w:t>
-      </w:r>
-      <w:r>
-        <w:t xml:space="preserve"> Elle exécute une loop qui permet au programme de tourner continuellement jusqu’à ce que l’utilisateur décide d’arrêter le programme.</w:t>
+      <w:proofErr w:type="spellEnd"/>
+    </w:p>
+    <w:p>
+      <w:r>
+        <w:t>Dans cette classe il se situe 3 méthodes.</w:t>
+      </w:r>
+      <w:r>
+        <w:t xml:space="preserve"> Elle exécute une </w:t>
+      </w:r>
+      <w:proofErr w:type="spellStart"/>
+      <w:r>
+        <w:t>loop</w:t>
+      </w:r>
+      <w:proofErr w:type="spellEnd"/>
+      <w:r>
+        <w:t xml:space="preserve"> qui permet au programme de tourner continuellement jusqu’à ce que l’utilisateur décide d’arrêter le programme.</w:t>
       </w:r>
     </w:p>
     <w:p>
@@ -3367,24 +3399,19 @@
         <w:pStyle w:val="Titre3"/>
         <w:ind w:firstLine="708"/>
       </w:pPr>
-      <w:bookmarkStart w:id="4" w:name="_Toc242094226"/>
+      <w:bookmarkStart w:id="4" w:name="_Toc244241613"/>
+      <w:proofErr w:type="spellStart"/>
       <w:r>
         <w:t>StartProgram</w:t>
       </w:r>
       <w:bookmarkEnd w:id="4"/>
+      <w:proofErr w:type="spellEnd"/>
     </w:p>
     <w:p>
       <w:pPr>
         <w:jc w:val="center"/>
-        <w:rPr>
-          <w:lang w:val="en-GB"/>
-        </w:rPr>
-      </w:pPr>
-      <w:r>
-        <w:rPr>
-          <w:noProof/>
-          <w:lang w:val="en-GB"/>
-        </w:rPr>
+      </w:pPr>
+      <w:r>
         <w:drawing>
           <wp:inline distT="0" distB="0" distL="0" distR="0" wp14:anchorId="56DF3C27" wp14:editId="5385300E">
             <wp:extent cx="4294836" cy="2552831"/>
@@ -3430,10 +3457,15 @@
     </w:p>
     <w:p>
       <w:r>
-        <w:t xml:space="preserve">Dans </w:t>
-      </w:r>
-      <w:r>
-        <w:t>cette méthode on commence par appelé « InitiateParking »</w:t>
+        <w:t>Dans cette méthode on commence par appelé « </w:t>
+      </w:r>
+      <w:proofErr w:type="spellStart"/>
+      <w:r>
+        <w:t>InitiateParking</w:t>
+      </w:r>
+      <w:proofErr w:type="spellEnd"/>
+      <w:r>
+        <w:t> »</w:t>
       </w:r>
       <w:r>
         <w:t xml:space="preserve"> </w:t>
@@ -3448,13 +3480,29 @@
         <w:t xml:space="preserve">e </w:t>
       </w:r>
       <w:r>
-        <w:t>on commence une boucle avec « continueProgram » (</w:t>
+        <w:t>on commence une boucle avec « </w:t>
+      </w:r>
+      <w:proofErr w:type="spellStart"/>
+      <w:r>
+        <w:t>continueProgram</w:t>
+      </w:r>
+      <w:proofErr w:type="spellEnd"/>
+      <w:r>
+        <w:t> » (</w:t>
       </w:r>
       <w:r>
         <w:t xml:space="preserve">un booléen </w:t>
       </w:r>
       <w:r>
-        <w:t>déclaré tout en haut de la capture) qui va faire en sorte que le menu et continuellement afficher puis de mettre à jour la variable « continueProgram ».</w:t>
+        <w:t>déclaré tout en haut de la capture) qui va faire en sorte que le menu et continuellement afficher puis de mettre à jour la variable « </w:t>
+      </w:r>
+      <w:proofErr w:type="spellStart"/>
+      <w:r>
+        <w:t>continueProgram</w:t>
+      </w:r>
+      <w:proofErr w:type="spellEnd"/>
+      <w:r>
+        <w:t> ».</w:t>
       </w:r>
     </w:p>
     <w:p>
@@ -3466,12 +3514,14 @@
       <w:pPr>
         <w:pStyle w:val="Titre2"/>
       </w:pPr>
-      <w:bookmarkStart w:id="5" w:name="_Toc242094227"/>
+      <w:bookmarkStart w:id="5" w:name="_Toc244241614"/>
+      <w:proofErr w:type="spellStart"/>
       <w:r>
         <w:lastRenderedPageBreak/>
         <w:t>Menu.cs</w:t>
       </w:r>
       <w:bookmarkEnd w:id="5"/>
+      <w:proofErr w:type="spellEnd"/>
     </w:p>
     <w:p>
       <w:r>
@@ -3486,20 +3536,19 @@
         <w:pStyle w:val="Titre3"/>
         <w:ind w:firstLine="708"/>
       </w:pPr>
-      <w:bookmarkStart w:id="6" w:name="_Toc242094228"/>
+      <w:bookmarkStart w:id="6" w:name="_Toc244241615"/>
+      <w:proofErr w:type="spellStart"/>
       <w:r>
         <w:t>DisplayMenu</w:t>
       </w:r>
       <w:bookmarkEnd w:id="6"/>
+      <w:proofErr w:type="spellEnd"/>
     </w:p>
     <w:p>
       <w:pPr>
         <w:jc w:val="center"/>
       </w:pPr>
       <w:r>
-        <w:rPr>
-          <w:noProof/>
-        </w:rPr>
         <w:drawing>
           <wp:inline distT="0" distB="0" distL="0" distR="0" wp14:anchorId="2AA6B406" wp14:editId="3CE323D4">
             <wp:extent cx="3853180" cy="2576830"/>
@@ -3555,7 +3604,41 @@
         <w:t>Une simple méthode permettant d’afficher</w:t>
       </w:r>
       <w:r>
-        <w:t xml:space="preserve"> le menu. Une boucle foreach pour afficher chaque option (stocker dans un tableau private au début du code) disponible pour l’utilisateur. « optionIndex » permet à l’utilisateur de savoir quelle numéro entrer pour utiliser cette option-ci ou </w:t>
+        <w:t xml:space="preserve"> le menu. Une boucle </w:t>
+      </w:r>
+      <w:proofErr w:type="spellStart"/>
+      <w:r>
+        <w:t>foreach</w:t>
+      </w:r>
+      <w:proofErr w:type="spellEnd"/>
+      <w:r>
+        <w:t xml:space="preserve"> pour afficher chaque option (stocker dans un tableau </w:t>
+      </w:r>
+      <w:proofErr w:type="spellStart"/>
+      <w:r>
+        <w:t>private</w:t>
+      </w:r>
+      <w:proofErr w:type="spellEnd"/>
+      <w:r>
+        <w:t xml:space="preserve"> au début du code) disponible pour l’utilisateur. « </w:t>
+      </w:r>
+      <w:proofErr w:type="spellStart"/>
+      <w:proofErr w:type="gramStart"/>
+      <w:r>
+        <w:t>optionIndex</w:t>
+      </w:r>
+      <w:proofErr w:type="spellEnd"/>
+      <w:proofErr w:type="gramEnd"/>
+      <w:r>
+        <w:t xml:space="preserve"> » permet à l’utilisateur de savoir </w:t>
+      </w:r>
+      <w:proofErr w:type="gramStart"/>
+      <w:r>
+        <w:t>quelle numéro</w:t>
+      </w:r>
+      <w:proofErr w:type="gramEnd"/>
+      <w:r>
+        <w:t xml:space="preserve"> entrer pour utiliser cette option-ci ou </w:t>
       </w:r>
       <w:r>
         <w:t>celle-là</w:t>
@@ -3577,20 +3660,19 @@
         <w:lastRenderedPageBreak/>
         <w:tab/>
       </w:r>
-      <w:bookmarkStart w:id="7" w:name="_Toc242094229"/>
+      <w:bookmarkStart w:id="7" w:name="_Toc244241616"/>
+      <w:proofErr w:type="spellStart"/>
       <w:r>
         <w:t>UserInputHandler</w:t>
       </w:r>
       <w:bookmarkEnd w:id="7"/>
+      <w:proofErr w:type="spellEnd"/>
     </w:p>
     <w:p>
       <w:pPr>
         <w:jc w:val="center"/>
       </w:pPr>
       <w:r>
-        <w:rPr>
-          <w:noProof/>
-        </w:rPr>
         <w:drawing>
           <wp:inline distT="0" distB="0" distL="0" distR="0" wp14:anchorId="6A3A66C0" wp14:editId="0DE1E896">
             <wp:extent cx="4077970" cy="2420620"/>
@@ -3646,13 +3728,37 @@
         <w:t>Elle est souvent appelée dans le code. Elle va</w:t>
       </w:r>
       <w:r>
-        <w:t xml:space="preserve"> gérer ce que l’utilisateur entre comme option (ex : « 5 » pour l’option numéro 5). Si la saisie de l’utilisateur ne peut pas être converti en int, on va supprimer son input (grâce à la méthode « CheckCorrectInput » qui est utiliser seulement pour effacer la saisie du joueur pour avoir une console propre)</w:t>
+        <w:t xml:space="preserve"> gérer ce que l’utilisateur entre comme option (ex : « 5 » pour l’option numéro 5). Si la saisie de l’utilisateur ne peut pas être converti en </w:t>
+      </w:r>
+      <w:proofErr w:type="spellStart"/>
+      <w:r>
+        <w:t>int</w:t>
+      </w:r>
+      <w:proofErr w:type="spellEnd"/>
+      <w:r>
+        <w:t>, on va supprimer son input (grâce à la méthode « </w:t>
+      </w:r>
+      <w:proofErr w:type="spellStart"/>
+      <w:r>
+        <w:t>CheckCorrectInput</w:t>
+      </w:r>
+      <w:proofErr w:type="spellEnd"/>
+      <w:r>
+        <w:t> » qui est utiliser seulement pour effacer la saisie du joueur pour avoir une console propre)</w:t>
       </w:r>
       <w:r>
         <w:t>. Car effacer l’entièreté de la console serait problématique vu qu’on aurait besoin de re-</w:t>
       </w:r>
       <w:r>
-        <w:t>appeler « DisplayMenu » simplement pour afficher un texte « Entrer votre choix : ».</w:t>
+        <w:t>appeler « </w:t>
+      </w:r>
+      <w:proofErr w:type="spellStart"/>
+      <w:r>
+        <w:t>DisplayMenu</w:t>
+      </w:r>
+      <w:proofErr w:type="spellEnd"/>
+      <w:r>
+        <w:t> » simplement pour afficher un texte « Entrer votre choix : ».</w:t>
       </w:r>
     </w:p>
     <w:p>
@@ -3666,7 +3772,15 @@
         <w:t xml:space="preserve">on va dire à l’utilisateur </w:t>
       </w:r>
       <w:r>
-        <w:t>de choisir un nombre dans la plage de valeur correcte. On va attendre 1.5 secondes (pour laisser l’utilisateur le temp de lire le message) avant d’appeler « UserInputHandler » une fois de plus.</w:t>
+        <w:t>de choisir un nombre dans la plage de valeur correcte. On va attendre 1.5 secondes (pour laisser l’utilisateur le temp de lire le message) avant d’appeler « </w:t>
+      </w:r>
+      <w:proofErr w:type="spellStart"/>
+      <w:r>
+        <w:t>UserInputHandler</w:t>
+      </w:r>
+      <w:proofErr w:type="spellEnd"/>
+      <w:r>
+        <w:t> » une fois de plus.</w:t>
       </w:r>
     </w:p>
     <w:p>
@@ -3674,7 +3788,15 @@
         <w:t xml:space="preserve">Si tout est bon, l’option choisi par l’utilisateur va être </w:t>
       </w:r>
       <w:r>
-        <w:t>exécuté grâce a une méthode qui contient un simple « switch case » pour appeler la méthode correspondante à l’option.</w:t>
+        <w:t xml:space="preserve">exécuté grâce </w:t>
+      </w:r>
+      <w:proofErr w:type="spellStart"/>
+      <w:r>
+        <w:t>a</w:t>
+      </w:r>
+      <w:proofErr w:type="spellEnd"/>
+      <w:r>
+        <w:t xml:space="preserve"> une méthode qui contient un simple « switch case » pour appeler la méthode correspondante à l’option.</w:t>
       </w:r>
     </w:p>
     <w:p>
@@ -3690,22 +3812,21 @@
         <w:lastRenderedPageBreak/>
         <w:tab/>
       </w:r>
-      <w:bookmarkStart w:id="8" w:name="_Toc242094230"/>
+      <w:bookmarkStart w:id="8" w:name="_Toc244241617"/>
+      <w:proofErr w:type="spellStart"/>
       <w:r>
         <w:t>EnterVehicle</w:t>
       </w:r>
       <w:bookmarkEnd w:id="8"/>
+      <w:proofErr w:type="spellEnd"/>
     </w:p>
     <w:p>
       <w:pPr>
         <w:jc w:val="center"/>
       </w:pPr>
       <w:r>
-        <w:rPr>
-          <w:noProof/>
-        </w:rPr>
         <w:drawing>
-          <wp:inline distT="0" distB="0" distL="0" distR="0" wp14:anchorId="21CFB329" wp14:editId="38C1C54F">
+          <wp:inline distT="0" distB="0" distL="0" distR="0" wp14:anchorId="21CFB329" wp14:editId="7E104B99">
             <wp:extent cx="5755640" cy="1550035"/>
             <wp:effectExtent l="0" t="0" r="0" b="0"/>
             <wp:docPr id="273820517" name="Image 3"/>
@@ -3768,7 +3889,15 @@
         <w:t xml:space="preserve"> est accepté</w:t>
       </w:r>
       <w:r>
-        <w:t xml:space="preserve"> pour que ça soit plus lisible) puis demander d’entrer une plaque. Si la saisie n’est pas vide, on va créer une voiture (la logique pour vérifier si la plaque est bonne ce déroule dans la classe « voiture ». Qui va informer au l’utilisateur si la voiture a bien été ajouté ou non). Faire des retours à la lignes avec « ReturnMultipleLines » (pour plus de lisibilité) puis réafficher le menu.</w:t>
+        <w:t xml:space="preserve"> pour que ça soit plus lisible) puis demander d’entrer une plaque. Si la saisie n’est pas vide, on va créer une voiture (la logique pour vérifier si la plaque est bonne ce déroule dans la classe « voiture ». Qui va informer au l’utilisateur si la voiture a bien été ajouté ou non). Faire des retours à la lignes avec « </w:t>
+      </w:r>
+      <w:proofErr w:type="spellStart"/>
+      <w:r>
+        <w:t>ReturnMultipleLines</w:t>
+      </w:r>
+      <w:proofErr w:type="spellEnd"/>
+      <w:r>
+        <w:t> » (pour plus de lisibilité) puis réafficher le menu.</w:t>
       </w:r>
     </w:p>
     <w:p>
@@ -3784,20 +3913,19 @@
         <w:lastRenderedPageBreak/>
         <w:tab/>
       </w:r>
-      <w:bookmarkStart w:id="9" w:name="_Toc242094231"/>
+      <w:bookmarkStart w:id="9" w:name="_Toc244241618"/>
+      <w:proofErr w:type="spellStart"/>
       <w:r>
         <w:t>SearchVehicle</w:t>
       </w:r>
       <w:bookmarkEnd w:id="9"/>
+      <w:proofErr w:type="spellEnd"/>
     </w:p>
     <w:p>
       <w:pPr>
         <w:jc w:val="center"/>
       </w:pPr>
       <w:r>
-        <w:rPr>
-          <w:noProof/>
-        </w:rPr>
         <w:drawing>
           <wp:inline distT="0" distB="0" distL="0" distR="0" wp14:anchorId="632E671E" wp14:editId="39480FC1">
             <wp:extent cx="5750560" cy="2782570"/>
@@ -3866,21 +3994,20 @@
         <w:pStyle w:val="Titre3"/>
         <w:ind w:firstLine="708"/>
       </w:pPr>
-      <w:bookmarkStart w:id="10" w:name="_Toc242094232"/>
+      <w:bookmarkStart w:id="10" w:name="_Toc244241619"/>
+      <w:proofErr w:type="spellStart"/>
       <w:r>
         <w:lastRenderedPageBreak/>
         <w:t>CallFindVehicle</w:t>
       </w:r>
       <w:bookmarkEnd w:id="10"/>
+      <w:proofErr w:type="spellEnd"/>
     </w:p>
     <w:p>
       <w:pPr>
         <w:jc w:val="center"/>
       </w:pPr>
       <w:r>
-        <w:rPr>
-          <w:noProof/>
-        </w:rPr>
         <w:drawing>
           <wp:inline distT="0" distB="0" distL="0" distR="0" wp14:anchorId="2FC200CC" wp14:editId="3FA56DD7">
             <wp:extent cx="5753735" cy="3286125"/>
@@ -3933,12 +4060,44 @@
     </w:p>
     <w:p>
       <w:r>
-        <w:t>Cette méthode va d’abord vérifier si on veut retirer un véhicule. Si c’est le cas on va demander à l’utilisateur s’il est sûr de ça décision (en appelant « UserIsSure). S’il choisit non, on lui informe que l’action a été annulé. S’il choisit oui, alors on va chercher une correspondance pour supprimer le véhicule entrer (la méthode « FindVehicule »).</w:t>
-      </w:r>
-    </w:p>
-    <w:p>
-      <w:r>
-        <w:t>Cependant, si l’utilisateur voulait simplement afficher des informations d’un véhicule, on va donc rien faire de spécial puis appelé « FindVehicule ».</w:t>
+        <w:t xml:space="preserve">Cette méthode va d’abord vérifier si on veut retirer un véhicule. Si c’est le cas on va demander à l’utilisateur s’il est sûr de </w:t>
+      </w:r>
+      <w:proofErr w:type="spellStart"/>
+      <w:r>
+        <w:t>ça</w:t>
+      </w:r>
+      <w:proofErr w:type="spellEnd"/>
+      <w:r>
+        <w:t xml:space="preserve"> décision (en appelant « </w:t>
+      </w:r>
+      <w:proofErr w:type="spellStart"/>
+      <w:r>
+        <w:t>UserIsSure</w:t>
+      </w:r>
+      <w:proofErr w:type="spellEnd"/>
+      <w:r>
+        <w:t>). S’il choisit non, on lui informe que l’action a été annulé. S’il choisit oui, alors on va chercher une correspondance pour supprimer le véhicule entrer (la méthode « </w:t>
+      </w:r>
+      <w:proofErr w:type="spellStart"/>
+      <w:r>
+        <w:t>FindVehicule</w:t>
+      </w:r>
+      <w:proofErr w:type="spellEnd"/>
+      <w:r>
+        <w:t> »).</w:t>
+      </w:r>
+    </w:p>
+    <w:p>
+      <w:r>
+        <w:t>Cependant, si l’utilisateur voulait simplement afficher des informations d’un véhicule, on va donc rien faire de spécial puis appelé « </w:t>
+      </w:r>
+      <w:proofErr w:type="spellStart"/>
+      <w:r>
+        <w:t>FindVehicule</w:t>
+      </w:r>
+      <w:proofErr w:type="spellEnd"/>
+      <w:r>
+        <w:t> ».</w:t>
       </w:r>
     </w:p>
     <w:p>
@@ -3950,12 +4109,14 @@
       <w:pPr>
         <w:pStyle w:val="Titre2"/>
       </w:pPr>
-      <w:bookmarkStart w:id="11" w:name="_Toc242094233"/>
+      <w:bookmarkStart w:id="11" w:name="_Toc244241620"/>
+      <w:proofErr w:type="spellStart"/>
       <w:r>
         <w:lastRenderedPageBreak/>
         <w:t>Parking.cs</w:t>
       </w:r>
       <w:bookmarkEnd w:id="11"/>
+      <w:proofErr w:type="spellEnd"/>
     </w:p>
     <w:p>
       <w:pPr>
@@ -3964,7 +4125,7 @@
       <w:r>
         <w:tab/>
       </w:r>
-      <w:bookmarkStart w:id="12" w:name="_Toc242094234"/>
+      <w:bookmarkStart w:id="12" w:name="_Toc244241621"/>
       <w:r>
         <w:t>Display</w:t>
       </w:r>
@@ -3975,9 +4136,6 @@
         <w:jc w:val="center"/>
       </w:pPr>
       <w:r>
-        <w:rPr>
-          <w:noProof/>
-        </w:rPr>
         <w:drawing>
           <wp:inline distT="0" distB="0" distL="0" distR="0" wp14:anchorId="16233297" wp14:editId="3B786F8A">
             <wp:extent cx="4617085" cy="3562350"/>
@@ -4033,10 +4191,26 @@
         <w:t>Cette méthode permet d’afficher le parking avec ses statistiques.</w:t>
       </w:r>
       <w:r>
-        <w:t xml:space="preserve"> Elle appelle cependant « ParkingSpot » qui va être celui qui va écrire chaque place de parking individuellement avec un certain style</w:t>
-      </w:r>
-      <w:r>
-        <w:t xml:space="preserve"> (ex : « |02:L||0</w:t>
+        <w:t xml:space="preserve"> Elle appelle cependant « </w:t>
+      </w:r>
+      <w:proofErr w:type="spellStart"/>
+      <w:r>
+        <w:t>ParkingSpot</w:t>
+      </w:r>
+      <w:proofErr w:type="spellEnd"/>
+      <w:r>
+        <w:t> » qui va être celui qui va écrire chaque place de parking individuellement avec un certain style</w:t>
+      </w:r>
+      <w:r>
+        <w:t xml:space="preserve"> (ex : « |</w:t>
+      </w:r>
+      <w:proofErr w:type="gramStart"/>
+      <w:r>
+        <w:t>02:L</w:t>
+      </w:r>
+      <w:proofErr w:type="gramEnd"/>
+      <w:r>
+        <w:t>||0</w:t>
       </w:r>
       <w:r>
         <w:t>3</w:t>
@@ -4067,20 +4241,19 @@
         <w:lastRenderedPageBreak/>
         <w:tab/>
       </w:r>
-      <w:bookmarkStart w:id="13" w:name="_Toc242094235"/>
+      <w:bookmarkStart w:id="13" w:name="_Toc244241622"/>
+      <w:proofErr w:type="spellStart"/>
       <w:r>
         <w:t>CheckParkingSpot</w:t>
       </w:r>
       <w:bookmarkEnd w:id="13"/>
+      <w:proofErr w:type="spellEnd"/>
     </w:p>
     <w:p>
       <w:pPr>
         <w:jc w:val="center"/>
       </w:pPr>
       <w:r>
-        <w:rPr>
-          <w:noProof/>
-        </w:rPr>
         <w:drawing>
           <wp:inline distT="0" distB="0" distL="0" distR="0" wp14:anchorId="08B897AA" wp14:editId="11F6C6DE">
             <wp:extent cx="5758180" cy="4576445"/>
@@ -4133,7 +4306,15 @@
     </w:p>
     <w:p>
       <w:r>
-        <w:t>Cette méthode (appeler par « ParkingSpot ») va s’occuper de gérer l’affichage du symbole en fonction de la valeur de la place de parking. Augmenté le nombre de place libre, le nombre de place occupé, etc…</w:t>
+        <w:t>Cette méthode (appeler par « </w:t>
+      </w:r>
+      <w:proofErr w:type="spellStart"/>
+      <w:r>
+        <w:t>ParkingSpot</w:t>
+      </w:r>
+      <w:proofErr w:type="spellEnd"/>
+      <w:r>
+        <w:t> ») va s’occuper de gérer l’affichage du symbole en fonction de la valeur de la place de parking. Augmenté le nombre de place libre, le nombre de place occupé, etc…</w:t>
       </w:r>
     </w:p>
     <w:p>
@@ -4149,20 +4330,19 @@
         <w:lastRenderedPageBreak/>
         <w:tab/>
       </w:r>
-      <w:bookmarkStart w:id="14" w:name="_Toc242094236"/>
+      <w:bookmarkStart w:id="14" w:name="_Toc244241623"/>
+      <w:proofErr w:type="spellStart"/>
       <w:r>
         <w:t>AddVehicle</w:t>
       </w:r>
       <w:bookmarkEnd w:id="14"/>
+      <w:proofErr w:type="spellEnd"/>
     </w:p>
     <w:p>
       <w:pPr>
         <w:jc w:val="center"/>
       </w:pPr>
       <w:r>
-        <w:rPr>
-          <w:noProof/>
-        </w:rPr>
         <w:drawing>
           <wp:inline distT="0" distB="0" distL="0" distR="0" wp14:anchorId="610F059E" wp14:editId="1247F74B">
             <wp:extent cx="5758180" cy="3213735"/>
@@ -4224,7 +4404,15 @@
         <w:t>un ticket pour la voiture</w:t>
       </w:r>
       <w:r>
-        <w:t xml:space="preserve">. Puis on ajoute la voiture dans la liste des voitures qui sont parké. </w:t>
+        <w:t xml:space="preserve">. Puis on ajoute la voiture dans la liste des voitures qui sont </w:t>
+      </w:r>
+      <w:proofErr w:type="spellStart"/>
+      <w:r>
+        <w:t>parké</w:t>
+      </w:r>
+      <w:proofErr w:type="spellEnd"/>
+      <w:r>
+        <w:t xml:space="preserve">. </w:t>
       </w:r>
     </w:p>
     <w:p>
@@ -4240,22 +4428,21 @@
         <w:lastRenderedPageBreak/>
         <w:tab/>
       </w:r>
-      <w:bookmarkStart w:id="15" w:name="_Toc242094237"/>
+      <w:bookmarkStart w:id="15" w:name="_Toc244241624"/>
+      <w:proofErr w:type="spellStart"/>
       <w:r>
         <w:t>FindVehicule</w:t>
       </w:r>
       <w:bookmarkEnd w:id="15"/>
+      <w:proofErr w:type="spellEnd"/>
     </w:p>
     <w:p>
       <w:pPr>
         <w:jc w:val="center"/>
       </w:pPr>
       <w:r>
-        <w:rPr>
-          <w:noProof/>
-        </w:rPr>
         <w:drawing>
-          <wp:inline distT="0" distB="0" distL="0" distR="0" wp14:anchorId="4E0C9F37" wp14:editId="41641D38">
+          <wp:inline distT="0" distB="0" distL="0" distR="0" wp14:anchorId="4E0C9F37" wp14:editId="5D46BEBD">
             <wp:extent cx="5753735" cy="2458085"/>
             <wp:effectExtent l="0" t="0" r="0" b="0"/>
             <wp:docPr id="460749035" name="Image 11"/>
@@ -4306,7 +4493,23 @@
     </w:p>
     <w:p>
       <w:r>
-        <w:t>Ici on va rechercher un véhicule via sa plaque d’immatriculation ou son numéro de place. La méthode « FindVehicleCondition » va simplement vérifier s’il trouve une correspondance ou non. Si aucune correspondance est trouvé, on l’informe à l’utilisateur.</w:t>
+        <w:t>Ici on va rechercher un véhicule via sa plaque d’immatriculation ou son numéro de place. La méthode « </w:t>
+      </w:r>
+      <w:proofErr w:type="spellStart"/>
+      <w:r>
+        <w:t>FindVehicleCondition</w:t>
+      </w:r>
+      <w:proofErr w:type="spellEnd"/>
+      <w:r>
+        <w:t xml:space="preserve"> » va simplement vérifier s’il trouve une correspondance ou non. Si aucune correspondance est </w:t>
+      </w:r>
+      <w:proofErr w:type="gramStart"/>
+      <w:r>
+        <w:t>trouvé</w:t>
+      </w:r>
+      <w:proofErr w:type="gramEnd"/>
+      <w:r>
+        <w:t>, on l’informe à l’utilisateur.</w:t>
       </w:r>
     </w:p>
     <w:p>
@@ -4322,20 +4525,19 @@
         <w:lastRenderedPageBreak/>
         <w:tab/>
       </w:r>
-      <w:bookmarkStart w:id="16" w:name="_Toc242094238"/>
+      <w:bookmarkStart w:id="16" w:name="_Toc244241625"/>
+      <w:proofErr w:type="spellStart"/>
       <w:r>
         <w:t>FindVehicleReturn</w:t>
       </w:r>
       <w:bookmarkEnd w:id="16"/>
+      <w:proofErr w:type="spellEnd"/>
     </w:p>
     <w:p>
       <w:pPr>
         <w:jc w:val="center"/>
       </w:pPr>
       <w:r>
-        <w:rPr>
-          <w:noProof/>
-        </w:rPr>
         <w:drawing>
           <wp:inline distT="0" distB="0" distL="0" distR="0" wp14:anchorId="6188A1EA" wp14:editId="56FB11BB">
             <wp:extent cx="5758180" cy="2503170"/>
@@ -4388,7 +4590,15 @@
     </w:p>
     <w:p>
       <w:r>
-        <w:t>Appeler par la méthode « FindVehicleCondition » (si une correspondance a été trouvé) elle permet d’effectuer une action. Soit afficher les informations du véhicule, soit le faire sortir du parking.</w:t>
+        <w:t>Appeler par la méthode « </w:t>
+      </w:r>
+      <w:proofErr w:type="spellStart"/>
+      <w:r>
+        <w:t>FindVehicleCondition</w:t>
+      </w:r>
+      <w:proofErr w:type="spellEnd"/>
+      <w:r>
+        <w:t> » (si une correspondance a été trouvé) elle permet d’effectuer une action. Soit afficher les informations du véhicule, soit le faire sortir du parking.</w:t>
       </w:r>
     </w:p>
     <w:p>
@@ -4404,19 +4614,18 @@
         <w:lastRenderedPageBreak/>
         <w:tab/>
       </w:r>
-      <w:bookmarkStart w:id="17" w:name="_Toc242094239"/>
+      <w:bookmarkStart w:id="17" w:name="_Toc244241626"/>
+      <w:proofErr w:type="spellStart"/>
       <w:r>
         <w:t>StatParking</w:t>
       </w:r>
       <w:bookmarkEnd w:id="17"/>
-    </w:p>
-    <w:p>
-      <w:r>
-        <w:rPr>
-          <w:noProof/>
-        </w:rPr>
+      <w:proofErr w:type="spellEnd"/>
+    </w:p>
+    <w:p>
+      <w:r>
         <w:drawing>
-          <wp:inline distT="0" distB="0" distL="0" distR="0" wp14:anchorId="28B65BB5" wp14:editId="3BB2473F">
+          <wp:inline distT="0" distB="0" distL="0" distR="0" wp14:anchorId="28B65BB5" wp14:editId="18E67C99">
             <wp:extent cx="5753735" cy="1552575"/>
             <wp:effectExtent l="0" t="0" r="0" b="9525"/>
             <wp:docPr id="925377937" name="Image 13"/>
@@ -4479,12 +4688,14 @@
       <w:pPr>
         <w:pStyle w:val="Titre1"/>
       </w:pPr>
-      <w:bookmarkStart w:id="18" w:name="_Toc242094240"/>
+      <w:bookmarkStart w:id="18" w:name="_Toc244241627"/>
+      <w:proofErr w:type="spellStart"/>
       <w:r>
         <w:lastRenderedPageBreak/>
         <w:t>Voiture.cs</w:t>
       </w:r>
       <w:bookmarkEnd w:id="18"/>
+      <w:proofErr w:type="spellEnd"/>
     </w:p>
     <w:p>
       <w:pPr>
@@ -4493,20 +4704,19 @@
       <w:r>
         <w:tab/>
       </w:r>
-      <w:bookmarkStart w:id="19" w:name="_Toc242094241"/>
+      <w:bookmarkStart w:id="19" w:name="_Toc244241628"/>
+      <w:proofErr w:type="spellStart"/>
       <w:r>
         <w:t>LicensingPlate</w:t>
       </w:r>
       <w:bookmarkEnd w:id="19"/>
+      <w:proofErr w:type="spellEnd"/>
     </w:p>
     <w:p>
       <w:pPr>
         <w:jc w:val="center"/>
       </w:pPr>
       <w:r>
-        <w:rPr>
-          <w:noProof/>
-        </w:rPr>
         <w:drawing>
           <wp:inline distT="0" distB="0" distL="0" distR="0" wp14:anchorId="4B3DB82A" wp14:editId="4311A714">
             <wp:extent cx="5758180" cy="3209290"/>
@@ -4567,7 +4777,7 @@
         <w:pStyle w:val="Titre3"/>
         <w:ind w:firstLine="708"/>
       </w:pPr>
-      <w:bookmarkStart w:id="20" w:name="_Toc242094242"/>
+      <w:bookmarkStart w:id="20" w:name="_Toc244241629"/>
       <w:r>
         <w:t>Constructeur</w:t>
       </w:r>
@@ -4578,9 +4788,6 @@
         <w:jc w:val="center"/>
       </w:pPr>
       <w:r>
-        <w:rPr>
-          <w:noProof/>
-        </w:rPr>
         <w:drawing>
           <wp:inline distT="0" distB="0" distL="0" distR="0" wp14:anchorId="0B38F71C" wp14:editId="2DF6B014">
             <wp:extent cx="2743200" cy="1493520"/>
@@ -4633,7 +4840,15 @@
     </w:p>
     <w:p>
       <w:r>
-        <w:t>Le constructeur. Si le véhicule est valid, on l’ajoute automatiquement au parking, sinon, on ne fait rien.</w:t>
+        <w:t xml:space="preserve">Le constructeur. Si le véhicule est </w:t>
+      </w:r>
+      <w:proofErr w:type="spellStart"/>
+      <w:r>
+        <w:t>valid</w:t>
+      </w:r>
+      <w:proofErr w:type="spellEnd"/>
+      <w:r>
+        <w:t>, on l’ajoute automatiquement au parking, sinon, on ne fait rien.</w:t>
       </w:r>
     </w:p>
     <w:p>
@@ -4645,12 +4860,14 @@
       <w:pPr>
         <w:pStyle w:val="Titre1"/>
       </w:pPr>
-      <w:bookmarkStart w:id="21" w:name="_Toc242094243"/>
+      <w:bookmarkStart w:id="21" w:name="_Toc244241630"/>
+      <w:proofErr w:type="spellStart"/>
       <w:r>
         <w:lastRenderedPageBreak/>
         <w:t>Ticket.cs</w:t>
       </w:r>
       <w:bookmarkEnd w:id="21"/>
+      <w:proofErr w:type="spellEnd"/>
     </w:p>
     <w:p>
       <w:pPr>
@@ -4659,7 +4876,7 @@
       <w:r>
         <w:tab/>
       </w:r>
-      <w:bookmarkStart w:id="22" w:name="_Toc242094244"/>
+      <w:bookmarkStart w:id="22" w:name="_Toc244241631"/>
       <w:r>
         <w:t>Constructeur</w:t>
       </w:r>
@@ -4670,9 +4887,6 @@
         <w:jc w:val="center"/>
       </w:pPr>
       <w:r>
-        <w:rPr>
-          <w:noProof/>
-        </w:rPr>
         <w:drawing>
           <wp:inline distT="0" distB="0" distL="0" distR="0" wp14:anchorId="4A62093C" wp14:editId="17074266">
             <wp:extent cx="3300095" cy="1294765"/>
@@ -4725,7 +4939,15 @@
     </w:p>
     <w:p>
       <w:r>
-        <w:t>On va mettre l’heure d’entrée à l’heure actuel. Lui donné son numéro de place, son tarif horaire, puis lui mettre qu’il est parké (son véhicule parent).</w:t>
+        <w:t xml:space="preserve">On va mettre l’heure d’entrée à l’heure actuel. Lui donné son numéro de place, son tarif horaire, puis lui mettre qu’il est </w:t>
+      </w:r>
+      <w:proofErr w:type="spellStart"/>
+      <w:r>
+        <w:t>parké</w:t>
+      </w:r>
+      <w:proofErr w:type="spellEnd"/>
+      <w:r>
+        <w:t xml:space="preserve"> (son véhicule parent).</w:t>
       </w:r>
     </w:p>
     <w:p>
@@ -4735,7 +4957,7 @@
       <w:r>
         <w:tab/>
       </w:r>
-      <w:bookmarkStart w:id="23" w:name="_Toc242094245"/>
+      <w:bookmarkStart w:id="23" w:name="_Toc244241632"/>
       <w:r>
         <w:t>Calc</w:t>
       </w:r>
@@ -4746,9 +4968,6 @@
         <w:jc w:val="center"/>
       </w:pPr>
       <w:r>
-        <w:rPr>
-          <w:noProof/>
-        </w:rPr>
         <w:drawing>
           <wp:inline distT="0" distB="0" distL="0" distR="0" wp14:anchorId="57139524" wp14:editId="64ACC77C">
             <wp:extent cx="5224145" cy="1792605"/>
@@ -4809,11 +5028,13 @@
         <w:pStyle w:val="Titre3"/>
         <w:ind w:firstLine="708"/>
       </w:pPr>
-      <w:bookmarkStart w:id="24" w:name="_Toc242094246"/>
+      <w:bookmarkStart w:id="24" w:name="_Toc244241633"/>
+      <w:proofErr w:type="spellStart"/>
       <w:r>
         <w:t>GetCurrentParkedTime</w:t>
       </w:r>
       <w:bookmarkEnd w:id="24"/>
+      <w:proofErr w:type="spellEnd"/>
     </w:p>
     <w:p>
       <w:r>
@@ -4832,7 +5053,7 @@
           <w:color w:val="auto"/>
         </w:rPr>
       </w:pPr>
-      <w:bookmarkStart w:id="25" w:name="_Toc242094247"/>
+      <w:bookmarkStart w:id="25" w:name="_Toc244241634"/>
       <w:r>
         <w:rPr>
           <w:color w:val="auto"/>
@@ -4846,7 +5067,8 @@
       <w:pPr>
         <w:pStyle w:val="Titre2"/>
       </w:pPr>
-      <w:bookmarkStart w:id="26" w:name="_Toc242094248"/>
+      <w:bookmarkStart w:id="26" w:name="_Toc244241635"/>
+      <w:proofErr w:type="spellStart"/>
       <w:r>
         <w:t>CheckParkingSpot_IsFree_Result_</w:t>
       </w:r>
@@ -4854,6 +5076,7 @@
         <w:t>L</w:t>
       </w:r>
       <w:bookmarkEnd w:id="26"/>
+      <w:proofErr w:type="spellEnd"/>
     </w:p>
     <w:p>
       <w:r>
@@ -4863,7 +5086,15 @@
         <w:t>0</w:t>
       </w:r>
       <w:r>
-        <w:t>. Puis dans « CheckParkingSpot »</w:t>
+        <w:t>. Puis dans « </w:t>
+      </w:r>
+      <w:proofErr w:type="spellStart"/>
+      <w:r>
+        <w:t>CheckParkingSpot</w:t>
+      </w:r>
+      <w:proofErr w:type="spellEnd"/>
+      <w:r>
+        <w:t> »</w:t>
       </w:r>
     </w:p>
     <w:p>
@@ -4875,40 +5106,18 @@
       </w:r>
     </w:p>
     <w:p>
-      <w:pPr>
-        <w:rPr>
-          <w:lang w:val="de-CH"/>
-        </w:rPr>
-      </w:pPr>
-      <w:r>
-        <w:rPr>
-          <w:lang w:val="de-CH"/>
-        </w:rPr>
+      <w:r>
         <w:t>1= « X »</w:t>
       </w:r>
       <w:r>
-        <w:rPr>
-          <w:lang w:val="de-CH"/>
-        </w:rPr>
         <w:t xml:space="preserve"> (occupé)</w:t>
       </w:r>
     </w:p>
     <w:p>
-      <w:pPr>
-        <w:rPr>
-          <w:lang w:val="de-CH"/>
-        </w:rPr>
-      </w:pPr>
-      <w:r>
-        <w:rPr>
-          <w:lang w:val="de-CH"/>
-        </w:rPr>
+      <w:r>
         <w:t>Default = « E »</w:t>
       </w:r>
       <w:r>
-        <w:rPr>
-          <w:lang w:val="de-CH"/>
-        </w:rPr>
         <w:t xml:space="preserve"> (erreur)</w:t>
       </w:r>
     </w:p>
@@ -4917,9 +5126,6 @@
         <w:jc w:val="center"/>
       </w:pPr>
       <w:r>
-        <w:rPr>
-          <w:noProof/>
-        </w:rPr>
         <w:drawing>
           <wp:inline distT="0" distB="0" distL="0" distR="0" wp14:anchorId="0F6811CC" wp14:editId="153EA5D5">
             <wp:extent cx="4579739" cy="1386205"/>
@@ -4967,7 +5173,7 @@
       <w:pPr>
         <w:pStyle w:val="Titre2"/>
       </w:pPr>
-      <w:bookmarkStart w:id="27" w:name="_Toc242094249"/>
+      <w:bookmarkStart w:id="27" w:name="_Toc244241636"/>
       <w:r>
         <w:t>GetTotalPaidPrice_Is0_Result_0</w:t>
       </w:r>
@@ -5027,6 +5233,71 @@
       </w:r>
     </w:p>
     <w:p>
+      <w:pPr>
+        <w:pStyle w:val="Titre2"/>
+      </w:pPr>
+      <w:bookmarkStart w:id="28" w:name="_Toc244241637"/>
+      <w:proofErr w:type="spellStart"/>
+      <w:r>
+        <w:t>StatParking_IsDaily_Result_Daily</w:t>
+      </w:r>
+      <w:bookmarkEnd w:id="28"/>
+      <w:proofErr w:type="spellEnd"/>
+    </w:p>
+    <w:p>
+      <w:r>
+        <w:t>Les statistiques afficher étaient les statistiques du jour (le résultat attendu). L’autre possibilité de statistiques à être afficher et l’historique de transaction.</w:t>
+      </w:r>
+    </w:p>
+    <w:p>
+      <w:pPr>
+        <w:jc w:val="center"/>
+      </w:pPr>
+      <w:r>
+        <w:drawing>
+          <wp:inline distT="0" distB="0" distL="0" distR="0" wp14:anchorId="1341423A" wp14:editId="539B5040">
+            <wp:extent cx="4497300" cy="1385101"/>
+            <wp:effectExtent l="0" t="0" r="0" b="5715"/>
+            <wp:docPr id="1473758694" name="Image 1"/>
+            <wp:cNvGraphicFramePr>
+              <a:graphicFrameLocks xmlns:a="http://schemas.openxmlformats.org/drawingml/2006/main" noChangeAspect="1"/>
+            </wp:cNvGraphicFramePr>
+            <a:graphic xmlns:a="http://schemas.openxmlformats.org/drawingml/2006/main">
+              <a:graphicData uri="http://schemas.openxmlformats.org/drawingml/2006/picture">
+                <pic:pic xmlns:pic="http://schemas.openxmlformats.org/drawingml/2006/picture">
+                  <pic:nvPicPr>
+                    <pic:cNvPr id="1473758694" name="Image 1"/>
+                    <pic:cNvPicPr/>
+                  </pic:nvPicPr>
+                  <pic:blipFill>
+                    <a:blip r:embed="rId27">
+                      <a:extLst>
+                        <a:ext uri="{28A0092B-C50C-407E-A947-70E740481C1C}">
+                          <a14:useLocalDpi xmlns:a14="http://schemas.microsoft.com/office/drawing/2010/main" val="0"/>
+                        </a:ext>
+                      </a:extLst>
+                    </a:blip>
+                    <a:stretch>
+                      <a:fillRect/>
+                    </a:stretch>
+                  </pic:blipFill>
+                  <pic:spPr>
+                    <a:xfrm>
+                      <a:off x="0" y="0"/>
+                      <a:ext cx="4497300" cy="1385101"/>
+                    </a:xfrm>
+                    <a:prstGeom prst="rect">
+                      <a:avLst/>
+                    </a:prstGeom>
+                  </pic:spPr>
+                </pic:pic>
+              </a:graphicData>
+            </a:graphic>
+          </wp:inline>
+        </w:drawing>
+      </w:r>
+    </w:p>
+    <w:p>
       <w:r>
         <w:br w:type="page"/>
       </w:r>
@@ -5038,7 +5309,7 @@
           <w:color w:val="auto"/>
         </w:rPr>
       </w:pPr>
-      <w:bookmarkStart w:id="28" w:name="_Toc242094250"/>
+      <w:bookmarkStart w:id="29" w:name="_Toc244241638"/>
       <w:r>
         <w:rPr>
           <w:color w:val="auto"/>
@@ -5046,7 +5317,7 @@
         <w:lastRenderedPageBreak/>
         <w:t>Conclusion</w:t>
       </w:r>
-      <w:bookmarkEnd w:id="28"/>
+      <w:bookmarkEnd w:id="29"/>
     </w:p>
     <w:p>
       <w:pPr>
@@ -5056,14 +5327,14 @@
           <w:color w:val="auto"/>
         </w:rPr>
       </w:pPr>
-      <w:bookmarkStart w:id="29" w:name="_Toc242094251"/>
+      <w:bookmarkStart w:id="30" w:name="_Toc244241639"/>
       <w:r>
         <w:rPr>
           <w:color w:val="auto"/>
         </w:rPr>
         <w:t>Bilan personnel</w:t>
       </w:r>
-      <w:bookmarkEnd w:id="29"/>
+      <w:bookmarkEnd w:id="30"/>
     </w:p>
     <w:p>
       <w:r>
@@ -5075,7 +5346,13 @@
     </w:p>
     <w:p>
       <w:r>
-        <w:t>À par ça je suis satisfait, j’ai évité le plus possible la redondance dans mon code, j’ai bien commenté, bien nommé mes variables, etc…</w:t>
+        <w:t xml:space="preserve">À </w:t>
+      </w:r>
+      <w:r>
+        <w:t>part</w:t>
+      </w:r>
+      <w:r>
+        <w:t xml:space="preserve"> ça je suis satisfait, j’ai évité le plus possible la redondance dans mon code, j’ai bien commenté, bien nommé mes variables, etc…</w:t>
       </w:r>
     </w:p>
     <w:p>
@@ -5086,18 +5363,99 @@
           <w:color w:val="auto"/>
         </w:rPr>
       </w:pPr>
-      <w:bookmarkStart w:id="30" w:name="_Toc242094252"/>
+      <w:bookmarkStart w:id="31" w:name="_Toc244241640"/>
+      <w:proofErr w:type="spellStart"/>
       <w:r>
         <w:rPr>
           <w:color w:val="auto"/>
         </w:rPr>
-        <w:t>Utilisiation de l’IA</w:t>
-      </w:r>
-      <w:bookmarkEnd w:id="30"/>
-    </w:p>
-    <w:p>
-      <w:r>
-        <w:t>J’ai utilisé l’IA pour m’aider à rédiger mon rapport (faut rajouter les 2 prompts).</w:t>
+        <w:t>Utilisiation</w:t>
+      </w:r>
+      <w:proofErr w:type="spellEnd"/>
+      <w:r>
+        <w:rPr>
+          <w:color w:val="auto"/>
+        </w:rPr>
+        <w:t xml:space="preserve"> de l’IA</w:t>
+      </w:r>
+      <w:bookmarkEnd w:id="31"/>
+    </w:p>
+    <w:p>
+      <w:r>
+        <w:t>J’ai utilisé l’IA pour m’aider à rédiger mon rapport</w:t>
+      </w:r>
+      <w:r>
+        <w:t xml:space="preserve"> (4 octobre 2026)</w:t>
+      </w:r>
+      <w:r>
+        <w:t>.</w:t>
+      </w:r>
+    </w:p>
+    <w:p>
+      <w:r>
+        <w:t xml:space="preserve">Le premier prompt </w:t>
+      </w:r>
+      <w:r>
+        <w:t>(</w:t>
+      </w:r>
+      <w:proofErr w:type="spellStart"/>
+      <w:r>
+        <w:t>ChatGPT</w:t>
+      </w:r>
+      <w:proofErr w:type="spellEnd"/>
+      <w:r>
+        <w:t xml:space="preserve">) utilisé était </w:t>
+      </w:r>
+      <w:r>
+        <w:t xml:space="preserve">celui-ci : </w:t>
+      </w:r>
+      <w:r>
+        <w:t>"</w:t>
+      </w:r>
+      <w:r>
+        <w:t xml:space="preserve">Je dois faire une documentation sur </w:t>
+      </w:r>
+      <w:proofErr w:type="spellStart"/>
+      <w:r>
+        <w:t>word</w:t>
+      </w:r>
+      <w:proofErr w:type="spellEnd"/>
+      <w:r>
+        <w:t xml:space="preserve"> pour un projet en C# console (qui utilise des classe). Puis je voulais savoir comment je suis censé rédiger cette documentation sous le chapitre « réalisation » ?</w:t>
+      </w:r>
+      <w:r>
+        <w:t>"</w:t>
+      </w:r>
+    </w:p>
+    <w:p>
+      <w:r>
+        <w:t xml:space="preserve">L’IA m’a répondu avec des exemples de comment je pourrais documenter, et comment ne pas le faire. Ducoup après avoir lus ça réponse je lui ait posé une autre question sous ce prompt : </w:t>
+      </w:r>
+      <w:r>
+        <w:t>"</w:t>
+      </w:r>
+      <w:r>
+        <w:t>Ducoup si j’ai par exemple 3 méthodes (qui son lier). Je peux très bien expliquer seulement 2 si la troisième méthode par exemple efface simplement ce que l’utilisateur a écrit ?</w:t>
+      </w:r>
+      <w:r>
+        <w:t>"</w:t>
+      </w:r>
+    </w:p>
+    <w:p>
+      <w:r>
+        <w:t xml:space="preserve">Elle m’a répondu que c’était une bonne façon de documenter un chapitre </w:t>
+      </w:r>
+      <w:r>
+        <w:t>"</w:t>
+      </w:r>
+      <w:r>
+        <w:t>réalisation</w:t>
+      </w:r>
+      <w:r>
+        <w:t>"</w:t>
+      </w:r>
+      <w:r>
+        <w:t>. Le chat c’est terminer à cette dernière réponse.</w:t>
       </w:r>
     </w:p>
     <w:p>
@@ -5108,14 +5466,14 @@
           <w:color w:val="auto"/>
         </w:rPr>
       </w:pPr>
-      <w:bookmarkStart w:id="31" w:name="_Toc242094253"/>
+      <w:bookmarkStart w:id="32" w:name="_Toc244241641"/>
       <w:r>
         <w:rPr>
           <w:color w:val="auto"/>
         </w:rPr>
         <w:t>Bilan des fonctionnalités</w:t>
       </w:r>
-      <w:bookmarkEnd w:id="31"/>
+      <w:bookmarkEnd w:id="32"/>
     </w:p>
     <w:p>
       <w:r>
@@ -5347,7 +5705,7 @@
     </w:tbl>
     <w:p/>
     <w:sectPr>
-      <w:footerReference w:type="default" r:id="rId27"/>
+      <w:footerReference w:type="default" r:id="rId28"/>
       <w:pgSz w:w="11906" w:h="16838"/>
       <w:pgMar w:top="1417" w:right="1417" w:bottom="1417" w:left="1417" w:header="708" w:footer="708" w:gutter="0"/>
       <w:pgNumType w:start="0"/>
@@ -6180,7 +6538,7 @@
   <w:style w:type="paragraph" w:default="1" w:styleId="Normal">
     <w:name w:val="Normal"/>
     <w:qFormat/>
-    <w:rsid w:val="00AE51BA"/>
+    <w:rsid w:val="00D21422"/>
   </w:style>
   <w:style w:type="paragraph" w:styleId="Titre1">
     <w:name w:val="heading 1"/>
@@ -6981,6 +7339,7 @@
     <w:rsid w:val="00026023"/>
     <w:rsid w:val="000805B5"/>
     <w:rsid w:val="000B25E6"/>
+    <w:rsid w:val="000D519E"/>
     <w:rsid w:val="00211AEE"/>
     <w:rsid w:val="002907FD"/>
     <w:rsid w:val="002C61A5"/>
@@ -7001,6 +7360,7 @@
     <w:rsid w:val="00A4481E"/>
     <w:rsid w:val="00AC09D7"/>
     <w:rsid w:val="00B42BEF"/>
+    <w:rsid w:val="00BA4BC9"/>
     <w:rsid w:val="00BA66F6"/>
     <w:rsid w:val="00C15624"/>
     <w:rsid w:val="00CD419C"/>

</xml_diff>

<commit_message>
doc exportation: Ajout d'une image pour illustrer le projet. Vérifier si tout est présent dans mon document. Exporter mon fichier word en tant que fichier pdf.
</commit_message>
<xml_diff>
--- a/R-320-NicolasMarques-Rapport.docx
+++ b/R-320-NicolasMarques-Rapport.docx
@@ -29,9 +29,62 @@
           <w:pPr>
             <w:pStyle w:val="Sansinterligne"/>
             <w:spacing w:before="1540" w:after="240"/>
+            <w:jc w:val="center"/>
           </w:pPr>
+          <w:r>
+            <w:rPr>
+              <w:noProof/>
+            </w:rPr>
+            <w:drawing>
+              <wp:inline distT="0" distB="0" distL="0" distR="0" wp14:anchorId="12FA7AE2" wp14:editId="09D62E73">
+                <wp:extent cx="3335655" cy="3335655"/>
+                <wp:effectExtent l="0" t="0" r="0" b="0"/>
+                <wp:docPr id="1292110406" name="Image 2" descr="P_320 Parking"/>
+                <wp:cNvGraphicFramePr>
+                  <a:graphicFrameLocks xmlns:a="http://schemas.openxmlformats.org/drawingml/2006/main" noChangeAspect="1"/>
+                </wp:cNvGraphicFramePr>
+                <a:graphic xmlns:a="http://schemas.openxmlformats.org/drawingml/2006/main">
+                  <a:graphicData uri="http://schemas.openxmlformats.org/drawingml/2006/picture">
+                    <pic:pic xmlns:pic="http://schemas.openxmlformats.org/drawingml/2006/picture">
+                      <pic:nvPicPr>
+                        <pic:cNvPr id="0" name="Picture 12" descr="P_320 Parking"/>
+                        <pic:cNvPicPr>
+                          <a:picLocks noChangeAspect="1" noChangeArrowheads="1"/>
+                        </pic:cNvPicPr>
+                      </pic:nvPicPr>
+                      <pic:blipFill>
+                        <a:blip r:embed="rId8">
+                          <a:extLst>
+                            <a:ext uri="{28A0092B-C50C-407E-A947-70E740481C1C}">
+                              <a14:useLocalDpi xmlns:a14="http://schemas.microsoft.com/office/drawing/2010/main" val="0"/>
+                            </a:ext>
+                          </a:extLst>
+                        </a:blip>
+                        <a:srcRect/>
+                        <a:stretch>
+                          <a:fillRect/>
+                        </a:stretch>
+                      </pic:blipFill>
+                      <pic:spPr bwMode="auto">
+                        <a:xfrm>
+                          <a:off x="0" y="0"/>
+                          <a:ext cx="3335655" cy="3335655"/>
+                        </a:xfrm>
+                        <a:prstGeom prst="rect">
+                          <a:avLst/>
+                        </a:prstGeom>
+                        <a:noFill/>
+                        <a:ln>
+                          <a:noFill/>
+                        </a:ln>
+                      </pic:spPr>
+                    </pic:pic>
+                  </a:graphicData>
+                </a:graphic>
+              </wp:inline>
+            </w:drawing>
+          </w:r>
         </w:p>
-        <w:p/>
         <w:p>
           <w:pPr>
             <w:jc w:val="center"/>
@@ -3317,6 +3370,9 @@
         <w:jc w:val="center"/>
       </w:pPr>
       <w:r>
+        <w:rPr>
+          <w:noProof/>
+        </w:rPr>
         <w:drawing>
           <wp:inline distT="0" distB="0" distL="0" distR="0" wp14:anchorId="4492B7CA" wp14:editId="1170FD9C">
             <wp:extent cx="2940201" cy="1911448"/>
@@ -3333,7 +3389,7 @@
                     <pic:cNvPicPr/>
                   </pic:nvPicPr>
                   <pic:blipFill>
-                    <a:blip r:embed="rId8">
+                    <a:blip r:embed="rId9">
                       <a:extLst>
                         <a:ext uri="{28A0092B-C50C-407E-A947-70E740481C1C}">
                           <a14:useLocalDpi xmlns:a14="http://schemas.microsoft.com/office/drawing/2010/main" val="0"/>
@@ -3412,6 +3468,9 @@
         <w:jc w:val="center"/>
       </w:pPr>
       <w:r>
+        <w:rPr>
+          <w:noProof/>
+        </w:rPr>
         <w:drawing>
           <wp:inline distT="0" distB="0" distL="0" distR="0" wp14:anchorId="56DF3C27" wp14:editId="5385300E">
             <wp:extent cx="4294836" cy="2552831"/>
@@ -3428,7 +3487,7 @@
                     <pic:cNvPicPr/>
                   </pic:nvPicPr>
                   <pic:blipFill>
-                    <a:blip r:embed="rId9">
+                    <a:blip r:embed="rId10">
                       <a:extLst>
                         <a:ext uri="{28A0092B-C50C-407E-A947-70E740481C1C}">
                           <a14:useLocalDpi xmlns:a14="http://schemas.microsoft.com/office/drawing/2010/main" val="0"/>
@@ -3549,6 +3608,9 @@
         <w:jc w:val="center"/>
       </w:pPr>
       <w:r>
+        <w:rPr>
+          <w:noProof/>
+        </w:rPr>
         <w:drawing>
           <wp:inline distT="0" distB="0" distL="0" distR="0" wp14:anchorId="2AA6B406" wp14:editId="3CE323D4">
             <wp:extent cx="3853180" cy="2576830"/>
@@ -3567,7 +3629,7 @@
                     </pic:cNvPicPr>
                   </pic:nvPicPr>
                   <pic:blipFill>
-                    <a:blip r:embed="rId10">
+                    <a:blip r:embed="rId11">
                       <a:extLst>
                         <a:ext uri="{28A0092B-C50C-407E-A947-70E740481C1C}">
                           <a14:useLocalDpi xmlns:a14="http://schemas.microsoft.com/office/drawing/2010/main" val="0"/>
@@ -3673,6 +3735,9 @@
         <w:jc w:val="center"/>
       </w:pPr>
       <w:r>
+        <w:rPr>
+          <w:noProof/>
+        </w:rPr>
         <w:drawing>
           <wp:inline distT="0" distB="0" distL="0" distR="0" wp14:anchorId="6A3A66C0" wp14:editId="0DE1E896">
             <wp:extent cx="4077970" cy="2420620"/>
@@ -3691,7 +3756,7 @@
                     </pic:cNvPicPr>
                   </pic:nvPicPr>
                   <pic:blipFill>
-                    <a:blip r:embed="rId11">
+                    <a:blip r:embed="rId12">
                       <a:extLst>
                         <a:ext uri="{28A0092B-C50C-407E-A947-70E740481C1C}">
                           <a14:useLocalDpi xmlns:a14="http://schemas.microsoft.com/office/drawing/2010/main" val="0"/>
@@ -3825,8 +3890,11 @@
         <w:jc w:val="center"/>
       </w:pPr>
       <w:r>
+        <w:rPr>
+          <w:noProof/>
+        </w:rPr>
         <w:drawing>
-          <wp:inline distT="0" distB="0" distL="0" distR="0" wp14:anchorId="21CFB329" wp14:editId="7E104B99">
+          <wp:inline distT="0" distB="0" distL="0" distR="0" wp14:anchorId="21CFB329" wp14:editId="4055D97B">
             <wp:extent cx="5755640" cy="1550035"/>
             <wp:effectExtent l="0" t="0" r="0" b="0"/>
             <wp:docPr id="273820517" name="Image 3"/>
@@ -3843,7 +3911,7 @@
                     </pic:cNvPicPr>
                   </pic:nvPicPr>
                   <pic:blipFill>
-                    <a:blip r:embed="rId12" cstate="print">
+                    <a:blip r:embed="rId13" cstate="print">
                       <a:extLst>
                         <a:ext uri="{28A0092B-C50C-407E-A947-70E740481C1C}">
                           <a14:useLocalDpi xmlns:a14="http://schemas.microsoft.com/office/drawing/2010/main" val="0"/>
@@ -3926,6 +3994,9 @@
         <w:jc w:val="center"/>
       </w:pPr>
       <w:r>
+        <w:rPr>
+          <w:noProof/>
+        </w:rPr>
         <w:drawing>
           <wp:inline distT="0" distB="0" distL="0" distR="0" wp14:anchorId="632E671E" wp14:editId="39480FC1">
             <wp:extent cx="5750560" cy="2782570"/>
@@ -3944,7 +4015,7 @@
                     </pic:cNvPicPr>
                   </pic:nvPicPr>
                   <pic:blipFill>
-                    <a:blip r:embed="rId13" cstate="print">
+                    <a:blip r:embed="rId14" cstate="print">
                       <a:extLst>
                         <a:ext uri="{28A0092B-C50C-407E-A947-70E740481C1C}">
                           <a14:useLocalDpi xmlns:a14="http://schemas.microsoft.com/office/drawing/2010/main" val="0"/>
@@ -4008,6 +4079,9 @@
         <w:jc w:val="center"/>
       </w:pPr>
       <w:r>
+        <w:rPr>
+          <w:noProof/>
+        </w:rPr>
         <w:drawing>
           <wp:inline distT="0" distB="0" distL="0" distR="0" wp14:anchorId="2FC200CC" wp14:editId="3FA56DD7">
             <wp:extent cx="5753735" cy="3286125"/>
@@ -4026,7 +4100,7 @@
                     </pic:cNvPicPr>
                   </pic:nvPicPr>
                   <pic:blipFill>
-                    <a:blip r:embed="rId14">
+                    <a:blip r:embed="rId15">
                       <a:extLst>
                         <a:ext uri="{28A0092B-C50C-407E-A947-70E740481C1C}">
                           <a14:useLocalDpi xmlns:a14="http://schemas.microsoft.com/office/drawing/2010/main" val="0"/>
@@ -4136,6 +4210,9 @@
         <w:jc w:val="center"/>
       </w:pPr>
       <w:r>
+        <w:rPr>
+          <w:noProof/>
+        </w:rPr>
         <w:drawing>
           <wp:inline distT="0" distB="0" distL="0" distR="0" wp14:anchorId="16233297" wp14:editId="3B786F8A">
             <wp:extent cx="4617085" cy="3562350"/>
@@ -4154,7 +4231,7 @@
                     </pic:cNvPicPr>
                   </pic:nvPicPr>
                   <pic:blipFill>
-                    <a:blip r:embed="rId15">
+                    <a:blip r:embed="rId16">
                       <a:extLst>
                         <a:ext uri="{28A0092B-C50C-407E-A947-70E740481C1C}">
                           <a14:useLocalDpi xmlns:a14="http://schemas.microsoft.com/office/drawing/2010/main" val="0"/>
@@ -4254,6 +4331,9 @@
         <w:jc w:val="center"/>
       </w:pPr>
       <w:r>
+        <w:rPr>
+          <w:noProof/>
+        </w:rPr>
         <w:drawing>
           <wp:inline distT="0" distB="0" distL="0" distR="0" wp14:anchorId="08B897AA" wp14:editId="11F6C6DE">
             <wp:extent cx="5758180" cy="4576445"/>
@@ -4272,7 +4352,7 @@
                     </pic:cNvPicPr>
                   </pic:nvPicPr>
                   <pic:blipFill>
-                    <a:blip r:embed="rId16">
+                    <a:blip r:embed="rId17">
                       <a:extLst>
                         <a:ext uri="{28A0092B-C50C-407E-A947-70E740481C1C}">
                           <a14:useLocalDpi xmlns:a14="http://schemas.microsoft.com/office/drawing/2010/main" val="0"/>
@@ -4343,6 +4423,9 @@
         <w:jc w:val="center"/>
       </w:pPr>
       <w:r>
+        <w:rPr>
+          <w:noProof/>
+        </w:rPr>
         <w:drawing>
           <wp:inline distT="0" distB="0" distL="0" distR="0" wp14:anchorId="610F059E" wp14:editId="1247F74B">
             <wp:extent cx="5758180" cy="3213735"/>
@@ -4361,7 +4444,7 @@
                     </pic:cNvPicPr>
                   </pic:nvPicPr>
                   <pic:blipFill>
-                    <a:blip r:embed="rId17">
+                    <a:blip r:embed="rId18">
                       <a:extLst>
                         <a:ext uri="{28A0092B-C50C-407E-A947-70E740481C1C}">
                           <a14:useLocalDpi xmlns:a14="http://schemas.microsoft.com/office/drawing/2010/main" val="0"/>
@@ -4441,8 +4524,11 @@
         <w:jc w:val="center"/>
       </w:pPr>
       <w:r>
+        <w:rPr>
+          <w:noProof/>
+        </w:rPr>
         <w:drawing>
-          <wp:inline distT="0" distB="0" distL="0" distR="0" wp14:anchorId="4E0C9F37" wp14:editId="5D46BEBD">
+          <wp:inline distT="0" distB="0" distL="0" distR="0" wp14:anchorId="4E0C9F37" wp14:editId="42AB4A80">
             <wp:extent cx="5753735" cy="2458085"/>
             <wp:effectExtent l="0" t="0" r="0" b="0"/>
             <wp:docPr id="460749035" name="Image 11"/>
@@ -4459,7 +4545,7 @@
                     </pic:cNvPicPr>
                   </pic:nvPicPr>
                   <pic:blipFill>
-                    <a:blip r:embed="rId18" cstate="print">
+                    <a:blip r:embed="rId19" cstate="print">
                       <a:extLst>
                         <a:ext uri="{28A0092B-C50C-407E-A947-70E740481C1C}">
                           <a14:useLocalDpi xmlns:a14="http://schemas.microsoft.com/office/drawing/2010/main" val="0"/>
@@ -4538,6 +4624,9 @@
         <w:jc w:val="center"/>
       </w:pPr>
       <w:r>
+        <w:rPr>
+          <w:noProof/>
+        </w:rPr>
         <w:drawing>
           <wp:inline distT="0" distB="0" distL="0" distR="0" wp14:anchorId="6188A1EA" wp14:editId="56FB11BB">
             <wp:extent cx="5758180" cy="2503170"/>
@@ -4556,7 +4645,7 @@
                     </pic:cNvPicPr>
                   </pic:nvPicPr>
                   <pic:blipFill>
-                    <a:blip r:embed="rId19">
+                    <a:blip r:embed="rId20">
                       <a:extLst>
                         <a:ext uri="{28A0092B-C50C-407E-A947-70E740481C1C}">
                           <a14:useLocalDpi xmlns:a14="http://schemas.microsoft.com/office/drawing/2010/main" val="0"/>
@@ -4624,8 +4713,11 @@
     </w:p>
     <w:p>
       <w:r>
+        <w:rPr>
+          <w:noProof/>
+        </w:rPr>
         <w:drawing>
-          <wp:inline distT="0" distB="0" distL="0" distR="0" wp14:anchorId="28B65BB5" wp14:editId="18E67C99">
+          <wp:inline distT="0" distB="0" distL="0" distR="0" wp14:anchorId="28B65BB5" wp14:editId="126B8A74">
             <wp:extent cx="5753735" cy="1552575"/>
             <wp:effectExtent l="0" t="0" r="0" b="9525"/>
             <wp:docPr id="925377937" name="Image 13"/>
@@ -4642,7 +4734,7 @@
                     </pic:cNvPicPr>
                   </pic:nvPicPr>
                   <pic:blipFill>
-                    <a:blip r:embed="rId20" cstate="print">
+                    <a:blip r:embed="rId21" cstate="print">
                       <a:extLst>
                         <a:ext uri="{28A0092B-C50C-407E-A947-70E740481C1C}">
                           <a14:useLocalDpi xmlns:a14="http://schemas.microsoft.com/office/drawing/2010/main" val="0"/>
@@ -4717,6 +4809,9 @@
         <w:jc w:val="center"/>
       </w:pPr>
       <w:r>
+        <w:rPr>
+          <w:noProof/>
+        </w:rPr>
         <w:drawing>
           <wp:inline distT="0" distB="0" distL="0" distR="0" wp14:anchorId="4B3DB82A" wp14:editId="4311A714">
             <wp:extent cx="5758180" cy="3209290"/>
@@ -4735,7 +4830,7 @@
                     </pic:cNvPicPr>
                   </pic:nvPicPr>
                   <pic:blipFill>
-                    <a:blip r:embed="rId21">
+                    <a:blip r:embed="rId22">
                       <a:extLst>
                         <a:ext uri="{28A0092B-C50C-407E-A947-70E740481C1C}">
                           <a14:useLocalDpi xmlns:a14="http://schemas.microsoft.com/office/drawing/2010/main" val="0"/>
@@ -4788,6 +4883,9 @@
         <w:jc w:val="center"/>
       </w:pPr>
       <w:r>
+        <w:rPr>
+          <w:noProof/>
+        </w:rPr>
         <w:drawing>
           <wp:inline distT="0" distB="0" distL="0" distR="0" wp14:anchorId="0B38F71C" wp14:editId="2DF6B014">
             <wp:extent cx="2743200" cy="1493520"/>
@@ -4806,7 +4904,7 @@
                     </pic:cNvPicPr>
                   </pic:nvPicPr>
                   <pic:blipFill>
-                    <a:blip r:embed="rId22">
+                    <a:blip r:embed="rId23">
                       <a:extLst>
                         <a:ext uri="{28A0092B-C50C-407E-A947-70E740481C1C}">
                           <a14:useLocalDpi xmlns:a14="http://schemas.microsoft.com/office/drawing/2010/main" val="0"/>
@@ -4887,6 +4985,9 @@
         <w:jc w:val="center"/>
       </w:pPr>
       <w:r>
+        <w:rPr>
+          <w:noProof/>
+        </w:rPr>
         <w:drawing>
           <wp:inline distT="0" distB="0" distL="0" distR="0" wp14:anchorId="4A62093C" wp14:editId="17074266">
             <wp:extent cx="3300095" cy="1294765"/>
@@ -4905,7 +5006,7 @@
                     </pic:cNvPicPr>
                   </pic:nvPicPr>
                   <pic:blipFill>
-                    <a:blip r:embed="rId23">
+                    <a:blip r:embed="rId24">
                       <a:extLst>
                         <a:ext uri="{28A0092B-C50C-407E-A947-70E740481C1C}">
                           <a14:useLocalDpi xmlns:a14="http://schemas.microsoft.com/office/drawing/2010/main" val="0"/>
@@ -4968,6 +5069,9 @@
         <w:jc w:val="center"/>
       </w:pPr>
       <w:r>
+        <w:rPr>
+          <w:noProof/>
+        </w:rPr>
         <w:drawing>
           <wp:inline distT="0" distB="0" distL="0" distR="0" wp14:anchorId="57139524" wp14:editId="64ACC77C">
             <wp:extent cx="5224145" cy="1792605"/>
@@ -4986,7 +5090,7 @@
                     </pic:cNvPicPr>
                   </pic:nvPicPr>
                   <pic:blipFill>
-                    <a:blip r:embed="rId24">
+                    <a:blip r:embed="rId25">
                       <a:extLst>
                         <a:ext uri="{28A0092B-C50C-407E-A947-70E740481C1C}">
                           <a14:useLocalDpi xmlns:a14="http://schemas.microsoft.com/office/drawing/2010/main" val="0"/>
@@ -5126,6 +5230,9 @@
         <w:jc w:val="center"/>
       </w:pPr>
       <w:r>
+        <w:rPr>
+          <w:noProof/>
+        </w:rPr>
         <w:drawing>
           <wp:inline distT="0" distB="0" distL="0" distR="0" wp14:anchorId="0F6811CC" wp14:editId="153EA5D5">
             <wp:extent cx="4579739" cy="1386205"/>
@@ -5142,7 +5249,7 @@
                     <pic:cNvPicPr/>
                   </pic:nvPicPr>
                   <pic:blipFill>
-                    <a:blip r:embed="rId25">
+                    <a:blip r:embed="rId26">
                       <a:extLst>
                         <a:ext uri="{28A0092B-C50C-407E-A947-70E740481C1C}">
                           <a14:useLocalDpi xmlns:a14="http://schemas.microsoft.com/office/drawing/2010/main" val="0"/>
@@ -5195,6 +5302,9 @@
         <w:jc w:val="center"/>
       </w:pPr>
       <w:r>
+        <w:rPr>
+          <w:noProof/>
+        </w:rPr>
         <w:drawing>
           <wp:inline distT="0" distB="0" distL="0" distR="0" wp14:anchorId="1872C16A" wp14:editId="6AE0E50C">
             <wp:extent cx="4518494" cy="1381125"/>
@@ -5211,7 +5321,7 @@
                     <pic:cNvPicPr/>
                   </pic:nvPicPr>
                   <pic:blipFill>
-                    <a:blip r:embed="rId26"/>
+                    <a:blip r:embed="rId27"/>
                     <a:stretch>
                       <a:fillRect/>
                     </a:stretch>
@@ -5254,6 +5364,9 @@
         <w:jc w:val="center"/>
       </w:pPr>
       <w:r>
+        <w:rPr>
+          <w:noProof/>
+        </w:rPr>
         <w:drawing>
           <wp:inline distT="0" distB="0" distL="0" distR="0" wp14:anchorId="1341423A" wp14:editId="539B5040">
             <wp:extent cx="4497300" cy="1385101"/>
@@ -5270,7 +5383,7 @@
                     <pic:cNvPicPr/>
                   </pic:nvPicPr>
                   <pic:blipFill>
-                    <a:blip r:embed="rId27">
+                    <a:blip r:embed="rId28">
                       <a:extLst>
                         <a:ext uri="{28A0092B-C50C-407E-A947-70E740481C1C}">
                           <a14:useLocalDpi xmlns:a14="http://schemas.microsoft.com/office/drawing/2010/main" val="0"/>
@@ -5459,6 +5572,23 @@
       </w:r>
     </w:p>
     <w:p>
+      <w:r>
+        <w:t>À part l’utilisation de l’IA pour ça, je ne l’ai pas utilisé du tout dans tout mon projet.</w:t>
+      </w:r>
+      <w:r>
+        <w:t xml:space="preserve"> De la </w:t>
+      </w:r>
+      <w:r>
+        <w:t xml:space="preserve">première ligne </w:t>
+      </w:r>
+      <w:r>
+        <w:t xml:space="preserve">de code </w:t>
+      </w:r>
+      <w:r>
+        <w:t>jusqu’au dernier commentaire a été fait entièrement par moi.</w:t>
+      </w:r>
+    </w:p>
+    <w:p>
       <w:pPr>
         <w:pStyle w:val="Titre2"/>
         <w:ind w:left="708"/>
@@ -5705,7 +5835,7 @@
     </w:tbl>
     <w:p/>
     <w:sectPr>
-      <w:footerReference w:type="default" r:id="rId28"/>
+      <w:footerReference w:type="default" r:id="rId29"/>
       <w:pgSz w:w="11906" w:h="16838"/>
       <w:pgMar w:top="1417" w:right="1417" w:bottom="1417" w:left="1417" w:header="708" w:footer="708" w:gutter="0"/>
       <w:pgNumType w:start="0"/>
@@ -6740,6 +6870,7 @@
   <w:style w:type="character" w:default="1" w:styleId="Policepardfaut">
     <w:name w:val="Default Paragraph Font"/>
     <w:uiPriority w:val="1"/>
+    <w:semiHidden/>
     <w:unhideWhenUsed/>
   </w:style>
   <w:style w:type="table" w:default="1" w:styleId="TableauNormal">
@@ -7347,12 +7478,14 @@
     <w:rsid w:val="0043780A"/>
     <w:rsid w:val="0048159C"/>
     <w:rsid w:val="00482DE2"/>
+    <w:rsid w:val="004F41E2"/>
     <w:rsid w:val="005B37DF"/>
     <w:rsid w:val="005D009D"/>
     <w:rsid w:val="005E5E67"/>
     <w:rsid w:val="006242E2"/>
     <w:rsid w:val="00665836"/>
     <w:rsid w:val="007946E6"/>
+    <w:rsid w:val="00852FBF"/>
     <w:rsid w:val="008B5502"/>
     <w:rsid w:val="009068F7"/>
     <w:rsid w:val="009851C5"/>

</xml_diff>